<commit_message>
updated + validation fix
</commit_message>
<xml_diff>
--- a/docs/Králik Juraj.docx
+++ b/docs/Králik Juraj.docx
@@ -1399,32 +1399,32 @@
           <w:lang w:val="sk-SK"/>
         </w:rPr>
       </w:pPr>
-      <w:bookmarkStart w:id="1" w:name="_Toc37577729"/>
-      <w:bookmarkStart w:id="2" w:name="_Toc88120440"/>
-      <w:bookmarkStart w:id="3" w:name="_Toc88120677"/>
-      <w:bookmarkStart w:id="4" w:name="_Toc88120889"/>
-      <w:bookmarkStart w:id="5" w:name="_Toc88120993"/>
-      <w:bookmarkStart w:id="6" w:name="_Toc88121036"/>
-      <w:bookmarkStart w:id="7" w:name="_Toc88121173"/>
-      <w:bookmarkStart w:id="8" w:name="_Toc88121547"/>
-      <w:bookmarkStart w:id="9" w:name="_Toc88121604"/>
-      <w:bookmarkStart w:id="10" w:name="_Toc88121742"/>
-      <w:bookmarkStart w:id="11" w:name="_Toc88122008"/>
-      <w:bookmarkStart w:id="12" w:name="_Toc88124611"/>
-      <w:bookmarkStart w:id="13" w:name="_Toc88124648"/>
-      <w:bookmarkStart w:id="14" w:name="_Toc88124798"/>
-      <w:bookmarkStart w:id="15" w:name="_Toc88125781"/>
-      <w:bookmarkStart w:id="16" w:name="_Toc88126301"/>
-      <w:bookmarkStart w:id="17" w:name="_Toc88126452"/>
-      <w:bookmarkStart w:id="18" w:name="_Toc88126519"/>
-      <w:bookmarkStart w:id="19" w:name="_Toc88126548"/>
-      <w:bookmarkStart w:id="20" w:name="_Toc88126764"/>
-      <w:bookmarkStart w:id="21" w:name="_Toc88126854"/>
-      <w:bookmarkStart w:id="22" w:name="_Toc88127095"/>
-      <w:bookmarkStart w:id="23" w:name="_Toc88127138"/>
-      <w:bookmarkStart w:id="24" w:name="_Toc88128503"/>
-      <w:bookmarkStart w:id="25" w:name="_Toc107634140"/>
-      <w:bookmarkStart w:id="26" w:name="_Toc107635157"/>
+      <w:bookmarkStart w:id="1" w:name="_Toc107635157"/>
+      <w:bookmarkStart w:id="2" w:name="_Toc107634140"/>
+      <w:bookmarkStart w:id="3" w:name="_Toc88128503"/>
+      <w:bookmarkStart w:id="4" w:name="_Toc88127138"/>
+      <w:bookmarkStart w:id="5" w:name="_Toc88127095"/>
+      <w:bookmarkStart w:id="6" w:name="_Toc88126854"/>
+      <w:bookmarkStart w:id="7" w:name="_Toc88126764"/>
+      <w:bookmarkStart w:id="8" w:name="_Toc88126548"/>
+      <w:bookmarkStart w:id="9" w:name="_Toc88126519"/>
+      <w:bookmarkStart w:id="10" w:name="_Toc88126452"/>
+      <w:bookmarkStart w:id="11" w:name="_Toc88126301"/>
+      <w:bookmarkStart w:id="12" w:name="_Toc88125781"/>
+      <w:bookmarkStart w:id="13" w:name="_Toc88124798"/>
+      <w:bookmarkStart w:id="14" w:name="_Toc88124648"/>
+      <w:bookmarkStart w:id="15" w:name="_Toc88124611"/>
+      <w:bookmarkStart w:id="16" w:name="_Toc88122008"/>
+      <w:bookmarkStart w:id="17" w:name="_Toc88121742"/>
+      <w:bookmarkStart w:id="18" w:name="_Toc88121604"/>
+      <w:bookmarkStart w:id="19" w:name="_Toc88121547"/>
+      <w:bookmarkStart w:id="20" w:name="_Toc88121173"/>
+      <w:bookmarkStart w:id="21" w:name="_Toc88121036"/>
+      <w:bookmarkStart w:id="22" w:name="_Toc88120993"/>
+      <w:bookmarkStart w:id="23" w:name="_Toc88120889"/>
+      <w:bookmarkStart w:id="24" w:name="_Toc88120677"/>
+      <w:bookmarkStart w:id="25" w:name="_Toc88120440"/>
+      <w:bookmarkStart w:id="26" w:name="_Toc37577729"/>
       <w:r>
         <w:rPr>
           <w:lang w:val="sk-SK"/>
@@ -2070,8 +2070,8 @@
           <w:lang w:val="sk-SK"/>
         </w:rPr>
       </w:pPr>
-      <w:bookmarkStart w:id="27" w:name="_Toc117787093"/>
-      <w:bookmarkStart w:id="28" w:name="_Toc22666742"/>
+      <w:bookmarkStart w:id="27" w:name="_Toc22666742"/>
+      <w:bookmarkStart w:id="28" w:name="_Toc117787093"/>
       <w:r>
         <w:rPr>
           <w:lang w:val="sk-SK"/>
@@ -2292,10 +2292,10 @@
         </w:rPr>
       </w:pPr>
       <w:bookmarkStart w:id="30" w:name="__RefHeading___Toc524_1577340545"/>
-      <w:bookmarkStart w:id="31" w:name="_Toc107634143"/>
-      <w:bookmarkStart w:id="32" w:name="_Toc107635178"/>
-      <w:bookmarkStart w:id="33" w:name="_Toc107635218"/>
-      <w:bookmarkStart w:id="34" w:name="_Toc107635235"/>
+      <w:bookmarkStart w:id="31" w:name="_Toc107635235"/>
+      <w:bookmarkStart w:id="32" w:name="_Toc107635218"/>
+      <w:bookmarkStart w:id="33" w:name="_Toc107635178"/>
+      <w:bookmarkStart w:id="34" w:name="_Toc107634143"/>
       <w:bookmarkEnd w:id="30"/>
       <w:bookmarkEnd w:id="31"/>
       <w:bookmarkEnd w:id="32"/>
@@ -2471,7 +2471,31 @@
         <w:rPr>
           <w:lang w:val="sk-SK"/>
         </w:rPr>
-        <w:t>V 70. rokoch výskum rozpoznávania reči dosiahol množstvo významných míľnikov. Poprvé sa oblasť rozpoznávania izolovaných slov alebo diskrétnych výrokov stala životaschopnou a použiteľnou technológiou na základe štúdií Velichka a Zagoruyka v Rusku, Sakoa a Chibu v Japonsku, a Itakuru v Spojených štátoch. Ruské štúdie rozšírili využívanie pattern-recognition v rozpoznávaní reči [16]; japonský výskum preukázal úspešné aplikovanie metód dynamického programovania [17]; Itakurov výskum ukázal, ako princípy linear predictive coding (LPC), ktoré už boli úspešne využívané v low-bit-rate speech coding, mohli byť rozšírené do systémov na rozoznávanie reči za použitia korektných meraní dĺžok podľa LPC spektrálnych parametrov [18].</w:t>
+        <w:t>V 70. rokoch výskum rozpoznávania reči dosiahol množstvo významných míľnikov. Poprvé sa oblasť rozpoznávania izolovaných slov alebo diskrétnych výrokov stala životaschopnou a použiteľnou technológiou na základe štúdií Velichka a Zagoruyka v Rusku, Sako</w:t>
+      </w:r>
+      <w:r>
+        <w:rPr>
+          <w:lang w:val="sk-SK"/>
+        </w:rPr>
+        <w:t>e</w:t>
+      </w:r>
+      <w:r>
+        <w:rPr>
+          <w:lang w:val="sk-SK"/>
+        </w:rPr>
+        <w:t xml:space="preserve"> a Chib</w:t>
+      </w:r>
+      <w:r>
+        <w:rPr>
+          <w:lang w:val="sk-SK"/>
+        </w:rPr>
+        <w:t>a</w:t>
+      </w:r>
+      <w:r>
+        <w:rPr>
+          <w:lang w:val="sk-SK"/>
+        </w:rPr>
+        <w:t xml:space="preserve"> v Japonsku, a Itakuru v Spojených štátoch. Ruské štúdie rozšírili využívanie pattern-recognition v rozpoznávaní reči [16]; japonský výskum preukázal úspešné aplikovanie metód dynamického programovania [17]; Itakurov výskum ukázal, ako princípy linear predictive coding (LPC), ktoré už boli úspešne využívané v low-bit-rate speech coding, mohli byť rozšírené do systémov na rozoznávanie reči za použitia korektných meraní dĺžok podľa LPC spektrálnych parametrov [18].</w:t>
       </w:r>
     </w:p>
     <w:p>
@@ -2485,19 +2509,7 @@
         <w:rPr>
           <w:lang w:val="sk-SK"/>
         </w:rPr>
-        <w:t>Ďalším míľnikom 70. rokov bol začiatok dlhodobého, veľmi úspešného skupinového úsilia v oblasti rozpoznávania reči s veľkou slovnou zásobou v IBM, v rámci ktorého skúmali tri rôzne úlohy v priebehu takmer dvoch desaťročí, predovšetkým jazyk New R</w:t>
-      </w:r>
-      <w:r>
-        <w:rPr>
-          <w:lang w:val="sk-SK"/>
-        </w:rPr>
-        <w:t xml:space="preserve">aleigh </w:t>
-      </w:r>
-      <w:r>
-        <w:rPr>
-          <w:lang w:val="sk-SK"/>
-        </w:rPr>
-        <w:t>[19] pre jednoduché databázové dotazy, využitie laser patent text language [20] pre transkripciu laser patentov a úlohu korešpondencie v kancelárskom prostredí, nazývanú Tangora [21], na diktovanie zápisníc a poznámok.</w:t>
+        <w:t>Ďalším míľnikom 70. rokov bol začiatok dlhodobého, veľmi úspešného skupinového úsilia v oblasti rozpoznávania reči s veľkou slovnou zásobou v IBM, v rámci ktorého skúmali tri rôzne úlohy v priebehu takmer dvoch desaťročí, predovšetkým jazyk New Raleigh [19] pre jednoduché databázové dotazy, využitie laser patent text language [20] pre transkripciu laser patentov a úlohu korešpondencie v kancelárskom prostredí, nazývanú Tangora [21], na diktovanie zápisníc a poznámok.</w:t>
       </w:r>
     </w:p>
     <w:p>
@@ -2614,7 +2626,7 @@
         <w:rPr>
           <w:lang w:val="sk-SK"/>
         </w:rPr>
-        <w:t>Úlohou automatického rozpoznávania reči je previesť akustický signál obsahujúci hovorenú reč na zodpovedajúcu textovú podobu. Vstupom systému je zvuková vlna, ktorá sa najskôr musí spracovať do podoby vhodnej pre výpočtové modely. Výstupom je následne sekvencia slov, znakov alebo iných textových jednotiek, ktoré najlepšie zodpovedajú obsahu nahrávky [1], [2].</w:t>
+        <w:t>Úlohou automatického rozpoznávania reči je previesť akustický signál obsahujúci hovorenú reč na zodpovedajúcu textovú podobu. Vstupom systému je zvuková vlna, ktorá sa najskôr spracuje do podoby vhodnej pre výpočtové modely. Výstupom je následne sekvencia slov, znakov alebo iných textových jednotiek, ktoré najlepšie zodpovedajú obsahu nahrávky [1].</w:t>
       </w:r>
     </w:p>
     <w:p>
@@ -2628,7 +2640,7 @@
         <w:rPr>
           <w:lang w:val="sk-SK"/>
         </w:rPr>
-        <w:t>Prvým krokom pri rozpoznávaní reči je spracovanie zvukového signálu. Rečový signál je spojitý, zatiaľ čo počítač pracuje s jeho digitálnou reprezentáciou. Zvuk sa preto vzorkuje, kvantizuje a následne rozdeľuje na krátke časové úseky. Z týchto úsekov sa získavajú príznaky, ktoré lepšie opisujú vlastnosti reči než samotná surová vlna. V moderných systémoch sa často používa spektrálna reprezentácia, napríklad log-mel spektrum. Táto reprezentácia zohľadňuje aj spôsob, akým človek vníma frekvencie a hlasitosť zvuku, a preto je vhodná na spracovanie reči [1].</w:t>
+        <w:t>Prvým krokom pri rozpoznávaní reči je spracovanie zvukového signálu. Rečový signál je spojitý, zatiaľ čo počítač pracuje s jeho digitálnou reprezentáciou. Zvuk sa preto vzorkuje, kvantizuje a následne rozdeľuje na krátke časové úseky. Z týchto úsekov sa získavajú príznaky, ktoré lepšie opisujú vlastnosti reči než samotná surová vlna. V moderných systémoch sa často používa spektrálna reprezentácia, napríklad log-mel spektrum, ktoré sa stalo jedným z bežných vstupov pre neurónové modely rozpoznávania reči [1], [37].</w:t>
       </w:r>
     </w:p>
     <w:p>
@@ -2642,7 +2654,7 @@
         <w:rPr>
           <w:lang w:val="sk-SK"/>
         </w:rPr>
-        <w:t>Tradičné systémy rozpoznávania reči boli často postavené na samostatných častiach, ktoré spolu tvorili jeden rozpoznávací reťazec. Typicky išlo o extrakciu príznakov, akustický model, jazykový model a dekódovanie. Akustický model určoval, ako pravdepodobné je, že určitý úsek zvuku zodpovedá konkrétnej hláske, fonému alebo inej rečovej jednotke. Jazykový model naopak pracoval s pravdepodobnosťou výskytu slov alebo slovných spojení v danom jazyku. Dekóder následne kombinoval informácie z akustického a jazykového modelu a hľadal najpravdepodobnejšiu výslednú vetu [4].</w:t>
+        <w:t>Tradičné systémy rozpoznávania reči boli postavené z viacerých samostatných častí. Typicky išlo o extrakciu príznakov, akustický model, jazykový model a dekódovanie. Akustický model určoval, ako pravdepodobné je, že určitý úsek zvuku zodpovedá konkrétnej hláske, fonému alebo inej rečovej jednotke. Jazykový model pracoval s pravdepodobnosťou výskytu slov alebo slovných spojení v danom jazyku. Dekóder následne kombinoval informácie z akustického a jazykového modelu a hľadal najpravdepodobnejší výsledný prepis [3], [4].</w:t>
       </w:r>
     </w:p>
     <w:p>
@@ -2656,7 +2668,7 @@
         <w:rPr>
           <w:lang w:val="sk-SK"/>
         </w:rPr>
-        <w:t>V starších systémoch sa ako akustické modely často používali modely GMM-HMM. Skryté Markovove modely, teda HMM, boli vhodné na modelovanie časovej postupnosti reči, keďže reč je prirodzene sekvenčný signál. Gaussian Mixture Models, teda GMM, sa používali na modelovanie vzťahu medzi akustickými príznakmi a rečovými jednotkami. Tento prístup bol dlhé roky základom praktických systémov automatického rozpoznávania reči [2], [4].</w:t>
+        <w:t>Dlhé obdobie boli základom praktických systémov modely GMM-HMM. Skryté Markovove modely, teda HMM, boli vhodné na modelovanie časovej postupnosti reči, keďže reč je prirodzene sekvenčný signál. Gaussian Mixture Models, teda GMM, sa používali na modelovanie vzťahu medzi akustickými príznakmi a rečovými jednotkami. HMM sa stali jedným z najdôležitejších prístupov v klasickom rozpoznávaní reči a ich teoretický základ bol podrobne spracovaný napríklad v Rabinerovej práci o HMM [28]. V kombinácii s GMM tvorili základ mnohých systémov rozpoznávania reči pred nástupom hlbokého učenia [3], [4].</w:t>
       </w:r>
     </w:p>
     <w:p>
@@ -2670,7 +2682,7 @@
         <w:rPr>
           <w:lang w:val="sk-SK"/>
         </w:rPr>
-        <w:t>S nástupom hlbokého učenia sa začali v rozpoznávaní reči používať neurónové siete. Najskôr často nahrádzali iba niektoré časti klasického systému, napríklad GMM v akustickom modeli, pričom HMM časť zostávala zachovaná. Takéto hybridné DNN-HMM systémy priniesli výrazné zlepšenie presnosti oproti starším GMM-HMM riešeniam. Dôvodom bolo hlavne to, že hlboké neurónové siete dokázali lepšie modelovať zložité vzťahy medzi akustickými príznakmi a rečovými jednotkami [2], [4].</w:t>
+        <w:t>S nástupom hlbokého učenia sa začali v rozpoznávaní reči používať neurónové siete. Najskôr často nahrádzali iba časť klasického systému, najmä GMM v akustickom modeli, pričom HMM časť zostávala zachovaná. Takéto hybridné DNN-HMM systémy používali HMM na modelovanie sekvenčnej povahy reči a DNN na odhad pravdepodobností stavov alebo rečových jednotiek [4], [38]. Výrazné zlepšenie týchto systémov oproti starším GMM-HMM riešeniam bolo neskôr potvrdené vo viacerých prácach z oblasti veľkoslovníkového rozpoznávania reči [39], [40].</w:t>
       </w:r>
     </w:p>
     <w:p>
@@ -2684,19 +2696,7 @@
         <w:rPr>
           <w:lang w:val="sk-SK"/>
         </w:rPr>
-        <w:t>Ďalším krok</w:t>
-      </w:r>
-      <w:r>
-        <w:rPr>
-          <w:lang w:val="sk-SK"/>
-        </w:rPr>
-        <w:t>o</w:t>
-      </w:r>
-      <w:r>
-        <w:rPr>
-          <w:lang w:val="sk-SK"/>
-        </w:rPr>
-        <w:t>m vo vývoji boli end-to-end modely. Tie sa snažia zjednodušiť celý proces tým, že modelujú prevod zvuku na text priamo, bez nutnosti ručne navrhovať viac samostatných komponentov. Namiesto oddeleného akustického modelu, výslovnostného slovníka a jazykového modelu sa jeden model učí prevádzať vstupnú akustickú reprezentáciu priamo na znaky, slová alebo slovné jednotky. Medzi časté prístupy patria modely založené na CTC a encoder-decoder architektúry s attention mechanizmom [1].</w:t>
+        <w:t>Ďalším smerom vývoja boli modely, ktoré sa snažili zjednodušiť celý rozpoznávací proces a priblížiť ho k end-to-end spracovaniu. Namiesto samostatného akustického modelu, výslovnostného slovníka a jazykového modelu sa model učí prevádzať vstupnú akustickú reprezentáciu priamo na znaky, slová alebo iné textové jednotky. Medzi dôležité prístupy patria modely založené na CTC a encoder-decoder architektúry s attention mechanizmom [1], [41].</w:t>
       </w:r>
     </w:p>
     <w:p>
@@ -2710,7 +2710,7 @@
         <w:rPr>
           <w:lang w:val="sk-SK"/>
         </w:rPr>
-        <w:t>CTC, teda Connectionist Temporal Classification, rieši problém, že pri trénovaní väčšinou poznáme výsledný text, ale nepoznáme presné časové zarovnanie medzi jednotlivými časťami zvuku a znakmi vo výstupe. Model sa preto učí nájsť možné zarovnania medzi vstupnou akustickou sekvenciou a výstupným textom. Výhodou CTC modelov je, že sú vhodné aj pre priebežné alebo streamované rozpoznávanie, pretože môžu generovať výstup postupne počas spracovania audia [1].</w:t>
+        <w:t>CTC, teda Connectionist Temporal Classification, rieši problém, že pri trénovaní väčšinou poznáme výsledný text, ale nepoznáme presné časové zarovnanie medzi jednotlivými časťami zvuku a znakmi vo výstupe. Model sa preto učí pracovať so všetkými možnými zarovnaniami medzi vstupnou akustickou sekvenciou a výstupným textom [41]. Tento prístup bol neskôr použitý aj pri end-to-end rozpoznávaní reči pomocou rekurentných neurónových sietí [42], [43]. Výhodou CTC modelov je, že sú vhodné aj pre priebežné alebo streamované rozpoznávanie, pretože dokážu generovať výstup postupne počas spracovania audia [1].</w:t>
       </w:r>
     </w:p>
     <w:p>
@@ -2724,7 +2724,7 @@
         <w:rPr>
           <w:lang w:val="sk-SK"/>
         </w:rPr>
-        <w:t>Encoder-decoder modely pracujú tak, že encoder najskôr spracuje vstupnú sekvenciu akustických príznakov a vytvorí jej vnútornú reprezentáciu. Decoder potom z tejto reprezentácie postupne generuje výstupnú textovú sekvenciu. Pri rozpoznávaní reči je dôležité, že vstupná sekvencia býva výrazne dlhšia než výstupný text. Napríklad krátke slovo môže zodpovedať stovkám akustických rámcov. Preto tieto modely často obsahujú aj mechanizmy na skrátenie alebo zhustenie vstupnej sekvencie [1].</w:t>
+        <w:t>Encoder-decoder modely pracujú tak, že encoder najskôr spracuje vstupnú sekvenciu akustických príznakov a vytvorí jej vnútornú reprezentáciu. Decoder potom z tejto reprezentácie postupne generuje výstupnú textovú sekvenciu. Pri rozpoznávaní reči je dôležité, že vstupná sekvencia býva výrazne dlhšia než výstupný text. Práve preto sa pri týchto modeloch používajú mechanizmy na zhustenie vstupnej sekvencie a attention mechanizmus, ktorý umožňuje modelu sústrediť sa pri generovaní výstupu na relevantné časti vstupu [44], [45], [46].</w:t>
       </w:r>
     </w:p>
     <w:p>
@@ -2738,7 +2738,7 @@
         <w:rPr>
           <w:lang w:val="sk-SK"/>
         </w:rPr>
-        <w:t>Moderné STT systémy môžu používať rôzne typy neurónových architektúr. V minulosti sa často používali rekurentné neurónové siete, najmä LSTM, pretože boli vhodné na spracovanie sekvenčných dát. Neskôr sa začali používať aj konvolučné siete, ktoré dokázali pracovať so spektrogramom podobne ako s obrazom, kde jedna os predstavuje čas a druhá frekvenciu. V súčasnosti sú veľmi dôležité aj transformerové architektúry, ktoré umožňujú efektívne modelovať vzťahy medzi vzdialenými časťami vstupu [1], [2].</w:t>
+        <w:t>Moderné STT systémy môžu používať rôzne typy neurónových architektúr. Rekurentné neurónové siete, najmä LSTM, boli dôležité pri spracovaní sekvenčných dát, pretože dokázali pracovať s časovou závislosťou vo vstupe [47]. Neskôr sa používali aj konvolučné siete, ktoré mohli spracovávať spektrogram podobne ako obraz, kde jedna os predstavuje čas a druhá frekvenciu. V posledných rokoch sa v rozpoznávaní reči presadili aj transformerové architektúry, ktoré umožňujú efektívne modelovať vzťahy medzi vzdialenými časťami vstupu [48], [49].</w:t>
       </w:r>
     </w:p>
     <w:p>
@@ -2752,7 +2752,7 @@
         <w:rPr>
           <w:lang w:val="sk-SK"/>
         </w:rPr>
-        <w:t>Pri rozpoznávaní reči je dôležitá aj robustnosť modelov. Presnosť systému môže ovplyvniť kvalita nahrávky, šum v pozadí, vzdialenosť mikrofónu, prízvuk hovoriaceho, rýchlosť reči alebo samotný jazyk. Z tohto dôvodu sa moderné modely často trénujú na veľkých a rôznorodých dátových sadách, aby boli schopné lepšie pracovať aj s menej ideálnymi nahrávkami [4].</w:t>
+        <w:t>Pri rozpoznávaní reči je dôležitá aj robustnosť modelov. Presnosť systému môže ovplyvniť kvalita nahrávky, šum v pozadí, vzdialenosť mikrofónu, prízvuk hovoriaceho, rýchlosť reči alebo samotný jazyk. Moderné neurónové modely sa preto často trénujú na veľkých a rôznorodých dátových sadách, aby boli použiteľné aj pri menej ideálnych nahrávkach. Yu a Deng uvádzajú, že robustnosť voči variáciám hovoriaceho a prostredia patrí medzi dôležité vlastnosti vhodných príznakov a modelov v ASR systémoch [4].</w:t>
       </w:r>
     </w:p>
     <w:p>
@@ -2801,36 +2801,142 @@
         <w:rPr>
           <w:lang w:val="sk-SK"/>
         </w:rPr>
-        <w:t xml:space="preserve">[3] chapters 6.5 – 6.11, 6.13(lepšie do záveru - (6)?), </w:t>
-      </w:r>
-      <w:r>
+        <w:t>Modely a systémy pre rozpoznávanie reči je možné klasifikovať viacerými spôsobmi. Najčastejšie sa rozlišujú podľa použitej technológie, spôsobu trénovania, spôsobu nasadenia a typu úlohy, na ktorú sú určené. Toto členenie je dôležité najmä preto, že pojem STT model nemusí vždy označovať rovnaký typ riešenia. V praxi môže ísť o samostatný lokálny model, modelovú architektúru, cloudovú službu alebo knižnicu, ktorá iba sprostredkuje prístup k inému backendu.</w:t>
+      </w:r>
+    </w:p>
+    <w:p>
+      <w:pPr>
+        <w:pStyle w:val="TextprceText"/>
         <w:rPr>
           <w:b/>
           <w:lang w:val="sk-SK"/>
         </w:rPr>
-        <w:t>7, 8</w:t>
+      </w:pPr>
+      <w:r>
+        <w:rPr>
+          <w:lang w:val="sk-SK"/>
+        </w:rPr>
+        <w:t>Z historického hľadiska možno STT systémy rozdeliť na klasické štatistické systémy, hybridné neurónové systémy a moderné end-to-end modely. Klasické štatistické systémy boli založené najmä na kombinácii GMM-HMM. V tomto prístupe HMM modeloval časovú postupnosť reči a GMM modeloval vzťah medzi akustickými príznakmi a rečovými jednotkami. Tento typ systému bol dlhé obdobie základom praktického rozpoznávania reči [3], [28].</w:t>
       </w:r>
     </w:p>
     <w:p>
       <w:pPr>
         <w:pStyle w:val="TextprceText"/>
-        <w:ind w:hanging="0"/>
-        <w:rPr>
-          <w:lang w:val="sk-SK"/>
-        </w:rPr>
-      </w:pPr>
-      <w:r>
-        <w:rPr>
-          <w:lang w:val="sk-SK"/>
-        </w:rPr>
-        <w:t xml:space="preserve">[4] chapter </w:t>
-      </w:r>
-      <w:r>
         <w:rPr>
           <w:b/>
           <w:lang w:val="sk-SK"/>
         </w:rPr>
-        <w:t>1.3!, celá kniha – modely do podpodkapitol</w:t>
+      </w:pPr>
+      <w:r>
+        <w:rPr>
+          <w:lang w:val="sk-SK"/>
+        </w:rPr>
+        <w:t>Ďalšiu skupinu tvoria hybridné DNN-HMM systémy. Tie zachovávajú HMM časť na modelovanie sekvenčnej povahy reči, ale namiesto GMM používajú hlboké neurónové siete na odhad pravdepodobností stavov. Tento prístup predstavoval významný prechod medzi klasickými štatistickými systémami a modernými neurónovými modelmi. V mnohých úlohách priniesol výrazné zlepšenie presnosti oproti pôvodným GMM-HMM riešeniam [4], [39], [40].</w:t>
+      </w:r>
+    </w:p>
+    <w:p>
+      <w:pPr>
+        <w:pStyle w:val="TextprceText"/>
+        <w:rPr>
+          <w:b/>
+          <w:lang w:val="sk-SK"/>
+        </w:rPr>
+      </w:pPr>
+      <w:r>
+        <w:rPr>
+          <w:lang w:val="sk-SK"/>
+        </w:rPr>
+        <w:t>Moderné systémy často smerujú k end-to-end rozpoznávaniu reči. Ich cieľom je zjednodušiť celý proces a nahradiť viac samostatných častí jedným modelom, ktorý sa učí priamo prevádzať akustickú reprezentáciu na text. Do tejto skupiny patria najmä modely založené na CTC, RNN-Transducer architektúrach a encoder-decoder modeloch s attention mechanizmom [41], [44], [50]. Výhodou týchto prístupov je jednoduchšia architektúra a menšia potreba ručne navrhnutých komponentov, nevýhodou však môže byť vyššia náročnosť na množstvo trénovacích dát a výpočtové zdroje.</w:t>
+      </w:r>
+    </w:p>
+    <w:p>
+      <w:pPr>
+        <w:pStyle w:val="TextprceText"/>
+        <w:rPr>
+          <w:b/>
+          <w:lang w:val="sk-SK"/>
+        </w:rPr>
+      </w:pPr>
+      <w:r>
+        <w:rPr>
+          <w:lang w:val="sk-SK"/>
+        </w:rPr>
+        <w:t>Podľa typu neurónovej architektúry možno STT modely rozdeliť na modely založené na rekurentných sieťach, konvolučných sieťach a transformeroch. Rekurentné siete, najmä LSTM, boli vhodné pre sekvenčné dáta, pretože dokázali spracovávať časové závislosti vo vstupe [47]. Konvolučné siete sa používali najmä pri práci so spektrogramom, ktorý je možné vnímať ako dvojrozmernú reprezentáciu zvuku. Transformerové modely a modely založené na attention mechanizme sa neskôr presadili vďaka schopnosti efektívne pracovať so vzťahmi medzi vzdialenými časťami vstupnej sekvencie [48], [49].</w:t>
+      </w:r>
+    </w:p>
+    <w:p>
+      <w:pPr>
+        <w:pStyle w:val="TextprceText"/>
+        <w:rPr>
+          <w:b/>
+          <w:lang w:val="sk-SK"/>
+        </w:rPr>
+      </w:pPr>
+      <w:r>
+        <w:rPr>
+          <w:lang w:val="sk-SK"/>
+        </w:rPr>
+        <w:t>Samostatnú skupinu tvoria modely využívajúce self-supervised alebo weakly supervised learning. Tieto modely sa učia z veľkého množstva zvukových dát, pričom nie vždy potrebujú rovnaký rozsah ručne anotovaných prepisov ako klasické supervised modely. Príkladom sú modely rodiny Wav2Vec2, XLSR alebo rozsiahle viacjazyčné modely ako Whisper [51], [52], [53]. Výhodou týchto modelov je možnosť využiť veľké množstvo dostupných dát a následne model prispôsobiť konkrétnemu jazyku alebo úlohe.</w:t>
+      </w:r>
+    </w:p>
+    <w:p>
+      <w:pPr>
+        <w:pStyle w:val="TextprceText"/>
+        <w:rPr>
+          <w:b/>
+          <w:lang w:val="sk-SK"/>
+        </w:rPr>
+      </w:pPr>
+      <w:r>
+        <w:rPr>
+          <w:lang w:val="sk-SK"/>
+        </w:rPr>
+        <w:t>Z pohľadu jazykového pokrytia možno modely rozdeliť na jednojazyčné, viacjazyčné a jazykovo doladené modely. Jednojazyčné modely sú trénované alebo doladené pre konkrétny jazyk a môžu dosahovať dobré výsledky v danej jazykovej oblasti. Viacjazyčné modely podporujú väčší počet jazykov a sú vhodné v prípadoch, keď je potrebné pracovať s rôznymi jazykmi bez samostatného modelu pre každý z nich. Jazykovo doladené modely predstavujú kompromis, keď všeobecný model vychádza z väčšej viacjazyčnej architektúry, ale je ďalej prispôsobený konkrétnemu jazyku.</w:t>
+      </w:r>
+    </w:p>
+    <w:p>
+      <w:pPr>
+        <w:pStyle w:val="TextprceText"/>
+        <w:rPr>
+          <w:b/>
+          <w:lang w:val="sk-SK"/>
+        </w:rPr>
+      </w:pPr>
+      <w:r>
+        <w:rPr>
+          <w:lang w:val="sk-SK"/>
+        </w:rPr>
+        <w:t>Dôležité je aj delenie podľa spôsobu nasadenia. Lokálne modely bežia priamo na zariadení používateľa alebo na vlastnom serveri. Ich výhodou je väčšia kontrola nad dátami, možnosť offline použitia a nezávislosť od externého poskytovateľa. Nevýhodou sú vyššie nároky na hardvér, najmä pri väčších modeloch. Cloudové riešenia a API služby naopak presúvajú výpočty na infraštruktúru poskytovateľa. Používateľ nemusí riešiť samotné spúšťanie modelu, ale je závislý od internetového pripojenia, dostupnosti služby, limitov API a prípadných nákladov.</w:t>
+      </w:r>
+    </w:p>
+    <w:p>
+      <w:pPr>
+        <w:pStyle w:val="TextprceText"/>
+        <w:rPr>
+          <w:b/>
+          <w:lang w:val="sk-SK"/>
+        </w:rPr>
+      </w:pPr>
+      <w:r>
+        <w:rPr>
+          <w:lang w:val="sk-SK"/>
+        </w:rPr>
+        <w:t>Podľa spôsobu spracovania možno rozlišovať aj offline a streamované rozpoznávanie. Offline modely spracujú celú nahrávku naraz, čo je vhodné napríklad pri prepise uložených audio alebo video súborov. Streamované rozpoznávanie spracováva reč priebežne a používa sa napríklad pri diktovaní, hlasových asistentoch alebo titulkovaní v reálnom čase. Nie každý model je vhodný pre oba režimy, pretože streamované riešenia musia pracovať s nízkou latenciou a často nemajú k dispozícii celý kontext nahrávky.</w:t>
+      </w:r>
+    </w:p>
+    <w:p>
+      <w:pPr>
+        <w:pStyle w:val="TextprceText"/>
+        <w:rPr>
+          <w:b/>
+          <w:lang w:val="sk-SK"/>
+        </w:rPr>
+      </w:pPr>
+      <w:r>
+        <w:rPr>
+          <w:lang w:val="sk-SK"/>
+        </w:rPr>
+        <w:t>Pre praktické porovnanie je preto potrebné rozlišovať nielen samotnú architektúru modelu, ale aj spôsob jeho použitia. Model s vysokou presnosťou nemusí byť vhodný pre bežné nasadenie, ak má príliš vysoké hardvérové nároky alebo pomalú inferenciu. Naopak, menší alebo cloudový model môže byť prakticky použiteľnejší, aj keď nemusí dosahovať najnižšiu chybovosť. Z tohto dôvodu boli v praktickej časti práce porovnávané rôzne typy riešení: lokálne modely, optimalizované implementácie, jazykovo doladené modely dostupné cez Hugging Face a vybrané cloudové backendy.</w:t>
       </w:r>
     </w:p>
     <w:p>
@@ -3348,10 +3454,10 @@
           <w:lang w:val="sk-SK"/>
         </w:rPr>
       </w:pPr>
-      <w:bookmarkStart w:id="46" w:name="_Toc107634143_Copy_1"/>
-      <w:bookmarkStart w:id="47" w:name="_Toc107635178_Copy_1"/>
-      <w:bookmarkStart w:id="48" w:name="_Toc107635218_Copy_1"/>
-      <w:bookmarkStart w:id="49" w:name="_Toc107635235_Copy_1"/>
+      <w:bookmarkStart w:id="46" w:name="_Toc107635235_Copy_1"/>
+      <w:bookmarkStart w:id="47" w:name="_Toc107635218_Copy_1"/>
+      <w:bookmarkStart w:id="48" w:name="_Toc107635178_Copy_1"/>
+      <w:bookmarkStart w:id="49" w:name="_Toc107634143_Copy_1"/>
       <w:bookmarkEnd w:id="46"/>
       <w:bookmarkEnd w:id="47"/>
       <w:bookmarkEnd w:id="48"/>
@@ -5064,35 +5170,35 @@
           <w:lang w:val="sk-SK"/>
         </w:rPr>
       </w:pPr>
-      <w:bookmarkStart w:id="66" w:name="_Toc37577735"/>
-      <w:bookmarkStart w:id="67" w:name="_Toc107635188"/>
-      <w:bookmarkStart w:id="68" w:name="_Toc88120446"/>
-      <w:bookmarkStart w:id="69" w:name="_Toc88120683"/>
-      <w:bookmarkStart w:id="70" w:name="_Toc88120999"/>
-      <w:bookmarkStart w:id="71" w:name="_Toc88121042"/>
-      <w:bookmarkStart w:id="72" w:name="_Toc88121179"/>
-      <w:bookmarkStart w:id="73" w:name="_Toc88121553"/>
-      <w:bookmarkStart w:id="74" w:name="_Toc88121610"/>
-      <w:bookmarkStart w:id="75" w:name="_Toc88122014"/>
-      <w:bookmarkStart w:id="76" w:name="_Toc88124619"/>
-      <w:bookmarkStart w:id="77" w:name="_Toc88124656"/>
-      <w:bookmarkStart w:id="78" w:name="_Toc88126527"/>
-      <w:bookmarkStart w:id="79" w:name="_Toc88124806"/>
+      <w:bookmarkStart w:id="66" w:name="_Toc88121748"/>
+      <w:bookmarkStart w:id="67" w:name="_Toc107635245"/>
+      <w:bookmarkStart w:id="68" w:name="_Toc107635228"/>
+      <w:bookmarkStart w:id="69" w:name="_Toc107634153"/>
+      <w:bookmarkStart w:id="70" w:name="_Toc88128511"/>
+      <w:bookmarkStart w:id="71" w:name="_Toc191630795"/>
+      <w:bookmarkStart w:id="72" w:name="_Toc88127146"/>
+      <w:bookmarkStart w:id="73" w:name="_Toc88127103"/>
+      <w:bookmarkStart w:id="74" w:name="_Toc88126862"/>
+      <w:bookmarkStart w:id="75" w:name="_Toc88126772"/>
+      <w:bookmarkStart w:id="76" w:name="_Toc88126556"/>
+      <w:bookmarkStart w:id="77" w:name="_Toc88126460"/>
+      <w:bookmarkStart w:id="78" w:name="_Toc88126309"/>
+      <w:bookmarkStart w:id="79" w:name="_Toc88120895"/>
       <w:bookmarkStart w:id="80" w:name="_Toc88125789"/>
-      <w:bookmarkStart w:id="81" w:name="_Toc88120895"/>
-      <w:bookmarkStart w:id="82" w:name="_Toc88126309"/>
-      <w:bookmarkStart w:id="83" w:name="_Toc88126460"/>
-      <w:bookmarkStart w:id="84" w:name="_Toc88126556"/>
-      <w:bookmarkStart w:id="85" w:name="_Toc88126772"/>
-      <w:bookmarkStart w:id="86" w:name="_Toc88126862"/>
-      <w:bookmarkStart w:id="87" w:name="_Toc88127103"/>
-      <w:bookmarkStart w:id="88" w:name="_Toc88127146"/>
-      <w:bookmarkStart w:id="89" w:name="_Toc191630795"/>
-      <w:bookmarkStart w:id="90" w:name="_Toc88128511"/>
-      <w:bookmarkStart w:id="91" w:name="_Toc107634153"/>
-      <w:bookmarkStart w:id="92" w:name="_Toc107635228"/>
-      <w:bookmarkStart w:id="93" w:name="_Toc107635245"/>
-      <w:bookmarkStart w:id="94" w:name="_Toc88121748"/>
+      <w:bookmarkStart w:id="81" w:name="_Toc88124806"/>
+      <w:bookmarkStart w:id="82" w:name="_Toc88126527"/>
+      <w:bookmarkStart w:id="83" w:name="_Toc88124656"/>
+      <w:bookmarkStart w:id="84" w:name="_Toc88124619"/>
+      <w:bookmarkStart w:id="85" w:name="_Toc88122014"/>
+      <w:bookmarkStart w:id="86" w:name="_Toc88121610"/>
+      <w:bookmarkStart w:id="87" w:name="_Toc88121553"/>
+      <w:bookmarkStart w:id="88" w:name="_Toc88121179"/>
+      <w:bookmarkStart w:id="89" w:name="_Toc88121042"/>
+      <w:bookmarkStart w:id="90" w:name="_Toc88120999"/>
+      <w:bookmarkStart w:id="91" w:name="_Toc88120683"/>
+      <w:bookmarkStart w:id="92" w:name="_Toc88120446"/>
+      <w:bookmarkStart w:id="93" w:name="_Toc107635188"/>
+      <w:bookmarkStart w:id="94" w:name="_Toc37577735"/>
       <w:r>
         <w:rPr>
           <w:lang w:val="sk-SK"/>
@@ -5132,75 +5238,44 @@
     <w:p>
       <w:pPr>
         <w:pStyle w:val="paragraph"/>
+        <w:widowControl/>
+        <w:suppressAutoHyphens w:val="true"/>
+        <w:bidi w:val="0"/>
         <w:spacing w:beforeAutospacing="0" w:before="0" w:afterAutospacing="0" w:after="0"/>
         <w:ind w:firstLine="75" w:start="270"/>
         <w:jc w:val="both"/>
         <w:textAlignment w:val="baseline"/>
-        <w:rPr>
-          <w:rStyle w:val="eop"/>
-          <w:lang w:val="sk-SK"/>
-        </w:rPr>
+        <w:rPr/>
       </w:pPr>
       <w:r>
         <w:rPr>
           <w:rStyle w:val="normaltextrun"/>
-          <w:color w:val="000000"/>
-          <w:lang w:val="sk-SK"/>
-        </w:rPr>
-        <w:t xml:space="preserve">[1] JURAFSKY Daniel, MARTIN James. </w:t>
-      </w:r>
-      <w:r>
-        <w:rPr>
-          <w:rStyle w:val="normaltextrun"/>
-          <w:i/>
-          <w:iCs/>
-          <w:color w:val="000000"/>
-          <w:lang w:val="sk-SK"/>
-        </w:rPr>
-        <w:t>Speech and Language Processing</w:t>
-      </w:r>
-      <w:r>
-        <w:rPr>
-          <w:rStyle w:val="normaltextrun"/>
-          <w:color w:val="000000"/>
-          <w:lang w:val="sk-SK"/>
-        </w:rPr>
-        <w:t>. Pearson, Harlow. 2014. ISBN 9781292025438.</w:t>
-      </w:r>
-      <w:r>
-        <w:rPr>
-          <w:rStyle w:val="normaltextrun"/>
-          <w:lang w:val="sk-SK"/>
-        </w:rPr>
-        <w:t> </w:t>
-      </w:r>
-      <w:r>
-        <w:rPr>
-          <w:rStyle w:val="eop"/>
-          <w:lang w:val="sk-SK"/>
-        </w:rPr>
-        <w:t> </w:t>
+          <w:rFonts w:eastAsia="Times New Roman" w:cs="Times New Roman"/>
+          <w:color w:val="auto"/>
+          <w:kern w:val="0"/>
+          <w:sz w:val="24"/>
+          <w:szCs w:val="24"/>
+          <w:lang w:val="sk-SK" w:bidi="ar-SA"/>
+        </w:rPr>
+        <w:t>[1] JURAFSKY Daniel, MARTIN James. Speech and Language Processing. Pearson, Harlow. 2014. ISBN 9781292025438.  </w:t>
       </w:r>
     </w:p>
     <w:p>
       <w:pPr>
         <w:pStyle w:val="paragraph"/>
+        <w:widowControl/>
+        <w:suppressAutoHyphens w:val="true"/>
+        <w:bidi w:val="0"/>
         <w:spacing w:beforeAutospacing="0" w:before="0" w:afterAutospacing="0" w:after="0"/>
         <w:ind w:firstLine="75" w:start="270"/>
         <w:jc w:val="both"/>
         <w:textAlignment w:val="baseline"/>
         <w:rPr>
-          <w:rFonts w:ascii="Segoe UI" w:hAnsi="Segoe UI" w:cs="Segoe UI"/>
-          <w:sz w:val="18"/>
-          <w:szCs w:val="18"/>
-          <w:lang w:val="sk-SK"/>
-        </w:rPr>
-      </w:pPr>
-      <w:r>
-        <w:rPr>
-          <w:rFonts w:cs="Segoe UI" w:ascii="Segoe UI" w:hAnsi="Segoe UI"/>
-          <w:sz w:val="18"/>
-          <w:szCs w:val="18"/>
+          <w:lang w:val="sk-SK"/>
+        </w:rPr>
+      </w:pPr>
+      <w:r>
+        <w:rPr>
           <w:lang w:val="sk-SK"/>
         </w:rPr>
       </w:r>
@@ -5208,70 +5283,44 @@
     <w:p>
       <w:pPr>
         <w:pStyle w:val="paragraph"/>
+        <w:widowControl/>
+        <w:suppressAutoHyphens w:val="true"/>
+        <w:bidi w:val="0"/>
         <w:spacing w:beforeAutospacing="0" w:before="0" w:afterAutospacing="0" w:after="0"/>
         <w:ind w:firstLine="75" w:start="270"/>
         <w:jc w:val="both"/>
         <w:textAlignment w:val="baseline"/>
-        <w:rPr>
-          <w:rStyle w:val="eop"/>
-          <w:color w:val="000000"/>
-          <w:lang w:val="sk-SK"/>
-        </w:rPr>
+        <w:rPr/>
       </w:pPr>
       <w:r>
         <w:rPr>
           <w:rStyle w:val="normaltextrun"/>
-          <w:color w:val="000000"/>
-          <w:lang w:val="sk-SK"/>
-        </w:rPr>
-        <w:t xml:space="preserve">[2] GOODFELLOW, Ian. </w:t>
-      </w:r>
-      <w:r>
-        <w:rPr>
-          <w:rStyle w:val="normaltextrun"/>
-          <w:i/>
-          <w:iCs/>
-          <w:color w:val="000000"/>
-          <w:lang w:val="sk-SK"/>
-        </w:rPr>
-        <w:t>Deep Learning</w:t>
-      </w:r>
-      <w:r>
-        <w:rPr>
-          <w:rStyle w:val="normaltextrun"/>
-          <w:color w:val="000000"/>
-          <w:lang w:val="sk-SK"/>
-        </w:rPr>
-        <w:t>, The MIT Press. Cambridge, MA. 2017. ISBN 9798841205937.</w:t>
-      </w:r>
-      <w:r>
-        <w:rPr>
-          <w:rStyle w:val="eop"/>
-          <w:color w:val="000000"/>
-          <w:lang w:val="sk-SK"/>
-        </w:rPr>
-        <w:t> </w:t>
+          <w:rFonts w:eastAsia="Times New Roman" w:cs="Times New Roman"/>
+          <w:color w:val="auto"/>
+          <w:kern w:val="0"/>
+          <w:sz w:val="24"/>
+          <w:szCs w:val="24"/>
+          <w:lang w:val="sk-SK" w:bidi="ar-SA"/>
+        </w:rPr>
+        <w:t>[2] GOODFELLOW, Ian. Deep Learning, The MIT Press. Cambridge, MA. 2017. ISBN 9798841205937. </w:t>
       </w:r>
     </w:p>
     <w:p>
       <w:pPr>
         <w:pStyle w:val="paragraph"/>
+        <w:widowControl/>
+        <w:suppressAutoHyphens w:val="true"/>
+        <w:bidi w:val="0"/>
         <w:spacing w:beforeAutospacing="0" w:before="0" w:afterAutospacing="0" w:after="0"/>
         <w:ind w:firstLine="75" w:start="270"/>
         <w:jc w:val="both"/>
         <w:textAlignment w:val="baseline"/>
         <w:rPr>
-          <w:rFonts w:ascii="Segoe UI" w:hAnsi="Segoe UI" w:cs="Segoe UI"/>
-          <w:sz w:val="18"/>
-          <w:szCs w:val="18"/>
-          <w:lang w:val="sk-SK"/>
-        </w:rPr>
-      </w:pPr>
-      <w:r>
-        <w:rPr>
-          <w:rFonts w:cs="Segoe UI" w:ascii="Segoe UI" w:hAnsi="Segoe UI"/>
-          <w:sz w:val="18"/>
-          <w:szCs w:val="18"/>
+          <w:lang w:val="sk-SK"/>
+        </w:rPr>
+      </w:pPr>
+      <w:r>
+        <w:rPr>
           <w:lang w:val="sk-SK"/>
         </w:rPr>
       </w:r>
@@ -5279,70 +5328,44 @@
     <w:p>
       <w:pPr>
         <w:pStyle w:val="paragraph"/>
+        <w:widowControl/>
+        <w:suppressAutoHyphens w:val="true"/>
+        <w:bidi w:val="0"/>
         <w:spacing w:beforeAutospacing="0" w:before="0" w:afterAutospacing="0" w:after="0"/>
         <w:ind w:firstLine="75" w:start="270"/>
         <w:jc w:val="both"/>
         <w:textAlignment w:val="baseline"/>
-        <w:rPr>
-          <w:rStyle w:val="eop"/>
-          <w:color w:val="000000"/>
-          <w:lang w:val="sk-SK"/>
-        </w:rPr>
+        <w:rPr/>
       </w:pPr>
       <w:r>
         <w:rPr>
           <w:rStyle w:val="normaltextrun"/>
-          <w:color w:val="000000"/>
-          <w:lang w:val="sk-SK"/>
-        </w:rPr>
-        <w:t xml:space="preserve">[3] RABINER Lawrence, JUANG Biing-Hwang. </w:t>
-      </w:r>
-      <w:r>
-        <w:rPr>
-          <w:rStyle w:val="normaltextrun"/>
-          <w:i/>
-          <w:iCs/>
-          <w:color w:val="000000"/>
-          <w:lang w:val="sk-SK"/>
-        </w:rPr>
-        <w:t>Fundamentals of speech recognition</w:t>
-      </w:r>
-      <w:r>
-        <w:rPr>
-          <w:rStyle w:val="normaltextrun"/>
-          <w:color w:val="000000"/>
-          <w:lang w:val="sk-SK"/>
-        </w:rPr>
-        <w:t>. Pearson Education, Delhi, 2005. ISBN 9788129701381.</w:t>
-      </w:r>
-      <w:r>
-        <w:rPr>
-          <w:rStyle w:val="eop"/>
-          <w:color w:val="000000"/>
-          <w:lang w:val="sk-SK"/>
-        </w:rPr>
-        <w:t> </w:t>
+          <w:rFonts w:eastAsia="Times New Roman" w:cs="Times New Roman"/>
+          <w:color w:val="auto"/>
+          <w:kern w:val="0"/>
+          <w:sz w:val="24"/>
+          <w:szCs w:val="24"/>
+          <w:lang w:val="sk-SK" w:bidi="ar-SA"/>
+        </w:rPr>
+        <w:t>[3] RABINER Lawrence, JUANG Biing-Hwang. Fundamentals of speech recognition. Pearson Education, Delhi, 2005. ISBN 9788129701381. </w:t>
       </w:r>
     </w:p>
     <w:p>
       <w:pPr>
         <w:pStyle w:val="paragraph"/>
+        <w:widowControl/>
+        <w:suppressAutoHyphens w:val="true"/>
+        <w:bidi w:val="0"/>
         <w:spacing w:beforeAutospacing="0" w:before="0" w:afterAutospacing="0" w:after="0"/>
         <w:ind w:firstLine="75" w:start="270"/>
         <w:jc w:val="both"/>
         <w:textAlignment w:val="baseline"/>
         <w:rPr>
-          <w:rFonts w:ascii="Segoe UI" w:hAnsi="Segoe UI" w:cs="Segoe UI"/>
-          <w:sz w:val="18"/>
-          <w:szCs w:val="18"/>
-          <w:lang w:val="sk-SK"/>
-        </w:rPr>
-      </w:pPr>
-      <w:r>
-        <w:rPr>
-          <w:rFonts w:cs="Segoe UI" w:ascii="Segoe UI" w:hAnsi="Segoe UI"/>
-          <w:sz w:val="18"/>
-          <w:szCs w:val="18"/>
+          <w:lang w:val="sk-SK"/>
+        </w:rPr>
+      </w:pPr>
+      <w:r>
+        <w:rPr>
           <w:lang w:val="sk-SK"/>
         </w:rPr>
       </w:r>
@@ -5350,70 +5373,44 @@
     <w:p>
       <w:pPr>
         <w:pStyle w:val="paragraph"/>
+        <w:widowControl/>
+        <w:suppressAutoHyphens w:val="true"/>
+        <w:bidi w:val="0"/>
         <w:spacing w:beforeAutospacing="0" w:before="0" w:afterAutospacing="0" w:after="0"/>
         <w:ind w:firstLine="75" w:start="270"/>
         <w:jc w:val="both"/>
         <w:textAlignment w:val="baseline"/>
-        <w:rPr>
-          <w:rStyle w:val="eop"/>
-          <w:color w:val="000000"/>
-          <w:lang w:val="sk-SK"/>
-        </w:rPr>
+        <w:rPr/>
       </w:pPr>
       <w:r>
         <w:rPr>
           <w:rStyle w:val="normaltextrun"/>
-          <w:color w:val="000000"/>
-          <w:lang w:val="sk-SK"/>
-        </w:rPr>
-        <w:t xml:space="preserve">[4] YU Dong, DENG Li. </w:t>
-      </w:r>
-      <w:r>
-        <w:rPr>
-          <w:rStyle w:val="normaltextrun"/>
-          <w:i/>
-          <w:iCs/>
-          <w:color w:val="000000"/>
-          <w:lang w:val="sk-SK"/>
-        </w:rPr>
-        <w:t>Automatic speech recognition : a deep learning approach</w:t>
-      </w:r>
-      <w:r>
-        <w:rPr>
-          <w:rStyle w:val="normaltextrun"/>
-          <w:color w:val="000000"/>
-          <w:lang w:val="sk-SK"/>
-        </w:rPr>
-        <w:t>. Springer, London. 2015. ISBN 9781447157786.</w:t>
-      </w:r>
-      <w:r>
-        <w:rPr>
-          <w:rStyle w:val="eop"/>
-          <w:color w:val="000000"/>
-          <w:lang w:val="sk-SK"/>
-        </w:rPr>
-        <w:t> </w:t>
+          <w:rFonts w:eastAsia="Times New Roman" w:cs="Times New Roman"/>
+          <w:color w:val="auto"/>
+          <w:kern w:val="0"/>
+          <w:sz w:val="24"/>
+          <w:szCs w:val="24"/>
+          <w:lang w:val="sk-SK" w:bidi="ar-SA"/>
+        </w:rPr>
+        <w:t>[4] YU Dong, DENG Li. Automatic speech recognition : a deep learning approach. Springer, London. 2015. ISBN 9781447157786. </w:t>
       </w:r>
     </w:p>
     <w:p>
       <w:pPr>
         <w:pStyle w:val="paragraph"/>
+        <w:widowControl/>
+        <w:suppressAutoHyphens w:val="true"/>
+        <w:bidi w:val="0"/>
         <w:spacing w:beforeAutospacing="0" w:before="0" w:afterAutospacing="0" w:after="0"/>
         <w:ind w:firstLine="75" w:start="270"/>
         <w:jc w:val="both"/>
         <w:textAlignment w:val="baseline"/>
         <w:rPr>
-          <w:rFonts w:ascii="Segoe UI" w:hAnsi="Segoe UI" w:cs="Segoe UI"/>
-          <w:sz w:val="18"/>
-          <w:szCs w:val="18"/>
-          <w:lang w:val="sk-SK"/>
-        </w:rPr>
-      </w:pPr>
-      <w:r>
-        <w:rPr>
-          <w:rFonts w:cs="Segoe UI" w:ascii="Segoe UI" w:hAnsi="Segoe UI"/>
-          <w:sz w:val="18"/>
-          <w:szCs w:val="18"/>
+          <w:lang w:val="sk-SK"/>
+        </w:rPr>
+      </w:pPr>
+      <w:r>
+        <w:rPr>
           <w:lang w:val="sk-SK"/>
         </w:rPr>
       </w:r>
@@ -5421,70 +5418,44 @@
     <w:p>
       <w:pPr>
         <w:pStyle w:val="paragraph"/>
+        <w:widowControl/>
+        <w:suppressAutoHyphens w:val="true"/>
+        <w:bidi w:val="0"/>
         <w:spacing w:beforeAutospacing="0" w:before="0" w:afterAutospacing="0" w:after="0"/>
         <w:ind w:firstLine="75" w:start="270"/>
         <w:jc w:val="both"/>
         <w:textAlignment w:val="baseline"/>
-        <w:rPr>
-          <w:rStyle w:val="eop"/>
-          <w:color w:val="000000"/>
-          <w:lang w:val="sk-SK"/>
-        </w:rPr>
+        <w:rPr/>
       </w:pPr>
       <w:r>
         <w:rPr>
           <w:rStyle w:val="normaltextrun"/>
-          <w:color w:val="000000"/>
-          <w:lang w:val="sk-SK"/>
-        </w:rPr>
-        <w:t xml:space="preserve">[5] KAMATH Uday, LIU John, WHITAKER James. </w:t>
-      </w:r>
-      <w:r>
-        <w:rPr>
-          <w:rStyle w:val="normaltextrun"/>
-          <w:i/>
-          <w:iCs/>
-          <w:color w:val="000000"/>
-          <w:lang w:val="sk-SK"/>
-        </w:rPr>
-        <w:t>Deep learning for NLP and speech recognition.</w:t>
-      </w:r>
-      <w:r>
-        <w:rPr>
-          <w:rStyle w:val="normaltextrun"/>
-          <w:color w:val="000000"/>
-          <w:lang w:val="sk-SK"/>
-        </w:rPr>
-        <w:t xml:space="preserve"> Springer, Cham, Switzerland. 2019. ISBN 9783030145965.</w:t>
-      </w:r>
-      <w:r>
-        <w:rPr>
-          <w:rStyle w:val="eop"/>
-          <w:color w:val="000000"/>
-          <w:lang w:val="sk-SK"/>
-        </w:rPr>
-        <w:t> </w:t>
+          <w:rFonts w:eastAsia="Times New Roman" w:cs="Times New Roman"/>
+          <w:color w:val="auto"/>
+          <w:kern w:val="0"/>
+          <w:sz w:val="24"/>
+          <w:szCs w:val="24"/>
+          <w:lang w:val="sk-SK" w:bidi="ar-SA"/>
+        </w:rPr>
+        <w:t>[5] KAMATH Uday, LIU John, WHITAKER James. Deep learning for NLP and speech recognition. Springer, Cham, Switzerland. 2019. ISBN 9783030145965. </w:t>
       </w:r>
     </w:p>
     <w:p>
       <w:pPr>
         <w:pStyle w:val="paragraph"/>
+        <w:widowControl/>
+        <w:suppressAutoHyphens w:val="true"/>
+        <w:bidi w:val="0"/>
         <w:spacing w:beforeAutospacing="0" w:before="0" w:afterAutospacing="0" w:after="0"/>
         <w:ind w:firstLine="75" w:start="270"/>
         <w:jc w:val="both"/>
         <w:textAlignment w:val="baseline"/>
         <w:rPr>
-          <w:rFonts w:ascii="Segoe UI" w:hAnsi="Segoe UI" w:cs="Segoe UI"/>
-          <w:sz w:val="18"/>
-          <w:szCs w:val="18"/>
-          <w:lang w:val="sk-SK"/>
-        </w:rPr>
-      </w:pPr>
-      <w:r>
-        <w:rPr>
-          <w:rFonts w:cs="Segoe UI" w:ascii="Segoe UI" w:hAnsi="Segoe UI"/>
-          <w:sz w:val="18"/>
-          <w:szCs w:val="18"/>
+          <w:lang w:val="sk-SK"/>
+        </w:rPr>
+      </w:pPr>
+      <w:r>
+        <w:rPr>
           <w:lang w:val="sk-SK"/>
         </w:rPr>
       </w:r>
@@ -5492,61 +5463,44 @@
     <w:p>
       <w:pPr>
         <w:pStyle w:val="paragraph"/>
+        <w:widowControl/>
+        <w:suppressAutoHyphens w:val="true"/>
+        <w:bidi w:val="0"/>
         <w:spacing w:beforeAutospacing="0" w:before="0" w:afterAutospacing="0" w:after="0"/>
         <w:ind w:firstLine="75" w:start="270"/>
         <w:jc w:val="both"/>
         <w:textAlignment w:val="baseline"/>
-        <w:rPr>
-          <w:rStyle w:val="eop"/>
-          <w:color w:val="000000"/>
-          <w:lang w:val="sk-SK"/>
-        </w:rPr>
-      </w:pPr>
-      <w:r>
-        <w:rPr>
-          <w:rStyle w:val="eop"/>
-          <w:color w:val="000000"/>
-          <w:lang w:val="sk-SK"/>
-        </w:rPr>
-        <w:t>[6] K. H. Davis, R. Biddulph, and S. Balashek, “</w:t>
-      </w:r>
-      <w:r>
-        <w:rPr>
-          <w:rStyle w:val="eop"/>
-          <w:i/>
-          <w:color w:val="000000"/>
-          <w:lang w:val="sk-SK"/>
-        </w:rPr>
-        <w:t>Automatic Recognition of Spoken Digits</w:t>
-      </w:r>
-      <w:r>
-        <w:rPr>
-          <w:rStyle w:val="eop"/>
-          <w:color w:val="000000"/>
-          <w:lang w:val="sk-SK"/>
-        </w:rPr>
-        <w:t>,” J. Acoust. Soc. Am., 24 (6): 637–642, 1952</w:t>
+        <w:rPr/>
+      </w:pPr>
+      <w:r>
+        <w:rPr>
+          <w:rStyle w:val="normaltextrun"/>
+          <w:rFonts w:eastAsia="Times New Roman" w:cs="Times New Roman"/>
+          <w:color w:val="auto"/>
+          <w:kern w:val="0"/>
+          <w:sz w:val="24"/>
+          <w:szCs w:val="24"/>
+          <w:lang w:val="sk-SK" w:bidi="ar-SA"/>
+        </w:rPr>
+        <w:t>[6] K. H. Davis, R. Biddulph, and S. Balashek, “Automatic Recognition of Spoken Digits,” J. Acoust. Soc. Am., 24 (6): 637–642, 1952</w:t>
       </w:r>
     </w:p>
     <w:p>
       <w:pPr>
         <w:pStyle w:val="paragraph"/>
+        <w:widowControl/>
+        <w:suppressAutoHyphens w:val="true"/>
+        <w:bidi w:val="0"/>
         <w:spacing w:beforeAutospacing="0" w:before="0" w:afterAutospacing="0" w:after="0"/>
         <w:ind w:firstLine="75" w:start="270"/>
         <w:jc w:val="both"/>
         <w:textAlignment w:val="baseline"/>
         <w:rPr>
-          <w:rFonts w:ascii="Segoe UI" w:hAnsi="Segoe UI" w:cs="Segoe UI"/>
-          <w:sz w:val="18"/>
-          <w:szCs w:val="18"/>
-          <w:lang w:val="sk-SK"/>
-        </w:rPr>
-      </w:pPr>
-      <w:r>
-        <w:rPr>
-          <w:rFonts w:cs="Segoe UI" w:ascii="Segoe UI" w:hAnsi="Segoe UI"/>
-          <w:sz w:val="18"/>
-          <w:szCs w:val="18"/>
+          <w:lang w:val="sk-SK"/>
+        </w:rPr>
+      </w:pPr>
+      <w:r>
+        <w:rPr>
           <w:lang w:val="sk-SK"/>
         </w:rPr>
       </w:r>
@@ -5554,21 +5508,24 @@
     <w:p>
       <w:pPr>
         <w:pStyle w:val="paragraph"/>
+        <w:widowControl/>
+        <w:suppressAutoHyphens w:val="true"/>
+        <w:bidi w:val="0"/>
         <w:spacing w:beforeAutospacing="0" w:before="0" w:afterAutospacing="0" w:after="0"/>
         <w:ind w:firstLine="75" w:start="270"/>
         <w:jc w:val="both"/>
         <w:textAlignment w:val="baseline"/>
-        <w:rPr>
-          <w:rStyle w:val="eop"/>
-          <w:color w:val="000000"/>
-          <w:lang w:val="sk-SK"/>
-        </w:rPr>
-      </w:pPr>
-      <w:r>
-        <w:rPr>
-          <w:rStyle w:val="eop"/>
-          <w:color w:val="000000"/>
-          <w:lang w:val="sk-SK"/>
+        <w:rPr/>
+      </w:pPr>
+      <w:r>
+        <w:rPr>
+          <w:rStyle w:val="normaltextrun"/>
+          <w:rFonts w:eastAsia="Times New Roman" w:cs="Times New Roman"/>
+          <w:color w:val="auto"/>
+          <w:kern w:val="0"/>
+          <w:sz w:val="24"/>
+          <w:szCs w:val="24"/>
+          <w:lang w:val="sk-SK" w:bidi="ar-SA"/>
         </w:rPr>
         <w:t xml:space="preserve">[7] H. F. Olson and H. Belar, “Phonetic Typewriter,” J. Acoust. Soc. Am., 28 (6): 1072–1081, 1956 </w:t>
       </w:r>
@@ -5576,22 +5533,19 @@
     <w:p>
       <w:pPr>
         <w:pStyle w:val="paragraph"/>
+        <w:widowControl/>
+        <w:suppressAutoHyphens w:val="true"/>
+        <w:bidi w:val="0"/>
         <w:spacing w:beforeAutospacing="0" w:before="0" w:afterAutospacing="0" w:after="0"/>
         <w:ind w:firstLine="75" w:start="270"/>
         <w:jc w:val="both"/>
         <w:textAlignment w:val="baseline"/>
         <w:rPr>
-          <w:rFonts w:ascii="Segoe UI" w:hAnsi="Segoe UI" w:cs="Segoe UI"/>
-          <w:sz w:val="18"/>
-          <w:szCs w:val="18"/>
-          <w:lang w:val="sk-SK"/>
-        </w:rPr>
-      </w:pPr>
-      <w:r>
-        <w:rPr>
-          <w:rFonts w:cs="Segoe UI" w:ascii="Segoe UI" w:hAnsi="Segoe UI"/>
-          <w:sz w:val="18"/>
-          <w:szCs w:val="18"/>
+          <w:lang w:val="sk-SK"/>
+        </w:rPr>
+      </w:pPr>
+      <w:r>
+        <w:rPr>
           <w:lang w:val="sk-SK"/>
         </w:rPr>
       </w:r>
@@ -5599,19 +5553,24 @@
     <w:p>
       <w:pPr>
         <w:pStyle w:val="paragraph"/>
+        <w:widowControl/>
+        <w:suppressAutoHyphens w:val="true"/>
+        <w:bidi w:val="0"/>
         <w:spacing w:beforeAutospacing="0" w:before="0" w:afterAutospacing="0" w:after="0"/>
         <w:ind w:firstLine="75" w:start="270"/>
         <w:jc w:val="both"/>
         <w:textAlignment w:val="baseline"/>
+        <w:rPr/>
+      </w:pPr>
+      <w:r>
         <w:rPr>
           <w:rStyle w:val="normaltextrun"/>
-          <w:lang w:val="sk-SK"/>
-        </w:rPr>
-      </w:pPr>
-      <w:r>
-        <w:rPr>
-          <w:rStyle w:val="normaltextrun"/>
-          <w:lang w:val="sk-SK"/>
+          <w:rFonts w:eastAsia="Times New Roman" w:cs="Times New Roman"/>
+          <w:color w:val="auto"/>
+          <w:kern w:val="0"/>
+          <w:sz w:val="24"/>
+          <w:szCs w:val="24"/>
+          <w:lang w:val="sk-SK" w:bidi="ar-SA"/>
         </w:rPr>
         <w:t>[8] D. B. Fry, “Theoretical Aspects of Mechanical Speech Recognition”; and P. Denes, “The Design and Operation of the Mechanical Speech Recognizer at University College London,” J. British Inst. Radio Engr., 19, 4: 211–229, 1959.</w:t>
       </w:r>
@@ -5619,22 +5578,19 @@
     <w:p>
       <w:pPr>
         <w:pStyle w:val="paragraph"/>
+        <w:widowControl/>
+        <w:suppressAutoHyphens w:val="true"/>
+        <w:bidi w:val="0"/>
         <w:spacing w:beforeAutospacing="0" w:before="0" w:afterAutospacing="0" w:after="0"/>
         <w:ind w:firstLine="75" w:start="270"/>
         <w:jc w:val="both"/>
         <w:textAlignment w:val="baseline"/>
         <w:rPr>
-          <w:rFonts w:ascii="Segoe UI" w:hAnsi="Segoe UI" w:cs="Segoe UI"/>
-          <w:sz w:val="18"/>
-          <w:szCs w:val="18"/>
-          <w:lang w:val="sk-SK"/>
-        </w:rPr>
-      </w:pPr>
-      <w:r>
-        <w:rPr>
-          <w:rFonts w:cs="Segoe UI" w:ascii="Segoe UI" w:hAnsi="Segoe UI"/>
-          <w:sz w:val="18"/>
-          <w:szCs w:val="18"/>
+          <w:lang w:val="sk-SK"/>
+        </w:rPr>
+      </w:pPr>
+      <w:r>
+        <w:rPr>
           <w:lang w:val="sk-SK"/>
         </w:rPr>
       </w:r>
@@ -5642,19 +5598,24 @@
     <w:p>
       <w:pPr>
         <w:pStyle w:val="paragraph"/>
+        <w:widowControl/>
+        <w:suppressAutoHyphens w:val="true"/>
+        <w:bidi w:val="0"/>
         <w:spacing w:beforeAutospacing="0" w:before="0" w:afterAutospacing="0" w:after="0"/>
         <w:ind w:firstLine="75" w:start="270"/>
         <w:jc w:val="both"/>
         <w:textAlignment w:val="baseline"/>
+        <w:rPr/>
+      </w:pPr>
+      <w:r>
         <w:rPr>
           <w:rStyle w:val="normaltextrun"/>
-          <w:lang w:val="sk-SK"/>
-        </w:rPr>
-      </w:pPr>
-      <w:r>
-        <w:rPr>
-          <w:rStyle w:val="normaltextrun"/>
-          <w:lang w:val="sk-SK"/>
+          <w:rFonts w:eastAsia="Times New Roman" w:cs="Times New Roman"/>
+          <w:color w:val="auto"/>
+          <w:kern w:val="0"/>
+          <w:sz w:val="24"/>
+          <w:szCs w:val="24"/>
+          <w:lang w:val="sk-SK" w:bidi="ar-SA"/>
         </w:rPr>
         <w:t>[9] W. R. Forgie and C. D. Forgie, “Results Obtained From a Vowel Recognition Computer Program,” J. Acoust. Soc. Am., 31 (11): 1480–1489, 1959.</w:t>
       </w:r>
@@ -5662,22 +5623,19 @@
     <w:p>
       <w:pPr>
         <w:pStyle w:val="paragraph"/>
+        <w:widowControl/>
+        <w:suppressAutoHyphens w:val="true"/>
+        <w:bidi w:val="0"/>
         <w:spacing w:beforeAutospacing="0" w:before="0" w:afterAutospacing="0" w:after="0"/>
         <w:ind w:firstLine="75" w:start="270"/>
         <w:jc w:val="both"/>
         <w:textAlignment w:val="baseline"/>
         <w:rPr>
-          <w:rFonts w:ascii="Segoe UI" w:hAnsi="Segoe UI" w:cs="Segoe UI"/>
-          <w:sz w:val="18"/>
-          <w:szCs w:val="18"/>
-          <w:lang w:val="sk-SK"/>
-        </w:rPr>
-      </w:pPr>
-      <w:r>
-        <w:rPr>
-          <w:rFonts w:cs="Segoe UI" w:ascii="Segoe UI" w:hAnsi="Segoe UI"/>
-          <w:sz w:val="18"/>
-          <w:szCs w:val="18"/>
+          <w:lang w:val="sk-SK"/>
+        </w:rPr>
+      </w:pPr>
+      <w:r>
+        <w:rPr>
           <w:lang w:val="sk-SK"/>
         </w:rPr>
       </w:r>
@@ -5685,19 +5643,24 @@
     <w:p>
       <w:pPr>
         <w:pStyle w:val="paragraph"/>
+        <w:widowControl/>
+        <w:suppressAutoHyphens w:val="true"/>
+        <w:bidi w:val="0"/>
         <w:spacing w:beforeAutospacing="0" w:before="0" w:afterAutospacing="0" w:after="0"/>
         <w:ind w:firstLine="75" w:start="270"/>
         <w:jc w:val="both"/>
         <w:textAlignment w:val="baseline"/>
+        <w:rPr/>
+      </w:pPr>
+      <w:r>
         <w:rPr>
           <w:rStyle w:val="normaltextrun"/>
-          <w:lang w:val="sk-SK"/>
-        </w:rPr>
-      </w:pPr>
-      <w:r>
-        <w:rPr>
-          <w:rStyle w:val="normaltextrun"/>
-          <w:lang w:val="sk-SK"/>
+          <w:rFonts w:eastAsia="Times New Roman" w:cs="Times New Roman"/>
+          <w:color w:val="auto"/>
+          <w:kern w:val="0"/>
+          <w:sz w:val="24"/>
+          <w:szCs w:val="24"/>
+          <w:lang w:val="sk-SK" w:bidi="ar-SA"/>
         </w:rPr>
         <w:t>[10] J. Suzuki and K. Nakata, “Recognition of Japanese Vowels—Preliminary to the Recognition of Speech,” J. Radio Res. Lab., 37 (8): 193–212, 1961.</w:t>
       </w:r>
@@ -5705,22 +5668,19 @@
     <w:p>
       <w:pPr>
         <w:pStyle w:val="paragraph"/>
+        <w:widowControl/>
+        <w:suppressAutoHyphens w:val="true"/>
+        <w:bidi w:val="0"/>
         <w:spacing w:beforeAutospacing="0" w:before="0" w:afterAutospacing="0" w:after="0"/>
         <w:ind w:firstLine="75" w:start="270"/>
         <w:jc w:val="both"/>
         <w:textAlignment w:val="baseline"/>
         <w:rPr>
-          <w:rFonts w:ascii="Segoe UI" w:hAnsi="Segoe UI" w:cs="Segoe UI"/>
-          <w:sz w:val="18"/>
-          <w:szCs w:val="18"/>
-          <w:lang w:val="sk-SK"/>
-        </w:rPr>
-      </w:pPr>
-      <w:r>
-        <w:rPr>
-          <w:rFonts w:cs="Segoe UI" w:ascii="Segoe UI" w:hAnsi="Segoe UI"/>
-          <w:sz w:val="18"/>
-          <w:szCs w:val="18"/>
+          <w:lang w:val="sk-SK"/>
+        </w:rPr>
+      </w:pPr>
+      <w:r>
+        <w:rPr>
           <w:lang w:val="sk-SK"/>
         </w:rPr>
       </w:r>
@@ -5728,19 +5688,24 @@
     <w:p>
       <w:pPr>
         <w:pStyle w:val="paragraph"/>
+        <w:widowControl/>
+        <w:suppressAutoHyphens w:val="true"/>
+        <w:bidi w:val="0"/>
         <w:spacing w:beforeAutospacing="0" w:before="0" w:afterAutospacing="0" w:after="0"/>
         <w:ind w:firstLine="75" w:start="270"/>
         <w:jc w:val="both"/>
         <w:textAlignment w:val="baseline"/>
+        <w:rPr/>
+      </w:pPr>
+      <w:r>
         <w:rPr>
           <w:rStyle w:val="normaltextrun"/>
-          <w:lang w:val="sk-SK"/>
-        </w:rPr>
-      </w:pPr>
-      <w:r>
-        <w:rPr>
-          <w:rStyle w:val="normaltextrun"/>
-          <w:lang w:val="sk-SK"/>
+          <w:rFonts w:eastAsia="Times New Roman" w:cs="Times New Roman"/>
+          <w:color w:val="auto"/>
+          <w:kern w:val="0"/>
+          <w:sz w:val="24"/>
+          <w:szCs w:val="24"/>
+          <w:lang w:val="sk-SK" w:bidi="ar-SA"/>
         </w:rPr>
         <w:t>[11] T. Sakai and S. Doshita, “The Phonetic Typewriter, Information Processing 1962,” Proc. IFIP Congress, Munich, 1962.</w:t>
       </w:r>
@@ -5748,22 +5713,19 @@
     <w:p>
       <w:pPr>
         <w:pStyle w:val="paragraph"/>
+        <w:widowControl/>
+        <w:suppressAutoHyphens w:val="true"/>
+        <w:bidi w:val="0"/>
         <w:spacing w:beforeAutospacing="0" w:before="0" w:afterAutospacing="0" w:after="0"/>
         <w:ind w:firstLine="75" w:start="270"/>
         <w:jc w:val="both"/>
         <w:textAlignment w:val="baseline"/>
         <w:rPr>
-          <w:rFonts w:ascii="Segoe UI" w:hAnsi="Segoe UI" w:cs="Segoe UI"/>
-          <w:sz w:val="18"/>
-          <w:szCs w:val="18"/>
-          <w:lang w:val="sk-SK"/>
-        </w:rPr>
-      </w:pPr>
-      <w:r>
-        <w:rPr>
-          <w:rFonts w:cs="Segoe UI" w:ascii="Segoe UI" w:hAnsi="Segoe UI"/>
-          <w:sz w:val="18"/>
-          <w:szCs w:val="18"/>
+          <w:lang w:val="sk-SK"/>
+        </w:rPr>
+      </w:pPr>
+      <w:r>
+        <w:rPr>
           <w:lang w:val="sk-SK"/>
         </w:rPr>
       </w:r>
@@ -5771,53 +5733,44 @@
     <w:p>
       <w:pPr>
         <w:pStyle w:val="paragraph"/>
+        <w:widowControl/>
+        <w:suppressAutoHyphens w:val="true"/>
+        <w:bidi w:val="0"/>
         <w:spacing w:beforeAutospacing="0" w:before="0" w:afterAutospacing="0" w:after="0"/>
         <w:ind w:firstLine="75" w:start="270"/>
         <w:jc w:val="both"/>
         <w:textAlignment w:val="baseline"/>
-        <w:rPr>
-          <w:rFonts w:ascii="Segoe UI" w:hAnsi="Segoe UI" w:cs="Segoe UI"/>
-          <w:sz w:val="18"/>
-          <w:szCs w:val="18"/>
-          <w:lang w:val="sk-SK"/>
-        </w:rPr>
+        <w:rPr/>
       </w:pPr>
       <w:r>
         <w:rPr>
           <w:rStyle w:val="normaltextrun"/>
-          <w:lang w:val="sk-SK"/>
-        </w:rPr>
-        <w:t>[12] K. Nagata, Y. Kato, and S. Chiba, “Spoken Digit Recognizer for Japanese Language,” NEC Res. Develop., No. 6, 1963.</w:t>
-      </w:r>
-      <w:r>
-        <w:rPr>
-          <w:rFonts w:cs="Segoe UI" w:ascii="Segoe UI" w:hAnsi="Segoe UI"/>
-          <w:sz w:val="18"/>
-          <w:szCs w:val="18"/>
-          <w:lang w:val="sk-SK"/>
-        </w:rPr>
-        <w:t xml:space="preserve"> </w:t>
+          <w:rFonts w:eastAsia="Times New Roman" w:cs="Times New Roman"/>
+          <w:color w:val="auto"/>
+          <w:kern w:val="0"/>
+          <w:sz w:val="24"/>
+          <w:szCs w:val="24"/>
+          <w:lang w:val="sk-SK" w:bidi="ar-SA"/>
+        </w:rPr>
+        <w:t xml:space="preserve">[12] K. Nagata, Y. Kato, and S. Chiba, “Spoken Digit Recognizer for Japanese Language,” NEC Res. Develop., No. 6, 1963. </w:t>
       </w:r>
     </w:p>
     <w:p>
       <w:pPr>
         <w:pStyle w:val="paragraph"/>
+        <w:widowControl/>
+        <w:suppressAutoHyphens w:val="true"/>
+        <w:bidi w:val="0"/>
         <w:spacing w:beforeAutospacing="0" w:before="0" w:afterAutospacing="0" w:after="0"/>
         <w:ind w:firstLine="75" w:start="270"/>
         <w:jc w:val="both"/>
         <w:textAlignment w:val="baseline"/>
         <w:rPr>
-          <w:rFonts w:ascii="Segoe UI" w:hAnsi="Segoe UI" w:cs="Segoe UI"/>
-          <w:sz w:val="18"/>
-          <w:szCs w:val="18"/>
-          <w:lang w:val="sk-SK"/>
-        </w:rPr>
-      </w:pPr>
-      <w:r>
-        <w:rPr>
-          <w:rFonts w:cs="Segoe UI" w:ascii="Segoe UI" w:hAnsi="Segoe UI"/>
-          <w:sz w:val="18"/>
-          <w:szCs w:val="18"/>
+          <w:lang w:val="sk-SK"/>
+        </w:rPr>
+      </w:pPr>
+      <w:r>
+        <w:rPr>
           <w:lang w:val="sk-SK"/>
         </w:rPr>
       </w:r>
@@ -5825,19 +5778,24 @@
     <w:p>
       <w:pPr>
         <w:pStyle w:val="paragraph"/>
+        <w:widowControl/>
+        <w:suppressAutoHyphens w:val="true"/>
+        <w:bidi w:val="0"/>
         <w:spacing w:beforeAutospacing="0" w:before="0" w:afterAutospacing="0" w:after="0"/>
         <w:ind w:firstLine="75" w:start="270"/>
         <w:jc w:val="both"/>
         <w:textAlignment w:val="baseline"/>
+        <w:rPr/>
+      </w:pPr>
+      <w:r>
         <w:rPr>
           <w:rStyle w:val="normaltextrun"/>
-          <w:lang w:val="sk-SK"/>
-        </w:rPr>
-      </w:pPr>
-      <w:r>
-        <w:rPr>
-          <w:rStyle w:val="normaltextrun"/>
-          <w:lang w:val="sk-SK"/>
+          <w:rFonts w:eastAsia="Times New Roman" w:cs="Times New Roman"/>
+          <w:color w:val="auto"/>
+          <w:kern w:val="0"/>
+          <w:sz w:val="24"/>
+          <w:szCs w:val="24"/>
+          <w:lang w:val="sk-SK" w:bidi="ar-SA"/>
         </w:rPr>
         <w:t>[13] T. B. Martin, A. L. Nelson, and H. J. Zadell, “Speech Recognition by Feature Abstraction Techniques,” Tech. Report AL-TDR-64-176, Air Force Avionics Lab, 1964.</w:t>
       </w:r>
@@ -5845,22 +5803,19 @@
     <w:p>
       <w:pPr>
         <w:pStyle w:val="paragraph"/>
+        <w:widowControl/>
+        <w:suppressAutoHyphens w:val="true"/>
+        <w:bidi w:val="0"/>
         <w:spacing w:beforeAutospacing="0" w:before="0" w:afterAutospacing="0" w:after="0"/>
         <w:ind w:firstLine="75" w:start="270"/>
         <w:jc w:val="both"/>
         <w:textAlignment w:val="baseline"/>
         <w:rPr>
-          <w:rFonts w:ascii="Segoe UI" w:hAnsi="Segoe UI" w:cs="Segoe UI"/>
-          <w:sz w:val="18"/>
-          <w:szCs w:val="18"/>
-          <w:lang w:val="sk-SK"/>
-        </w:rPr>
-      </w:pPr>
-      <w:r>
-        <w:rPr>
-          <w:rFonts w:cs="Segoe UI" w:ascii="Segoe UI" w:hAnsi="Segoe UI"/>
-          <w:sz w:val="18"/>
-          <w:szCs w:val="18"/>
+          <w:lang w:val="sk-SK"/>
+        </w:rPr>
+      </w:pPr>
+      <w:r>
+        <w:rPr>
           <w:lang w:val="sk-SK"/>
         </w:rPr>
       </w:r>
@@ -5868,19 +5823,24 @@
     <w:p>
       <w:pPr>
         <w:pStyle w:val="paragraph"/>
+        <w:widowControl/>
+        <w:suppressAutoHyphens w:val="true"/>
+        <w:bidi w:val="0"/>
         <w:spacing w:beforeAutospacing="0" w:before="0" w:afterAutospacing="0" w:after="0"/>
         <w:ind w:firstLine="75" w:start="270"/>
         <w:jc w:val="both"/>
         <w:textAlignment w:val="baseline"/>
+        <w:rPr/>
+      </w:pPr>
+      <w:r>
         <w:rPr>
           <w:rStyle w:val="normaltextrun"/>
-          <w:lang w:val="sk-SK"/>
-        </w:rPr>
-      </w:pPr>
-      <w:r>
-        <w:rPr>
-          <w:rStyle w:val="normaltextrun"/>
-          <w:lang w:val="sk-SK"/>
+          <w:rFonts w:eastAsia="Times New Roman" w:cs="Times New Roman"/>
+          <w:color w:val="auto"/>
+          <w:kern w:val="0"/>
+          <w:sz w:val="24"/>
+          <w:szCs w:val="24"/>
+          <w:lang w:val="sk-SK" w:bidi="ar-SA"/>
         </w:rPr>
         <w:t>[14] T. K. Vintsyuk, “Speech Discrimination by Dynamic Programming,” Kibernetika, 4 (2): 81–88, Jan.–Feb. 1968.</w:t>
       </w:r>
@@ -5888,22 +5848,19 @@
     <w:p>
       <w:pPr>
         <w:pStyle w:val="paragraph"/>
+        <w:widowControl/>
+        <w:suppressAutoHyphens w:val="true"/>
+        <w:bidi w:val="0"/>
         <w:spacing w:beforeAutospacing="0" w:before="0" w:afterAutospacing="0" w:after="0"/>
         <w:ind w:firstLine="75" w:start="270"/>
         <w:jc w:val="both"/>
         <w:textAlignment w:val="baseline"/>
         <w:rPr>
-          <w:rFonts w:ascii="Segoe UI" w:hAnsi="Segoe UI" w:cs="Segoe UI"/>
-          <w:sz w:val="18"/>
-          <w:szCs w:val="18"/>
-          <w:lang w:val="sk-SK"/>
-        </w:rPr>
-      </w:pPr>
-      <w:r>
-        <w:rPr>
-          <w:rFonts w:cs="Segoe UI" w:ascii="Segoe UI" w:hAnsi="Segoe UI"/>
-          <w:sz w:val="18"/>
-          <w:szCs w:val="18"/>
+          <w:lang w:val="sk-SK"/>
+        </w:rPr>
+      </w:pPr>
+      <w:r>
+        <w:rPr>
           <w:lang w:val="sk-SK"/>
         </w:rPr>
       </w:r>
@@ -5911,19 +5868,24 @@
     <w:p>
       <w:pPr>
         <w:pStyle w:val="paragraph"/>
+        <w:widowControl/>
+        <w:suppressAutoHyphens w:val="true"/>
+        <w:bidi w:val="0"/>
         <w:spacing w:beforeAutospacing="0" w:before="0" w:afterAutospacing="0" w:after="0"/>
         <w:ind w:firstLine="75" w:start="270"/>
         <w:jc w:val="both"/>
         <w:textAlignment w:val="baseline"/>
+        <w:rPr/>
+      </w:pPr>
+      <w:r>
         <w:rPr>
           <w:rStyle w:val="normaltextrun"/>
-          <w:lang w:val="sk-SK"/>
-        </w:rPr>
-      </w:pPr>
-      <w:r>
-        <w:rPr>
-          <w:rStyle w:val="normaltextrun"/>
-          <w:lang w:val="sk-SK"/>
+          <w:rFonts w:eastAsia="Times New Roman" w:cs="Times New Roman"/>
+          <w:color w:val="auto"/>
+          <w:kern w:val="0"/>
+          <w:sz w:val="24"/>
+          <w:szCs w:val="24"/>
+          <w:lang w:val="sk-SK" w:bidi="ar-SA"/>
         </w:rPr>
         <w:t>[15] D. R. Reddy, “An Approach to Computer Speech Recognition by Direct Analysis of the Speech Wave,” Tech. Report No. C549, Computer Science Dept., Stanford Univ., September 1966.</w:t>
       </w:r>
@@ -5931,22 +5893,19 @@
     <w:p>
       <w:pPr>
         <w:pStyle w:val="paragraph"/>
+        <w:widowControl/>
+        <w:suppressAutoHyphens w:val="true"/>
+        <w:bidi w:val="0"/>
         <w:spacing w:beforeAutospacing="0" w:before="0" w:afterAutospacing="0" w:after="0"/>
         <w:ind w:firstLine="75" w:start="270"/>
         <w:jc w:val="both"/>
         <w:textAlignment w:val="baseline"/>
         <w:rPr>
-          <w:rFonts w:ascii="Segoe UI" w:hAnsi="Segoe UI" w:cs="Segoe UI"/>
-          <w:sz w:val="18"/>
-          <w:szCs w:val="18"/>
-          <w:lang w:val="sk-SK"/>
-        </w:rPr>
-      </w:pPr>
-      <w:r>
-        <w:rPr>
-          <w:rFonts w:cs="Segoe UI" w:ascii="Segoe UI" w:hAnsi="Segoe UI"/>
-          <w:sz w:val="18"/>
-          <w:szCs w:val="18"/>
+          <w:lang w:val="sk-SK"/>
+        </w:rPr>
+      </w:pPr>
+      <w:r>
+        <w:rPr>
           <w:lang w:val="sk-SK"/>
         </w:rPr>
       </w:r>
@@ -5954,19 +5913,24 @@
     <w:p>
       <w:pPr>
         <w:pStyle w:val="paragraph"/>
+        <w:widowControl/>
+        <w:suppressAutoHyphens w:val="true"/>
+        <w:bidi w:val="0"/>
         <w:spacing w:beforeAutospacing="0" w:before="0" w:afterAutospacing="0" w:after="0"/>
         <w:ind w:firstLine="75" w:start="270"/>
         <w:jc w:val="both"/>
         <w:textAlignment w:val="baseline"/>
+        <w:rPr/>
+      </w:pPr>
+      <w:r>
         <w:rPr>
           <w:rStyle w:val="normaltextrun"/>
-          <w:lang w:val="sk-SK"/>
-        </w:rPr>
-      </w:pPr>
-      <w:r>
-        <w:rPr>
-          <w:rStyle w:val="normaltextrun"/>
-          <w:lang w:val="sk-SK"/>
+          <w:rFonts w:eastAsia="Times New Roman" w:cs="Times New Roman"/>
+          <w:color w:val="auto"/>
+          <w:kern w:val="0"/>
+          <w:sz w:val="24"/>
+          <w:szCs w:val="24"/>
+          <w:lang w:val="sk-SK" w:bidi="ar-SA"/>
         </w:rPr>
         <w:t>[16] V. M. Velichko and N. G. Zagoruyko, “Automatic Recognition of 200 Words,” Int. J. Man-Machine Studies, 2: 223, June 1970.</w:t>
       </w:r>
@@ -5974,22 +5938,19 @@
     <w:p>
       <w:pPr>
         <w:pStyle w:val="paragraph"/>
+        <w:widowControl/>
+        <w:suppressAutoHyphens w:val="true"/>
+        <w:bidi w:val="0"/>
         <w:spacing w:beforeAutospacing="0" w:before="0" w:afterAutospacing="0" w:after="0"/>
         <w:ind w:firstLine="75" w:start="270"/>
         <w:jc w:val="both"/>
         <w:textAlignment w:val="baseline"/>
         <w:rPr>
-          <w:rFonts w:ascii="Segoe UI" w:hAnsi="Segoe UI" w:cs="Segoe UI"/>
-          <w:sz w:val="18"/>
-          <w:szCs w:val="18"/>
-          <w:lang w:val="sk-SK"/>
-        </w:rPr>
-      </w:pPr>
-      <w:r>
-        <w:rPr>
-          <w:rFonts w:cs="Segoe UI" w:ascii="Segoe UI" w:hAnsi="Segoe UI"/>
-          <w:sz w:val="18"/>
-          <w:szCs w:val="18"/>
+          <w:lang w:val="sk-SK"/>
+        </w:rPr>
+      </w:pPr>
+      <w:r>
+        <w:rPr>
           <w:lang w:val="sk-SK"/>
         </w:rPr>
       </w:r>
@@ -5997,19 +5958,24 @@
     <w:p>
       <w:pPr>
         <w:pStyle w:val="paragraph"/>
+        <w:widowControl/>
+        <w:suppressAutoHyphens w:val="true"/>
+        <w:bidi w:val="0"/>
         <w:spacing w:beforeAutospacing="0" w:before="0" w:afterAutospacing="0" w:after="0"/>
         <w:ind w:firstLine="75" w:start="270"/>
         <w:jc w:val="both"/>
         <w:textAlignment w:val="baseline"/>
+        <w:rPr/>
+      </w:pPr>
+      <w:r>
         <w:rPr>
           <w:rStyle w:val="normaltextrun"/>
-          <w:lang w:val="sk-SK"/>
-        </w:rPr>
-      </w:pPr>
-      <w:r>
-        <w:rPr>
-          <w:rStyle w:val="normaltextrun"/>
-          <w:lang w:val="sk-SK"/>
+          <w:rFonts w:eastAsia="Times New Roman" w:cs="Times New Roman"/>
+          <w:color w:val="auto"/>
+          <w:kern w:val="0"/>
+          <w:sz w:val="24"/>
+          <w:szCs w:val="24"/>
+          <w:lang w:val="sk-SK" w:bidi="ar-SA"/>
         </w:rPr>
         <w:t>[17] H. Sakoe and S. Chiba, “Dynamic Programming Algorithm Optimization for Spoken Word Recognition,” IEEE Trans. Acoustics, Speech, Signal Proc., ASSP-26 (1): 43–49, February 1978.</w:t>
       </w:r>
@@ -6017,12 +5983,14 @@
     <w:p>
       <w:pPr>
         <w:pStyle w:val="paragraph"/>
+        <w:widowControl/>
+        <w:suppressAutoHyphens w:val="true"/>
+        <w:bidi w:val="0"/>
         <w:spacing w:beforeAutospacing="0" w:before="0" w:afterAutospacing="0" w:after="0"/>
         <w:ind w:firstLine="75" w:start="270"/>
         <w:jc w:val="both"/>
         <w:textAlignment w:val="baseline"/>
         <w:rPr>
-          <w:rStyle w:val="normaltextrun"/>
           <w:lang w:val="sk-SK"/>
         </w:rPr>
       </w:pPr>
@@ -6035,19 +6003,24 @@
     <w:p>
       <w:pPr>
         <w:pStyle w:val="paragraph"/>
+        <w:widowControl/>
+        <w:suppressAutoHyphens w:val="true"/>
+        <w:bidi w:val="0"/>
         <w:spacing w:beforeAutospacing="0" w:before="0" w:afterAutospacing="0" w:after="0"/>
         <w:ind w:firstLine="75" w:start="270"/>
         <w:jc w:val="both"/>
         <w:textAlignment w:val="baseline"/>
+        <w:rPr/>
+      </w:pPr>
+      <w:r>
         <w:rPr>
           <w:rStyle w:val="normaltextrun"/>
-          <w:lang w:val="sk-SK"/>
-        </w:rPr>
-      </w:pPr>
-      <w:r>
-        <w:rPr>
-          <w:rStyle w:val="normaltextrun"/>
-          <w:lang w:val="sk-SK"/>
+          <w:rFonts w:eastAsia="Times New Roman" w:cs="Times New Roman"/>
+          <w:color w:val="auto"/>
+          <w:kern w:val="0"/>
+          <w:sz w:val="24"/>
+          <w:szCs w:val="24"/>
+          <w:lang w:val="sk-SK" w:bidi="ar-SA"/>
         </w:rPr>
         <w:t>[18] F. Itakura, “Minimum Prediction Residual Applied to Speech Recognition,” IEEE Trans. Acoustics, Speech, Signal Proc., ASSP-23 (1): 67–72, February 1975.</w:t>
       </w:r>
@@ -6055,12 +6028,14 @@
     <w:p>
       <w:pPr>
         <w:pStyle w:val="paragraph"/>
+        <w:widowControl/>
+        <w:suppressAutoHyphens w:val="true"/>
+        <w:bidi w:val="0"/>
         <w:spacing w:beforeAutospacing="0" w:before="0" w:afterAutospacing="0" w:after="0"/>
         <w:ind w:firstLine="75" w:start="270"/>
         <w:jc w:val="both"/>
         <w:textAlignment w:val="baseline"/>
         <w:rPr>
-          <w:rStyle w:val="normaltextrun"/>
           <w:lang w:val="sk-SK"/>
         </w:rPr>
       </w:pPr>
@@ -6073,19 +6048,24 @@
     <w:p>
       <w:pPr>
         <w:pStyle w:val="paragraph"/>
+        <w:widowControl/>
+        <w:suppressAutoHyphens w:val="true"/>
+        <w:bidi w:val="0"/>
         <w:spacing w:beforeAutospacing="0" w:before="0" w:afterAutospacing="0" w:after="0"/>
         <w:ind w:firstLine="75" w:start="270"/>
         <w:jc w:val="both"/>
         <w:textAlignment w:val="baseline"/>
+        <w:rPr/>
+      </w:pPr>
+      <w:r>
         <w:rPr>
           <w:rStyle w:val="normaltextrun"/>
-          <w:lang w:val="sk-SK"/>
-        </w:rPr>
-      </w:pPr>
-      <w:r>
-        <w:rPr>
-          <w:rStyle w:val="normaltextrun"/>
-          <w:lang w:val="sk-SK"/>
+          <w:rFonts w:eastAsia="Times New Roman" w:cs="Times New Roman"/>
+          <w:color w:val="auto"/>
+          <w:kern w:val="0"/>
+          <w:sz w:val="24"/>
+          <w:szCs w:val="24"/>
+          <w:lang w:val="sk-SK" w:bidi="ar-SA"/>
         </w:rPr>
         <w:t>[19] C. C. Tappert, N. R. Dixon, A. S. Rabinowitz, and W. D. Chapman, “Automatic Recognition of Continuous Speech Utilizing Dynamic Segmentation, Dual Classification, Sequential Decoding and Error Recovery,” Rome Air Dev. Cen, Rome, NY, Tech. Report TR-71-146, 1971.</w:t>
       </w:r>
@@ -6093,872 +6073,1472 @@
     <w:p>
       <w:pPr>
         <w:pStyle w:val="paragraph"/>
-        <w:spacing w:before="280" w:after="280"/>
-        <w:ind w:firstLine="75" w:start="270"/>
-        <w:textAlignment w:val="baseline"/>
-        <w:rPr>
-          <w:rStyle w:val="normaltextrun"/>
-          <w:lang w:val="sk-SK"/>
-        </w:rPr>
-      </w:pPr>
-      <w:r>
-        <w:rPr>
-          <w:rStyle w:val="normaltextrun"/>
-          <w:lang w:val="sk-SK"/>
-        </w:rPr>
-        <w:t>[</w:t>
-      </w:r>
-      <w:r>
-        <w:rPr>
-          <w:rStyle w:val="normaltextrun"/>
-          <w:lang w:val="sk-SK"/>
-        </w:rPr>
-        <w:t>20</w:t>
-      </w:r>
-      <w:r>
-        <w:rPr>
-          <w:rStyle w:val="normaltextrun"/>
-          <w:lang w:val="sk-SK"/>
-        </w:rPr>
-        <w:t>] F. Jelinek, L. R. Bahl, and R. L. Mercer, “Design of a Linguistic Statistical Decoder for the Recognition of Continuous Speech,” IEEE Trans. Information Theory, IT-21: 250–256, 1975.</w:t>
-      </w:r>
-    </w:p>
-    <w:p>
-      <w:pPr>
-        <w:pStyle w:val="paragraph"/>
-        <w:spacing w:before="280" w:after="280"/>
-        <w:ind w:firstLine="75" w:start="270"/>
-        <w:textAlignment w:val="baseline"/>
-        <w:rPr>
-          <w:rStyle w:val="normaltextrun"/>
-          <w:lang w:val="sk-SK"/>
-        </w:rPr>
-      </w:pPr>
-      <w:r>
-        <w:rPr>
-          <w:lang w:val="sk-SK"/>
-        </w:rPr>
-      </w:r>
-    </w:p>
-    <w:p>
-      <w:pPr>
-        <w:pStyle w:val="paragraph"/>
-        <w:spacing w:before="280" w:after="280"/>
-        <w:ind w:firstLine="75" w:start="270"/>
-        <w:textAlignment w:val="baseline"/>
-        <w:rPr>
-          <w:rStyle w:val="normaltextrun"/>
-          <w:lang w:val="sk-SK"/>
-        </w:rPr>
-      </w:pPr>
-      <w:r>
-        <w:rPr>
-          <w:rStyle w:val="normaltextrun"/>
-          <w:lang w:val="sk-SK"/>
-        </w:rPr>
-        <w:t>[</w:t>
-      </w:r>
-      <w:r>
-        <w:rPr>
-          <w:rStyle w:val="normaltextrun"/>
-          <w:lang w:val="sk-SK"/>
-        </w:rPr>
-        <w:t>21</w:t>
-      </w:r>
-      <w:r>
-        <w:rPr>
-          <w:rStyle w:val="normaltextrun"/>
-          <w:lang w:val="sk-SK"/>
-        </w:rPr>
-        <w:t>] F. Jelinek, “The Development of an Experimental Discrete Dictation Recognizer,” Proc. IEEE, 73 (11): 1616–1624, 1985.</w:t>
-      </w:r>
-    </w:p>
-    <w:p>
-      <w:pPr>
-        <w:pStyle w:val="paragraph"/>
-        <w:spacing w:before="280" w:after="280"/>
-        <w:ind w:firstLine="75" w:start="270"/>
-        <w:textAlignment w:val="baseline"/>
-        <w:rPr>
-          <w:rStyle w:val="normaltextrun"/>
-          <w:lang w:val="sk-SK"/>
-        </w:rPr>
-      </w:pPr>
-      <w:r>
-        <w:rPr>
-          <w:lang w:val="sk-SK"/>
-        </w:rPr>
-      </w:r>
-    </w:p>
-    <w:p>
-      <w:pPr>
-        <w:pStyle w:val="paragraph"/>
-        <w:spacing w:before="280" w:after="280"/>
-        <w:ind w:firstLine="75" w:start="270"/>
-        <w:textAlignment w:val="baseline"/>
-        <w:rPr>
-          <w:rStyle w:val="normaltextrun"/>
-          <w:lang w:val="sk-SK"/>
-        </w:rPr>
-      </w:pPr>
-      <w:r>
-        <w:rPr>
-          <w:rStyle w:val="normaltextrun"/>
-          <w:lang w:val="sk-SK"/>
-        </w:rPr>
-        <w:t>[</w:t>
-      </w:r>
-      <w:r>
-        <w:rPr>
-          <w:rStyle w:val="normaltextrun"/>
-          <w:lang w:val="sk-SK"/>
-        </w:rPr>
-        <w:t>22</w:t>
-      </w:r>
-      <w:r>
-        <w:rPr>
-          <w:rStyle w:val="normaltextrun"/>
-          <w:lang w:val="sk-SK"/>
-        </w:rPr>
-        <w:t>] L. R. Rabiner, S. E. Levinson, A. E. Rosenberg, and J. G. Wilpon, “Speaker Independent Recognition of Isolated Words Using Clustering Techniques,” IEEE Trans. Acoustics, Speech, Signal Proc., ASSP-27: 336–349, August 1979.</w:t>
-      </w:r>
-    </w:p>
-    <w:p>
-      <w:pPr>
-        <w:pStyle w:val="paragraph"/>
-        <w:spacing w:before="280" w:after="280"/>
-        <w:ind w:firstLine="75" w:start="270"/>
-        <w:textAlignment w:val="baseline"/>
-        <w:rPr>
-          <w:rStyle w:val="normaltextrun"/>
-          <w:lang w:val="sk-SK"/>
-        </w:rPr>
-      </w:pPr>
-      <w:r>
-        <w:rPr>
-          <w:lang w:val="sk-SK"/>
-        </w:rPr>
-      </w:r>
-    </w:p>
-    <w:p>
-      <w:pPr>
-        <w:pStyle w:val="paragraph"/>
-        <w:spacing w:before="280" w:after="280"/>
-        <w:ind w:firstLine="75" w:start="270"/>
-        <w:textAlignment w:val="baseline"/>
-        <w:rPr>
-          <w:rStyle w:val="normaltextrun"/>
-          <w:lang w:val="sk-SK"/>
-        </w:rPr>
-      </w:pPr>
-      <w:r>
-        <w:rPr>
-          <w:rStyle w:val="normaltextrun"/>
-          <w:lang w:val="sk-SK"/>
-        </w:rPr>
-        <w:t>[</w:t>
-      </w:r>
-      <w:r>
-        <w:rPr>
-          <w:rStyle w:val="normaltextrun"/>
-          <w:lang w:val="sk-SK"/>
-        </w:rPr>
-        <w:t>23</w:t>
-      </w:r>
-      <w:r>
-        <w:rPr>
-          <w:rStyle w:val="normaltextrun"/>
-          <w:lang w:val="sk-SK"/>
-        </w:rPr>
-        <w:t>] H. Sakoe, “Two Level DP Matching—A Dynamic Programming Based Pattern Matching Algorithm for Connected Word Recognition,” IEEE Trans. Acoustics, Speech, Signal Proc., ASSP-27: 588–595, December 1979.</w:t>
-      </w:r>
-    </w:p>
-    <w:p>
-      <w:pPr>
-        <w:pStyle w:val="paragraph"/>
-        <w:spacing w:before="280" w:after="280"/>
-        <w:ind w:firstLine="75" w:start="270"/>
-        <w:textAlignment w:val="baseline"/>
-        <w:rPr>
-          <w:rStyle w:val="normaltextrun"/>
-          <w:lang w:val="sk-SK"/>
-        </w:rPr>
-      </w:pPr>
-      <w:r>
-        <w:rPr>
-          <w:lang w:val="sk-SK"/>
-        </w:rPr>
-      </w:r>
-    </w:p>
-    <w:p>
-      <w:pPr>
-        <w:pStyle w:val="paragraph"/>
-        <w:spacing w:before="280" w:after="280"/>
-        <w:ind w:firstLine="75" w:start="270"/>
-        <w:textAlignment w:val="baseline"/>
-        <w:rPr>
-          <w:rStyle w:val="normaltextrun"/>
-          <w:lang w:val="sk-SK"/>
-        </w:rPr>
-      </w:pPr>
-      <w:r>
-        <w:rPr>
-          <w:rStyle w:val="normaltextrun"/>
-          <w:lang w:val="sk-SK"/>
-        </w:rPr>
-        <w:t>[</w:t>
-      </w:r>
-      <w:r>
-        <w:rPr>
-          <w:rStyle w:val="normaltextrun"/>
-          <w:lang w:val="sk-SK"/>
-        </w:rPr>
-        <w:t>24</w:t>
-      </w:r>
-      <w:r>
-        <w:rPr>
-          <w:rStyle w:val="normaltextrun"/>
-          <w:lang w:val="sk-SK"/>
-        </w:rPr>
-        <w:t>] J. S. Bridle and M. D. Brown, “Connected Word Recognition Using Whole Word Templates,” Proc. Inst. Acoust. Autumn Conf., 25–28, November 1979.</w:t>
-      </w:r>
-    </w:p>
-    <w:p>
-      <w:pPr>
-        <w:pStyle w:val="paragraph"/>
-        <w:spacing w:before="280" w:after="280"/>
-        <w:ind w:firstLine="75" w:start="270"/>
-        <w:textAlignment w:val="baseline"/>
-        <w:rPr>
-          <w:rStyle w:val="normaltextrun"/>
-          <w:lang w:val="sk-SK"/>
-        </w:rPr>
-      </w:pPr>
-      <w:r>
-        <w:rPr>
-          <w:lang w:val="sk-SK"/>
-        </w:rPr>
-      </w:r>
-    </w:p>
-    <w:p>
-      <w:pPr>
-        <w:pStyle w:val="paragraph"/>
-        <w:spacing w:before="280" w:after="280"/>
-        <w:ind w:firstLine="75" w:start="270"/>
-        <w:textAlignment w:val="baseline"/>
-        <w:rPr>
-          <w:rStyle w:val="normaltextrun"/>
-          <w:lang w:val="sk-SK"/>
-        </w:rPr>
-      </w:pPr>
-      <w:r>
-        <w:rPr>
-          <w:rStyle w:val="normaltextrun"/>
-          <w:lang w:val="sk-SK"/>
-        </w:rPr>
-        <w:t>[2</w:t>
-      </w:r>
-      <w:r>
-        <w:rPr>
-          <w:rStyle w:val="normaltextrun"/>
-          <w:lang w:val="sk-SK"/>
-        </w:rPr>
-        <w:t>5</w:t>
-      </w:r>
-      <w:r>
-        <w:rPr>
-          <w:rStyle w:val="normaltextrun"/>
-          <w:lang w:val="sk-SK"/>
-        </w:rPr>
-        <w:t>] C. S. Myers and L. R. Rabiner, “A Level Building Dynamic Time Warping Algorithm for Connected Word Recognition,” IEEE Trans. Acoustics, Speech, Signal Proc., ASSP-29: 284–297, April 1981.</w:t>
-      </w:r>
-    </w:p>
-    <w:p>
-      <w:pPr>
-        <w:pStyle w:val="paragraph"/>
-        <w:spacing w:before="280" w:after="280"/>
-        <w:ind w:firstLine="75" w:start="270"/>
-        <w:textAlignment w:val="baseline"/>
-        <w:rPr>
-          <w:rStyle w:val="normaltextrun"/>
-          <w:lang w:val="sk-SK"/>
-        </w:rPr>
-      </w:pPr>
-      <w:r>
-        <w:rPr>
-          <w:lang w:val="sk-SK"/>
-        </w:rPr>
-      </w:r>
-    </w:p>
-    <w:p>
-      <w:pPr>
-        <w:pStyle w:val="paragraph"/>
-        <w:spacing w:before="280" w:after="280"/>
-        <w:ind w:firstLine="75" w:start="270"/>
-        <w:textAlignment w:val="baseline"/>
-        <w:rPr>
-          <w:rStyle w:val="normaltextrun"/>
-          <w:lang w:val="sk-SK"/>
-        </w:rPr>
-      </w:pPr>
-      <w:r>
-        <w:rPr>
-          <w:rStyle w:val="normaltextrun"/>
-          <w:lang w:val="sk-SK"/>
-        </w:rPr>
-        <w:t>[2</w:t>
-      </w:r>
-      <w:r>
-        <w:rPr>
-          <w:rStyle w:val="normaltextrun"/>
-          <w:lang w:val="sk-SK"/>
-        </w:rPr>
-        <w:t>6</w:t>
-      </w:r>
-      <w:r>
-        <w:rPr>
-          <w:rStyle w:val="normaltextrun"/>
-          <w:lang w:val="sk-SK"/>
-        </w:rPr>
-        <w:t>] C. H. Lee and L. R. Rabiner, “A Frame Synchronous Network Search Algorithm for Connected Word Recognition,” IEEE Trans. Acoustics, Speech, Signal Proc., 37 (11): 1649–1658, November 1989.</w:t>
-      </w:r>
-    </w:p>
-    <w:p>
-      <w:pPr>
-        <w:pStyle w:val="paragraph"/>
-        <w:spacing w:before="280" w:after="280"/>
-        <w:ind w:firstLine="75" w:start="270"/>
-        <w:textAlignment w:val="baseline"/>
-        <w:rPr>
-          <w:rStyle w:val="normaltextrun"/>
-          <w:lang w:val="sk-SK"/>
-        </w:rPr>
-      </w:pPr>
-      <w:r>
-        <w:rPr>
-          <w:lang w:val="sk-SK"/>
-        </w:rPr>
-      </w:r>
-    </w:p>
-    <w:p>
-      <w:pPr>
-        <w:pStyle w:val="paragraph"/>
-        <w:spacing w:before="280" w:after="280"/>
-        <w:ind w:firstLine="75" w:start="270"/>
-        <w:textAlignment w:val="baseline"/>
-        <w:rPr>
-          <w:rStyle w:val="normaltextrun"/>
-          <w:lang w:val="sk-SK"/>
-        </w:rPr>
-      </w:pPr>
-      <w:r>
-        <w:rPr>
-          <w:rStyle w:val="normaltextrun"/>
-          <w:lang w:val="sk-SK"/>
-        </w:rPr>
-        <w:t>[2</w:t>
-      </w:r>
-      <w:r>
-        <w:rPr>
-          <w:rStyle w:val="normaltextrun"/>
-          <w:lang w:val="sk-SK"/>
-        </w:rPr>
-        <w:t>7</w:t>
-      </w:r>
-      <w:r>
-        <w:rPr>
-          <w:rStyle w:val="normaltextrun"/>
-          <w:lang w:val="sk-SK"/>
-        </w:rPr>
-        <w:t>] J. Ferguson, Ed., Hidden Markov Models for Speech, IDA, Princeton, NJ, 1980.</w:t>
-      </w:r>
-    </w:p>
-    <w:p>
-      <w:pPr>
-        <w:pStyle w:val="paragraph"/>
-        <w:spacing w:before="280" w:after="280"/>
-        <w:ind w:firstLine="75" w:start="270"/>
-        <w:textAlignment w:val="baseline"/>
-        <w:rPr>
-          <w:rStyle w:val="normaltextrun"/>
-          <w:lang w:val="sk-SK"/>
-        </w:rPr>
-      </w:pPr>
-      <w:r>
-        <w:rPr>
-          <w:lang w:val="sk-SK"/>
-        </w:rPr>
-      </w:r>
-    </w:p>
-    <w:p>
-      <w:pPr>
-        <w:pStyle w:val="paragraph"/>
-        <w:spacing w:before="280" w:after="280"/>
-        <w:ind w:firstLine="75" w:start="270"/>
-        <w:textAlignment w:val="baseline"/>
-        <w:rPr>
-          <w:rStyle w:val="normaltextrun"/>
-          <w:lang w:val="sk-SK"/>
-        </w:rPr>
-      </w:pPr>
-      <w:r>
-        <w:rPr>
-          <w:rStyle w:val="normaltextrun"/>
-          <w:lang w:val="sk-SK"/>
-        </w:rPr>
-        <w:t>[2</w:t>
-      </w:r>
-      <w:r>
-        <w:rPr>
-          <w:rStyle w:val="normaltextrun"/>
-          <w:lang w:val="sk-SK"/>
-        </w:rPr>
-        <w:t>8</w:t>
-      </w:r>
-      <w:r>
-        <w:rPr>
-          <w:rStyle w:val="normaltextrun"/>
-          <w:lang w:val="sk-SK"/>
-        </w:rPr>
-        <w:t>] L. R. Rabiner, “A Tutorial on Hidden Markov Models and Selected Applications in Speech Recognition,” Proc. IEEE, 77 (2): 257–286, February 1989.</w:t>
-      </w:r>
-    </w:p>
-    <w:p>
-      <w:pPr>
-        <w:pStyle w:val="paragraph"/>
-        <w:spacing w:before="280" w:after="280"/>
-        <w:ind w:firstLine="75" w:start="270"/>
-        <w:textAlignment w:val="baseline"/>
-        <w:rPr>
-          <w:rStyle w:val="normaltextrun"/>
-          <w:lang w:val="sk-SK"/>
-        </w:rPr>
-      </w:pPr>
-      <w:r>
-        <w:rPr>
-          <w:lang w:val="sk-SK"/>
-        </w:rPr>
-      </w:r>
-    </w:p>
-    <w:p>
-      <w:pPr>
-        <w:pStyle w:val="paragraph"/>
-        <w:spacing w:before="280" w:after="280"/>
-        <w:ind w:firstLine="75" w:start="270"/>
-        <w:textAlignment w:val="baseline"/>
-        <w:rPr>
-          <w:rStyle w:val="normaltextrun"/>
-          <w:lang w:val="sk-SK"/>
-        </w:rPr>
-      </w:pPr>
-      <w:r>
-        <w:rPr>
-          <w:rStyle w:val="normaltextrun"/>
-          <w:lang w:val="sk-SK"/>
-        </w:rPr>
-        <w:t>[2</w:t>
-      </w:r>
-      <w:r>
-        <w:rPr>
-          <w:rStyle w:val="normaltextrun"/>
-          <w:lang w:val="sk-SK"/>
-        </w:rPr>
-        <w:t>9</w:t>
-      </w:r>
-      <w:r>
-        <w:rPr>
-          <w:rStyle w:val="normaltextrun"/>
-          <w:lang w:val="sk-SK"/>
-        </w:rPr>
-        <w:t>] R. P. Lippmann, “An Introduction to Computing with Neural Nets,” IEEE ASSP Mag., 4 (2): 4–22, April 1987.</w:t>
-      </w:r>
-    </w:p>
-    <w:p>
-      <w:pPr>
-        <w:pStyle w:val="paragraph"/>
-        <w:spacing w:before="280" w:after="280"/>
-        <w:ind w:firstLine="75" w:start="270"/>
-        <w:textAlignment w:val="baseline"/>
-        <w:rPr>
-          <w:rStyle w:val="normaltextrun"/>
-          <w:lang w:val="sk-SK"/>
-        </w:rPr>
-      </w:pPr>
-      <w:r>
-        <w:rPr>
-          <w:lang w:val="sk-SK"/>
-        </w:rPr>
-      </w:r>
-    </w:p>
-    <w:p>
-      <w:pPr>
-        <w:pStyle w:val="paragraph"/>
-        <w:spacing w:before="280" w:after="280"/>
-        <w:ind w:firstLine="75" w:start="270"/>
-        <w:textAlignment w:val="baseline"/>
-        <w:rPr>
-          <w:rStyle w:val="normaltextrun"/>
-          <w:lang w:val="sk-SK"/>
-        </w:rPr>
-      </w:pPr>
-      <w:r>
-        <w:rPr>
-          <w:rStyle w:val="normaltextrun"/>
-          <w:lang w:val="sk-SK"/>
-        </w:rPr>
-        <w:t>[</w:t>
-      </w:r>
-      <w:r>
-        <w:rPr>
-          <w:rStyle w:val="normaltextrun"/>
-          <w:lang w:val="sk-SK"/>
-        </w:rPr>
-        <w:t>30</w:t>
-      </w:r>
-      <w:r>
-        <w:rPr>
-          <w:rStyle w:val="normaltextrun"/>
-          <w:lang w:val="sk-SK"/>
-        </w:rPr>
-        <w:t>] A. Weibel, T. Hanazawa, G. Hinton, K. Shikano, and K. Lang, “Phoneme Recognition Using Time-Delay Neural Networks,” IEEE Trans. Acoustics, Speech, Signal Proc., 37: 393–404, 1989.</w:t>
-      </w:r>
-    </w:p>
-    <w:p>
-      <w:pPr>
-        <w:pStyle w:val="paragraph"/>
-        <w:spacing w:before="280" w:after="280"/>
-        <w:ind w:firstLine="75" w:start="270"/>
-        <w:textAlignment w:val="baseline"/>
-        <w:rPr>
-          <w:rStyle w:val="normaltextrun"/>
-          <w:lang w:val="sk-SK"/>
-        </w:rPr>
-      </w:pPr>
-      <w:r>
-        <w:rPr>
-          <w:lang w:val="sk-SK"/>
-        </w:rPr>
-      </w:r>
-    </w:p>
-    <w:p>
-      <w:pPr>
-        <w:pStyle w:val="paragraph"/>
-        <w:spacing w:before="280" w:after="280"/>
-        <w:ind w:firstLine="75" w:start="270"/>
-        <w:textAlignment w:val="baseline"/>
-        <w:rPr>
-          <w:rStyle w:val="normaltextrun"/>
-          <w:lang w:val="sk-SK"/>
-        </w:rPr>
-      </w:pPr>
-      <w:r>
-        <w:rPr>
-          <w:rStyle w:val="normaltextrun"/>
-          <w:lang w:val="sk-SK"/>
-        </w:rPr>
-        <w:t>[</w:t>
-      </w:r>
-      <w:r>
-        <w:rPr>
-          <w:rStyle w:val="normaltextrun"/>
-          <w:lang w:val="sk-SK"/>
-        </w:rPr>
-        <w:t>31</w:t>
-      </w:r>
-      <w:r>
-        <w:rPr>
-          <w:rStyle w:val="normaltextrun"/>
-          <w:lang w:val="sk-SK"/>
-        </w:rPr>
-        <w:t>] K. F. Lee, H. W. Hon, and D. R. Reddy, “An Overview of the SPHINX Speech Recognition System,” IEEE Trans. Acoustics, Speech, Signal Proc., 38: 600–610, 1990.</w:t>
-      </w:r>
-    </w:p>
-    <w:p>
-      <w:pPr>
-        <w:pStyle w:val="paragraph"/>
-        <w:spacing w:before="280" w:after="280"/>
-        <w:ind w:firstLine="75" w:start="270"/>
-        <w:textAlignment w:val="baseline"/>
-        <w:rPr>
-          <w:rStyle w:val="normaltextrun"/>
-          <w:lang w:val="sk-SK"/>
-        </w:rPr>
-      </w:pPr>
-      <w:r>
-        <w:rPr>
-          <w:lang w:val="sk-SK"/>
-        </w:rPr>
-      </w:r>
-    </w:p>
-    <w:p>
-      <w:pPr>
-        <w:pStyle w:val="paragraph"/>
-        <w:spacing w:before="280" w:after="280"/>
-        <w:ind w:firstLine="75" w:start="270"/>
-        <w:textAlignment w:val="baseline"/>
-        <w:rPr>
-          <w:rStyle w:val="normaltextrun"/>
-          <w:lang w:val="sk-SK"/>
-        </w:rPr>
-      </w:pPr>
-      <w:r>
-        <w:rPr>
-          <w:rStyle w:val="normaltextrun"/>
-          <w:lang w:val="sk-SK"/>
-        </w:rPr>
-        <w:t>[</w:t>
-      </w:r>
-      <w:r>
-        <w:rPr>
-          <w:rStyle w:val="normaltextrun"/>
-          <w:lang w:val="sk-SK"/>
-        </w:rPr>
-        <w:t>32</w:t>
-      </w:r>
-      <w:r>
-        <w:rPr>
-          <w:rStyle w:val="normaltextrun"/>
-          <w:lang w:val="sk-SK"/>
-        </w:rPr>
-        <w:t>] Y. L. Chow, M. O. Dunham, O. A. Kimball, M. A. Krasner, G. F. Kubala, J. Makhoul, S. Roucos, and R. M. Schwartz, “BYBLOS: The BBN Continuous Speech Recognition System,” Proc. ICASSP 87, 89–92, April 1987.</w:t>
-      </w:r>
-    </w:p>
-    <w:p>
-      <w:pPr>
-        <w:pStyle w:val="paragraph"/>
-        <w:spacing w:before="280" w:after="280"/>
-        <w:ind w:firstLine="75" w:start="270"/>
-        <w:textAlignment w:val="baseline"/>
-        <w:rPr>
-          <w:rStyle w:val="normaltextrun"/>
-          <w:lang w:val="sk-SK"/>
-        </w:rPr>
-      </w:pPr>
-      <w:r>
-        <w:rPr>
-          <w:lang w:val="sk-SK"/>
-        </w:rPr>
-      </w:r>
-    </w:p>
-    <w:p>
-      <w:pPr>
-        <w:pStyle w:val="paragraph"/>
-        <w:spacing w:before="280" w:after="280"/>
-        <w:ind w:firstLine="75" w:start="270"/>
-        <w:textAlignment w:val="baseline"/>
-        <w:rPr>
-          <w:rStyle w:val="normaltextrun"/>
-          <w:lang w:val="sk-SK"/>
-        </w:rPr>
-      </w:pPr>
-      <w:r>
-        <w:rPr>
-          <w:rStyle w:val="normaltextrun"/>
-          <w:lang w:val="sk-SK"/>
-        </w:rPr>
-        <w:t>[</w:t>
-      </w:r>
-      <w:r>
-        <w:rPr>
-          <w:rStyle w:val="normaltextrun"/>
-          <w:lang w:val="sk-SK"/>
-        </w:rPr>
-        <w:t>33</w:t>
-      </w:r>
-      <w:r>
-        <w:rPr>
-          <w:rStyle w:val="normaltextrun"/>
-          <w:lang w:val="sk-SK"/>
-        </w:rPr>
-        <w:t>] D. B. Paul, “The Lincoln Robust Continuous Speech Recognizer,” Proc. ICASSP 89, Glasgow, Scotland, 449–452, May 1989.</w:t>
-      </w:r>
-    </w:p>
-    <w:p>
-      <w:pPr>
-        <w:pStyle w:val="paragraph"/>
-        <w:spacing w:before="280" w:after="280"/>
-        <w:ind w:firstLine="75" w:start="270"/>
-        <w:textAlignment w:val="baseline"/>
-        <w:rPr>
-          <w:rStyle w:val="normaltextrun"/>
-          <w:lang w:val="sk-SK"/>
-        </w:rPr>
-      </w:pPr>
-      <w:r>
-        <w:rPr>
-          <w:lang w:val="sk-SK"/>
-        </w:rPr>
-      </w:r>
-    </w:p>
-    <w:p>
-      <w:pPr>
-        <w:pStyle w:val="paragraph"/>
-        <w:spacing w:before="280" w:after="280"/>
-        <w:ind w:firstLine="75" w:start="270"/>
-        <w:textAlignment w:val="baseline"/>
-        <w:rPr>
-          <w:rStyle w:val="normaltextrun"/>
-          <w:lang w:val="sk-SK"/>
-        </w:rPr>
-      </w:pPr>
-      <w:r>
-        <w:rPr>
-          <w:rStyle w:val="normaltextrun"/>
-          <w:lang w:val="sk-SK"/>
-        </w:rPr>
-        <w:t>[</w:t>
-      </w:r>
-      <w:r>
-        <w:rPr>
-          <w:rStyle w:val="normaltextrun"/>
-          <w:lang w:val="sk-SK"/>
-        </w:rPr>
-        <w:t>34</w:t>
-      </w:r>
-      <w:r>
-        <w:rPr>
-          <w:rStyle w:val="normaltextrun"/>
-          <w:lang w:val="sk-SK"/>
-        </w:rPr>
-        <w:t>] M. Weintraub et al., “Linguistic Constraints in Hidden Markov Model Based Speech Recognition,” Proc. ICASSP 89, Glasgow, Scotland, 699–702, May 1989.</w:t>
-      </w:r>
-    </w:p>
-    <w:p>
-      <w:pPr>
-        <w:pStyle w:val="paragraph"/>
-        <w:spacing w:before="280" w:after="280"/>
-        <w:ind w:firstLine="75" w:start="270"/>
-        <w:textAlignment w:val="baseline"/>
-        <w:rPr>
-          <w:rStyle w:val="normaltextrun"/>
-          <w:lang w:val="sk-SK"/>
-        </w:rPr>
-      </w:pPr>
-      <w:r>
-        <w:rPr>
-          <w:lang w:val="sk-SK"/>
-        </w:rPr>
-      </w:r>
-    </w:p>
-    <w:p>
-      <w:pPr>
-        <w:pStyle w:val="paragraph"/>
-        <w:spacing w:before="280" w:after="280"/>
-        <w:ind w:firstLine="75" w:start="270"/>
-        <w:textAlignment w:val="baseline"/>
-        <w:rPr>
-          <w:rStyle w:val="normaltextrun"/>
-          <w:lang w:val="sk-SK"/>
-        </w:rPr>
-      </w:pPr>
-      <w:r>
-        <w:rPr>
-          <w:rStyle w:val="normaltextrun"/>
-          <w:lang w:val="sk-SK"/>
-        </w:rPr>
-        <w:t>[3</w:t>
-      </w:r>
-      <w:r>
-        <w:rPr>
-          <w:rStyle w:val="normaltextrun"/>
-          <w:lang w:val="sk-SK"/>
-        </w:rPr>
-        <w:t>5</w:t>
-      </w:r>
-      <w:r>
-        <w:rPr>
-          <w:rStyle w:val="normaltextrun"/>
-          <w:lang w:val="sk-SK"/>
-        </w:rPr>
-        <w:t>] V. Zue, J. Glass, M. Phillips, and S. Seneff, “The MIT Summit Speech Recognition System: A Progress Report,” Proc. DARPA Speech and Natural Language Workshop, 179–189, February 1989.</w:t>
-      </w:r>
-    </w:p>
-    <w:p>
-      <w:pPr>
-        <w:pStyle w:val="paragraph"/>
-        <w:spacing w:before="280" w:after="280"/>
-        <w:ind w:firstLine="75" w:start="270"/>
-        <w:textAlignment w:val="baseline"/>
-        <w:rPr>
-          <w:rStyle w:val="normaltextrun"/>
-          <w:lang w:val="sk-SK"/>
-        </w:rPr>
-      </w:pPr>
-      <w:r>
-        <w:rPr>
-          <w:lang w:val="sk-SK"/>
-        </w:rPr>
-      </w:r>
-    </w:p>
-    <w:p>
-      <w:pPr>
-        <w:pStyle w:val="paragraph"/>
+        <w:widowControl/>
+        <w:suppressAutoHyphens w:val="true"/>
+        <w:bidi w:val="0"/>
         <w:spacing w:beforeAutospacing="0" w:before="0" w:afterAutospacing="0" w:after="0"/>
         <w:ind w:firstLine="75" w:start="270"/>
         <w:jc w:val="both"/>
         <w:textAlignment w:val="baseline"/>
+        <w:rPr/>
+      </w:pPr>
+      <w:r>
         <w:rPr>
           <w:rStyle w:val="normaltextrun"/>
-          <w:lang w:val="sk-SK"/>
-        </w:rPr>
-      </w:pPr>
-      <w:r>
-        <w:rPr>
-          <w:rStyle w:val="normaltextrun"/>
-          <w:lang w:val="sk-SK"/>
-        </w:rPr>
-        <w:t>[3</w:t>
-      </w:r>
-      <w:r>
-        <w:rPr>
-          <w:rStyle w:val="normaltextrun"/>
-          <w:lang w:val="sk-SK"/>
-        </w:rPr>
-        <w:t>6</w:t>
-      </w:r>
-      <w:r>
-        <w:rPr>
-          <w:rStyle w:val="normaltextrun"/>
-          <w:lang w:val="sk-SK"/>
-        </w:rPr>
-        <w:t>] C. H. Lee, L. R. Rabiner, R. Pieraccini, and J. G. Wilpon, “Acoustic Modeling for Large Vocabulary Speech Recognition,” Computer Speech and Language, 4: 127–165, 1990.</w:t>
+          <w:rFonts w:eastAsia="Times New Roman" w:cs="Times New Roman"/>
+          <w:color w:val="auto"/>
+          <w:kern w:val="0"/>
+          <w:sz w:val="24"/>
+          <w:szCs w:val="24"/>
+          <w:lang w:val="sk-SK" w:bidi="ar-SA"/>
+        </w:rPr>
+        <w:t>[20] F. Jelinek, L. R. Bahl, and R. L. Mercer, “Design of a Linguistic Statistical Decoder for the Recognition of Continuous Speech,” IEEE Trans. Information Theory, IT-21: 250–256, 1975.</w:t>
       </w:r>
     </w:p>
     <w:p>
       <w:pPr>
         <w:pStyle w:val="paragraph"/>
+        <w:widowControl/>
+        <w:suppressAutoHyphens w:val="true"/>
+        <w:bidi w:val="0"/>
         <w:spacing w:beforeAutospacing="0" w:before="0" w:afterAutospacing="0" w:after="0"/>
         <w:ind w:firstLine="75" w:start="270"/>
         <w:jc w:val="both"/>
         <w:textAlignment w:val="baseline"/>
         <w:rPr>
+          <w:lang w:val="sk-SK"/>
+        </w:rPr>
+      </w:pPr>
+      <w:r>
+        <w:rPr>
+          <w:lang w:val="sk-SK"/>
+        </w:rPr>
+      </w:r>
+    </w:p>
+    <w:p>
+      <w:pPr>
+        <w:pStyle w:val="paragraph"/>
+        <w:widowControl/>
+        <w:suppressAutoHyphens w:val="true"/>
+        <w:bidi w:val="0"/>
+        <w:spacing w:beforeAutospacing="0" w:before="0" w:afterAutospacing="0" w:after="0"/>
+        <w:ind w:firstLine="75" w:start="270"/>
+        <w:jc w:val="both"/>
+        <w:textAlignment w:val="baseline"/>
+        <w:rPr/>
+      </w:pPr>
+      <w:r>
+        <w:rPr>
           <w:rStyle w:val="normaltextrun"/>
-          <w:lang w:val="sk-SK"/>
-        </w:rPr>
-      </w:pPr>
-      <w:r>
-        <w:rPr>
-          <w:lang w:val="sk-SK"/>
-        </w:rPr>
-      </w:r>
-    </w:p>
-    <w:p>
-      <w:pPr>
-        <w:pStyle w:val="PouitzdrojeLiterature"/>
-        <w:rPr>
-          <w:lang w:val="sk-SK"/>
-        </w:rPr>
-      </w:pPr>
-      <w:r>
-        <w:rPr>
-          <w:lang w:val="sk-SK"/>
-        </w:rPr>
-        <w:t>TODO Vyhľadať viac online</w:t>
-      </w:r>
-    </w:p>
-    <w:p>
-      <w:pPr>
-        <w:pStyle w:val="PouitzdrojeLiterature"/>
+          <w:rFonts w:eastAsia="Times New Roman" w:cs="Times New Roman"/>
+          <w:color w:val="auto"/>
+          <w:kern w:val="0"/>
+          <w:sz w:val="24"/>
+          <w:szCs w:val="24"/>
+          <w:lang w:val="sk-SK" w:bidi="ar-SA"/>
+        </w:rPr>
+        <w:t>[21] F. Jelinek, “The Development of an Experimental Discrete Dictation Recognizer,” Proc. IEEE, 73 (11): 1616–1624, 1985.</w:t>
+      </w:r>
+    </w:p>
+    <w:p>
+      <w:pPr>
+        <w:pStyle w:val="paragraph"/>
+        <w:widowControl/>
+        <w:suppressAutoHyphens w:val="true"/>
+        <w:bidi w:val="0"/>
+        <w:spacing w:beforeAutospacing="0" w:before="0" w:afterAutospacing="0" w:after="0"/>
+        <w:ind w:firstLine="75" w:start="270"/>
+        <w:jc w:val="both"/>
+        <w:textAlignment w:val="baseline"/>
+        <w:rPr>
+          <w:lang w:val="sk-SK"/>
+        </w:rPr>
+      </w:pPr>
+      <w:r>
+        <w:rPr>
+          <w:lang w:val="sk-SK"/>
+        </w:rPr>
+      </w:r>
+    </w:p>
+    <w:p>
+      <w:pPr>
+        <w:pStyle w:val="paragraph"/>
+        <w:widowControl/>
+        <w:suppressAutoHyphens w:val="true"/>
+        <w:bidi w:val="0"/>
+        <w:spacing w:beforeAutospacing="0" w:before="0" w:afterAutospacing="0" w:after="0"/>
+        <w:ind w:firstLine="75" w:start="270"/>
+        <w:jc w:val="both"/>
+        <w:textAlignment w:val="baseline"/>
+        <w:rPr/>
+      </w:pPr>
+      <w:r>
+        <w:rPr>
+          <w:rStyle w:val="normaltextrun"/>
+          <w:rFonts w:eastAsia="Times New Roman" w:cs="Times New Roman"/>
+          <w:color w:val="auto"/>
+          <w:kern w:val="0"/>
+          <w:sz w:val="24"/>
+          <w:szCs w:val="24"/>
+          <w:lang w:val="sk-SK" w:bidi="ar-SA"/>
+        </w:rPr>
+        <w:t>[22] L. R. Rabiner, S. E. Levinson, A. E. Rosenberg, and J. G. Wilpon, “Speaker Independent Recognition of Isolated Words Using Clustering Techniques,” IEEE Trans. Acoustics, Speech, Signal Proc., ASSP-27: 336–349, August 1979.</w:t>
+      </w:r>
+    </w:p>
+    <w:p>
+      <w:pPr>
+        <w:pStyle w:val="paragraph"/>
+        <w:widowControl/>
+        <w:suppressAutoHyphens w:val="true"/>
+        <w:bidi w:val="0"/>
+        <w:spacing w:beforeAutospacing="0" w:before="0" w:afterAutospacing="0" w:after="0"/>
+        <w:ind w:firstLine="75" w:start="270"/>
+        <w:jc w:val="both"/>
+        <w:textAlignment w:val="baseline"/>
+        <w:rPr>
+          <w:lang w:val="sk-SK"/>
+        </w:rPr>
+      </w:pPr>
+      <w:r>
+        <w:rPr>
+          <w:lang w:val="sk-SK"/>
+        </w:rPr>
+      </w:r>
+    </w:p>
+    <w:p>
+      <w:pPr>
+        <w:pStyle w:val="paragraph"/>
+        <w:widowControl/>
+        <w:suppressAutoHyphens w:val="true"/>
+        <w:bidi w:val="0"/>
+        <w:spacing w:beforeAutospacing="0" w:before="0" w:afterAutospacing="0" w:after="0"/>
+        <w:ind w:firstLine="75" w:start="270"/>
+        <w:jc w:val="both"/>
+        <w:textAlignment w:val="baseline"/>
+        <w:rPr/>
+      </w:pPr>
+      <w:r>
+        <w:rPr>
+          <w:rStyle w:val="normaltextrun"/>
+          <w:rFonts w:eastAsia="Times New Roman" w:cs="Times New Roman"/>
+          <w:color w:val="auto"/>
+          <w:kern w:val="0"/>
+          <w:sz w:val="24"/>
+          <w:szCs w:val="24"/>
+          <w:lang w:val="sk-SK" w:bidi="ar-SA"/>
+        </w:rPr>
+        <w:t>[23] H. Sakoe, “Two Level DP Matching—A Dynamic Programming Based Pattern Matching Algorithm for Connected Word Recognition,” IEEE Trans. Acoustics, Speech, Signal Proc., ASSP-27: 588–595, December 1979.</w:t>
+      </w:r>
+    </w:p>
+    <w:p>
+      <w:pPr>
+        <w:pStyle w:val="paragraph"/>
+        <w:widowControl/>
+        <w:suppressAutoHyphens w:val="true"/>
+        <w:bidi w:val="0"/>
+        <w:spacing w:beforeAutospacing="0" w:before="0" w:afterAutospacing="0" w:after="0"/>
+        <w:ind w:firstLine="75" w:start="270"/>
+        <w:jc w:val="both"/>
+        <w:textAlignment w:val="baseline"/>
+        <w:rPr>
+          <w:lang w:val="sk-SK"/>
+        </w:rPr>
+      </w:pPr>
+      <w:r>
+        <w:rPr>
+          <w:lang w:val="sk-SK"/>
+        </w:rPr>
+      </w:r>
+    </w:p>
+    <w:p>
+      <w:pPr>
+        <w:pStyle w:val="paragraph"/>
+        <w:widowControl/>
+        <w:suppressAutoHyphens w:val="true"/>
+        <w:bidi w:val="0"/>
+        <w:spacing w:beforeAutospacing="0" w:before="0" w:afterAutospacing="0" w:after="0"/>
+        <w:ind w:firstLine="75" w:start="270"/>
+        <w:jc w:val="both"/>
+        <w:textAlignment w:val="baseline"/>
+        <w:rPr/>
+      </w:pPr>
+      <w:r>
+        <w:rPr>
+          <w:rStyle w:val="normaltextrun"/>
+          <w:rFonts w:eastAsia="Times New Roman" w:cs="Times New Roman"/>
+          <w:color w:val="auto"/>
+          <w:kern w:val="0"/>
+          <w:sz w:val="24"/>
+          <w:szCs w:val="24"/>
+          <w:lang w:val="sk-SK" w:bidi="ar-SA"/>
+        </w:rPr>
+        <w:t>[24] J. S. Bridle and M. D. Brown, “Connected Word Recognition Using Whole Word Templates,” Proc. Inst. Acoust. Autumn Conf., 25–28, November 1979.</w:t>
+      </w:r>
+    </w:p>
+    <w:p>
+      <w:pPr>
+        <w:pStyle w:val="paragraph"/>
+        <w:widowControl/>
+        <w:suppressAutoHyphens w:val="true"/>
+        <w:bidi w:val="0"/>
+        <w:spacing w:beforeAutospacing="0" w:before="0" w:afterAutospacing="0" w:after="0"/>
+        <w:ind w:firstLine="75" w:start="270"/>
+        <w:jc w:val="both"/>
+        <w:textAlignment w:val="baseline"/>
+        <w:rPr>
+          <w:lang w:val="sk-SK"/>
+        </w:rPr>
+      </w:pPr>
+      <w:r>
+        <w:rPr>
+          <w:lang w:val="sk-SK"/>
+        </w:rPr>
+      </w:r>
+    </w:p>
+    <w:p>
+      <w:pPr>
+        <w:pStyle w:val="paragraph"/>
+        <w:widowControl/>
+        <w:suppressAutoHyphens w:val="true"/>
+        <w:bidi w:val="0"/>
+        <w:spacing w:beforeAutospacing="0" w:before="0" w:afterAutospacing="0" w:after="0"/>
+        <w:ind w:firstLine="75" w:start="270"/>
+        <w:jc w:val="both"/>
+        <w:textAlignment w:val="baseline"/>
+        <w:rPr/>
+      </w:pPr>
+      <w:r>
+        <w:rPr>
+          <w:rStyle w:val="normaltextrun"/>
+          <w:rFonts w:eastAsia="Times New Roman" w:cs="Times New Roman"/>
+          <w:color w:val="auto"/>
+          <w:kern w:val="0"/>
+          <w:sz w:val="24"/>
+          <w:szCs w:val="24"/>
+          <w:lang w:val="sk-SK" w:bidi="ar-SA"/>
+        </w:rPr>
+        <w:t>[25] C. S. Myers and L. R. Rabiner, “A Level Building Dynamic Time Warping Algorithm for Connected Word Recognition,” IEEE Trans. Acoustics, Speech, Signal Proc., ASSP-29: 284–297, April 1981.</w:t>
+      </w:r>
+    </w:p>
+    <w:p>
+      <w:pPr>
+        <w:pStyle w:val="paragraph"/>
+        <w:widowControl/>
+        <w:suppressAutoHyphens w:val="true"/>
+        <w:bidi w:val="0"/>
+        <w:spacing w:beforeAutospacing="0" w:before="0" w:afterAutospacing="0" w:after="0"/>
+        <w:ind w:firstLine="75" w:start="270"/>
+        <w:jc w:val="both"/>
+        <w:textAlignment w:val="baseline"/>
+        <w:rPr>
+          <w:lang w:val="sk-SK"/>
+        </w:rPr>
+      </w:pPr>
+      <w:r>
+        <w:rPr>
+          <w:lang w:val="sk-SK"/>
+        </w:rPr>
+      </w:r>
+    </w:p>
+    <w:p>
+      <w:pPr>
+        <w:pStyle w:val="paragraph"/>
+        <w:widowControl/>
+        <w:suppressAutoHyphens w:val="true"/>
+        <w:bidi w:val="0"/>
+        <w:spacing w:beforeAutospacing="0" w:before="0" w:afterAutospacing="0" w:after="0"/>
+        <w:ind w:firstLine="75" w:start="270"/>
+        <w:jc w:val="both"/>
+        <w:textAlignment w:val="baseline"/>
+        <w:rPr/>
+      </w:pPr>
+      <w:r>
+        <w:rPr>
+          <w:rStyle w:val="normaltextrun"/>
+          <w:rFonts w:eastAsia="Times New Roman" w:cs="Times New Roman"/>
+          <w:color w:val="auto"/>
+          <w:kern w:val="0"/>
+          <w:sz w:val="24"/>
+          <w:szCs w:val="24"/>
+          <w:lang w:val="sk-SK" w:bidi="ar-SA"/>
+        </w:rPr>
+        <w:t>[26] C. H. Lee and L. R. Rabiner, “A Frame Synchronous Network Search Algorithm for Connected Word Recognition,” IEEE Trans. Acoustics, Speech, Signal Proc., 37 (11): 1649–1658, November 1989.</w:t>
+      </w:r>
+    </w:p>
+    <w:p>
+      <w:pPr>
+        <w:pStyle w:val="paragraph"/>
+        <w:widowControl/>
+        <w:suppressAutoHyphens w:val="true"/>
+        <w:bidi w:val="0"/>
+        <w:spacing w:beforeAutospacing="0" w:before="0" w:afterAutospacing="0" w:after="0"/>
+        <w:ind w:firstLine="75" w:start="270"/>
+        <w:jc w:val="both"/>
+        <w:textAlignment w:val="baseline"/>
+        <w:rPr>
+          <w:lang w:val="sk-SK"/>
+        </w:rPr>
+      </w:pPr>
+      <w:r>
+        <w:rPr>
+          <w:lang w:val="sk-SK"/>
+        </w:rPr>
+      </w:r>
+    </w:p>
+    <w:p>
+      <w:pPr>
+        <w:pStyle w:val="paragraph"/>
+        <w:widowControl/>
+        <w:suppressAutoHyphens w:val="true"/>
+        <w:bidi w:val="0"/>
+        <w:spacing w:beforeAutospacing="0" w:before="0" w:afterAutospacing="0" w:after="0"/>
+        <w:ind w:firstLine="75" w:start="270"/>
+        <w:jc w:val="both"/>
+        <w:textAlignment w:val="baseline"/>
+        <w:rPr/>
+      </w:pPr>
+      <w:r>
+        <w:rPr>
+          <w:rStyle w:val="normaltextrun"/>
+          <w:rFonts w:eastAsia="Times New Roman" w:cs="Times New Roman"/>
+          <w:color w:val="auto"/>
+          <w:kern w:val="0"/>
+          <w:sz w:val="24"/>
+          <w:szCs w:val="24"/>
+          <w:lang w:val="sk-SK" w:bidi="ar-SA"/>
+        </w:rPr>
+        <w:t>[27] J. Ferguson, Ed., Hidden Markov Models for Speech, IDA, Princeton, NJ, 1980.</w:t>
+      </w:r>
+    </w:p>
+    <w:p>
+      <w:pPr>
+        <w:pStyle w:val="paragraph"/>
+        <w:widowControl/>
+        <w:suppressAutoHyphens w:val="true"/>
+        <w:bidi w:val="0"/>
+        <w:spacing w:beforeAutospacing="0" w:before="0" w:afterAutospacing="0" w:after="0"/>
+        <w:ind w:firstLine="75" w:start="270"/>
+        <w:jc w:val="both"/>
+        <w:textAlignment w:val="baseline"/>
+        <w:rPr>
+          <w:lang w:val="sk-SK"/>
+        </w:rPr>
+      </w:pPr>
+      <w:r>
+        <w:rPr>
+          <w:lang w:val="sk-SK"/>
+        </w:rPr>
+      </w:r>
+    </w:p>
+    <w:p>
+      <w:pPr>
+        <w:pStyle w:val="paragraph"/>
+        <w:widowControl/>
+        <w:suppressAutoHyphens w:val="true"/>
+        <w:bidi w:val="0"/>
+        <w:spacing w:beforeAutospacing="0" w:before="0" w:afterAutospacing="0" w:after="0"/>
+        <w:ind w:firstLine="75" w:start="270"/>
+        <w:jc w:val="both"/>
+        <w:textAlignment w:val="baseline"/>
+        <w:rPr/>
+      </w:pPr>
+      <w:r>
+        <w:rPr>
+          <w:rStyle w:val="normaltextrun"/>
+          <w:rFonts w:eastAsia="Times New Roman" w:cs="Times New Roman"/>
+          <w:color w:val="auto"/>
+          <w:kern w:val="0"/>
+          <w:sz w:val="24"/>
+          <w:szCs w:val="24"/>
+          <w:lang w:val="sk-SK" w:bidi="ar-SA"/>
+        </w:rPr>
+        <w:t>[28] L. R. Rabiner, “A Tutorial on Hidden Markov Models and Selected Applications in Speech Recognition,” Proc. IEEE, 77 (2): 257–286, February 1989.</w:t>
+      </w:r>
+    </w:p>
+    <w:p>
+      <w:pPr>
+        <w:pStyle w:val="paragraph"/>
+        <w:widowControl/>
+        <w:suppressAutoHyphens w:val="true"/>
+        <w:bidi w:val="0"/>
+        <w:spacing w:beforeAutospacing="0" w:before="0" w:afterAutospacing="0" w:after="0"/>
+        <w:ind w:firstLine="75" w:start="270"/>
+        <w:jc w:val="both"/>
+        <w:textAlignment w:val="baseline"/>
+        <w:rPr>
+          <w:lang w:val="sk-SK"/>
+        </w:rPr>
+      </w:pPr>
+      <w:r>
+        <w:rPr>
+          <w:lang w:val="sk-SK"/>
+        </w:rPr>
+      </w:r>
+    </w:p>
+    <w:p>
+      <w:pPr>
+        <w:pStyle w:val="paragraph"/>
+        <w:widowControl/>
+        <w:suppressAutoHyphens w:val="true"/>
+        <w:bidi w:val="0"/>
+        <w:spacing w:beforeAutospacing="0" w:before="0" w:afterAutospacing="0" w:after="0"/>
+        <w:ind w:firstLine="75" w:start="270"/>
+        <w:jc w:val="both"/>
+        <w:textAlignment w:val="baseline"/>
+        <w:rPr/>
+      </w:pPr>
+      <w:r>
+        <w:rPr>
+          <w:rStyle w:val="normaltextrun"/>
+          <w:rFonts w:eastAsia="Times New Roman" w:cs="Times New Roman"/>
+          <w:color w:val="auto"/>
+          <w:kern w:val="0"/>
+          <w:sz w:val="24"/>
+          <w:szCs w:val="24"/>
+          <w:lang w:val="sk-SK" w:bidi="ar-SA"/>
+        </w:rPr>
+        <w:t>[29] R. P. Lippmann, “An Introduction to Computing with Neural Nets,” IEEE ASSP Mag., 4 (2): 4–22, April 1987.</w:t>
+      </w:r>
+    </w:p>
+    <w:p>
+      <w:pPr>
+        <w:pStyle w:val="paragraph"/>
+        <w:widowControl/>
+        <w:suppressAutoHyphens w:val="true"/>
+        <w:bidi w:val="0"/>
+        <w:spacing w:beforeAutospacing="0" w:before="0" w:afterAutospacing="0" w:after="0"/>
+        <w:ind w:firstLine="75" w:start="270"/>
+        <w:jc w:val="both"/>
+        <w:textAlignment w:val="baseline"/>
+        <w:rPr>
+          <w:lang w:val="sk-SK"/>
+        </w:rPr>
+      </w:pPr>
+      <w:r>
+        <w:rPr>
+          <w:lang w:val="sk-SK"/>
+        </w:rPr>
+      </w:r>
+    </w:p>
+    <w:p>
+      <w:pPr>
+        <w:pStyle w:val="paragraph"/>
+        <w:widowControl/>
+        <w:suppressAutoHyphens w:val="true"/>
+        <w:bidi w:val="0"/>
+        <w:spacing w:beforeAutospacing="0" w:before="0" w:afterAutospacing="0" w:after="0"/>
+        <w:ind w:firstLine="75" w:start="270"/>
+        <w:jc w:val="both"/>
+        <w:textAlignment w:val="baseline"/>
+        <w:rPr/>
+      </w:pPr>
+      <w:r>
+        <w:rPr>
+          <w:rStyle w:val="normaltextrun"/>
+          <w:rFonts w:eastAsia="Times New Roman" w:cs="Times New Roman"/>
+          <w:color w:val="auto"/>
+          <w:kern w:val="0"/>
+          <w:sz w:val="24"/>
+          <w:szCs w:val="24"/>
+          <w:lang w:val="sk-SK" w:bidi="ar-SA"/>
+        </w:rPr>
+        <w:t>[30] A. Weibel, T. Hanazawa, G. Hinton, K. Shikano, and K. Lang, “Phoneme Recognition Using Time-Delay Neural Networks,” IEEE Trans. Acoustics, Speech, Signal Proc., 37: 393–404, 1989.</w:t>
+      </w:r>
+    </w:p>
+    <w:p>
+      <w:pPr>
+        <w:pStyle w:val="paragraph"/>
+        <w:widowControl/>
+        <w:suppressAutoHyphens w:val="true"/>
+        <w:bidi w:val="0"/>
+        <w:spacing w:beforeAutospacing="0" w:before="0" w:afterAutospacing="0" w:after="0"/>
+        <w:ind w:firstLine="75" w:start="270"/>
+        <w:jc w:val="both"/>
+        <w:textAlignment w:val="baseline"/>
+        <w:rPr>
+          <w:lang w:val="sk-SK"/>
+        </w:rPr>
+      </w:pPr>
+      <w:r>
+        <w:rPr>
+          <w:lang w:val="sk-SK"/>
+        </w:rPr>
+      </w:r>
+    </w:p>
+    <w:p>
+      <w:pPr>
+        <w:pStyle w:val="paragraph"/>
+        <w:widowControl/>
+        <w:suppressAutoHyphens w:val="true"/>
+        <w:bidi w:val="0"/>
+        <w:spacing w:beforeAutospacing="0" w:before="0" w:afterAutospacing="0" w:after="0"/>
+        <w:ind w:firstLine="75" w:start="270"/>
+        <w:jc w:val="both"/>
+        <w:textAlignment w:val="baseline"/>
+        <w:rPr/>
+      </w:pPr>
+      <w:r>
+        <w:rPr>
+          <w:rStyle w:val="normaltextrun"/>
+          <w:rFonts w:eastAsia="Times New Roman" w:cs="Times New Roman"/>
+          <w:color w:val="auto"/>
+          <w:kern w:val="0"/>
+          <w:sz w:val="24"/>
+          <w:szCs w:val="24"/>
+          <w:lang w:val="sk-SK" w:bidi="ar-SA"/>
+        </w:rPr>
+        <w:t>[31] K. F. Lee, H. W. Hon, and D. R. Reddy, “An Overview of the SPHINX Speech Recognition System,” IEEE Trans. Acoustics, Speech, Signal Proc., 38: 600–610, 1990.</w:t>
+      </w:r>
+    </w:p>
+    <w:p>
+      <w:pPr>
+        <w:pStyle w:val="paragraph"/>
+        <w:widowControl/>
+        <w:suppressAutoHyphens w:val="true"/>
+        <w:bidi w:val="0"/>
+        <w:spacing w:beforeAutospacing="0" w:before="0" w:afterAutospacing="0" w:after="0"/>
+        <w:ind w:firstLine="75" w:start="270"/>
+        <w:jc w:val="both"/>
+        <w:textAlignment w:val="baseline"/>
+        <w:rPr>
+          <w:lang w:val="sk-SK"/>
+        </w:rPr>
+      </w:pPr>
+      <w:r>
+        <w:rPr>
+          <w:lang w:val="sk-SK"/>
+        </w:rPr>
+      </w:r>
+    </w:p>
+    <w:p>
+      <w:pPr>
+        <w:pStyle w:val="paragraph"/>
+        <w:widowControl/>
+        <w:suppressAutoHyphens w:val="true"/>
+        <w:bidi w:val="0"/>
+        <w:spacing w:beforeAutospacing="0" w:before="0" w:afterAutospacing="0" w:after="0"/>
+        <w:ind w:firstLine="75" w:start="270"/>
+        <w:jc w:val="both"/>
+        <w:textAlignment w:val="baseline"/>
+        <w:rPr/>
+      </w:pPr>
+      <w:r>
+        <w:rPr>
+          <w:rStyle w:val="normaltextrun"/>
+          <w:rFonts w:eastAsia="Times New Roman" w:cs="Times New Roman"/>
+          <w:color w:val="auto"/>
+          <w:kern w:val="0"/>
+          <w:sz w:val="24"/>
+          <w:szCs w:val="24"/>
+          <w:lang w:val="sk-SK" w:bidi="ar-SA"/>
+        </w:rPr>
+        <w:t>[32] Y. L. Chow, M. O. Dunham, O. A. Kimball, M. A. Krasner, G. F. Kubala, J. Makhoul, S. Roucos, and R. M. Schwartz, “BYBLOS: The BBN Continuous Speech Recognition System,” Proc. ICASSP 87, 89–92, April 1987.</w:t>
+      </w:r>
+    </w:p>
+    <w:p>
+      <w:pPr>
+        <w:pStyle w:val="paragraph"/>
+        <w:widowControl/>
+        <w:suppressAutoHyphens w:val="true"/>
+        <w:bidi w:val="0"/>
+        <w:spacing w:beforeAutospacing="0" w:before="0" w:afterAutospacing="0" w:after="0"/>
+        <w:ind w:firstLine="75" w:start="270"/>
+        <w:jc w:val="both"/>
+        <w:textAlignment w:val="baseline"/>
+        <w:rPr>
+          <w:lang w:val="sk-SK"/>
+        </w:rPr>
+      </w:pPr>
+      <w:r>
+        <w:rPr>
+          <w:lang w:val="sk-SK"/>
+        </w:rPr>
+      </w:r>
+    </w:p>
+    <w:p>
+      <w:pPr>
+        <w:pStyle w:val="paragraph"/>
+        <w:widowControl/>
+        <w:suppressAutoHyphens w:val="true"/>
+        <w:bidi w:val="0"/>
+        <w:spacing w:beforeAutospacing="0" w:before="0" w:afterAutospacing="0" w:after="0"/>
+        <w:ind w:firstLine="75" w:start="270"/>
+        <w:jc w:val="both"/>
+        <w:textAlignment w:val="baseline"/>
+        <w:rPr/>
+      </w:pPr>
+      <w:r>
+        <w:rPr>
+          <w:rStyle w:val="normaltextrun"/>
+          <w:rFonts w:eastAsia="Times New Roman" w:cs="Times New Roman"/>
+          <w:color w:val="auto"/>
+          <w:kern w:val="0"/>
+          <w:sz w:val="24"/>
+          <w:szCs w:val="24"/>
+          <w:lang w:val="sk-SK" w:bidi="ar-SA"/>
+        </w:rPr>
+        <w:t>[33] D. B. Paul, “The Lincoln Robust Continuous Speech Recognizer,” Proc. ICASSP 89, Glasgow, Scotland, 449–452, May 1989.</w:t>
+      </w:r>
+    </w:p>
+    <w:p>
+      <w:pPr>
+        <w:pStyle w:val="paragraph"/>
+        <w:widowControl/>
+        <w:suppressAutoHyphens w:val="true"/>
+        <w:bidi w:val="0"/>
+        <w:spacing w:beforeAutospacing="0" w:before="0" w:afterAutospacing="0" w:after="0"/>
+        <w:ind w:firstLine="75" w:start="270"/>
+        <w:jc w:val="both"/>
+        <w:textAlignment w:val="baseline"/>
+        <w:rPr>
+          <w:lang w:val="sk-SK"/>
+        </w:rPr>
+      </w:pPr>
+      <w:r>
+        <w:rPr>
+          <w:lang w:val="sk-SK"/>
+        </w:rPr>
+      </w:r>
+    </w:p>
+    <w:p>
+      <w:pPr>
+        <w:pStyle w:val="paragraph"/>
+        <w:widowControl/>
+        <w:suppressAutoHyphens w:val="true"/>
+        <w:bidi w:val="0"/>
+        <w:spacing w:beforeAutospacing="0" w:before="0" w:afterAutospacing="0" w:after="0"/>
+        <w:ind w:firstLine="75" w:start="270"/>
+        <w:jc w:val="both"/>
+        <w:textAlignment w:val="baseline"/>
+        <w:rPr/>
+      </w:pPr>
+      <w:r>
+        <w:rPr>
+          <w:rStyle w:val="normaltextrun"/>
+          <w:rFonts w:eastAsia="Times New Roman" w:cs="Times New Roman"/>
+          <w:color w:val="auto"/>
+          <w:kern w:val="0"/>
+          <w:sz w:val="24"/>
+          <w:szCs w:val="24"/>
+          <w:lang w:val="sk-SK" w:bidi="ar-SA"/>
+        </w:rPr>
+        <w:t>[34] M. Weintraub et al., “Linguistic Constraints in Hidden Markov Model Based Speech Recognition,” Proc. ICASSP 89, Glasgow, Scotland, 699–702, May 1989.</w:t>
+      </w:r>
+    </w:p>
+    <w:p>
+      <w:pPr>
+        <w:pStyle w:val="paragraph"/>
+        <w:widowControl/>
+        <w:suppressAutoHyphens w:val="true"/>
+        <w:bidi w:val="0"/>
+        <w:spacing w:beforeAutospacing="0" w:before="0" w:afterAutospacing="0" w:after="0"/>
+        <w:ind w:firstLine="75" w:start="270"/>
+        <w:jc w:val="both"/>
+        <w:textAlignment w:val="baseline"/>
+        <w:rPr>
+          <w:lang w:val="sk-SK"/>
+        </w:rPr>
+      </w:pPr>
+      <w:r>
+        <w:rPr>
+          <w:lang w:val="sk-SK"/>
+        </w:rPr>
+      </w:r>
+    </w:p>
+    <w:p>
+      <w:pPr>
+        <w:pStyle w:val="paragraph"/>
+        <w:widowControl/>
+        <w:suppressAutoHyphens w:val="true"/>
+        <w:bidi w:val="0"/>
+        <w:spacing w:beforeAutospacing="0" w:before="0" w:afterAutospacing="0" w:after="0"/>
+        <w:ind w:firstLine="75" w:start="270"/>
+        <w:jc w:val="both"/>
+        <w:textAlignment w:val="baseline"/>
+        <w:rPr/>
+      </w:pPr>
+      <w:r>
+        <w:rPr>
+          <w:rStyle w:val="normaltextrun"/>
+          <w:rFonts w:eastAsia="Times New Roman" w:cs="Times New Roman"/>
+          <w:color w:val="auto"/>
+          <w:kern w:val="0"/>
+          <w:sz w:val="24"/>
+          <w:szCs w:val="24"/>
+          <w:lang w:val="sk-SK" w:bidi="ar-SA"/>
+        </w:rPr>
+        <w:t>[35] V. Zue, J. Glass, M. Phillips, and S. Seneff, “The MIT Summit Speech Recognition System: A Progress Report,” Proc. DARPA Speech and Natural Language Workshop, 179–189, February 1989.</w:t>
+      </w:r>
+    </w:p>
+    <w:p>
+      <w:pPr>
+        <w:pStyle w:val="paragraph"/>
+        <w:widowControl/>
+        <w:suppressAutoHyphens w:val="true"/>
+        <w:bidi w:val="0"/>
+        <w:spacing w:beforeAutospacing="0" w:before="0" w:afterAutospacing="0" w:after="0"/>
+        <w:ind w:firstLine="75" w:start="270"/>
+        <w:jc w:val="both"/>
+        <w:textAlignment w:val="baseline"/>
+        <w:rPr>
+          <w:lang w:val="sk-SK"/>
+        </w:rPr>
+      </w:pPr>
+      <w:r>
+        <w:rPr>
+          <w:lang w:val="sk-SK"/>
+        </w:rPr>
+      </w:r>
+    </w:p>
+    <w:p>
+      <w:pPr>
+        <w:pStyle w:val="paragraph"/>
+        <w:widowControl/>
+        <w:suppressAutoHyphens w:val="true"/>
+        <w:bidi w:val="0"/>
+        <w:spacing w:beforeAutospacing="0" w:before="0" w:afterAutospacing="0" w:after="0"/>
+        <w:ind w:firstLine="75" w:start="270"/>
+        <w:jc w:val="both"/>
+        <w:textAlignment w:val="baseline"/>
+        <w:rPr>
+          <w:rStyle w:val="normaltextrun"/>
+          <w:lang w:val="sk-SK"/>
+        </w:rPr>
+      </w:pPr>
+      <w:r>
+        <w:rPr>
+          <w:rStyle w:val="normaltextrun"/>
+          <w:lang w:val="sk-SK"/>
+        </w:rPr>
+        <w:t>[36] C. H. Lee, L. R. Rabiner, R. Pieraccini, and J. G. Wilpon, “Acoustic Modeling for Large Vocabulary</w:t>
+      </w:r>
+      <w:r>
+        <w:rPr>
+          <w:rStyle w:val="normaltextrun"/>
+          <w:rFonts w:eastAsia="Times New Roman" w:cs="Times New Roman"/>
+          <w:color w:val="auto"/>
+          <w:kern w:val="0"/>
+          <w:sz w:val="24"/>
+          <w:szCs w:val="24"/>
+          <w:lang w:val="sk-SK" w:bidi="ar-SA"/>
+        </w:rPr>
+        <w:t xml:space="preserve"> Speech Recognition,” Computer Speech and Language, 4: 127–165, 1990.</w:t>
+      </w:r>
+    </w:p>
+    <w:p>
+      <w:pPr>
+        <w:pStyle w:val="paragraph"/>
+        <w:widowControl/>
+        <w:suppressAutoHyphens w:val="true"/>
+        <w:bidi w:val="0"/>
+        <w:spacing w:beforeAutospacing="0" w:before="0" w:afterAutospacing="0" w:after="0"/>
+        <w:ind w:firstLine="75" w:start="270"/>
+        <w:jc w:val="both"/>
+        <w:textAlignment w:val="baseline"/>
+        <w:rPr>
+          <w:lang w:val="sk-SK"/>
+        </w:rPr>
+      </w:pPr>
+      <w:r>
+        <w:rPr>
+          <w:lang w:val="sk-SK"/>
+        </w:rPr>
+      </w:r>
+    </w:p>
+    <w:p>
+      <w:pPr>
+        <w:pStyle w:val="paragraph"/>
+        <w:widowControl/>
+        <w:suppressAutoHyphens w:val="true"/>
+        <w:bidi w:val="0"/>
+        <w:spacing w:beforeAutospacing="0" w:before="0" w:afterAutospacing="0" w:after="0"/>
+        <w:ind w:firstLine="75" w:start="270"/>
+        <w:jc w:val="both"/>
+        <w:textAlignment w:val="baseline"/>
+        <w:rPr/>
+      </w:pPr>
+      <w:r>
+        <w:rPr>
+          <w:rStyle w:val="normaltextrun"/>
+          <w:rFonts w:eastAsia="Times New Roman" w:cs="Times New Roman"/>
+          <w:color w:val="auto"/>
+          <w:kern w:val="0"/>
+          <w:sz w:val="24"/>
+          <w:szCs w:val="24"/>
+          <w:lang w:val="sk-SK" w:bidi="ar-SA"/>
+        </w:rPr>
+        <w:t>[37] DENG, Li; HINTON, Geoffrey; KINGSBURY, Brian. New types of deep neural network learning for speech recognition and related applications: An overview. In: IEEE International Conference on Acoustics, Speech and Signal Processing. 2013, s. 8599–8603.</w:t>
+      </w:r>
+    </w:p>
+    <w:p>
+      <w:pPr>
+        <w:pStyle w:val="paragraph"/>
+        <w:widowControl/>
+        <w:suppressAutoHyphens w:val="true"/>
+        <w:bidi w:val="0"/>
+        <w:spacing w:beforeAutospacing="0" w:before="0" w:afterAutospacing="0" w:after="0"/>
+        <w:ind w:firstLine="75" w:start="270"/>
+        <w:jc w:val="both"/>
+        <w:textAlignment w:val="baseline"/>
+        <w:rPr>
+          <w:lang w:val="sk-SK"/>
+        </w:rPr>
+      </w:pPr>
+      <w:r>
+        <w:rPr>
+          <w:lang w:val="sk-SK"/>
+        </w:rPr>
+      </w:r>
+    </w:p>
+    <w:p>
+      <w:pPr>
+        <w:pStyle w:val="paragraph"/>
+        <w:widowControl/>
+        <w:suppressAutoHyphens w:val="true"/>
+        <w:bidi w:val="0"/>
+        <w:spacing w:beforeAutospacing="0" w:before="0" w:afterAutospacing="0" w:after="0"/>
+        <w:ind w:firstLine="75" w:start="270"/>
+        <w:jc w:val="both"/>
+        <w:textAlignment w:val="baseline"/>
+        <w:rPr>
+          <w:rStyle w:val="normaltextrun"/>
+          <w:lang w:val="sk-SK"/>
+        </w:rPr>
+      </w:pPr>
+      <w:r>
+        <w:rPr>
+          <w:rStyle w:val="normaltextrun"/>
+          <w:rFonts w:eastAsia="Times New Roman" w:cs="Times New Roman"/>
+          <w:color w:val="auto"/>
+          <w:kern w:val="0"/>
+          <w:sz w:val="24"/>
+          <w:szCs w:val="24"/>
+          <w:lang w:val="sk-SK" w:bidi="ar-SA"/>
+        </w:rPr>
+        <w:t>[38] MOHAMED, Abdel-rahman; DAHL, George E.; HINTON, Geoffrey. Acoustic modeling using deep belief networks. IEEE Transactions on Audio, Speech, and Language Processing. 2012, 20(1), s. 14–22.</w:t>
+      </w:r>
+    </w:p>
+    <w:p>
+      <w:pPr>
+        <w:pStyle w:val="paragraph"/>
+        <w:widowControl/>
+        <w:suppressAutoHyphens w:val="true"/>
+        <w:bidi w:val="0"/>
+        <w:spacing w:beforeAutospacing="0" w:before="0" w:afterAutospacing="0" w:after="0"/>
+        <w:ind w:firstLine="75" w:start="270"/>
+        <w:jc w:val="both"/>
+        <w:textAlignment w:val="baseline"/>
+        <w:rPr>
+          <w:lang w:val="sk-SK"/>
+        </w:rPr>
+      </w:pPr>
+      <w:r>
+        <w:rPr>
+          <w:lang w:val="sk-SK"/>
+        </w:rPr>
+      </w:r>
+    </w:p>
+    <w:p>
+      <w:pPr>
+        <w:pStyle w:val="paragraph"/>
+        <w:widowControl/>
+        <w:suppressAutoHyphens w:val="true"/>
+        <w:bidi w:val="0"/>
+        <w:spacing w:beforeAutospacing="0" w:before="0" w:afterAutospacing="0" w:after="0"/>
+        <w:ind w:firstLine="75" w:start="270"/>
+        <w:jc w:val="both"/>
+        <w:textAlignment w:val="baseline"/>
+        <w:rPr/>
+      </w:pPr>
+      <w:r>
+        <w:rPr>
+          <w:rStyle w:val="normaltextrun"/>
+          <w:rFonts w:eastAsia="Times New Roman" w:cs="Times New Roman"/>
+          <w:color w:val="auto"/>
+          <w:kern w:val="0"/>
+          <w:sz w:val="24"/>
+          <w:szCs w:val="24"/>
+          <w:lang w:val="sk-SK" w:bidi="ar-SA"/>
+        </w:rPr>
+        <w:t>[39] HINTON, Geoffrey; DENG, Li; YU, Dong; DAHL, George E.; MOHAMED, Abdel-rahman; JAITLY, Navdeep; SENIOR, Andrew; VANHOUCKE, Vincent; NGUYEN, Patrick; SAINATH, Tara N.; KINGSBURY, Brian. Deep neural networks for acoustic modeling in speech recognition. IEEE Signal Processing Magazine. 2012, 29(6), s. 82–97.</w:t>
+      </w:r>
+    </w:p>
+    <w:p>
+      <w:pPr>
+        <w:pStyle w:val="paragraph"/>
+        <w:widowControl/>
+        <w:suppressAutoHyphens w:val="true"/>
+        <w:bidi w:val="0"/>
+        <w:spacing w:beforeAutospacing="0" w:before="0" w:afterAutospacing="0" w:after="0"/>
+        <w:ind w:firstLine="75" w:start="270"/>
+        <w:jc w:val="both"/>
+        <w:textAlignment w:val="baseline"/>
+        <w:rPr>
+          <w:lang w:val="sk-SK"/>
+        </w:rPr>
+      </w:pPr>
+      <w:r>
+        <w:rPr>
+          <w:lang w:val="sk-SK"/>
+        </w:rPr>
+      </w:r>
+    </w:p>
+    <w:p>
+      <w:pPr>
+        <w:pStyle w:val="paragraph"/>
+        <w:widowControl/>
+        <w:suppressAutoHyphens w:val="true"/>
+        <w:bidi w:val="0"/>
+        <w:spacing w:beforeAutospacing="0" w:before="0" w:afterAutospacing="0" w:after="0"/>
+        <w:ind w:firstLine="75" w:start="270"/>
+        <w:jc w:val="both"/>
+        <w:textAlignment w:val="baseline"/>
+        <w:rPr/>
+      </w:pPr>
+      <w:r>
+        <w:rPr>
+          <w:rStyle w:val="normaltextrun"/>
+          <w:rFonts w:eastAsia="Times New Roman" w:cs="Times New Roman"/>
+          <w:color w:val="auto"/>
+          <w:kern w:val="0"/>
+          <w:sz w:val="24"/>
+          <w:szCs w:val="24"/>
+          <w:lang w:val="sk-SK" w:bidi="ar-SA"/>
+        </w:rPr>
+        <w:t>[40] DAHL, George E.; YU, Dong; DENG, Li; ACERO, Alex. Context-dependent pre-trained deep neural networks for large-vocabulary speech recognition. IEEE Transactions on Audio, Speech, and Language Processing. 2012, 20(1), s. 30–42.</w:t>
+      </w:r>
+    </w:p>
+    <w:p>
+      <w:pPr>
+        <w:pStyle w:val="paragraph"/>
+        <w:widowControl/>
+        <w:suppressAutoHyphens w:val="true"/>
+        <w:bidi w:val="0"/>
+        <w:spacing w:beforeAutospacing="0" w:before="0" w:afterAutospacing="0" w:after="0"/>
+        <w:ind w:firstLine="75" w:start="270"/>
+        <w:jc w:val="both"/>
+        <w:textAlignment w:val="baseline"/>
+        <w:rPr>
+          <w:lang w:val="sk-SK"/>
+        </w:rPr>
+      </w:pPr>
+      <w:r>
+        <w:rPr>
+          <w:lang w:val="sk-SK"/>
+        </w:rPr>
+      </w:r>
+    </w:p>
+    <w:p>
+      <w:pPr>
+        <w:pStyle w:val="paragraph"/>
+        <w:widowControl/>
+        <w:suppressAutoHyphens w:val="true"/>
+        <w:bidi w:val="0"/>
+        <w:spacing w:beforeAutospacing="0" w:before="0" w:afterAutospacing="0" w:after="0"/>
+        <w:ind w:firstLine="75" w:start="270"/>
+        <w:jc w:val="both"/>
+        <w:textAlignment w:val="baseline"/>
+        <w:rPr/>
+      </w:pPr>
+      <w:r>
+        <w:rPr>
+          <w:rStyle w:val="normaltextrun"/>
+          <w:rFonts w:eastAsia="Times New Roman" w:cs="Times New Roman"/>
+          <w:color w:val="auto"/>
+          <w:kern w:val="0"/>
+          <w:sz w:val="24"/>
+          <w:szCs w:val="24"/>
+          <w:lang w:val="sk-SK" w:bidi="ar-SA"/>
+        </w:rPr>
+        <w:t>[41] GRAVES, Alex; FERNÁNDEZ, Santiago; GOMEZ, Faustino; SCHMIDHUBER, Jürgen. Connectionist temporal classification: Labelling unsegmented sequence data with recurrent neural networks. In: Proceedings of the 23rd International Conference on Machine Learning. 2006, s. 369–376.</w:t>
+      </w:r>
+    </w:p>
+    <w:p>
+      <w:pPr>
+        <w:pStyle w:val="paragraph"/>
+        <w:widowControl/>
+        <w:suppressAutoHyphens w:val="true"/>
+        <w:bidi w:val="0"/>
+        <w:spacing w:beforeAutospacing="0" w:before="0" w:afterAutospacing="0" w:after="0"/>
+        <w:ind w:firstLine="75" w:start="270"/>
+        <w:jc w:val="both"/>
+        <w:textAlignment w:val="baseline"/>
+        <w:rPr>
+          <w:lang w:val="sk-SK"/>
+        </w:rPr>
+      </w:pPr>
+      <w:r>
+        <w:rPr>
+          <w:lang w:val="sk-SK"/>
+        </w:rPr>
+      </w:r>
+    </w:p>
+    <w:p>
+      <w:pPr>
+        <w:pStyle w:val="paragraph"/>
+        <w:widowControl/>
+        <w:suppressAutoHyphens w:val="true"/>
+        <w:bidi w:val="0"/>
+        <w:spacing w:beforeAutospacing="0" w:before="0" w:afterAutospacing="0" w:after="0"/>
+        <w:ind w:firstLine="75" w:start="270"/>
+        <w:jc w:val="both"/>
+        <w:textAlignment w:val="baseline"/>
+        <w:rPr/>
+      </w:pPr>
+      <w:r>
+        <w:rPr>
+          <w:rStyle w:val="normaltextrun"/>
+          <w:rFonts w:eastAsia="Times New Roman" w:cs="Times New Roman"/>
+          <w:color w:val="auto"/>
+          <w:kern w:val="0"/>
+          <w:sz w:val="24"/>
+          <w:szCs w:val="24"/>
+          <w:lang w:val="sk-SK" w:bidi="ar-SA"/>
+        </w:rPr>
+        <w:t>[42] GRAVES, Alex; MOHAMED, Abdel-rahman; HINTON, Geoffrey. Speech recognition with deep recurrent neural networks. In: IEEE International Conference on Acoustics, Speech and Signal Processing. 2013, s. 6645–6649.</w:t>
+      </w:r>
+    </w:p>
+    <w:p>
+      <w:pPr>
+        <w:pStyle w:val="paragraph"/>
+        <w:widowControl/>
+        <w:suppressAutoHyphens w:val="true"/>
+        <w:bidi w:val="0"/>
+        <w:spacing w:beforeAutospacing="0" w:before="0" w:afterAutospacing="0" w:after="0"/>
+        <w:ind w:firstLine="75" w:start="270"/>
+        <w:jc w:val="both"/>
+        <w:textAlignment w:val="baseline"/>
+        <w:rPr>
+          <w:lang w:val="sk-SK"/>
+        </w:rPr>
+      </w:pPr>
+      <w:r>
+        <w:rPr>
+          <w:lang w:val="sk-SK"/>
+        </w:rPr>
+      </w:r>
+    </w:p>
+    <w:p>
+      <w:pPr>
+        <w:pStyle w:val="paragraph"/>
+        <w:widowControl/>
+        <w:suppressAutoHyphens w:val="true"/>
+        <w:bidi w:val="0"/>
+        <w:spacing w:beforeAutospacing="0" w:before="0" w:afterAutospacing="0" w:after="0"/>
+        <w:ind w:firstLine="75" w:start="270"/>
+        <w:jc w:val="both"/>
+        <w:textAlignment w:val="baseline"/>
+        <w:rPr/>
+      </w:pPr>
+      <w:r>
+        <w:rPr>
+          <w:rStyle w:val="normaltextrun"/>
+          <w:rFonts w:eastAsia="Times New Roman" w:cs="Times New Roman"/>
+          <w:color w:val="auto"/>
+          <w:kern w:val="0"/>
+          <w:sz w:val="24"/>
+          <w:szCs w:val="24"/>
+          <w:lang w:val="sk-SK" w:bidi="ar-SA"/>
+        </w:rPr>
+        <w:t>[43] GRAVES, Alex; JAITLY, Navdeep. Towards end-to-end speech recognition with recurrent neural networks. In: International Conference on Machine Learning. 2014.</w:t>
+      </w:r>
+    </w:p>
+    <w:p>
+      <w:pPr>
+        <w:pStyle w:val="paragraph"/>
+        <w:widowControl/>
+        <w:suppressAutoHyphens w:val="true"/>
+        <w:bidi w:val="0"/>
+        <w:spacing w:beforeAutospacing="0" w:before="0" w:afterAutospacing="0" w:after="0"/>
+        <w:ind w:firstLine="75" w:start="270"/>
+        <w:jc w:val="both"/>
+        <w:textAlignment w:val="baseline"/>
+        <w:rPr>
+          <w:lang w:val="sk-SK"/>
+        </w:rPr>
+      </w:pPr>
+      <w:r>
+        <w:rPr>
+          <w:lang w:val="sk-SK"/>
+        </w:rPr>
+      </w:r>
+    </w:p>
+    <w:p>
+      <w:pPr>
+        <w:pStyle w:val="paragraph"/>
+        <w:widowControl/>
+        <w:suppressAutoHyphens w:val="true"/>
+        <w:bidi w:val="0"/>
+        <w:spacing w:beforeAutospacing="0" w:before="0" w:afterAutospacing="0" w:after="0"/>
+        <w:ind w:firstLine="75" w:start="270"/>
+        <w:jc w:val="both"/>
+        <w:textAlignment w:val="baseline"/>
+        <w:rPr/>
+      </w:pPr>
+      <w:r>
+        <w:rPr>
+          <w:rStyle w:val="normaltextrun"/>
+          <w:rFonts w:eastAsia="Times New Roman" w:cs="Times New Roman"/>
+          <w:color w:val="auto"/>
+          <w:kern w:val="0"/>
+          <w:sz w:val="24"/>
+          <w:szCs w:val="24"/>
+          <w:lang w:val="sk-SK" w:bidi="ar-SA"/>
+        </w:rPr>
+        <w:t>[44] CHAN, William; JAITLY, Navdeep; LE, Quoc; VINYALS, Oriol. Listen, Attend and Spell. In: IEEE International Conference on Acoustics, Speech and Signal Processing. 2016, s. 4960–4964.</w:t>
+      </w:r>
+    </w:p>
+    <w:p>
+      <w:pPr>
+        <w:pStyle w:val="paragraph"/>
+        <w:widowControl/>
+        <w:suppressAutoHyphens w:val="true"/>
+        <w:bidi w:val="0"/>
+        <w:spacing w:beforeAutospacing="0" w:before="0" w:afterAutospacing="0" w:after="0"/>
+        <w:ind w:firstLine="75" w:start="270"/>
+        <w:jc w:val="both"/>
+        <w:textAlignment w:val="baseline"/>
+        <w:rPr>
+          <w:lang w:val="sk-SK"/>
+        </w:rPr>
+      </w:pPr>
+      <w:r>
+        <w:rPr>
+          <w:lang w:val="sk-SK"/>
+        </w:rPr>
+      </w:r>
+    </w:p>
+    <w:p>
+      <w:pPr>
+        <w:pStyle w:val="paragraph"/>
+        <w:widowControl/>
+        <w:suppressAutoHyphens w:val="true"/>
+        <w:bidi w:val="0"/>
+        <w:spacing w:beforeAutospacing="0" w:before="0" w:afterAutospacing="0" w:after="0"/>
+        <w:ind w:firstLine="75" w:start="270"/>
+        <w:jc w:val="both"/>
+        <w:textAlignment w:val="baseline"/>
+        <w:rPr/>
+      </w:pPr>
+      <w:r>
+        <w:rPr>
+          <w:rStyle w:val="normaltextrun"/>
+          <w:rFonts w:eastAsia="Times New Roman" w:cs="Times New Roman"/>
+          <w:color w:val="auto"/>
+          <w:kern w:val="0"/>
+          <w:sz w:val="24"/>
+          <w:szCs w:val="24"/>
+          <w:lang w:val="sk-SK" w:bidi="ar-SA"/>
+        </w:rPr>
+        <w:t>[45] CHOROWSKI, Jan; BAHDANAU, Dzmitry; CHO, Kyunghyun; BENGIO, Yoshua. End-to-end continuous speech recognition using attention-based recurrent neural networks. In: Advances in Neural Information Processing Systems. 2015.</w:t>
+      </w:r>
+    </w:p>
+    <w:p>
+      <w:pPr>
+        <w:pStyle w:val="paragraph"/>
+        <w:widowControl/>
+        <w:suppressAutoHyphens w:val="true"/>
+        <w:bidi w:val="0"/>
+        <w:spacing w:beforeAutospacing="0" w:before="0" w:afterAutospacing="0" w:after="0"/>
+        <w:ind w:firstLine="75" w:start="270"/>
+        <w:jc w:val="both"/>
+        <w:textAlignment w:val="baseline"/>
+        <w:rPr>
+          <w:lang w:val="sk-SK"/>
+        </w:rPr>
+      </w:pPr>
+      <w:r>
+        <w:rPr>
+          <w:lang w:val="sk-SK"/>
+        </w:rPr>
+      </w:r>
+    </w:p>
+    <w:p>
+      <w:pPr>
+        <w:pStyle w:val="paragraph"/>
+        <w:widowControl/>
+        <w:suppressAutoHyphens w:val="true"/>
+        <w:bidi w:val="0"/>
+        <w:spacing w:beforeAutospacing="0" w:before="0" w:afterAutospacing="0" w:after="0"/>
+        <w:ind w:firstLine="75" w:start="270"/>
+        <w:jc w:val="both"/>
+        <w:textAlignment w:val="baseline"/>
+        <w:rPr/>
+      </w:pPr>
+      <w:r>
+        <w:rPr>
+          <w:rStyle w:val="normaltextrun"/>
+          <w:rFonts w:eastAsia="Times New Roman" w:cs="Times New Roman"/>
+          <w:color w:val="auto"/>
+          <w:kern w:val="0"/>
+          <w:sz w:val="24"/>
+          <w:szCs w:val="24"/>
+          <w:lang w:val="sk-SK" w:bidi="ar-SA"/>
+        </w:rPr>
+        <w:t>[46] BAHDANAU, Dzmitry; CHOROWSKI, Jan; SERDYUK, Dmitriy; BRakel, Philemon; BENGIO, Yoshua. End-to-end attention-based large vocabulary speech recognition. In: IEEE International Conference on Acoustics, Speech and Signal Processing. 2016, s. 4945–4949.</w:t>
+      </w:r>
+    </w:p>
+    <w:p>
+      <w:pPr>
+        <w:pStyle w:val="paragraph"/>
+        <w:widowControl/>
+        <w:suppressAutoHyphens w:val="true"/>
+        <w:bidi w:val="0"/>
+        <w:spacing w:beforeAutospacing="0" w:before="0" w:afterAutospacing="0" w:after="0"/>
+        <w:ind w:firstLine="75" w:start="270"/>
+        <w:jc w:val="both"/>
+        <w:textAlignment w:val="baseline"/>
+        <w:rPr>
+          <w:lang w:val="sk-SK"/>
+        </w:rPr>
+      </w:pPr>
+      <w:r>
+        <w:rPr>
+          <w:lang w:val="sk-SK"/>
+        </w:rPr>
+      </w:r>
+    </w:p>
+    <w:p>
+      <w:pPr>
+        <w:pStyle w:val="paragraph"/>
+        <w:widowControl/>
+        <w:suppressAutoHyphens w:val="true"/>
+        <w:bidi w:val="0"/>
+        <w:spacing w:beforeAutospacing="0" w:before="0" w:afterAutospacing="0" w:after="0"/>
+        <w:ind w:firstLine="75" w:start="270"/>
+        <w:jc w:val="both"/>
+        <w:textAlignment w:val="baseline"/>
+        <w:rPr/>
+      </w:pPr>
+      <w:r>
+        <w:rPr>
+          <w:rStyle w:val="normaltextrun"/>
+          <w:rFonts w:eastAsia="Times New Roman" w:cs="Times New Roman"/>
+          <w:color w:val="auto"/>
+          <w:kern w:val="0"/>
+          <w:sz w:val="24"/>
+          <w:szCs w:val="24"/>
+          <w:lang w:val="sk-SK" w:bidi="ar-SA"/>
+        </w:rPr>
+        <w:t>[47] HOCHREITER, Sepp; SCHMIDHUBER, Jürgen. Long short-term memory. Neural Computation. 1997, 9(8), s. 1735–1780.</w:t>
+      </w:r>
+    </w:p>
+    <w:p>
+      <w:pPr>
+        <w:pStyle w:val="paragraph"/>
+        <w:widowControl/>
+        <w:suppressAutoHyphens w:val="true"/>
+        <w:bidi w:val="0"/>
+        <w:spacing w:beforeAutospacing="0" w:before="0" w:afterAutospacing="0" w:after="0"/>
+        <w:ind w:firstLine="75" w:start="270"/>
+        <w:jc w:val="both"/>
+        <w:textAlignment w:val="baseline"/>
+        <w:rPr>
+          <w:lang w:val="sk-SK"/>
+        </w:rPr>
+      </w:pPr>
+      <w:r>
+        <w:rPr>
+          <w:lang w:val="sk-SK"/>
+        </w:rPr>
+      </w:r>
+    </w:p>
+    <w:p>
+      <w:pPr>
+        <w:pStyle w:val="paragraph"/>
+        <w:widowControl/>
+        <w:suppressAutoHyphens w:val="true"/>
+        <w:bidi w:val="0"/>
+        <w:spacing w:beforeAutospacing="0" w:before="0" w:afterAutospacing="0" w:after="0"/>
+        <w:ind w:firstLine="75" w:start="270"/>
+        <w:jc w:val="both"/>
+        <w:textAlignment w:val="baseline"/>
+        <w:rPr/>
+      </w:pPr>
+      <w:r>
+        <w:rPr>
+          <w:rStyle w:val="normaltextrun"/>
+          <w:rFonts w:eastAsia="Times New Roman" w:cs="Times New Roman"/>
+          <w:color w:val="auto"/>
+          <w:kern w:val="0"/>
+          <w:sz w:val="24"/>
+          <w:szCs w:val="24"/>
+          <w:lang w:val="sk-SK" w:bidi="ar-SA"/>
+        </w:rPr>
+        <w:t>[48] VASWANI, Ashish; SHAZEER, Noam; PARMAR, Niki; USZKOREIT, Jakob; JONES, Llion; GOMEZ, Aidan N.; KAISER, Łukasz; POLOSUKHIN, Illia. Attention is all you need. In: Advances in Neural Information Processing Systems. 2017.</w:t>
+      </w:r>
+    </w:p>
+    <w:p>
+      <w:pPr>
+        <w:pStyle w:val="paragraph"/>
+        <w:widowControl/>
+        <w:suppressAutoHyphens w:val="true"/>
+        <w:bidi w:val="0"/>
+        <w:spacing w:beforeAutospacing="0" w:before="0" w:afterAutospacing="0" w:after="0"/>
+        <w:ind w:firstLine="75" w:start="270"/>
+        <w:jc w:val="both"/>
+        <w:textAlignment w:val="baseline"/>
+        <w:rPr>
+          <w:lang w:val="sk-SK"/>
+        </w:rPr>
+      </w:pPr>
+      <w:r>
+        <w:rPr>
+          <w:lang w:val="sk-SK"/>
+        </w:rPr>
+      </w:r>
+    </w:p>
+    <w:p>
+      <w:pPr>
+        <w:pStyle w:val="paragraph"/>
+        <w:widowControl/>
+        <w:suppressAutoHyphens w:val="true"/>
+        <w:bidi w:val="0"/>
+        <w:spacing w:beforeAutospacing="0" w:before="0" w:afterAutospacing="0" w:after="0"/>
+        <w:ind w:firstLine="75" w:start="270"/>
+        <w:jc w:val="both"/>
+        <w:textAlignment w:val="baseline"/>
+        <w:rPr/>
+      </w:pPr>
+      <w:r>
+        <w:rPr>
+          <w:rStyle w:val="normaltextrun"/>
+          <w:rFonts w:eastAsia="Times New Roman" w:cs="Times New Roman"/>
+          <w:color w:val="auto"/>
+          <w:kern w:val="0"/>
+          <w:sz w:val="24"/>
+          <w:szCs w:val="24"/>
+          <w:lang w:val="sk-SK" w:bidi="ar-SA"/>
+        </w:rPr>
+        <w:t>[49] KARITA, Shigeki; WANG, Xiong; WATANABE, Shinji; YOSHIMURA, Takenori; ZHANG, Wei; CHEN, Nanxin; HAYASHI, Tomoki; HIRA, Moto; TOKUDA, Keiichi. A comparative study on Transformer vs RNN in speech applications. In: IEEE Automatic Speech Recognition and Understanding Workshop. 2019.</w:t>
+      </w:r>
+    </w:p>
+    <w:p>
+      <w:pPr>
+        <w:pStyle w:val="paragraph"/>
+        <w:widowControl/>
+        <w:suppressAutoHyphens w:val="true"/>
+        <w:bidi w:val="0"/>
+        <w:spacing w:beforeAutospacing="0" w:before="0" w:afterAutospacing="0" w:after="0"/>
+        <w:ind w:firstLine="75" w:start="270"/>
+        <w:jc w:val="both"/>
+        <w:textAlignment w:val="baseline"/>
+        <w:rPr/>
+      </w:pPr>
+      <w:r>
+        <w:rPr/>
+        <w:t>[50] GRAVES, Alex. Sequence transduction with recurrent neural networks. In: ICML Workshop on Representation Learning. 2012.</w:t>
+      </w:r>
+    </w:p>
+    <w:p>
+      <w:pPr>
+        <w:pStyle w:val="paragraph"/>
+        <w:widowControl/>
+        <w:suppressAutoHyphens w:val="true"/>
+        <w:bidi w:val="0"/>
+        <w:spacing w:beforeAutospacing="0" w:before="0" w:afterAutospacing="0" w:after="0"/>
+        <w:ind w:firstLine="75" w:start="270"/>
+        <w:jc w:val="both"/>
+        <w:textAlignment w:val="baseline"/>
+        <w:rPr/>
+      </w:pPr>
+      <w:r>
+        <w:rPr/>
+      </w:r>
+    </w:p>
+    <w:p>
+      <w:pPr>
+        <w:pStyle w:val="paragraph"/>
+        <w:widowControl/>
+        <w:suppressAutoHyphens w:val="true"/>
+        <w:bidi w:val="0"/>
+        <w:spacing w:beforeAutospacing="0" w:before="0" w:afterAutospacing="0" w:after="0"/>
+        <w:ind w:firstLine="75" w:start="270"/>
+        <w:jc w:val="both"/>
+        <w:textAlignment w:val="baseline"/>
+        <w:rPr/>
+      </w:pPr>
+      <w:r>
+        <w:rPr/>
+        <w:t>[51] BAEVSKI, Alexei; ZHOU, Yuhao; MOHAMED, Abdelrahman; AULI, Michael. wav2vec 2.0: A framework for self-supervised learning of speech representations. In: Advances in Neural Information Processing Systems. 2020.</w:t>
+      </w:r>
+    </w:p>
+    <w:p>
+      <w:pPr>
+        <w:pStyle w:val="paragraph"/>
+        <w:widowControl/>
+        <w:suppressAutoHyphens w:val="true"/>
+        <w:bidi w:val="0"/>
+        <w:spacing w:beforeAutospacing="0" w:before="0" w:afterAutospacing="0" w:after="0"/>
+        <w:ind w:firstLine="75" w:start="270"/>
+        <w:jc w:val="both"/>
+        <w:textAlignment w:val="baseline"/>
+        <w:rPr/>
+      </w:pPr>
+      <w:r>
+        <w:rPr/>
+      </w:r>
+    </w:p>
+    <w:p>
+      <w:pPr>
+        <w:pStyle w:val="paragraph"/>
+        <w:widowControl/>
+        <w:suppressAutoHyphens w:val="true"/>
+        <w:bidi w:val="0"/>
+        <w:spacing w:beforeAutospacing="0" w:before="0" w:afterAutospacing="0" w:after="0"/>
+        <w:ind w:firstLine="75" w:start="270"/>
+        <w:jc w:val="both"/>
+        <w:textAlignment w:val="baseline"/>
+        <w:rPr/>
+      </w:pPr>
+      <w:r>
+        <w:rPr/>
+        <w:t>[52] CONNEAU, Alexis; BAEVSKI, Alexei; COLLOBERT, Ronan; MOHAMED, Abdelrahman; AULI, Michael. Unsupervised cross-lingual representation learning for speech recognition. In: Interspeech. 2021.</w:t>
+      </w:r>
+    </w:p>
+    <w:p>
+      <w:pPr>
+        <w:pStyle w:val="paragraph"/>
+        <w:widowControl/>
+        <w:suppressAutoHyphens w:val="true"/>
+        <w:bidi w:val="0"/>
+        <w:spacing w:beforeAutospacing="0" w:before="0" w:afterAutospacing="0" w:after="0"/>
+        <w:ind w:firstLine="75" w:start="270"/>
+        <w:jc w:val="both"/>
+        <w:textAlignment w:val="baseline"/>
+        <w:rPr/>
+      </w:pPr>
+      <w:r>
+        <w:rPr/>
+      </w:r>
+    </w:p>
+    <w:p>
+      <w:pPr>
+        <w:pStyle w:val="paragraph"/>
+        <w:widowControl/>
+        <w:suppressAutoHyphens w:val="true"/>
+        <w:bidi w:val="0"/>
+        <w:spacing w:beforeAutospacing="0" w:before="0" w:afterAutospacing="0" w:after="0"/>
+        <w:ind w:firstLine="75" w:start="270"/>
+        <w:jc w:val="both"/>
+        <w:textAlignment w:val="baseline"/>
+        <w:rPr/>
+      </w:pPr>
+      <w:r>
+        <w:rPr/>
+        <w:t>[53] RADFORD, Alec; KIM, Jong Wook; XU, Tao; BROCKMAN, Greg; MCLEAVEY, Christine; SUTSKEVER, Ilya. Robust speech recognition via large-scale weak supervision. In: International Conference on Machine Learning. 2023.</w:t>
+      </w:r>
+    </w:p>
+    <w:p>
+      <w:pPr>
+        <w:pStyle w:val="paragraph"/>
+        <w:widowControl/>
+        <w:suppressAutoHyphens w:val="true"/>
+        <w:bidi w:val="0"/>
+        <w:spacing w:beforeAutospacing="0" w:before="0" w:afterAutospacing="0" w:after="0"/>
+        <w:ind w:firstLine="75" w:start="270"/>
+        <w:jc w:val="both"/>
+        <w:textAlignment w:val="baseline"/>
         <w:rPr>
           <w:lang w:val="sk-SK"/>
         </w:rPr>
@@ -7709,7 +8289,7 @@
     </w:r>
     <w:r>
       <w:rPr/>
-      <w:t>35</w:t>
+      <w:t>37</w:t>
     </w:r>
     <w:r>
       <w:rPr/>
@@ -10588,8 +11168,8 @@
       <w:lang w:eastAsia="cs-CZ"/>
     </w:rPr>
   </w:style>
-  <w:style w:type="character" w:styleId="FootnoteCharactersuser">
-    <w:name w:val="Footnote Characters (user)"/>
+  <w:style w:type="character" w:styleId="FootnoteCharacters">
+    <w:name w:val="Footnote Characters"/>
     <w:uiPriority w:val="99"/>
     <w:semiHidden/>
     <w:unhideWhenUsed/>
@@ -10599,8 +11179,8 @@
       <w:vertAlign w:val="superscript"/>
     </w:rPr>
   </w:style>
-  <w:style w:type="character" w:styleId="FootnoteCharacters">
-    <w:name w:val="Footnote Characters"/>
+  <w:style w:type="character" w:styleId="FootnoteCharactersuser">
+    <w:name w:val="Footnote Characters (user)"/>
     <w:qFormat/>
     <w:rPr>
       <w:vertAlign w:val="superscript"/>
@@ -10664,8 +11244,8 @@
       <w:rFonts w:ascii="Liberation Mono" w:hAnsi="Liberation Mono" w:eastAsia="Liberation Mono" w:cs="Liberation Mono"/>
     </w:rPr>
   </w:style>
-  <w:style w:type="character" w:styleId="Bulletsuser">
-    <w:name w:val="Bullets (user)"/>
+  <w:style w:type="character" w:styleId="Bullets">
+    <w:name w:val="Bullets"/>
     <w:qFormat/>
     <w:rPr>
       <w:rFonts w:ascii="OpenSymbol" w:hAnsi="OpenSymbol" w:eastAsia="OpenSymbol" w:cs="OpenSymbol"/>
@@ -11266,8 +11846,8 @@
       <w:lang w:val="en-US" w:eastAsia="en-US"/>
     </w:rPr>
   </w:style>
-  <w:style w:type="paragraph" w:styleId="HeaderLeftuser">
-    <w:name w:val="Header Left (user)"/>
+  <w:style w:type="paragraph" w:styleId="HeaderLeft">
+    <w:name w:val="Header Left"/>
     <w:basedOn w:val="Header"/>
     <w:qFormat/>
     <w:pPr/>

</xml_diff>

<commit_message>
added all. polish needed
</commit_message>
<xml_diff>
--- a/docs/Králik Juraj.docx
+++ b/docs/Králik Juraj.docx
@@ -325,7 +325,7 @@
                     <w:szCs w:val="32"/>
                     <w:lang w:val="sk-SK"/>
                   </w:rPr>
-                  <w:t>2025</w:t>
+                  <w:t>2026</w:t>
                 </w:r>
               </w:sdtContent>
             </w:sdt>
@@ -1399,32 +1399,32 @@
           <w:lang w:val="sk-SK"/>
         </w:rPr>
       </w:pPr>
-      <w:bookmarkStart w:id="1" w:name="_Toc107635157"/>
-      <w:bookmarkStart w:id="2" w:name="_Toc107634140"/>
-      <w:bookmarkStart w:id="3" w:name="_Toc88128503"/>
-      <w:bookmarkStart w:id="4" w:name="_Toc88127138"/>
-      <w:bookmarkStart w:id="5" w:name="_Toc88127095"/>
-      <w:bookmarkStart w:id="6" w:name="_Toc88126854"/>
-      <w:bookmarkStart w:id="7" w:name="_Toc88126764"/>
-      <w:bookmarkStart w:id="8" w:name="_Toc88126548"/>
-      <w:bookmarkStart w:id="9" w:name="_Toc88126519"/>
-      <w:bookmarkStart w:id="10" w:name="_Toc88126452"/>
-      <w:bookmarkStart w:id="11" w:name="_Toc88126301"/>
-      <w:bookmarkStart w:id="12" w:name="_Toc88125781"/>
-      <w:bookmarkStart w:id="13" w:name="_Toc88124798"/>
-      <w:bookmarkStart w:id="14" w:name="_Toc88124648"/>
-      <w:bookmarkStart w:id="15" w:name="_Toc88124611"/>
-      <w:bookmarkStart w:id="16" w:name="_Toc88122008"/>
-      <w:bookmarkStart w:id="17" w:name="_Toc88121742"/>
-      <w:bookmarkStart w:id="18" w:name="_Toc88121604"/>
-      <w:bookmarkStart w:id="19" w:name="_Toc88121547"/>
-      <w:bookmarkStart w:id="20" w:name="_Toc88121173"/>
-      <w:bookmarkStart w:id="21" w:name="_Toc88121036"/>
-      <w:bookmarkStart w:id="22" w:name="_Toc88120993"/>
-      <w:bookmarkStart w:id="23" w:name="_Toc88120889"/>
-      <w:bookmarkStart w:id="24" w:name="_Toc88120677"/>
-      <w:bookmarkStart w:id="25" w:name="_Toc88120440"/>
-      <w:bookmarkStart w:id="26" w:name="_Toc37577729"/>
+      <w:bookmarkStart w:id="1" w:name="_Toc37577729"/>
+      <w:bookmarkStart w:id="2" w:name="_Toc88120440"/>
+      <w:bookmarkStart w:id="3" w:name="_Toc88120677"/>
+      <w:bookmarkStart w:id="4" w:name="_Toc88120889"/>
+      <w:bookmarkStart w:id="5" w:name="_Toc88120993"/>
+      <w:bookmarkStart w:id="6" w:name="_Toc88121036"/>
+      <w:bookmarkStart w:id="7" w:name="_Toc88121173"/>
+      <w:bookmarkStart w:id="8" w:name="_Toc88121547"/>
+      <w:bookmarkStart w:id="9" w:name="_Toc88121604"/>
+      <w:bookmarkStart w:id="10" w:name="_Toc88121742"/>
+      <w:bookmarkStart w:id="11" w:name="_Toc88122008"/>
+      <w:bookmarkStart w:id="12" w:name="_Toc88124611"/>
+      <w:bookmarkStart w:id="13" w:name="_Toc88124648"/>
+      <w:bookmarkStart w:id="14" w:name="_Toc88124798"/>
+      <w:bookmarkStart w:id="15" w:name="_Toc88125781"/>
+      <w:bookmarkStart w:id="16" w:name="_Toc88126301"/>
+      <w:bookmarkStart w:id="17" w:name="_Toc88126452"/>
+      <w:bookmarkStart w:id="18" w:name="_Toc88126519"/>
+      <w:bookmarkStart w:id="19" w:name="_Toc88126548"/>
+      <w:bookmarkStart w:id="20" w:name="_Toc88126764"/>
+      <w:bookmarkStart w:id="21" w:name="_Toc88126854"/>
+      <w:bookmarkStart w:id="22" w:name="_Toc88127095"/>
+      <w:bookmarkStart w:id="23" w:name="_Toc88127138"/>
+      <w:bookmarkStart w:id="24" w:name="_Toc88128503"/>
+      <w:bookmarkStart w:id="25" w:name="_Toc107634140"/>
+      <w:bookmarkStart w:id="26" w:name="_Toc107635157"/>
       <w:r>
         <w:rPr>
           <w:lang w:val="sk-SK"/>
@@ -1492,7 +1492,6 @@
               <w:tab w:val="left" w:pos="440" w:leader="none"/>
               <w:tab w:val="right" w:pos="8786" w:leader="dot"/>
             </w:tabs>
-            <w:ind w:hanging="360" w:start="720" w:end="567"/>
             <w:rPr/>
           </w:pPr>
           <w:r>
@@ -1510,18 +1509,17 @@
             </w:rPr>
             <w:fldChar w:fldCharType="separate"/>
           </w:r>
-          <w:r>
-            <w:rPr>
-              <w:rStyle w:val="IndexLink"/>
-            </w:rPr>
-            <w:tab/>
-          </w:r>
-          <w:r>
-            <w:rPr/>
-            <w:t>teoRetická časť</w:t>
-            <w:tab/>
-            <w:t>14</w:t>
-          </w:r>
+          <w:hyperlink w:anchor="__RefHeading___Toc522_1577340545" w:tooltip="teoRetická časť">
+            <w:r>
+              <w:rPr>
+                <w:rStyle w:val="IndexLink"/>
+              </w:rPr>
+              <w:tab/>
+              <w:t>teoRetická časť</w:t>
+              <w:tab/>
+              <w:t>14</w:t>
+            </w:r>
+          </w:hyperlink>
         </w:p>
         <w:p>
           <w:pPr>
@@ -1533,14 +1531,18 @@
             </w:tabs>
             <w:rPr/>
           </w:pPr>
-          <w:r>
-            <w:rPr/>
-            <w:t>1</w:t>
-            <w:tab/>
-            <w:t>Teoretický prehľad technológie speech-to-text</w:t>
-            <w:tab/>
-            <w:t>15</w:t>
-          </w:r>
+          <w:hyperlink w:anchor="__RefHeading___Toc524_1577340545" w:tooltip="Teoretický prehľad technológie speech-to-text">
+            <w:r>
+              <w:rPr>
+                <w:rStyle w:val="IndexLink"/>
+              </w:rPr>
+              <w:t>1</w:t>
+              <w:tab/>
+              <w:t>Teoretický prehľad technológie speech-to-text</w:t>
+              <w:tab/>
+              <w:t>15</w:t>
+            </w:r>
+          </w:hyperlink>
         </w:p>
         <w:p>
           <w:pPr>
@@ -1552,14 +1554,18 @@
             </w:tabs>
             <w:rPr/>
           </w:pPr>
-          <w:r>
-            <w:rPr/>
-            <w:t>1.1</w:t>
-            <w:tab/>
-            <w:t>História a vývoj STT technológií</w:t>
-            <w:tab/>
-            <w:t>16</w:t>
-          </w:r>
+          <w:hyperlink w:anchor="__RefHeading___Toc536_1577340545" w:tooltip="História a vývoj STT technológií">
+            <w:r>
+              <w:rPr>
+                <w:rStyle w:val="IndexLink"/>
+              </w:rPr>
+              <w:t>1.1</w:t>
+              <w:tab/>
+              <w:t>História a vývoj STT technológií</w:t>
+              <w:tab/>
+              <w:t>16</w:t>
+            </w:r>
+          </w:hyperlink>
         </w:p>
         <w:p>
           <w:pPr>
@@ -1571,14 +1577,18 @@
             </w:tabs>
             <w:rPr/>
           </w:pPr>
-          <w:r>
-            <w:rPr/>
-            <w:t>1.2</w:t>
-            <w:tab/>
-            <w:t>Prehľad základných princípov a metód (akustické modely, jazykové modely, neurónové siete)</w:t>
-            <w:tab/>
-            <w:t>19</w:t>
-          </w:r>
+          <w:hyperlink w:anchor="__RefHeading___Toc562_1577340545" w:tooltip="Prehľad základných princípov a metód (akustické modely, jazykové modely, neurónové siete)">
+            <w:r>
+              <w:rPr>
+                <w:rStyle w:val="IndexLink"/>
+              </w:rPr>
+              <w:t>1.2</w:t>
+              <w:tab/>
+              <w:t>Prehľad základných princípov a metód (akustické modely, jazykové modely, neurónové siete)</w:t>
+              <w:tab/>
+              <w:t>19</w:t>
+            </w:r>
+          </w:hyperlink>
         </w:p>
         <w:p>
           <w:pPr>
@@ -1590,14 +1600,18 @@
             </w:tabs>
             <w:rPr/>
           </w:pPr>
-          <w:r>
-            <w:rPr/>
-            <w:t>1.3</w:t>
-            <w:tab/>
-            <w:t>Klasifikácia STT modelov podľa technológií a použití</w:t>
-            <w:tab/>
-            <w:t>19</w:t>
-          </w:r>
+          <w:hyperlink w:anchor="__RefHeading___Toc560_1577340545" w:tooltip="Klasifikácia STT modelov podľa technológií a použití">
+            <w:r>
+              <w:rPr>
+                <w:rStyle w:val="IndexLink"/>
+              </w:rPr>
+              <w:t>1.3</w:t>
+              <w:tab/>
+              <w:t>Klasifikácia STT modelov podľa technológií a použití</w:t>
+              <w:tab/>
+              <w:t>21</w:t>
+            </w:r>
+          </w:hyperlink>
         </w:p>
         <w:p>
           <w:pPr>
@@ -1611,16 +1625,19 @@
               <w:tab w:val="left" w:pos="440" w:leader="none"/>
               <w:tab w:val="right" w:pos="8786" w:leader="dot"/>
             </w:tabs>
-            <w:ind w:hanging="360" w:start="720" w:end="567"/>
             <w:rPr/>
           </w:pPr>
-          <w:r>
-            <w:rPr/>
-            <w:tab/>
-            <w:t>praktická část</w:t>
-            <w:tab/>
-            <w:t>20</w:t>
-          </w:r>
+          <w:hyperlink w:anchor="__RefHeading___Toc520_1577340545" w:tooltip="praktická část">
+            <w:r>
+              <w:rPr>
+                <w:rStyle w:val="IndexLink"/>
+              </w:rPr>
+              <w:tab/>
+              <w:t>praktická část</w:t>
+              <w:tab/>
+              <w:t>24</w:t>
+            </w:r>
+          </w:hyperlink>
         </w:p>
         <w:p>
           <w:pPr>
@@ -1632,14 +1649,18 @@
             </w:tabs>
             <w:rPr/>
           </w:pPr>
-          <w:r>
-            <w:rPr/>
-            <w:t>2</w:t>
-            <w:tab/>
-            <w:t>Príprava Testovania</w:t>
-            <w:tab/>
-            <w:t>21</w:t>
-          </w:r>
+          <w:hyperlink w:anchor="__RefHeading___Toc534_1577340545" w:tooltip="Príprava Testovania">
+            <w:r>
+              <w:rPr>
+                <w:rStyle w:val="IndexLink"/>
+              </w:rPr>
+              <w:t>2</w:t>
+              <w:tab/>
+              <w:t>Príprava Testovania</w:t>
+              <w:tab/>
+              <w:t>25</w:t>
+            </w:r>
+          </w:hyperlink>
         </w:p>
         <w:p>
           <w:pPr>
@@ -1651,14 +1672,18 @@
             </w:tabs>
             <w:rPr/>
           </w:pPr>
-          <w:r>
-            <w:rPr/>
-            <w:t>2.1</w:t>
-            <w:tab/>
-            <w:t>Kritéria výberu dostupných modelov</w:t>
-            <w:tab/>
-            <w:t>21</w:t>
-          </w:r>
+          <w:hyperlink w:anchor="__RefHeading___Toc558_1577340545" w:tooltip="Kritériá výberu dostupných modelov">
+            <w:r>
+              <w:rPr>
+                <w:rStyle w:val="IndexLink"/>
+              </w:rPr>
+              <w:t>2.1</w:t>
+              <w:tab/>
+              <w:t>Kritériá výberu dostupných modelov</w:t>
+              <w:tab/>
+              <w:t>25</w:t>
+            </w:r>
+          </w:hyperlink>
         </w:p>
         <w:p>
           <w:pPr>
@@ -1670,14 +1695,18 @@
             </w:tabs>
             <w:rPr/>
           </w:pPr>
-          <w:r>
-            <w:rPr/>
-            <w:t>2.1.1</w:t>
-            <w:tab/>
-            <w:t>Open-source</w:t>
-            <w:tab/>
-            <w:t>21</w:t>
-          </w:r>
+          <w:hyperlink w:anchor="__RefHeading___Toc564_1577340545" w:tooltip="Open-source">
+            <w:r>
+              <w:rPr>
+                <w:rStyle w:val="IndexLink"/>
+              </w:rPr>
+              <w:t>2.1.1</w:t>
+              <w:tab/>
+              <w:t>Open-source</w:t>
+              <w:tab/>
+              <w:t>25</w:t>
+            </w:r>
+          </w:hyperlink>
         </w:p>
         <w:p>
           <w:pPr>
@@ -1689,14 +1718,18 @@
             </w:tabs>
             <w:rPr/>
           </w:pPr>
-          <w:r>
-            <w:rPr/>
-            <w:t>2.1.2</w:t>
-            <w:tab/>
-            <w:t>Integrácia v Pythone</w:t>
-            <w:tab/>
-            <w:t>21</w:t>
-          </w:r>
+          <w:hyperlink w:anchor="__RefHeading___Toc574_1577340545" w:tooltip="Integrácia v Pythone">
+            <w:r>
+              <w:rPr>
+                <w:rStyle w:val="IndexLink"/>
+              </w:rPr>
+              <w:t>2.1.2</w:t>
+              <w:tab/>
+              <w:t>Integrácia v Pythone</w:t>
+              <w:tab/>
+              <w:t>25</w:t>
+            </w:r>
+          </w:hyperlink>
         </w:p>
         <w:p>
           <w:pPr>
@@ -1708,14 +1741,18 @@
             </w:tabs>
             <w:rPr/>
           </w:pPr>
-          <w:r>
-            <w:rPr/>
-            <w:t>2.1.3</w:t>
-            <w:tab/>
-            <w:t>Predtrénované modely</w:t>
-            <w:tab/>
-            <w:t>21</w:t>
-          </w:r>
+          <w:hyperlink w:anchor="__RefHeading___Toc572_1577340545" w:tooltip="Predtrénované modely">
+            <w:r>
+              <w:rPr>
+                <w:rStyle w:val="IndexLink"/>
+              </w:rPr>
+              <w:t>2.1.3</w:t>
+              <w:tab/>
+              <w:t>Predtrénované modely</w:t>
+              <w:tab/>
+              <w:t>25</w:t>
+            </w:r>
+          </w:hyperlink>
         </w:p>
         <w:p>
           <w:pPr>
@@ -1727,14 +1764,18 @@
             </w:tabs>
             <w:rPr/>
           </w:pPr>
-          <w:r>
-            <w:rPr/>
-            <w:t>2.1.4</w:t>
-            <w:tab/>
-            <w:t>Použité STT riešenia</w:t>
-            <w:tab/>
-            <w:t>22</w:t>
-          </w:r>
+          <w:hyperlink w:anchor="__RefHeading___Toc570_1577340545" w:tooltip="Použité STT riešenia">
+            <w:r>
+              <w:rPr>
+                <w:rStyle w:val="IndexLink"/>
+              </w:rPr>
+              <w:t>2.1.4</w:t>
+              <w:tab/>
+              <w:t>Použité STT riešenia</w:t>
+              <w:tab/>
+              <w:t>26</w:t>
+            </w:r>
+          </w:hyperlink>
         </w:p>
         <w:p>
           <w:pPr>
@@ -1746,14 +1787,18 @@
             </w:tabs>
             <w:rPr/>
           </w:pPr>
-          <w:r>
-            <w:rPr/>
-            <w:t>2.2</w:t>
-            <w:tab/>
-            <w:t>Príprava modelov</w:t>
-            <w:tab/>
-            <w:t>23</w:t>
-          </w:r>
+          <w:hyperlink w:anchor="__RefHeading___Toc556_1577340545" w:tooltip="Príprava modelov">
+            <w:r>
+              <w:rPr>
+                <w:rStyle w:val="IndexLink"/>
+              </w:rPr>
+              <w:t>2.2</w:t>
+              <w:tab/>
+              <w:t>Príprava modelov</w:t>
+              <w:tab/>
+              <w:t>27</w:t>
+            </w:r>
+          </w:hyperlink>
         </w:p>
         <w:p>
           <w:pPr>
@@ -1765,14 +1810,18 @@
             </w:tabs>
             <w:rPr/>
           </w:pPr>
-          <w:r>
-            <w:rPr/>
-            <w:t>2.2.1</w:t>
-            <w:tab/>
-            <w:t>Moduly pre prácu s modelmi</w:t>
-            <w:tab/>
-            <w:t>24</w:t>
-          </w:r>
+          <w:hyperlink w:anchor="__RefHeading___Toc568_1577340545" w:tooltip="Moduly pre prácu s modelmi">
+            <w:r>
+              <w:rPr>
+                <w:rStyle w:val="IndexLink"/>
+              </w:rPr>
+              <w:t>2.2.1</w:t>
+              <w:tab/>
+              <w:t>Moduly pre prácu s modelmi</w:t>
+              <w:tab/>
+              <w:t>27</w:t>
+            </w:r>
+          </w:hyperlink>
         </w:p>
         <w:p>
           <w:pPr>
@@ -1784,14 +1833,41 @@
             </w:tabs>
             <w:rPr/>
           </w:pPr>
-          <w:r>
+          <w:hyperlink w:anchor="__RefHeading___Toc566_1577340545" w:tooltip="Hlavný script">
+            <w:r>
+              <w:rPr>
+                <w:rStyle w:val="IndexLink"/>
+              </w:rPr>
+              <w:t>2.2.2</w:t>
+              <w:tab/>
+              <w:t>Hlavný script</w:t>
+              <w:tab/>
+              <w:t>28</w:t>
+            </w:r>
+          </w:hyperlink>
+        </w:p>
+        <w:p>
+          <w:pPr>
+            <w:pStyle w:val="TOC2"/>
+            <w:tabs>
+              <w:tab w:val="clear" w:pos="8777"/>
+              <w:tab w:val="left" w:pos="880" w:leader="none"/>
+              <w:tab w:val="right" w:pos="8786" w:leader="dot"/>
+            </w:tabs>
             <w:rPr/>
-            <w:t>2.2.2</w:t>
-            <w:tab/>
-            <w:t>Hlavný script</w:t>
-            <w:tab/>
-            <w:t>24</w:t>
-          </w:r>
+          </w:pPr>
+          <w:hyperlink w:anchor="__RefHeading___Toc532_1577340545" w:tooltip="Metodika testovania a porovnávania">
+            <w:r>
+              <w:rPr>
+                <w:rStyle w:val="IndexLink"/>
+              </w:rPr>
+              <w:t>3</w:t>
+              <w:tab/>
+              <w:t>Metodika testovania a porovnávania</w:t>
+              <w:tab/>
+              <w:t>29</w:t>
+            </w:r>
+          </w:hyperlink>
         </w:p>
         <w:p>
           <w:pPr>
@@ -1803,14 +1879,18 @@
             </w:tabs>
             <w:rPr/>
           </w:pPr>
-          <w:r>
-            <w:rPr/>
-            <w:t>2.3</w:t>
-            <w:tab/>
-            <w:t>Príprava testovacieho materiálu</w:t>
-            <w:tab/>
-            <w:t>25</w:t>
-          </w:r>
+          <w:hyperlink w:anchor="__RefHeading___Toc552_1577340545" w:tooltip="Kritéria hodnotenia modelov">
+            <w:r>
+              <w:rPr>
+                <w:rStyle w:val="IndexLink"/>
+              </w:rPr>
+              <w:t>3.1</w:t>
+              <w:tab/>
+              <w:t>Kritéria hodnotenia modelov</w:t>
+              <w:tab/>
+              <w:t>29</w:t>
+            </w:r>
+          </w:hyperlink>
         </w:p>
         <w:p>
           <w:pPr>
@@ -1822,14 +1902,18 @@
             </w:tabs>
             <w:rPr/>
           </w:pPr>
-          <w:r>
-            <w:rPr/>
-            <w:t>3</w:t>
-            <w:tab/>
-            <w:t>Metodika testovania a porovnávania</w:t>
-            <w:tab/>
-            <w:t>27</w:t>
-          </w:r>
+          <w:hyperlink w:anchor="__RefHeading___Toc530_1577340545" w:tooltip="Praktické testovanie modelov">
+            <w:r>
+              <w:rPr>
+                <w:rStyle w:val="IndexLink"/>
+              </w:rPr>
+              <w:t>4</w:t>
+              <w:tab/>
+              <w:t>Praktické testovanie modelov</w:t>
+              <w:tab/>
+              <w:t>31</w:t>
+            </w:r>
+          </w:hyperlink>
         </w:p>
         <w:p>
           <w:pPr>
@@ -1841,14 +1925,64 @@
             </w:tabs>
             <w:rPr/>
           </w:pPr>
-          <w:r>
+          <w:hyperlink w:anchor="__RefHeading___Toc550_1577340545" w:tooltip="Príprava datasetu">
+            <w:r>
+              <w:rPr>
+                <w:rStyle w:val="IndexLink"/>
+              </w:rPr>
+              <w:t>4.1</w:t>
+              <w:tab/>
+              <w:t>Príprava datasetu</w:t>
+              <w:tab/>
+              <w:t>31</w:t>
+            </w:r>
+          </w:hyperlink>
+        </w:p>
+        <w:p>
+          <w:pPr>
+            <w:pStyle w:val="TOC3"/>
+            <w:tabs>
+              <w:tab w:val="clear" w:pos="8777"/>
+              <w:tab w:val="left" w:pos="1320" w:leader="none"/>
+              <w:tab w:val="right" w:pos="8786" w:leader="dot"/>
+            </w:tabs>
             <w:rPr/>
-            <w:t>3.1</w:t>
-            <w:tab/>
-            <w:t>Kritéria hodnotenia modelov</w:t>
-            <w:tab/>
-            <w:t>27</w:t>
-          </w:r>
+          </w:pPr>
+          <w:hyperlink w:anchor="__RefHeading___Toc548_1577340545" w:tooltip="Postup testovania jednotlivých modelov">
+            <w:r>
+              <w:rPr>
+                <w:rStyle w:val="IndexLink"/>
+              </w:rPr>
+              <w:t>4.2</w:t>
+              <w:tab/>
+              <w:t>Postup testovania jednotlivých modelov</w:t>
+              <w:tab/>
+              <w:t>32</w:t>
+            </w:r>
+          </w:hyperlink>
+        </w:p>
+        <w:p>
+          <w:pPr>
+            <w:pStyle w:val="TOC3"/>
+            <w:tabs>
+              <w:tab w:val="clear" w:pos="8777"/>
+              <w:tab w:val="left" w:pos="1320" w:leader="none"/>
+              <w:tab w:val="right" w:pos="8786" w:leader="dot"/>
+            </w:tabs>
+            <w:rPr/>
+          </w:pPr>
+          <w:hyperlink w:anchor="__RefHeading___Toc546_1577340545" w:tooltip="Zber a spracovanie výsledkov">
+            <w:r>
+              <w:rPr>
+                <w:rStyle w:val="IndexLink"/>
+              </w:rPr>
+              <w:t>4.3</w:t>
+              <w:tab/>
+              <w:t>Zber a spracovanie výsledkov</w:t>
+              <w:tab/>
+              <w:t>32</w:t>
+            </w:r>
+          </w:hyperlink>
         </w:p>
         <w:p>
           <w:pPr>
@@ -1860,14 +1994,18 @@
             </w:tabs>
             <w:rPr/>
           </w:pPr>
-          <w:r>
-            <w:rPr/>
-            <w:t>4</w:t>
-            <w:tab/>
-            <w:t>Praktické testovanie modelov</w:t>
-            <w:tab/>
-            <w:t>29</w:t>
-          </w:r>
+          <w:hyperlink w:anchor="__RefHeading___Toc528_1577340545" w:tooltip="Analýza a prezentácia výsledkov">
+            <w:r>
+              <w:rPr>
+                <w:rStyle w:val="IndexLink"/>
+              </w:rPr>
+              <w:t>5</w:t>
+              <w:tab/>
+              <w:t>Analýza a prezentácia výsledkov</w:t>
+              <w:tab/>
+              <w:t>33</w:t>
+            </w:r>
+          </w:hyperlink>
         </w:p>
         <w:p>
           <w:pPr>
@@ -1879,14 +2017,18 @@
             </w:tabs>
             <w:rPr/>
           </w:pPr>
-          <w:r>
-            <w:rPr/>
-            <w:t>4.1</w:t>
-            <w:tab/>
-            <w:t>Príprava datasetov</w:t>
-            <w:tab/>
-            <w:t>29</w:t>
-          </w:r>
+          <w:hyperlink w:anchor="__RefHeading___Toc544_1577340545" w:tooltip="Porovnanie modelov na základe zvolených metrík">
+            <w:r>
+              <w:rPr>
+                <w:rStyle w:val="IndexLink"/>
+              </w:rPr>
+              <w:t>5.1</w:t>
+              <w:tab/>
+              <w:t>Porovnanie modelov na základe zvolených metrík</w:t>
+              <w:tab/>
+              <w:t>33</w:t>
+            </w:r>
+          </w:hyperlink>
         </w:p>
         <w:p>
           <w:pPr>
@@ -1898,14 +2040,18 @@
             </w:tabs>
             <w:rPr/>
           </w:pPr>
-          <w:r>
-            <w:rPr/>
-            <w:t>4.2</w:t>
-            <w:tab/>
-            <w:t>Postup testovania jednotlivých modelov</w:t>
-            <w:tab/>
-            <w:t>29</w:t>
-          </w:r>
+          <w:hyperlink w:anchor="__RefHeading___Toc542_1577340545" w:tooltip="Vizualizácia výsledkov">
+            <w:r>
+              <w:rPr>
+                <w:rStyle w:val="IndexLink"/>
+              </w:rPr>
+              <w:t>5.2</w:t>
+              <w:tab/>
+              <w:t>Vizualizácia výsledkov</w:t>
+              <w:tab/>
+              <w:t>34</w:t>
+            </w:r>
+          </w:hyperlink>
         </w:p>
         <w:p>
           <w:pPr>
@@ -1917,14 +2063,18 @@
             </w:tabs>
             <w:rPr/>
           </w:pPr>
-          <w:r>
-            <w:rPr/>
-            <w:t>4.3</w:t>
-            <w:tab/>
-            <w:t>Zber a spracovanie výsledkov</w:t>
-            <w:tab/>
-            <w:t>29</w:t>
-          </w:r>
+          <w:hyperlink w:anchor="__RefHeading___Toc540_1577340545" w:tooltip="Rozbor silných a slabých stránok modelov">
+            <w:r>
+              <w:rPr>
+                <w:rStyle w:val="IndexLink"/>
+              </w:rPr>
+              <w:t>5.3</w:t>
+              <w:tab/>
+              <w:t>Rozbor silných a slabých stránok modelov</w:t>
+              <w:tab/>
+              <w:t>36</w:t>
+            </w:r>
+          </w:hyperlink>
         </w:p>
         <w:p>
           <w:pPr>
@@ -1936,14 +2086,18 @@
             </w:tabs>
             <w:rPr/>
           </w:pPr>
-          <w:r>
-            <w:rPr/>
-            <w:t>5</w:t>
-            <w:tab/>
-            <w:t>Analýza a prezentácia výsledkov</w:t>
-            <w:tab/>
-            <w:t>30</w:t>
-          </w:r>
+          <w:hyperlink w:anchor="__RefHeading___Toc526_1577340545" w:tooltip="Možnosti využitia STT technológií v praxi">
+            <w:r>
+              <w:rPr>
+                <w:rStyle w:val="IndexLink"/>
+              </w:rPr>
+              <w:t>6</w:t>
+              <w:tab/>
+              <w:t>Možnosti využitia STT technológií v praxi</w:t>
+              <w:tab/>
+              <w:t>38</w:t>
+            </w:r>
+          </w:hyperlink>
         </w:p>
         <w:p>
           <w:pPr>
@@ -1955,93 +2109,22 @@
             </w:tabs>
             <w:rPr/>
           </w:pPr>
+          <w:hyperlink w:anchor="__RefHeading___Toc538_1577340545" w:tooltip="Budúci vývoj a trendy v oblasti STT">
+            <w:r>
+              <w:rPr>
+                <w:rStyle w:val="IndexLink"/>
+              </w:rPr>
+              <w:t>6.1</w:t>
+              <w:tab/>
+              <w:t>Budúci vývoj a trendy v oblasti STT</w:t>
+              <w:tab/>
+              <w:t>39</w:t>
+            </w:r>
+          </w:hyperlink>
           <w:r>
-            <w:rPr/>
-            <w:t>5.1</w:t>
-            <w:tab/>
-            <w:t>Porovnanie modelov na základe zvolených metrík</w:t>
-            <w:tab/>
-            <w:t>30</w:t>
-          </w:r>
-        </w:p>
-        <w:p>
-          <w:pPr>
-            <w:pStyle w:val="TOC3"/>
-            <w:tabs>
-              <w:tab w:val="clear" w:pos="8777"/>
-              <w:tab w:val="left" w:pos="1320" w:leader="none"/>
-              <w:tab w:val="right" w:pos="8786" w:leader="dot"/>
-            </w:tabs>
-            <w:rPr/>
-          </w:pPr>
-          <w:r>
-            <w:rPr/>
-            <w:t>5.2</w:t>
-            <w:tab/>
-            <w:t>Vizualizácia výsledkov</w:t>
-            <w:tab/>
-            <w:t>30</w:t>
-          </w:r>
-        </w:p>
-        <w:p>
-          <w:pPr>
-            <w:pStyle w:val="TOC3"/>
-            <w:tabs>
-              <w:tab w:val="clear" w:pos="8777"/>
-              <w:tab w:val="left" w:pos="1320" w:leader="none"/>
-              <w:tab w:val="right" w:pos="8786" w:leader="dot"/>
-            </w:tabs>
-            <w:rPr/>
-          </w:pPr>
-          <w:r>
-            <w:rPr/>
-            <w:t>5.3</w:t>
-            <w:tab/>
-            <w:t>Rozbor silných a slabých stránok modelov</w:t>
-            <w:tab/>
-            <w:t>30</w:t>
-          </w:r>
-        </w:p>
-        <w:p>
-          <w:pPr>
-            <w:pStyle w:val="TOC2"/>
-            <w:tabs>
-              <w:tab w:val="clear" w:pos="8777"/>
-              <w:tab w:val="left" w:pos="880" w:leader="none"/>
-              <w:tab w:val="right" w:pos="8786" w:leader="dot"/>
-            </w:tabs>
-            <w:rPr/>
-          </w:pPr>
-          <w:r>
-            <w:rPr/>
-            <w:t>6</w:t>
-            <w:tab/>
-            <w:t>Možnosti využitia STT technológií v praxi</w:t>
-            <w:tab/>
-            <w:t>31</w:t>
-          </w:r>
-        </w:p>
-        <w:p>
-          <w:pPr>
-            <w:pStyle w:val="TOC3"/>
-            <w:tabs>
-              <w:tab w:val="clear" w:pos="8777"/>
-              <w:tab w:val="left" w:pos="1320" w:leader="none"/>
-              <w:tab w:val="right" w:pos="8786" w:leader="dot"/>
-            </w:tabs>
-            <w:spacing w:before="120" w:after="0"/>
-            <w:rPr/>
-          </w:pPr>
-          <w:r>
-            <w:rPr/>
-            <w:t>6.1</w:t>
-            <w:tab/>
-            <w:t>Budúci vývoj a trendy v oblasti STT</w:t>
-            <w:tab/>
-            <w:t>31</w:t>
-          </w:r>
-          <w:r>
-            <w:rPr/>
+            <w:rPr>
+              <w:rStyle w:val="IndexLink"/>
+            </w:rPr>
             <w:fldChar w:fldCharType="end"/>
           </w:r>
         </w:p>
@@ -2070,8 +2153,8 @@
           <w:lang w:val="sk-SK"/>
         </w:rPr>
       </w:pPr>
-      <w:bookmarkStart w:id="27" w:name="_Toc22666742"/>
-      <w:bookmarkStart w:id="28" w:name="_Toc117787093"/>
+      <w:bookmarkStart w:id="27" w:name="_Toc117787093"/>
+      <w:bookmarkStart w:id="28" w:name="_Toc22666742"/>
       <w:r>
         <w:rPr>
           <w:lang w:val="sk-SK"/>
@@ -2084,57 +2167,49 @@
     <w:p>
       <w:pPr>
         <w:pStyle w:val="TextprceText"/>
-        <w:rPr>
-          <w:lang w:val="sk-SK"/>
-        </w:rPr>
-      </w:pPr>
-      <w:r>
-        <w:rPr>
-          <w:lang w:val="sk-SK"/>
-        </w:rPr>
-        <w:t>TO DO:</w:t>
+        <w:ind w:hanging="0" w:start="0"/>
+        <w:rPr>
+          <w:lang w:val="sk-SK"/>
+        </w:rPr>
+      </w:pPr>
+      <w:r>
+        <w:rPr>
+          <w:lang w:val="sk-SK"/>
+        </w:rPr>
+        <w:tab/>
+        <w:t>Úlohou rozpoznávania reči je previesť akustický signál obsahujúci hovorený prejav na zodpovedajúcu postupnosť slov zamýšľanú hovoriacim. Táto technológia dnes tvorí základ mnohých bežných aplikácií, ako sú hlasoví asistenti, automatické titulkovanie, diktovanie textu alebo prepis zvukových záznamov.</w:t>
       </w:r>
     </w:p>
     <w:p>
       <w:pPr>
         <w:pStyle w:val="TextprceText"/>
-        <w:rPr>
-          <w:lang w:val="sk-SK"/>
-        </w:rPr>
-      </w:pPr>
-      <w:r>
-        <w:rPr>
-          <w:lang w:val="sk-SK"/>
-        </w:rPr>
-        <w:t>(translate) The task of speech recognition is to map an acoustic signal containing a spoken natural language utterance into the corresponding sequence of words intended by the speaker.</w:t>
+        <w:ind w:hanging="0" w:start="0"/>
+        <w:rPr>
+          <w:lang w:val="sk-SK"/>
+        </w:rPr>
+      </w:pPr>
+      <w:r>
+        <w:rPr>
+          <w:lang w:val="sk-SK"/>
+        </w:rPr>
+        <w:tab/>
+        <w:t>Cieľom tejto práce je porovnať vybrané súčasné riešenia Speech-to-Text z hľadiska presnosti, rýchlosti a praktickej použiteľnosti. Práca sa zameriava najmä na modely a služby dostupné pre použitie v jazyku Python, s dôrazom na prepis českých nahrávok.</w:t>
       </w:r>
     </w:p>
     <w:p>
       <w:pPr>
         <w:pStyle w:val="TextprceText"/>
-        <w:rPr>
-          <w:lang w:val="sk-SK"/>
-        </w:rPr>
-      </w:pPr>
-      <w:r>
-        <w:rPr>
-          <w:lang w:val="sk-SK"/>
-        </w:rPr>
-        <w:t>Modely</w:t>
-      </w:r>
-    </w:p>
-    <w:p>
-      <w:pPr>
-        <w:pStyle w:val="TextprceText"/>
-        <w:rPr>
-          <w:lang w:val="sk-SK"/>
-        </w:rPr>
-      </w:pPr>
-      <w:r>
-        <w:rPr>
-          <w:lang w:val="sk-SK"/>
-        </w:rPr>
-        <w:t>Praktická časť - overview</w:t>
+        <w:ind w:hanging="0" w:start="0"/>
+        <w:rPr>
+          <w:lang w:val="sk-SK"/>
+        </w:rPr>
+      </w:pPr>
+      <w:r>
+        <w:rPr>
+          <w:lang w:val="sk-SK"/>
+        </w:rPr>
+        <w:tab/>
+        <w:t>Teoretická časť stručne opisuje vývoj a základné princípy rozpoznávania reči. Praktická časť sa venuje príprave testovacieho prostredia, výberu datasetu, testovaniu vybraných modelov a vyhodnoteniu dosiahnutých výsledkov.</w:t>
       </w:r>
     </w:p>
     <w:p>
@@ -2292,10 +2367,10 @@
         </w:rPr>
       </w:pPr>
       <w:bookmarkStart w:id="30" w:name="__RefHeading___Toc524_1577340545"/>
-      <w:bookmarkStart w:id="31" w:name="_Toc107635235"/>
-      <w:bookmarkStart w:id="32" w:name="_Toc107635218"/>
-      <w:bookmarkStart w:id="33" w:name="_Toc107635178"/>
-      <w:bookmarkStart w:id="34" w:name="_Toc107634143"/>
+      <w:bookmarkStart w:id="31" w:name="_Toc107634143"/>
+      <w:bookmarkStart w:id="32" w:name="_Toc107635178"/>
+      <w:bookmarkStart w:id="33" w:name="_Toc107635218"/>
+      <w:bookmarkStart w:id="34" w:name="_Toc107635235"/>
       <w:bookmarkEnd w:id="30"/>
       <w:bookmarkEnd w:id="31"/>
       <w:bookmarkEnd w:id="32"/>
@@ -2401,7 +2476,8 @@
         <w:rPr>
           <w:lang w:val="sk-SK"/>
         </w:rPr>
-        <w:t xml:space="preserve">Vývoj automatického rozpoznávania reči prebieha už takmer štyri storočia. Prvé pokusy o prevod reči boli už v roku 1952, keď v Bell Laboratories, Davis, Biddulph a Balashek zostavili systém na rozoznávanie jednotlivých číslic pre jedného hovoriaceho [6]. Systém sa spoliehal hlavne na meranie spektrálnych rezonancií samohláskovej časti každej číslice. V nezávislom projekte v RCA Laboratories v roku 1956 sa Olson a Belar pokúsili rozpoznať 10 rôznych slabík jedného hovoriaceho, stvárnených ako 10 jednoslabičných slov [7]. Systém sa opäť spoliehal na spektrálne merania najmä počas samohláskových častí. V roku 1959 sa na University College v Anglicku pokúsili Fry a Denes vybudovať fonémový rozpoznávač, ktorý rozpoznával štyri samohlásky a deväť spoluhlások [8]. Používali spektrálny analyzátor a vzorový porovnávač na prijímanie rozhodnutí o rozpoznávaní. Novým aspektom tohto výskumu bolo využitie štatistických informácií o prípustných sekvenciách foném v angličtine (primitívna forma jazykovej syntaxe) na zlepšenie celkovej presnosti rozpoznávania foném pre slová obsahujúce dve alebo viac foném. Ďalší významný projekt v tomto období bol rozpoznávač samohlások od Forgieho a Forgieho, vytvorený v MIT Lincoln Laboratories v roku 1959, v ktorom bolo rozpoznávaných 10 samohlások vložených vo formáte /b/-samohláska-/t/ nezávisle od hovoriaceho [9]. </w:t>
+        <w:tab/>
+        <w:t xml:space="preserve">Prvé pokusy o prevod reči boli už v roku 1952, keď v Bell Laboratories, Davis, Biddulph a Balashek zostavili systém na rozoznávanie jednotlivých číslic pre jedného hovoriaceho [6]. Systém sa spoliehal hlavne na meranie spektrálnych rezonancií samohláskovej časti každej číslice. V nezávislom projekte v RCA Laboratories v roku 1956 sa Olson a Belar pokúsili rozpoznať 10 rôznych slabík jedného hovoriaceho, stvárnených ako 10 jednoslabičných slov [7]. Systém sa opäť spoliehal na spektrálne merania najmä počas samohláskových častí. V roku 1959 sa na University College v Anglicku pokúsili Fry a Denes vybudovať fonémový rozpoznávač, ktorý rozpoznával štyri samohlásky a deväť spoluhlások [8]. Používali spektrálny analyzátor a vzorový porovnávač na prijímanie rozhodnutí o rozpoznávaní. Novým aspektom tohto výskumu bolo využitie štatistických informácií o prípustných sekvenciách foném v angličtine (primitívna forma jazykovej syntaxe) na zlepšenie celkovej presnosti rozpoznávania foném pre slová obsahujúce dve alebo viac foném. Ďalší významný projekt v tomto období bol rozpoznávač samohlások od Forgieho a Forgieho, vytvorený v MIT Lincoln Laboratories v roku 1959, v ktorom bolo rozpoznávaných 10 samohlások vložených vo formáte /b/-samohláska-/t/ nezávisle od hovoriaceho [9]. </w:t>
       </w:r>
     </w:p>
     <w:p>
@@ -2471,31 +2547,7 @@
         <w:rPr>
           <w:lang w:val="sk-SK"/>
         </w:rPr>
-        <w:t>V 70. rokoch výskum rozpoznávania reči dosiahol množstvo významných míľnikov. Poprvé sa oblasť rozpoznávania izolovaných slov alebo diskrétnych výrokov stala životaschopnou a použiteľnou technológiou na základe štúdií Velichka a Zagoruyka v Rusku, Sako</w:t>
-      </w:r>
-      <w:r>
-        <w:rPr>
-          <w:lang w:val="sk-SK"/>
-        </w:rPr>
-        <w:t>e</w:t>
-      </w:r>
-      <w:r>
-        <w:rPr>
-          <w:lang w:val="sk-SK"/>
-        </w:rPr>
-        <w:t xml:space="preserve"> a Chib</w:t>
-      </w:r>
-      <w:r>
-        <w:rPr>
-          <w:lang w:val="sk-SK"/>
-        </w:rPr>
-        <w:t>a</w:t>
-      </w:r>
-      <w:r>
-        <w:rPr>
-          <w:lang w:val="sk-SK"/>
-        </w:rPr>
-        <w:t xml:space="preserve"> v Japonsku, a Itakuru v Spojených štátoch. Ruské štúdie rozšírili využívanie pattern-recognition v rozpoznávaní reči [16]; japonský výskum preukázal úspešné aplikovanie metód dynamického programovania [17]; Itakurov výskum ukázal, ako princípy linear predictive coding (LPC), ktoré už boli úspešne využívané v low-bit-rate speech coding, mohli byť rozšírené do systémov na rozoznávanie reči za použitia korektných meraní dĺžok podľa LPC spektrálnych parametrov [18].</w:t>
+        <w:t>V 70. rokoch výskum rozpoznávania reči dosiahol množstvo významných míľnikov. Poprvé sa oblasť rozpoznávania izolovaných slov alebo diskrétnych výrokov stala životaschopnou a použiteľnou technológiou na základe štúdií Velichka a Zagoruyka v Rusku, Sakoe a Chiba v Japonsku, a Itakuru v Spojených štátoch. Ruské štúdie rozšírili využívanie pattern-recognition v rozpoznávaní reči [16]; japonský výskum preukázal úspešné aplikovanie metód dynamického programovania [17]; Itakurov výskum ukázal, ako princípy linear predictive coding (LPC), ktoré už boli úspešne využívané v low-bit-rate speech coding, mohli byť rozšírené do systémov na rozoznávanie reči za použitia korektných meraní dĺžok podľa LPC spektrálnych parametrov [18].</w:t>
       </w:r>
     </w:p>
     <w:p>
@@ -2566,19 +2618,6 @@
           <w:lang w:val="sk-SK"/>
         </w:rPr>
         <w:t>Ďalšou „novou“ technológiou, ktorá bola znovu zavedená koncom osemdesiatych rokov, bola myšlienka aplikácie neurónových sietí na problémy s rozpoznávaním reči. Neurónové siete boli prvýkrát predstavené v 50. rokoch 20. storočia, ale spočiatku sa neukázali ako užitočné, pretože mali veľa praktických problémov. V 80. rokoch však došlo k hlbšiemu pochopeniu silných stránok a obmedzení technológie, ako aj vzťahov tejto technológie ku klasickým metódam klasifikácie signálov. Bolo tiež navrhnutých niekoľko nových spôsobov implementácie systémov [29, 30].</w:t>
-      </w:r>
-    </w:p>
-    <w:p>
-      <w:pPr>
-        <w:pStyle w:val="TextprceText"/>
-        <w:rPr>
-          <w:lang w:val="sk-SK"/>
-        </w:rPr>
-      </w:pPr>
-      <w:r>
-        <w:rPr>
-          <w:lang w:val="sk-SK"/>
-        </w:rPr>
       </w:r>
     </w:p>
     <w:p>
@@ -2891,7 +2930,22 @@
         <w:rPr>
           <w:lang w:val="sk-SK"/>
         </w:rPr>
-        <w:t>Z pohľadu jazykového pokrytia možno modely rozdeliť na jednojazyčné, viacjazyčné a jazykovo doladené modely. Jednojazyčné modely sú trénované alebo doladené pre konkrétny jazyk a môžu dosahovať dobré výsledky v danej jazykovej oblasti. Viacjazyčné modely podporujú väčší počet jazykov a sú vhodné v prípadoch, keď je potrebné pracovať s rôznymi jazykmi bez samostatného modelu pre každý z nich. Jazykovo doladené modely predstavujú kompromis, keď všeobecný model vychádza z väčšej viacjazyčnej architektúry, ale je ďalej prispôsobený konkrétnemu jazyku.</w:t>
+        <w:t xml:space="preserve">Z pohľadu jazykového pokrytia možno modely rozdeliť na jednojazyčné, viacjazyčné a jazykovo doladené modely. Jednojazyčné modely sú trénované alebo doladené pre konkrétny jazyk a môžu dosahovať dobré výsledky v danej jazykovej oblasti. Viacjazyčné modely podporujú väčší počet jazykov a sú vhodné v prípadoch, keď je potrebné pracovať </w:t>
+      </w:r>
+    </w:p>
+    <w:p>
+      <w:pPr>
+        <w:pStyle w:val="TextprceText"/>
+        <w:rPr>
+          <w:b/>
+          <w:lang w:val="sk-SK"/>
+        </w:rPr>
+      </w:pPr>
+      <w:r>
+        <w:rPr>
+          <w:lang w:val="sk-SK"/>
+        </w:rPr>
+        <w:t>s rôznymi jazykmi bez samostatného modelu pre každý z nich. Jazykovo doladené modely predstavujú kompromis, keď všeobecný model vychádza z väčšej viacjazyčnej architektúry, ale je ďalej prispôsobený konkrétnemu jazyku.</w:t>
       </w:r>
     </w:p>
     <w:p>
@@ -3454,10 +3508,10 @@
           <w:lang w:val="sk-SK"/>
         </w:rPr>
       </w:pPr>
-      <w:bookmarkStart w:id="46" w:name="_Toc107635235_Copy_1"/>
-      <w:bookmarkStart w:id="47" w:name="_Toc107635218_Copy_1"/>
-      <w:bookmarkStart w:id="48" w:name="_Toc107635178_Copy_1"/>
-      <w:bookmarkStart w:id="49" w:name="_Toc107634143_Copy_1"/>
+      <w:bookmarkStart w:id="46" w:name="_Toc107634143_Copy_1"/>
+      <w:bookmarkStart w:id="47" w:name="_Toc107635178_Copy_1"/>
+      <w:bookmarkStart w:id="48" w:name="_Toc107635218_Copy_1"/>
+      <w:bookmarkStart w:id="49" w:name="_Toc107635235_Copy_1"/>
       <w:bookmarkEnd w:id="46"/>
       <w:bookmarkEnd w:id="47"/>
       <w:bookmarkEnd w:id="48"/>
@@ -4392,26 +4446,32 @@
       </w:pPr>
       <w:r>
         <w:rPr>
-          <w:lang w:val="sk-SK"/>
-        </w:rPr>
-      </w:r>
-    </w:p>
-    <w:p>
-      <w:pPr>
-        <w:pStyle w:val="TextprceText"/>
-        <w:rPr>
-          <w:lang w:val="sk-SK"/>
-        </w:rPr>
-      </w:pPr>
-      <w:r>
-        <w:rPr>
           <w:rFonts w:eastAsia="Times New Roman" w:cs="Times New Roman"/>
           <w:kern w:val="0"/>
           <w:sz w:val="24"/>
           <w:szCs w:val="24"/>
           <w:lang w:val="sk-SK" w:eastAsia="cs-CZ" w:bidi="ar-SA"/>
         </w:rPr>
-        <w:t>Čas spracovania však nebol pri všetkých modeloch priamo porovnateľný. Niektoré modely bežali s CUDA akceleráciou, zatiaľ čo iné museli bežať na CPU. Pri niektorých API riešeniach sa navyše prejavilo výrazné spomaľovanie pri väčšom počte požiadaviek. Preto bol čas prepisu použitý skôr ako praktický ukazovateľ použiteľnosti v daných testovacích podmienkach, nie ako úplne presné porovnanie výkonu všetkých modelov.</w:t>
+        <w:t xml:space="preserve">Čas spracovania však nebol pri všetkých modeloch priamo porovnateľný. Niektoré modely bežali s CUDA akceleráciou, zatiaľ čo iné museli bežať na CPU. Pri niektorých API riešeniach sa navyše prejavilo výrazné spomaľovanie pri väčšom počte požiadaviek. </w:t>
+      </w:r>
+    </w:p>
+    <w:p>
+      <w:pPr>
+        <w:pStyle w:val="TextprceText"/>
+        <w:ind w:hanging="0" w:start="0"/>
+        <w:rPr>
+          <w:lang w:val="sk-SK"/>
+        </w:rPr>
+      </w:pPr>
+      <w:r>
+        <w:rPr>
+          <w:rFonts w:eastAsia="Times New Roman" w:cs="Times New Roman"/>
+          <w:kern w:val="0"/>
+          <w:sz w:val="24"/>
+          <w:szCs w:val="24"/>
+          <w:lang w:val="sk-SK" w:eastAsia="cs-CZ" w:bidi="ar-SA"/>
+        </w:rPr>
+        <w:t>Preto bol čas prepisu použitý skôr ako praktický ukazovateľ použiteľnosti v daných testovacích podmienkach, nie ako úplne presné porovnanie výkonu všetkých modelov.</w:t>
       </w:r>
       <w:r>
         <w:br w:type="page"/>
@@ -4537,7 +4597,7 @@
           <w:szCs w:val="24"/>
           <w:lang w:val="sk-SK" w:eastAsia="cs-CZ" w:bidi="ar-SA"/>
         </w:rPr>
-        <w:t>veľkosť približne 268 hodín zvukových nahrávok vo formáte .mp3 v českom jazyku,</w:t>
+        <w:t>približne 268 hodín zvukových nahrávok vo formáte .mp3 v českom jazyku,</w:t>
       </w:r>
     </w:p>
     <w:p>
@@ -4572,7 +4632,7 @@
           <w:szCs w:val="24"/>
           <w:lang w:val="sk-SK" w:eastAsia="cs-CZ" w:bidi="ar-SA"/>
         </w:rPr>
-        <w:t>dĺžka vzoriek: priemerná dĺžka jednotlivých nahrávok je približne 5 sekúnd,</w:t>
+        <w:t>priemerná dĺžka jednotlivých nahrávok je približne 5 sekúnd,</w:t>
       </w:r>
     </w:p>
     <w:p>
@@ -4706,14 +4766,16 @@
     <w:p>
       <w:pPr>
         <w:pStyle w:val="TextprceText"/>
-        <w:rPr>
-          <w:lang w:val="sk-SK"/>
-        </w:rPr>
-      </w:pPr>
-      <w:r>
-        <w:rPr>
-          <w:lang w:val="sk-SK"/>
-        </w:rPr>
+        <w:ind w:hanging="0" w:start="0"/>
+        <w:rPr>
+          <w:lang w:val="sk-SK"/>
+        </w:rPr>
+      </w:pPr>
+      <w:r>
+        <w:rPr>
+          <w:lang w:val="sk-SK"/>
+        </w:rPr>
+        <w:tab/>
         <w:t>Niektoré pôvodne zaradené modely alebo API backendy neboli použité vo finálnom porovnaní, ak sa počas testovania ukázali ako nefunkčné, príliš pomalé alebo nevhodné pre český jazyk.</w:t>
       </w:r>
     </w:p>
@@ -4755,42 +4817,47 @@
     <w:p>
       <w:pPr>
         <w:pStyle w:val="TextprceText"/>
-        <w:rPr>
-          <w:lang w:val="sk-SK"/>
-        </w:rPr>
-      </w:pPr>
-      <w:r>
-        <w:rPr>
-          <w:lang w:val="sk-SK"/>
-        </w:rPr>
+        <w:ind w:hanging="0" w:start="0"/>
+        <w:rPr>
+          <w:lang w:val="sk-SK"/>
+        </w:rPr>
+      </w:pPr>
+      <w:r>
+        <w:rPr>
+          <w:lang w:val="sk-SK"/>
+        </w:rPr>
+        <w:tab/>
         <w:t>Jednotlivé výsledky boli uložené v poli items. Pri každej nahrávke bol zaznamenaný názov súboru, dĺžka audia, čas potrebný na prepis a text vygenerovaný modelom. Tieto súbory boli následne spracované validačným skriptom, ktorý doplnil referenčný text a vypočítal hodnoty WER a CER.</w:t>
       </w:r>
     </w:p>
     <w:p>
       <w:pPr>
         <w:pStyle w:val="TextprceText"/>
-        <w:rPr>
-          <w:lang w:val="sk-SK"/>
-        </w:rPr>
-      </w:pPr>
-      <w:r>
-        <w:rPr>
-          <w:lang w:val="sk-SK"/>
-        </w:rPr>
-        <w:t>Výstupom validačného skriptu bol nový JSON súbor s výsledkami jednotlivých nahrávok a priemernými hodnotami WER a CER pre celý testovaný model.</w:t>
-      </w:r>
-    </w:p>
-    <w:p>
-      <w:pPr>
-        <w:pStyle w:val="Normal"/>
-        <w:rPr>
-          <w:lang w:val="sk-SK"/>
-        </w:rPr>
-      </w:pPr>
-      <w:r>
-        <w:rPr>
-          <w:lang w:val="sk-SK"/>
-        </w:rPr>
+        <w:ind w:hanging="0" w:start="0"/>
+        <w:rPr>
+          <w:lang w:val="sk-SK"/>
+        </w:rPr>
+      </w:pPr>
+      <w:r>
+        <w:rPr>
+          <w:lang w:val="sk-SK"/>
+        </w:rPr>
+        <w:tab/>
+        <w:t>Výstupom validačného skriptu bol nový JSON súbor s výsledkami jednotlivých nahrávok, priemernou hodnotou WER, priemernou hodnotou CER a hodnotou average_transcript_ratio. Táto hodnota vyjadruje priemerný pomer medzi časom prepisu a dĺžkou nahrávky, teda koľko sekúnd spracovania bolo potrebných na jednu sekundu audia.</w:t>
+      </w:r>
+    </w:p>
+    <w:p>
+      <w:pPr>
+        <w:pStyle w:val="TextprceText"/>
+        <w:ind w:hanging="0" w:start="0"/>
+        <w:rPr>
+          <w:lang w:val="sk-SK"/>
+        </w:rPr>
+      </w:pPr>
+      <w:r>
+        <w:rPr/>
+        <w:tab/>
+        <w:t>Z validovaných výstupov bola následne vytvorená sumarizácia, ktorá obsahovala priemerné hodnoty jednotlivých behov pre každý testovaný model. Táto sumarizácia bola použitá ako základ pre porovnanie modelov.</w:t>
       </w:r>
       <w:r>
         <w:br w:type="page"/>
@@ -4828,21 +4895,22 @@
         <w:rPr>
           <w:lang w:val="sk-SK"/>
         </w:rPr>
-        <w:t>Aktuálny stav po teste</w:t>
-      </w:r>
-    </w:p>
-    <w:p>
-      <w:pPr>
-        <w:pStyle w:val="Odstavec1Paragraph1"/>
-        <w:rPr>
-          <w:lang w:val="sk-SK"/>
-        </w:rPr>
-      </w:pPr>
-      <w:r>
-        <w:rPr>
-          <w:lang w:val="sk-SK"/>
-        </w:rPr>
-        <w:t>Voľba vizualizácie výsledkov</w:t>
+        <w:tab/>
+        <w:t>V tejto kapitole sú spracované výsledky praktického testovania jednotlivých modelov. Porovnanie vychádza zo sumarizovaných výstupov validačného skriptu, ktoré obsahujú priemerné hodnoty WER, CER a average_transcript_ratio pre každý testovaný model.</w:t>
+      </w:r>
+    </w:p>
+    <w:p>
+      <w:pPr>
+        <w:pStyle w:val="TextprceText"/>
+        <w:rPr>
+          <w:lang w:val="sk-SK"/>
+        </w:rPr>
+      </w:pPr>
+      <w:r>
+        <w:rPr>
+          <w:lang w:val="sk-SK"/>
+        </w:rPr>
+        <w:t>Pri interpretácii výsledkov je potrebné zohľadniť, že nie všetky modely boli testované za úplne rovnakých podmienok. Väčšina modelov bola testovaná v troch behoch na vzorke 15 000 nahrávok, no pri niektorých modeloch bola z dôvodu časovej náročnosti alebo obmedzení API použitá menšia vzorka. Z tohto dôvodu je presnosť možné porovnávať priamo vo väčšom rozsahu než rýchlosť, ktorá závisela aj od spôsobu spustenia modelu, dostupného hardvéru a prípadných obmedzení cloudovej služby.</w:t>
       </w:r>
     </w:p>
     <w:p>
@@ -4876,36 +4944,90 @@
         <w:rPr>
           <w:lang w:val="sk-SK"/>
         </w:rPr>
-        <w:t>Vyjadrenie chybovosti modelov</w:t>
+        <w:tab/>
+        <w:t>Z pohľadu presnosti dosiahol najlepší výsledok model huggingface_whisper_large_v3_czech, ktorý mal priemernú hodnotu WER 0,0635 a CER 0,0147. Tento výsledok naznačuje, že jazykovo doladený model Whisper pre český jazyk bol na použitom datasete výrazne presnejší než všeobecné viacjazyčné modely.</w:t>
       </w:r>
     </w:p>
     <w:p>
       <w:pPr>
         <w:pStyle w:val="TextprceText"/>
-        <w:ind w:hanging="0"/>
-        <w:rPr>
-          <w:lang w:val="sk-SK"/>
-        </w:rPr>
-      </w:pPr>
-      <w:r>
-        <w:rPr>
-          <w:lang w:val="sk-SK"/>
-        </w:rPr>
-        <w:t>Vyhodnotenie rýchlosti prevodu</w:t>
-      </w:r>
-    </w:p>
-    <w:p>
-      <w:pPr>
-        <w:pStyle w:val="Odstavec1Paragraph1"/>
-        <w:rPr>
-          <w:lang w:val="sk-SK"/>
-        </w:rPr>
-      </w:pPr>
-      <w:r>
-        <w:rPr>
-          <w:lang w:val="sk-SK"/>
-        </w:rPr>
-        <w:t>Porovnanie chybovosti bežného textu a textu zaťaženého accentom/rýchlosťou/šumom pozadia</w:t>
+        <w:rPr>
+          <w:lang w:val="sk-SK"/>
+        </w:rPr>
+      </w:pPr>
+      <w:r>
+        <w:rPr>
+          <w:lang w:val="sk-SK"/>
+        </w:rPr>
+        <w:t>Druhý najlepší výsledok dosiahol model huggingface_whisper_medium_czech s hodnotou WER 0,1167 a CER 0,0278. Aj tento model bol doladený pre český jazyk, čo potvrdzuje význam jazykovej adaptácie pri rozpoznávaní reči.</w:t>
+      </w:r>
+    </w:p>
+    <w:p>
+      <w:pPr>
+        <w:pStyle w:val="TextprceText"/>
+        <w:rPr>
+          <w:lang w:val="sk-SK"/>
+        </w:rPr>
+      </w:pPr>
+      <w:r>
+        <w:rPr>
+          <w:lang w:val="sk-SK"/>
+        </w:rPr>
+        <w:t>Z pôvodných lokálnych modelov Whisper dosiahol najlepší výsledok whisper_large s hodnotou WER 0,1655 a CER 0,0441. Tento model však nebolo možné spustiť s CUDA akceleráciou na dostupnej grafickej karte, preto bol testovaný iba na menšej vzorke približne 3 000 nahrávok v jednom behu. Jeho presnosť je preto zaujímavá, ale čas spracovania bol výrazne horší než pri modeloch bežiacich na GPU.</w:t>
+      </w:r>
+    </w:p>
+    <w:p>
+      <w:pPr>
+        <w:pStyle w:val="TextprceText"/>
+        <w:rPr>
+          <w:lang w:val="sk-SK"/>
+        </w:rPr>
+      </w:pPr>
+      <w:r>
+        <w:rPr>
+          <w:lang w:val="sk-SK"/>
+        </w:rPr>
+        <w:t>Modely Faster-Whisper dosiahli horšiu presnosť než české Hugging Face Whisper modely, ale ich hlavnou výhodou bola optimalizovaná inferencia a nižšie nároky na praktické spustenie. Faster-Whisper Large dosiahol WER 0,2112 a CER 0,0581, zatiaľ čo Faster-Whisper Medium dosiahol WER 0,2636 a CER 0,0716.</w:t>
+      </w:r>
+    </w:p>
+    <w:p>
+      <w:pPr>
+        <w:pStyle w:val="TextprceText"/>
+        <w:rPr>
+          <w:lang w:val="sk-SK"/>
+        </w:rPr>
+      </w:pPr>
+      <w:r>
+        <w:rPr>
+          <w:lang w:val="sk-SK"/>
+        </w:rPr>
+        <w:t xml:space="preserve">Pri hodnotení rýchlosti bol použitý ukazovateľ average_transcript_ratio. Hodnota menšia ako 1 znamená, že model spracovával audio rýchlejšie než v reálnom čase. Najnižšiu hodnotu </w:t>
+      </w:r>
+      <w:r>
+        <w:rPr>
+          <w:lang w:val="sk-SK"/>
+        </w:rPr>
+        <w:t>z relevantných výsledkov</w:t>
+      </w:r>
+      <w:r>
+        <w:rPr>
+          <w:lang w:val="sk-SK"/>
+        </w:rPr>
+        <w:t xml:space="preserve"> dosiahol model huggingface_wav2vec2_xlsr_czech, avšak jeho presnosť bola v porovnaní s najlepšími modelmi výrazne horšia. Podobne rýchle boli aj menšie modely Whisper, najmä whisper_base, whisper_small a whisper_tiny, pri ktorých sa však prejavil výrazný pokles presnosti.</w:t>
+      </w:r>
+    </w:p>
+    <w:p>
+      <w:pPr>
+        <w:pStyle w:val="TextprceText"/>
+        <w:rPr>
+          <w:lang w:val="sk-SK"/>
+        </w:rPr>
+      </w:pPr>
+      <w:r>
+        <w:rPr>
+          <w:lang w:val="sk-SK"/>
+        </w:rPr>
+        <w:t>Z praktického pohľadu preto nebolo možné hodnotiť modely iba podľa rýchlosti. Najlepšie modely z hľadiska presnosti boli spravidla výpočtovo náročnejšie, zatiaľ čo najrýchlejšie modely dosahovali vyššiu chybovosť.</w:t>
       </w:r>
     </w:p>
     <w:p>
@@ -4939,7 +5061,263 @@
         <w:rPr>
           <w:lang w:val="sk-SK"/>
         </w:rPr>
-        <w:t>TODO</w:t>
+        <w:tab/>
+        <w:t>Na vizualizáciu výsledkov boli zvolené samostatné grafy pre metriky WER, CER a average_transcript_ratio. Hodnoty WER a CER boli použité na porovnanie presnosti modelov, zatiaľ čo average_transcript_ratio slúžil na porovnanie praktickej rýchlosti spracovania.</w:t>
+      </w:r>
+    </w:p>
+    <w:p>
+      <w:pPr>
+        <w:pStyle w:val="TextprceText"/>
+        <w:rPr>
+          <w:lang w:val="sk-SK"/>
+        </w:rPr>
+      </w:pPr>
+      <w:r>
+        <w:rPr>
+          <w:lang w:val="sk-SK"/>
+        </w:rPr>
+        <w:t>Pre lepšiu čitateľnosť boli modely v grafoch zoradené podľa hodnoty príslušnej metriky od najlepšieho výsledku po najhorší. Pri WER a CER znamená nižšia hodnota lepší výsledok. Pri average_transcript_ratio znamená nižšia hodnota rýchlejšie spracovanie.</w:t>
+      </w:r>
+    </w:p>
+    <w:p>
+      <w:pPr>
+        <w:pStyle w:val="TextprceText"/>
+        <w:rPr>
+          <w:lang w:val="sk-SK"/>
+        </w:rPr>
+      </w:pPr>
+      <w:r>
+        <w:rPr>
+          <w:lang w:val="sk-SK"/>
+        </w:rPr>
+      </w:r>
+    </w:p>
+    <w:p>
+      <w:pPr>
+        <w:pStyle w:val="TextprceText"/>
+        <w:rPr>
+          <w:lang w:val="sk-SK"/>
+        </w:rPr>
+      </w:pPr>
+      <w:r>
+        <w:rPr>
+          <w:lang w:val="sk-SK"/>
+        </w:rPr>
+        <w:drawing>
+          <wp:anchor distT="0" distB="0" distL="0" distR="0" simplePos="0" relativeHeight="6" behindDoc="0" locked="0" layoutInCell="0" allowOverlap="1">
+            <wp:simplePos x="0" y="0"/>
+            <wp:positionH relativeFrom="column">
+              <wp:posOffset>-466090</wp:posOffset>
+            </wp:positionH>
+            <wp:positionV relativeFrom="paragraph">
+              <wp:posOffset>-35560</wp:posOffset>
+            </wp:positionV>
+            <wp:extent cx="6286500" cy="3212465"/>
+            <wp:effectExtent l="0" t="0" r="0" b="0"/>
+            <wp:wrapSquare wrapText="largest"/>
+            <wp:docPr id="5" name="Object1"/>
+            <wp:cNvGraphicFramePr/>
+            <a:graphic xmlns:a="http://schemas.openxmlformats.org/drawingml/2006/main">
+              <a:graphicData uri="http://schemas.openxmlformats.org/drawingml/2006/chart">
+                <c:chart xmlns:c="http://schemas.openxmlformats.org/drawingml/2006/chart" xmlns:r="http://schemas.openxmlformats.org/officeDocument/2006/relationships" r:id="rId15"/>
+              </a:graphicData>
+            </a:graphic>
+          </wp:anchor>
+        </w:drawing>
+      </w:r>
+    </w:p>
+    <w:p>
+      <w:pPr>
+        <w:pStyle w:val="TextprceText"/>
+        <w:ind w:hanging="0" w:start="0"/>
+        <w:rPr>
+          <w:lang w:val="sk-SK"/>
+        </w:rPr>
+      </w:pPr>
+      <w:r>
+        <w:rPr>
+          <w:lang w:val="sk-SK"/>
+        </w:rPr>
+      </w:r>
+    </w:p>
+    <w:p>
+      <w:pPr>
+        <w:pStyle w:val="TextprceText"/>
+        <w:rPr>
+          <w:lang w:val="sk-SK"/>
+        </w:rPr>
+      </w:pPr>
+      <w:r>
+        <w:rPr>
+          <w:lang w:val="sk-SK"/>
+        </w:rPr>
+        <w:drawing>
+          <wp:anchor distT="0" distB="0" distL="0" distR="0" simplePos="0" relativeHeight="7" behindDoc="0" locked="0" layoutInCell="0" allowOverlap="1">
+            <wp:simplePos x="0" y="0"/>
+            <wp:positionH relativeFrom="column">
+              <wp:align>center</wp:align>
+            </wp:positionH>
+            <wp:positionV relativeFrom="paragraph">
+              <wp:posOffset>635</wp:posOffset>
+            </wp:positionV>
+            <wp:extent cx="6257290" cy="3204210"/>
+            <wp:effectExtent l="0" t="0" r="0" b="0"/>
+            <wp:wrapSquare wrapText="largest"/>
+            <wp:docPr id="6" name="Object2"/>
+            <wp:cNvGraphicFramePr/>
+            <a:graphic xmlns:a="http://schemas.openxmlformats.org/drawingml/2006/main">
+              <a:graphicData uri="http://schemas.openxmlformats.org/drawingml/2006/chart">
+                <c:chart xmlns:c="http://schemas.openxmlformats.org/drawingml/2006/chart" xmlns:r="http://schemas.openxmlformats.org/officeDocument/2006/relationships" r:id="rId16"/>
+              </a:graphicData>
+            </a:graphic>
+          </wp:anchor>
+        </w:drawing>
+      </w:r>
+    </w:p>
+    <w:p>
+      <w:pPr>
+        <w:pStyle w:val="TextprceText"/>
+        <w:rPr>
+          <w:lang w:val="sk-SK"/>
+        </w:rPr>
+      </w:pPr>
+      <w:r>
+        <w:rPr>
+          <w:lang w:val="sk-SK"/>
+        </w:rPr>
+      </w:r>
+    </w:p>
+    <w:p>
+      <w:pPr>
+        <w:pStyle w:val="TextprceText"/>
+        <w:rPr>
+          <w:lang w:val="sk-SK"/>
+        </w:rPr>
+      </w:pPr>
+      <w:r>
+        <w:rPr>
+          <w:lang w:val="sk-SK"/>
+        </w:rPr>
+        <w:drawing>
+          <wp:anchor distT="0" distB="0" distL="0" distR="0" simplePos="0" relativeHeight="8" behindDoc="0" locked="0" layoutInCell="0" allowOverlap="1">
+            <wp:simplePos x="0" y="0"/>
+            <wp:positionH relativeFrom="column">
+              <wp:align>center</wp:align>
+            </wp:positionH>
+            <wp:positionV relativeFrom="paragraph">
+              <wp:posOffset>635</wp:posOffset>
+            </wp:positionV>
+            <wp:extent cx="6265545" cy="3239770"/>
+            <wp:effectExtent l="0" t="0" r="0" b="0"/>
+            <wp:wrapSquare wrapText="largest"/>
+            <wp:docPr id="7" name="Object3"/>
+            <wp:cNvGraphicFramePr/>
+            <a:graphic xmlns:a="http://schemas.openxmlformats.org/drawingml/2006/main">
+              <a:graphicData uri="http://schemas.openxmlformats.org/drawingml/2006/chart">
+                <c:chart xmlns:c="http://schemas.openxmlformats.org/drawingml/2006/chart" xmlns:r="http://schemas.openxmlformats.org/officeDocument/2006/relationships" r:id="rId17"/>
+              </a:graphicData>
+            </a:graphic>
+          </wp:anchor>
+        </w:drawing>
+      </w:r>
+    </w:p>
+    <w:p>
+      <w:pPr>
+        <w:pStyle w:val="TextprceText"/>
+        <w:rPr>
+          <w:lang w:val="sk-SK"/>
+        </w:rPr>
+      </w:pPr>
+      <w:r>
+        <w:rPr>
+          <w:lang w:val="sk-SK"/>
+        </w:rPr>
+      </w:r>
+    </w:p>
+    <w:p>
+      <w:pPr>
+        <w:pStyle w:val="TextprceText"/>
+        <w:rPr>
+          <w:lang w:val="sk-SK"/>
+        </w:rPr>
+      </w:pPr>
+      <w:r>
+        <w:rPr>
+          <w:lang w:val="sk-SK"/>
+        </w:rPr>
+      </w:r>
+    </w:p>
+    <w:p>
+      <w:pPr>
+        <w:pStyle w:val="TextprceText"/>
+        <w:rPr>
+          <w:lang w:val="sk-SK"/>
+        </w:rPr>
+      </w:pPr>
+      <w:r>
+        <w:rPr>
+          <w:lang w:val="sk-SK"/>
+        </w:rPr>
+      </w:r>
+    </w:p>
+    <w:p>
+      <w:pPr>
+        <w:pStyle w:val="TextprceText"/>
+        <w:rPr>
+          <w:lang w:val="sk-SK"/>
+        </w:rPr>
+      </w:pPr>
+      <w:r>
+        <w:rPr>
+          <w:lang w:val="sk-SK"/>
+        </w:rPr>
+      </w:r>
+    </w:p>
+    <w:p>
+      <w:pPr>
+        <w:pStyle w:val="TextprceText"/>
+        <w:rPr>
+          <w:lang w:val="sk-SK"/>
+        </w:rPr>
+      </w:pPr>
+      <w:r>
+        <w:rPr>
+          <w:lang w:val="sk-SK"/>
+        </w:rPr>
+        <w:drawing>
+          <wp:anchor distT="0" distB="0" distL="0" distR="0" simplePos="0" relativeHeight="9" behindDoc="0" locked="0" layoutInCell="0" allowOverlap="1">
+            <wp:simplePos x="0" y="0"/>
+            <wp:positionH relativeFrom="column">
+              <wp:align>center</wp:align>
+            </wp:positionH>
+            <wp:positionV relativeFrom="paragraph">
+              <wp:posOffset>635</wp:posOffset>
+            </wp:positionV>
+            <wp:extent cx="6286500" cy="3532505"/>
+            <wp:effectExtent l="0" t="0" r="0" b="0"/>
+            <wp:wrapSquare wrapText="largest"/>
+            <wp:docPr id="8" name="Object4"/>
+            <wp:cNvGraphicFramePr/>
+            <a:graphic xmlns:a="http://schemas.openxmlformats.org/drawingml/2006/main">
+              <a:graphicData uri="http://schemas.openxmlformats.org/drawingml/2006/chart">
+                <c:chart xmlns:c="http://schemas.openxmlformats.org/drawingml/2006/chart" xmlns:r="http://schemas.openxmlformats.org/officeDocument/2006/relationships" r:id="rId18"/>
+              </a:graphicData>
+            </a:graphic>
+          </wp:anchor>
+        </w:drawing>
+      </w:r>
+    </w:p>
+    <w:p>
+      <w:pPr>
+        <w:pStyle w:val="TextprceText"/>
+        <w:rPr>
+          <w:lang w:val="sk-SK"/>
+        </w:rPr>
+      </w:pPr>
+      <w:r>
+        <w:rPr>
+          <w:lang w:val="sk-SK"/>
+        </w:rPr>
       </w:r>
     </w:p>
     <w:p>
@@ -4973,7 +5351,78 @@
         <w:rPr>
           <w:lang w:val="sk-SK"/>
         </w:rPr>
-        <w:t>Vyhodnotenie chybovosti a rýchlosti spracovania, vrátane zmien vznikajúcich zmenou rýchlosti/pridanie šumu</w:t>
+        <w:tab/>
+        <w:t>Najlepšie výsledky z pohľadu presnosti dosiahli české modely založené na architektúre Whisper dostupné cez Hugging Face. Najmä model huggingface_whisper_large_v3_czech mal výrazne nižšiu chybovosť než ostatné testované riešenia. Jeho výhodou bola dobrá adaptácia na český jazyk, nevýhodou vyššie hardvérové nároky oproti menším modelom.</w:t>
+      </w:r>
+    </w:p>
+    <w:p>
+      <w:pPr>
+        <w:pStyle w:val="TextprceText"/>
+        <w:rPr>
+          <w:lang w:val="sk-SK"/>
+        </w:rPr>
+      </w:pPr>
+      <w:r>
+        <w:rPr>
+          <w:lang w:val="sk-SK"/>
+        </w:rPr>
+        <w:t>Všeobecné modely Whisper dosiahli rozdielne výsledky podľa veľkosti modelu. Väčšie modely boli presnejšie, ale zároveň pomalšie a náročnejšie na hardvér. Model whisper_large dosiahol dobrú presnosť, ale pre nedostatok VRAM musel bežať na CPU, čo výrazne zhoršilo jeho praktickú použiteľnosť.</w:t>
+      </w:r>
+    </w:p>
+    <w:p>
+      <w:pPr>
+        <w:pStyle w:val="TextprceText"/>
+        <w:rPr>
+          <w:lang w:val="sk-SK"/>
+        </w:rPr>
+      </w:pPr>
+      <w:r>
+        <w:rPr>
+          <w:lang w:val="sk-SK"/>
+        </w:rPr>
+        <w:t>Faster-Whisper modely predstavovali vhodný kompromis medzi presnosťou a rýchlosťou. Hoci nedosiahli presnosť českých Hugging Face Whisper modelov, ich výhodou bola optimalizovaná implementácia a možnosť efektívneho behu na GPU.</w:t>
+      </w:r>
+    </w:p>
+    <w:p>
+      <w:pPr>
+        <w:pStyle w:val="TextprceText"/>
+        <w:rPr>
+          <w:lang w:val="sk-SK"/>
+        </w:rPr>
+      </w:pPr>
+      <w:r>
+        <w:rPr>
+          <w:lang w:val="sk-SK"/>
+        </w:rPr>
+        <w:t>Modely Wav2Vec2 dostupné cez Hugging Face boli vo viacerých prípadoch rýchle, ale ich presnosť bola horšia než pri modeloch Whisper. Výsledky ukazujú, že samotná jazyková špecializácia modelu nestačí, ak model nedosahuje dostatočnú kvalitu pre konkrétny testovaný dataset.</w:t>
+      </w:r>
+    </w:p>
+    <w:p>
+      <w:pPr>
+        <w:pStyle w:val="TextprceText"/>
+        <w:rPr>
+          <w:lang w:val="sk-SK"/>
+        </w:rPr>
+      </w:pPr>
+      <w:r>
+        <w:rPr>
+          <w:lang w:val="sk-SK"/>
+        </w:rPr>
+        <w:t>Cloudové riešenia priniesli zmiešané výsledky. Google Web Speech API dosiahol použiteľné, ale nie špičkové výsledky. Pri Groq API sa prejavila lepšia presnosť než pri Google API, avšak čas spracovania bol výrazne ovplyvnený spomaľovaním odpovedí pri väčšom počte požiadaviek. Pri API modeloch preto výsledný čas neodráža iba výkon samotného modelu, ale aj sieťovú komunikáciu a limity služby.</w:t>
+      </w:r>
+    </w:p>
+    <w:p>
+      <w:pPr>
+        <w:pStyle w:val="TextprceText"/>
+        <w:rPr>
+          <w:lang w:val="sk-SK"/>
+        </w:rPr>
+      </w:pPr>
+      <w:r>
+        <w:rPr>
+          <w:lang w:val="sk-SK"/>
+        </w:rPr>
+        <w:t>Najhoršie výsledky dosiahli najmenšie modely Whisper, najmä whisper_tiny a whisper_base. Ich výhodou bola rýchlosť a nízke nároky, ale chybovosť bola výrazne vyššia. Tieto modely môžu byť použiteľné ako rýchly orientačný prepis, nie však ako najvhodnejšie riešenie pri požiadavke na presnosť.</w:t>
       </w:r>
     </w:p>
     <w:p>
@@ -5024,37 +5473,359 @@
         <w:rPr>
           <w:lang w:val="sk-SK"/>
         </w:rPr>
-        <w:t>Vyhodnotiť využiteľnosť použitých modelov</w:t>
+        <w:tab/>
+        <w:t>Technológie Speech-to-Text majú v praxi široké využitie všade tam, kde je potrebné previesť hovorené slovo do textovej podoby. Môže ísť o automatické titulkovanie, diktovanie textu, prepis stretnutí, spracovanie telefonátov, hlasové ovládanie aplikácií alebo podporu prístupnosti pre používateľov so zdravotným znevýhodnením.</w:t>
       </w:r>
     </w:p>
     <w:p>
       <w:pPr>
         <w:pStyle w:val="TextprceText"/>
-        <w:ind w:hanging="0"/>
-        <w:rPr>
-          <w:lang w:val="sk-SK"/>
-        </w:rPr>
-      </w:pPr>
-      <w:r>
-        <w:rPr>
-          <w:lang w:val="sk-SK"/>
-        </w:rPr>
-        <w:t>Použitie v softwaroch</w:t>
+        <w:ind w:hanging="0" w:start="0"/>
+        <w:rPr>
+          <w:lang w:val="sk-SK"/>
+        </w:rPr>
+      </w:pPr>
+      <w:r>
+        <w:rPr>
+          <w:lang w:val="sk-SK"/>
+        </w:rPr>
+        <w:tab/>
+        <w:t>Z výsledkov praktického testovania vyplýva, že výber vhodného STT riešenia závisí najmä od požiadaviek konkrétnej aplikácie. Ak je dôležitá čo najvyššia presnosť prepisu, vhodnejšie sú väčšie alebo jazykovo špecializované modely. V tejto práci dosiahli najlepšie výsledky najmä modely založené na architektúre Whisper, ktoré boli doladené pre český jazyk. Ich nevýhodou sú však vyššie hardvérové nároky a dlhší čas spracovania.</w:t>
       </w:r>
     </w:p>
     <w:p>
       <w:pPr>
         <w:pStyle w:val="TextprceText"/>
-        <w:ind w:hanging="0"/>
-        <w:rPr>
-          <w:lang w:val="sk-SK"/>
-        </w:rPr>
-      </w:pPr>
-      <w:r>
-        <w:rPr>
-          <w:lang w:val="sk-SK"/>
-        </w:rPr>
-        <w:t>Príklady využitia v praxi</w:t>
+        <w:ind w:hanging="0" w:start="0"/>
+        <w:rPr>
+          <w:lang w:val="sk-SK"/>
+        </w:rPr>
+      </w:pPr>
+      <w:r>
+        <w:rPr>
+          <w:lang w:val="sk-SK"/>
+        </w:rPr>
+        <w:tab/>
+        <w:t>Menšie modely môžu byť vhodné v situáciách, kde je dôležitejšia rýchlosť alebo nízka výpočtová náročnosť než úplná presnosť. Takéto riešenia sa môžu uplatniť napríklad pri orientačnom prepise, rýchlom vyhľadávaní v audiozáznamoch alebo v aplikáciách, kde sa text následne ešte manuálne kontroluje. Ich nevýhodou je vyššia chybovosť, najmä pri menej kvalitných nahrávkach alebo zložitejších vetách.</w:t>
+      </w:r>
+    </w:p>
+    <w:p>
+      <w:pPr>
+        <w:pStyle w:val="TextprceText"/>
+        <w:ind w:hanging="0" w:start="0"/>
+        <w:rPr>
+          <w:lang w:val="sk-SK"/>
+        </w:rPr>
+      </w:pPr>
+      <w:r>
+        <w:rPr>
+          <w:lang w:val="sk-SK"/>
+        </w:rPr>
+        <w:tab/>
+        <w:t>Lokálne spúšťané modely sú vhodné najmä tam, kde je dôležitá kontrola nad dátami. Môže ísť napríklad o interné firemné systémy, zdravotnícke dáta, právne záznamy alebo iné citlivé nahrávky. Výhodou lokálneho riešenia je aj možnosť práce bez internetového pripojenia. Nevýhodou sú vyššie nároky na hardvér, hlavne pri väčších modeloch, ktoré pre efektívne spracovanie často vyžadujú GPU.</w:t>
+      </w:r>
+    </w:p>
+    <w:p>
+      <w:pPr>
+        <w:pStyle w:val="TextprceText"/>
+        <w:ind w:hanging="0" w:start="0"/>
+        <w:rPr>
+          <w:lang w:val="sk-SK"/>
+        </w:rPr>
+      </w:pPr>
+      <w:r>
+        <w:rPr>
+          <w:lang w:val="sk-SK"/>
+        </w:rPr>
+        <w:tab/>
+        <w:t>Cloudové API služby sú vhodné v prípadoch, kde používateľ nechce riešiť inštaláciu modelov, závislosti ani výpočtový výkon vlastného zariadenia. Ich výhodou je jednoduchá integrácia a dostupnosť. Nevýhodou je závislosť od poskytovateľa služby, internetového pripojenia, API limitov a prípadných nákladov. Pri väčšom množstve požiadaviek sa môže prejaviť aj spomalenie spracovania alebo obmedzenie služby.</w:t>
+      </w:r>
+    </w:p>
+    <w:p>
+      <w:pPr>
+        <w:pStyle w:val="TextprceText"/>
+        <w:rPr>
+          <w:lang w:val="sk-SK"/>
+        </w:rPr>
+      </w:pPr>
+      <w:r>
+        <w:rPr>
+          <w:lang w:val="sk-SK"/>
+        </w:rPr>
+        <w:t>STT technológie môžu byť prakticky využité napríklad v týchto oblastiach:</w:t>
+      </w:r>
+    </w:p>
+    <w:p>
+      <w:pPr>
+        <w:pStyle w:val="TextprceText"/>
+        <w:widowControl/>
+        <w:numPr>
+          <w:ilvl w:val="0"/>
+          <w:numId w:val="9"/>
+        </w:numPr>
+        <w:tabs>
+          <w:tab w:val="clear" w:pos="709"/>
+          <w:tab w:val="left" w:pos="3261" w:leader="none"/>
+          <w:tab w:val="left" w:pos="7938" w:leader="none"/>
+        </w:tabs>
+        <w:suppressAutoHyphens w:val="true"/>
+        <w:bidi w:val="0"/>
+        <w:jc w:val="both"/>
+        <w:rPr>
+          <w:rFonts w:ascii="Times New Roman" w:hAnsi="Times New Roman" w:eastAsia="Times New Roman" w:cs="Times New Roman"/>
+          <w:kern w:val="0"/>
+          <w:sz w:val="24"/>
+          <w:szCs w:val="24"/>
+          <w:lang w:val="sk-SK" w:eastAsia="cs-CZ" w:bidi="ar-SA"/>
+        </w:rPr>
+      </w:pPr>
+      <w:r>
+        <w:rPr>
+          <w:lang w:val="sk-SK"/>
+        </w:rPr>
+        <w:t>au</w:t>
+      </w:r>
+      <w:r>
+        <w:rPr>
+          <w:rFonts w:eastAsia="Times New Roman" w:cs="Times New Roman"/>
+          <w:kern w:val="0"/>
+          <w:sz w:val="24"/>
+          <w:szCs w:val="24"/>
+          <w:lang w:val="cs-CZ" w:eastAsia="cs-CZ" w:bidi="ar-SA"/>
+        </w:rPr>
+        <w:t>tomatické titulkovanie videí a prednášok,</w:t>
+      </w:r>
+    </w:p>
+    <w:p>
+      <w:pPr>
+        <w:pStyle w:val="TextprceText"/>
+        <w:widowControl/>
+        <w:numPr>
+          <w:ilvl w:val="0"/>
+          <w:numId w:val="9"/>
+        </w:numPr>
+        <w:tabs>
+          <w:tab w:val="clear" w:pos="709"/>
+          <w:tab w:val="left" w:pos="3261" w:leader="none"/>
+          <w:tab w:val="left" w:pos="7938" w:leader="none"/>
+        </w:tabs>
+        <w:suppressAutoHyphens w:val="true"/>
+        <w:bidi w:val="0"/>
+        <w:jc w:val="both"/>
+        <w:rPr>
+          <w:rFonts w:ascii="Times New Roman" w:hAnsi="Times New Roman" w:eastAsia="Times New Roman" w:cs="Times New Roman"/>
+          <w:kern w:val="0"/>
+          <w:sz w:val="24"/>
+          <w:szCs w:val="24"/>
+          <w:lang w:val="cs-CZ" w:eastAsia="cs-CZ" w:bidi="ar-SA"/>
+        </w:rPr>
+      </w:pPr>
+      <w:r>
+        <w:rPr>
+          <w:rFonts w:eastAsia="Times New Roman" w:cs="Times New Roman"/>
+          <w:kern w:val="0"/>
+          <w:sz w:val="24"/>
+          <w:szCs w:val="24"/>
+          <w:lang w:val="cs-CZ" w:eastAsia="cs-CZ" w:bidi="ar-SA"/>
+        </w:rPr>
+        <w:t>prepis pracovných stretnutí a rozhovorov,</w:t>
+      </w:r>
+    </w:p>
+    <w:p>
+      <w:pPr>
+        <w:pStyle w:val="TextprceText"/>
+        <w:widowControl/>
+        <w:numPr>
+          <w:ilvl w:val="0"/>
+          <w:numId w:val="9"/>
+        </w:numPr>
+        <w:tabs>
+          <w:tab w:val="clear" w:pos="709"/>
+          <w:tab w:val="left" w:pos="3261" w:leader="none"/>
+          <w:tab w:val="left" w:pos="7938" w:leader="none"/>
+        </w:tabs>
+        <w:suppressAutoHyphens w:val="true"/>
+        <w:bidi w:val="0"/>
+        <w:jc w:val="both"/>
+        <w:rPr>
+          <w:rFonts w:ascii="Times New Roman" w:hAnsi="Times New Roman" w:eastAsia="Times New Roman" w:cs="Times New Roman"/>
+          <w:kern w:val="0"/>
+          <w:sz w:val="24"/>
+          <w:szCs w:val="24"/>
+          <w:lang w:val="cs-CZ" w:eastAsia="cs-CZ" w:bidi="ar-SA"/>
+        </w:rPr>
+      </w:pPr>
+      <w:r>
+        <w:rPr>
+          <w:rFonts w:eastAsia="Times New Roman" w:cs="Times New Roman"/>
+          <w:kern w:val="0"/>
+          <w:sz w:val="24"/>
+          <w:szCs w:val="24"/>
+          <w:lang w:val="cs-CZ" w:eastAsia="cs-CZ" w:bidi="ar-SA"/>
+        </w:rPr>
+        <w:t>diktovanie textu v kancelárskych aplikáciách,</w:t>
+      </w:r>
+    </w:p>
+    <w:p>
+      <w:pPr>
+        <w:pStyle w:val="TextprceText"/>
+        <w:widowControl/>
+        <w:numPr>
+          <w:ilvl w:val="0"/>
+          <w:numId w:val="9"/>
+        </w:numPr>
+        <w:tabs>
+          <w:tab w:val="clear" w:pos="709"/>
+          <w:tab w:val="left" w:pos="3261" w:leader="none"/>
+          <w:tab w:val="left" w:pos="7938" w:leader="none"/>
+        </w:tabs>
+        <w:suppressAutoHyphens w:val="true"/>
+        <w:bidi w:val="0"/>
+        <w:jc w:val="both"/>
+        <w:rPr>
+          <w:rFonts w:ascii="Times New Roman" w:hAnsi="Times New Roman" w:eastAsia="Times New Roman" w:cs="Times New Roman"/>
+          <w:kern w:val="0"/>
+          <w:sz w:val="24"/>
+          <w:szCs w:val="24"/>
+          <w:lang w:val="cs-CZ" w:eastAsia="cs-CZ" w:bidi="ar-SA"/>
+        </w:rPr>
+      </w:pPr>
+      <w:r>
+        <w:rPr>
+          <w:rFonts w:eastAsia="Times New Roman" w:cs="Times New Roman"/>
+          <w:kern w:val="0"/>
+          <w:sz w:val="24"/>
+          <w:szCs w:val="24"/>
+          <w:lang w:val="cs-CZ" w:eastAsia="cs-CZ" w:bidi="ar-SA"/>
+        </w:rPr>
+        <w:t>spracovanie záznamov z call centier,</w:t>
+      </w:r>
+    </w:p>
+    <w:p>
+      <w:pPr>
+        <w:pStyle w:val="TextprceText"/>
+        <w:widowControl/>
+        <w:numPr>
+          <w:ilvl w:val="0"/>
+          <w:numId w:val="9"/>
+        </w:numPr>
+        <w:tabs>
+          <w:tab w:val="clear" w:pos="709"/>
+          <w:tab w:val="left" w:pos="3261" w:leader="none"/>
+          <w:tab w:val="left" w:pos="7938" w:leader="none"/>
+        </w:tabs>
+        <w:suppressAutoHyphens w:val="true"/>
+        <w:bidi w:val="0"/>
+        <w:jc w:val="both"/>
+        <w:rPr>
+          <w:rFonts w:ascii="Times New Roman" w:hAnsi="Times New Roman" w:eastAsia="Times New Roman" w:cs="Times New Roman"/>
+          <w:kern w:val="0"/>
+          <w:sz w:val="24"/>
+          <w:szCs w:val="24"/>
+          <w:lang w:val="cs-CZ" w:eastAsia="cs-CZ" w:bidi="ar-SA"/>
+        </w:rPr>
+      </w:pPr>
+      <w:r>
+        <w:rPr>
+          <w:rFonts w:eastAsia="Times New Roman" w:cs="Times New Roman"/>
+          <w:kern w:val="0"/>
+          <w:sz w:val="24"/>
+          <w:szCs w:val="24"/>
+          <w:lang w:val="cs-CZ" w:eastAsia="cs-CZ" w:bidi="ar-SA"/>
+        </w:rPr>
+        <w:t>hlasové ovládanie softvéru,</w:t>
+      </w:r>
+    </w:p>
+    <w:p>
+      <w:pPr>
+        <w:pStyle w:val="TextprceText"/>
+        <w:widowControl/>
+        <w:numPr>
+          <w:ilvl w:val="0"/>
+          <w:numId w:val="9"/>
+        </w:numPr>
+        <w:tabs>
+          <w:tab w:val="clear" w:pos="709"/>
+          <w:tab w:val="left" w:pos="3261" w:leader="none"/>
+          <w:tab w:val="left" w:pos="7938" w:leader="none"/>
+        </w:tabs>
+        <w:suppressAutoHyphens w:val="true"/>
+        <w:bidi w:val="0"/>
+        <w:jc w:val="both"/>
+        <w:rPr>
+          <w:rFonts w:ascii="Times New Roman" w:hAnsi="Times New Roman" w:eastAsia="Times New Roman" w:cs="Times New Roman"/>
+          <w:kern w:val="0"/>
+          <w:sz w:val="24"/>
+          <w:szCs w:val="24"/>
+          <w:lang w:val="cs-CZ" w:eastAsia="cs-CZ" w:bidi="ar-SA"/>
+        </w:rPr>
+      </w:pPr>
+      <w:r>
+        <w:rPr>
+          <w:rFonts w:eastAsia="Times New Roman" w:cs="Times New Roman"/>
+          <w:kern w:val="0"/>
+          <w:sz w:val="24"/>
+          <w:szCs w:val="24"/>
+          <w:lang w:val="cs-CZ" w:eastAsia="cs-CZ" w:bidi="ar-SA"/>
+        </w:rPr>
+        <w:t>vyhľadávanie v audio a video archívoch,</w:t>
+      </w:r>
+    </w:p>
+    <w:p>
+      <w:pPr>
+        <w:pStyle w:val="TextprceText"/>
+        <w:widowControl/>
+        <w:numPr>
+          <w:ilvl w:val="0"/>
+          <w:numId w:val="9"/>
+        </w:numPr>
+        <w:tabs>
+          <w:tab w:val="clear" w:pos="709"/>
+          <w:tab w:val="left" w:pos="3261" w:leader="none"/>
+          <w:tab w:val="left" w:pos="7938" w:leader="none"/>
+        </w:tabs>
+        <w:suppressAutoHyphens w:val="true"/>
+        <w:bidi w:val="0"/>
+        <w:jc w:val="both"/>
+        <w:rPr>
+          <w:rFonts w:ascii="Times New Roman" w:hAnsi="Times New Roman" w:eastAsia="Times New Roman" w:cs="Times New Roman"/>
+          <w:kern w:val="0"/>
+          <w:sz w:val="24"/>
+          <w:szCs w:val="24"/>
+          <w:lang w:val="sk-SK" w:eastAsia="cs-CZ" w:bidi="ar-SA"/>
+        </w:rPr>
+      </w:pPr>
+      <w:r>
+        <w:rPr>
+          <w:rFonts w:eastAsia="Times New Roman" w:cs="Times New Roman"/>
+          <w:kern w:val="0"/>
+          <w:sz w:val="24"/>
+          <w:szCs w:val="24"/>
+          <w:lang w:val="cs-CZ" w:eastAsia="cs-CZ" w:bidi="ar-SA"/>
+        </w:rPr>
+        <w:t xml:space="preserve">podpora </w:t>
+      </w:r>
+      <w:r>
+        <w:rPr>
+          <w:lang w:val="sk-SK"/>
+        </w:rPr>
+        <w:t>používateľov so sluchovým alebo pohybovým obmedzením.</w:t>
+      </w:r>
+    </w:p>
+    <w:p>
+      <w:pPr>
+        <w:pStyle w:val="TextprceText"/>
+        <w:ind w:hanging="0" w:start="0"/>
+        <w:rPr>
+          <w:lang w:val="sk-SK"/>
+        </w:rPr>
+      </w:pPr>
+      <w:r>
+        <w:rPr>
+          <w:lang w:val="sk-SK"/>
+        </w:rPr>
+        <w:tab/>
+        <w:t>Pri reálnom nasadení však nestačí sledovať iba presnosť modelu. Dôležitá je aj rýchlosť spracovania, cena, hardvérové požiadavky, možnosť offline použitia, ochrana dát a dostupnosť podpory pre konkrétny jazyk. Model, ktorý dosiahne najlepšiu presnosť v testoch, nemusí byť vždy najvhodnejší pre každú aplikáciu.</w:t>
       </w:r>
     </w:p>
     <w:p>
@@ -5079,30 +5850,92 @@
     </w:p>
     <w:p>
       <w:pPr>
-        <w:pStyle w:val="Normal"/>
-        <w:rPr>
-          <w:lang w:val="sk-SK"/>
-        </w:rPr>
-      </w:pPr>
-      <w:r>
-        <w:rPr>
-          <w:lang w:val="sk-SK"/>
-        </w:rPr>
-        <w:t>[3] chapter 6,</w:t>
-      </w:r>
-    </w:p>
-    <w:p>
-      <w:pPr>
-        <w:pStyle w:val="Normal"/>
-        <w:rPr>
-          <w:lang w:val="sk-SK"/>
-        </w:rPr>
-      </w:pPr>
-      <w:r>
-        <w:rPr>
-          <w:lang w:val="sk-SK"/>
-        </w:rPr>
-        <w:t>Pridať online zdroje?</w:t>
+        <w:pStyle w:val="TextprceText"/>
+        <w:ind w:hanging="0" w:start="0"/>
+        <w:rPr>
+          <w:lang w:val="sk-SK"/>
+        </w:rPr>
+      </w:pPr>
+      <w:r>
+        <w:rPr>
+          <w:lang w:val="sk-SK"/>
+        </w:rPr>
+        <w:t>Vývoj STT technológií smeruje najmä k vyššej presnosti, nižším hardvérovým nárokom a lepšej podpore viacerých jazykov. Dôležitým trendom je využívanie veľkých viacjazyčných modelov, ktoré sú trénované na rozsiahlych a rôznorodých dátach. Príkladom je model Whisper, ktorý bol trénovaný pomocou veľkého množstva slabšie anotovaných dát a dosiahol dobrú robustnosť naprieč jazykmi, prízvukmi a kvalitou nahrávok [53]. V podobnom smere sa vyvíjajú aj modely využívajúce self-supervised learning, napríklad wav2vec 2.0, pri ktorom sa model najskôr učí zo samotného audia a až následne sa dolaďuje na anotovaných prepisoch [51].</w:t>
+      </w:r>
+    </w:p>
+    <w:p>
+      <w:pPr>
+        <w:pStyle w:val="TextprceText"/>
+        <w:ind w:hanging="0" w:start="0"/>
+        <w:rPr>
+          <w:lang w:val="sk-SK"/>
+        </w:rPr>
+      </w:pPr>
+      <w:r>
+        <w:rPr>
+          <w:lang w:val="sk-SK"/>
+        </w:rPr>
+        <w:t>Ďalším trendom je znižovanie nárokov na množstvo ručne anotovaných dát. To je dôležité najmä pre jazyky, ktoré nemajú k dispozícii také rozsiahle datasety ako angličtina. Self-supervised a weakly supervised prístupy umožňujú využiť väčšie množstvo neanotovaného alebo menej presne anotovaného audia, čím sa zlepšuje dostupnosť STT technológií aj pre menšie jazyky.</w:t>
+      </w:r>
+    </w:p>
+    <w:p>
+      <w:pPr>
+        <w:pStyle w:val="TextprceText"/>
+        <w:ind w:hanging="0" w:start="0"/>
+        <w:rPr>
+          <w:lang w:val="sk-SK"/>
+        </w:rPr>
+      </w:pPr>
+      <w:r>
+        <w:rPr>
+          <w:lang w:val="sk-SK"/>
+        </w:rPr>
+        <w:t xml:space="preserve">Významným smerom je aj optimalizácia modelov pre lokálne a mobilné zariadenia. Pri praktickom použití nie je vždy možné alebo vhodné odosielať zvukové dáta do cloudu. Preto rastie význam modelov, ktoré dokážu bežať priamo na zariadení používateľa, prípadne na vlastnom serveri. Takéto riešenia môžu zlepšiť ochranu súkromia, znížiť latenciu a umožniť použitie aj bez internetového pripojenia. Pri on-device a streamovanom rozpoznávaní je však dôležitá nielen presnosť, ale aj spotreba energie a pamäťové nároky modelu. </w:t>
+      </w:r>
+    </w:p>
+    <w:p>
+      <w:pPr>
+        <w:pStyle w:val="TextprceText"/>
+        <w:ind w:hanging="0" w:start="0"/>
+        <w:rPr>
+          <w:lang w:val="sk-SK"/>
+        </w:rPr>
+      </w:pPr>
+      <w:r>
+        <w:rPr>
+          <w:lang w:val="sk-SK"/>
+        </w:rPr>
+        <w:t xml:space="preserve">V oblasti používateľských aplikácií bude pravdepodobne narastať význam realtime prepisu. Ten je dôležitý napríklad pri titulkovaní živých prenosov, online výučbe, videokonferenciách alebo hlasových asistentoch. Streamované end-to-end modely sa preto zameriavajú na čo najnižšiu latenciu pri zachovaní dobrej presnosti rozpoznávania. </w:t>
+      </w:r>
+    </w:p>
+    <w:p>
+      <w:pPr>
+        <w:pStyle w:val="TextprceText"/>
+        <w:ind w:hanging="0" w:start="0"/>
+        <w:rPr>
+          <w:lang w:val="sk-SK"/>
+        </w:rPr>
+      </w:pPr>
+      <w:r>
+        <w:rPr>
+          <w:lang w:val="sk-SK"/>
+        </w:rPr>
+        <w:t>Do budúcnosti možno očakávať aj užšie prepojenie STT systémov s ďalšími jazykovými technológiami. Samotný prepis reči často nie je konečným cieľom. V praxi môže nasledovať sumarizácia stretnutia, vyhľadávanie v prepise, automatické rozdelenie hovoriacich, preklad alebo extrakcia dôležitých informácií. STT sa tak postupne stáva jednou časťou širších systémov na spracovanie hovoreného obsahu.</w:t>
+      </w:r>
+    </w:p>
+    <w:p>
+      <w:pPr>
+        <w:pStyle w:val="TextprceText"/>
+        <w:ind w:hanging="0" w:start="0"/>
+        <w:rPr>
+          <w:lang w:val="sk-SK"/>
+        </w:rPr>
+      </w:pPr>
+      <w:r>
+        <w:rPr>
+          <w:lang w:val="sk-SK"/>
+        </w:rPr>
+        <w:t>Z pohľadu tejto práce sa ako najdôležitejší trend javí kombinácia presných viacjazyčných modelov, jazykového doladenia a optimalizovanej inferencie. Výsledky testovania ukázali, že jazykovo prispôsobené modely môžu pri češtine dosiahnuť výrazne lepšie výsledky než všeobecné modely. Zároveň však platí, že pre praktické použitie je potrebné sledovať aj rýchlosť, hardvérové nároky a jednoduchosť nasadenia.</w:t>
       </w:r>
     </w:p>
     <w:p>
@@ -5143,9 +5976,60 @@
         <w:rPr>
           <w:lang w:val="sk-SK"/>
         </w:rPr>
+      </w:pPr>
+      <w:r>
+        <w:rPr>
+          <w:lang w:val="sk-SK"/>
+        </w:rPr>
+        <w:tab/>
+        <w:t>Cieľom práce bolo porovnať dostupné riešenia na prevod reči na text a overiť ich použiteľnosť pri prepise českých nahrávok. Testovanie prebehlo na datasete Mozilla Common Voice, pričom výsledky boli hodnotené hlavne pomocou metrík WER a CER.</w:t>
+      </w:r>
+    </w:p>
+    <w:p>
+      <w:pPr>
+        <w:pStyle w:val="TextprceText"/>
+        <w:spacing w:before="0" w:after="120"/>
+        <w:ind w:hanging="0" w:start="0"/>
+        <w:rPr>
+          <w:lang w:val="sk-SK"/>
+        </w:rPr>
+      </w:pPr>
+      <w:r>
+        <w:rPr>
+          <w:lang w:val="sk-SK"/>
+        </w:rPr>
+        <w:tab/>
+        <w:t>Najlepšie výsledky dosiahol model huggingface_whisper_large_v3_czech. Napriek tomu, že nepatril medzi najrýchlejšie riešenia, pri dosiahnutej presnosti je jeho čas spracovania podľa môjho názoru prijateľný. Ak by som mal podobné riešenie zakomponovať do vlastného projektu, zvolil by som práve tento model.</w:t>
+      </w:r>
+    </w:p>
+    <w:p>
+      <w:pPr>
+        <w:pStyle w:val="TextprceText"/>
+        <w:spacing w:before="0" w:after="120"/>
+        <w:ind w:hanging="0" w:start="0"/>
+        <w:rPr>
+          <w:lang w:val="sk-SK"/>
+        </w:rPr>
+      </w:pPr>
+      <w:r>
+        <w:rPr>
+          <w:lang w:val="sk-SK"/>
+        </w:rPr>
+        <w:tab/>
+        <w:t>Cloudové riešenia, napríklad Google Web Speech API, sú jednoduché na použitie a z osobnej skúsenosti môžu byť dostačujúce pri bežnom hlasovom ovládaní alebo zvukovom asistentovi. Pri väčšom objeme dát však začínajú byť dôležité aj limity služby, stabilita odozvy a závislosť od internetového pripojenia.</w:t>
+      </w:r>
+    </w:p>
+    <w:p>
+      <w:pPr>
+        <w:pStyle w:val="TextprceText"/>
+        <w:spacing w:before="0" w:after="120"/>
+        <w:ind w:hanging="0" w:start="0"/>
+        <w:rPr>
+          <w:lang w:val="sk-SK"/>
+        </w:rPr>
         <w:sectPr>
-          <w:headerReference w:type="even" r:id="rId15"/>
-          <w:headerReference w:type="default" r:id="rId16"/>
+          <w:headerReference w:type="even" r:id="rId19"/>
+          <w:headerReference w:type="default" r:id="rId20"/>
           <w:type w:val="oddPage"/>
           <w:pgSz w:w="11906" w:h="16838"/>
           <w:pgMar w:left="1134" w:right="1134" w:gutter="851" w:header="851" w:top="1701" w:footer="0" w:bottom="1134"/>
@@ -5160,7 +6044,8 @@
         <w:rPr>
           <w:lang w:val="sk-SK"/>
         </w:rPr>
-        <w:t>Využiteľnosť použitých modelov, skúsenoti s prípravou a použiteľnosť pre bežného užívateľa.</w:t>
+        <w:tab/>
+        <w:t>Z testovania vyplynulo, že najpresnejší model nemusí byť vždy najpraktickejší pre každé použitie, ale pri prepise uložených nahrávok má presnosť často väčšiu váhu než rýchlosť. Cieľ práce bol splnený a výsledky ukázali rozdiely medzi lokálnymi modelmi, optimalizovanými implementáciami a cloudovými službami.</w:t>
       </w:r>
     </w:p>
     <w:p>
@@ -5170,22 +6055,22 @@
           <w:lang w:val="sk-SK"/>
         </w:rPr>
       </w:pPr>
-      <w:bookmarkStart w:id="66" w:name="_Toc88121748"/>
-      <w:bookmarkStart w:id="67" w:name="_Toc107635245"/>
-      <w:bookmarkStart w:id="68" w:name="_Toc107635228"/>
-      <w:bookmarkStart w:id="69" w:name="_Toc107634153"/>
-      <w:bookmarkStart w:id="70" w:name="_Toc88128511"/>
-      <w:bookmarkStart w:id="71" w:name="_Toc191630795"/>
-      <w:bookmarkStart w:id="72" w:name="_Toc88127146"/>
+      <w:bookmarkStart w:id="66" w:name="_Toc88120895"/>
+      <w:bookmarkStart w:id="67" w:name="_Toc88124806"/>
+      <w:bookmarkStart w:id="68" w:name="_Toc88126309"/>
+      <w:bookmarkStart w:id="69" w:name="_Toc88126460"/>
+      <w:bookmarkStart w:id="70" w:name="_Toc88126556"/>
+      <w:bookmarkStart w:id="71" w:name="_Toc88126772"/>
+      <w:bookmarkStart w:id="72" w:name="_Toc88126862"/>
       <w:bookmarkStart w:id="73" w:name="_Toc88127103"/>
-      <w:bookmarkStart w:id="74" w:name="_Toc88126862"/>
-      <w:bookmarkStart w:id="75" w:name="_Toc88126772"/>
-      <w:bookmarkStart w:id="76" w:name="_Toc88126556"/>
-      <w:bookmarkStart w:id="77" w:name="_Toc88126460"/>
-      <w:bookmarkStart w:id="78" w:name="_Toc88126309"/>
-      <w:bookmarkStart w:id="79" w:name="_Toc88120895"/>
-      <w:bookmarkStart w:id="80" w:name="_Toc88125789"/>
-      <w:bookmarkStart w:id="81" w:name="_Toc88124806"/>
+      <w:bookmarkStart w:id="74" w:name="_Toc88127146"/>
+      <w:bookmarkStart w:id="75" w:name="_Toc191630795"/>
+      <w:bookmarkStart w:id="76" w:name="_Toc88128511"/>
+      <w:bookmarkStart w:id="77" w:name="_Toc107634153"/>
+      <w:bookmarkStart w:id="78" w:name="_Toc107635228"/>
+      <w:bookmarkStart w:id="79" w:name="_Toc107635245"/>
+      <w:bookmarkStart w:id="80" w:name="_Toc88121748"/>
+      <w:bookmarkStart w:id="81" w:name="_Toc88125789"/>
       <w:bookmarkStart w:id="82" w:name="_Toc88126527"/>
       <w:bookmarkStart w:id="83" w:name="_Toc88124656"/>
       <w:bookmarkStart w:id="84" w:name="_Toc88124619"/>
@@ -5932,7 +6817,55 @@
           <w:szCs w:val="24"/>
           <w:lang w:val="sk-SK" w:bidi="ar-SA"/>
         </w:rPr>
-        <w:t>[16] V. M. Velichko and N. G. Zagoruyko, “Automatic Recognition of 200 Words,” Int. J. Man-Machine Studies, 2: 223, June 1970.</w:t>
+        <w:t>[16] V. M. Velichko and N. G. Zagoruyko, “Automatic Recognition of 200 Words,” Int. J. Man-Machine Studies, 2: 223-</w:t>
+      </w:r>
+      <w:r>
+        <w:rPr>
+          <w:rStyle w:val="normaltextrun"/>
+          <w:rFonts w:eastAsia="Times New Roman" w:cs="Times New Roman"/>
+          <w:color w:val="auto"/>
+          <w:kern w:val="0"/>
+          <w:sz w:val="24"/>
+          <w:szCs w:val="24"/>
+          <w:lang w:val="sk-SK" w:bidi="ar-SA"/>
+        </w:rPr>
+        <w:t>234</w:t>
+      </w:r>
+      <w:r>
+        <w:rPr>
+          <w:rStyle w:val="normaltextrun"/>
+          <w:rFonts w:eastAsia="Times New Roman" w:cs="Times New Roman"/>
+          <w:color w:val="auto"/>
+          <w:kern w:val="0"/>
+          <w:sz w:val="24"/>
+          <w:szCs w:val="24"/>
+          <w:lang w:val="sk-SK" w:bidi="ar-SA"/>
+        </w:rPr>
+        <w:t>, Ju</w:t>
+      </w:r>
+      <w:r>
+        <w:rPr>
+          <w:rStyle w:val="normaltextrun"/>
+          <w:rFonts w:eastAsia="Times New Roman" w:cs="Times New Roman"/>
+          <w:color w:val="auto"/>
+          <w:kern w:val="0"/>
+          <w:sz w:val="24"/>
+          <w:szCs w:val="24"/>
+          <w:lang w:val="sk-SK" w:bidi="ar-SA"/>
+        </w:rPr>
+        <w:t>ly</w:t>
+      </w:r>
+      <w:r>
+        <w:rPr>
+          <w:rStyle w:val="normaltextrun"/>
+          <w:rFonts w:eastAsia="Times New Roman" w:cs="Times New Roman"/>
+          <w:color w:val="auto"/>
+          <w:kern w:val="0"/>
+          <w:sz w:val="24"/>
+          <w:szCs w:val="24"/>
+          <w:lang w:val="sk-SK" w:bidi="ar-SA"/>
+        </w:rPr>
+        <w:t xml:space="preserve"> 1970.</w:t>
       </w:r>
     </w:p>
     <w:p>
@@ -6182,7 +7115,31 @@
           <w:szCs w:val="24"/>
           <w:lang w:val="sk-SK" w:bidi="ar-SA"/>
         </w:rPr>
-        <w:t>[22] L. R. Rabiner, S. E. Levinson, A. E. Rosenberg, and J. G. Wilpon, “Speaker Independent Recognition of Isolated Words Using Clustering Techniques,” IEEE Trans. Acoustics, Speech, Signal Proc., ASSP-27: 336–349, August 1979.</w:t>
+        <w:t>[22] L. R. Rabiner, S. E. Levinson, A. E. Rosenberg, and J. G. Wilpon, “Speaker Independent Recognition of Isolated Words Using Clustering Techniques,” IEEE Trans. Acoustics, Speech, Signal Proc., ASSP-27</w:t>
+      </w:r>
+      <w:r>
+        <w:rPr>
+          <w:rStyle w:val="normaltextrun"/>
+          <w:rFonts w:eastAsia="Times New Roman" w:cs="Times New Roman"/>
+          <w:color w:val="auto"/>
+          <w:kern w:val="0"/>
+          <w:sz w:val="24"/>
+          <w:szCs w:val="24"/>
+          <w:lang w:val="sk-SK" w:bidi="ar-SA"/>
+        </w:rPr>
+        <w:t>(4)</w:t>
+      </w:r>
+      <w:r>
+        <w:rPr>
+          <w:rStyle w:val="normaltextrun"/>
+          <w:rFonts w:eastAsia="Times New Roman" w:cs="Times New Roman"/>
+          <w:color w:val="auto"/>
+          <w:kern w:val="0"/>
+          <w:sz w:val="24"/>
+          <w:szCs w:val="24"/>
+          <w:lang w:val="sk-SK" w:bidi="ar-SA"/>
+        </w:rPr>
+        <w:t>: 336–349, August 1979.</w:t>
       </w:r>
     </w:p>
     <w:p>
@@ -6227,7 +7184,7 @@
           <w:szCs w:val="24"/>
           <w:lang w:val="sk-SK" w:bidi="ar-SA"/>
         </w:rPr>
-        <w:t>[23] H. Sakoe, “Two Level DP Matching—A Dynamic Programming Based Pattern Matching Algorithm for Connected Word Recognition,” IEEE Trans. Acoustics, Speech, Signal Proc., ASSP-27: 588–595, December 1979.</w:t>
+        <w:t>[23] H. Sakoe, “Two Level DP Matching-A Dynamic Programming-Based Pattern Matching Algorithm for Connected Word Recognition,” IEEE Trans. Acoustics, Speech, Signal Proc., ASSP-27: 588–595, December 1979.</w:t>
       </w:r>
     </w:p>
     <w:p>
@@ -6407,7 +7364,55 @@
           <w:szCs w:val="24"/>
           <w:lang w:val="sk-SK" w:bidi="ar-SA"/>
         </w:rPr>
-        <w:t>[27] J. Ferguson, Ed., Hidden Markov Models for Speech, IDA, Princeton, NJ, 1980.</w:t>
+        <w:t xml:space="preserve">[27] J. </w:t>
+      </w:r>
+      <w:r>
+        <w:rPr>
+          <w:rStyle w:val="normaltextrun"/>
+          <w:rFonts w:eastAsia="Times New Roman" w:cs="Times New Roman"/>
+          <w:color w:val="auto"/>
+          <w:kern w:val="0"/>
+          <w:sz w:val="24"/>
+          <w:szCs w:val="24"/>
+          <w:lang w:val="sk-SK" w:bidi="ar-SA"/>
+        </w:rPr>
+        <w:t xml:space="preserve">D. </w:t>
+      </w:r>
+      <w:r>
+        <w:rPr>
+          <w:rStyle w:val="normaltextrun"/>
+          <w:rFonts w:eastAsia="Times New Roman" w:cs="Times New Roman"/>
+          <w:color w:val="auto"/>
+          <w:kern w:val="0"/>
+          <w:sz w:val="24"/>
+          <w:szCs w:val="24"/>
+          <w:lang w:val="sk-SK" w:bidi="ar-SA"/>
+        </w:rPr>
+        <w:t xml:space="preserve">Ferguson, Ed., Hidden Markov Models for Speech, IDA, Princeton, NJ, </w:t>
+      </w:r>
+      <w:r>
+        <w:rPr>
+          <w:rStyle w:val="normaltextrun"/>
+          <w:rFonts w:eastAsia="Times New Roman" w:cs="Times New Roman"/>
+          <w:color w:val="auto"/>
+          <w:kern w:val="0"/>
+          <w:sz w:val="24"/>
+          <w:szCs w:val="24"/>
+          <w:lang w:val="sk-SK" w:bidi="ar-SA"/>
+        </w:rPr>
+        <w:t xml:space="preserve">October </w:t>
+      </w:r>
+      <w:r>
+        <w:rPr>
+          <w:rStyle w:val="normaltextrun"/>
+          <w:rFonts w:eastAsia="Times New Roman" w:cs="Times New Roman"/>
+          <w:color w:val="auto"/>
+          <w:kern w:val="0"/>
+          <w:sz w:val="24"/>
+          <w:szCs w:val="24"/>
+          <w:lang w:val="sk-SK" w:bidi="ar-SA"/>
+        </w:rPr>
+        <w:t>1980.</w:t>
       </w:r>
     </w:p>
     <w:p>
@@ -6542,7 +7547,55 @@
           <w:szCs w:val="24"/>
           <w:lang w:val="sk-SK" w:bidi="ar-SA"/>
         </w:rPr>
-        <w:t>[30] A. Weibel, T. Hanazawa, G. Hinton, K. Shikano, and K. Lang, “Phoneme Recognition Using Time-Delay Neural Networks,” IEEE Trans. Acoustics, Speech, Signal Proc., 37: 393–404, 1989.</w:t>
+        <w:t>[30] A. Weibel, T. Hanazawa, G. Hinton, K. Shikano, and K. Lang, “Phoneme Recognition Using Time-Delay Neural Networks,” IEEE Trans</w:t>
+      </w:r>
+      <w:r>
+        <w:rPr>
+          <w:rStyle w:val="normaltextrun"/>
+          <w:rFonts w:eastAsia="Times New Roman" w:cs="Times New Roman"/>
+          <w:color w:val="auto"/>
+          <w:kern w:val="0"/>
+          <w:sz w:val="24"/>
+          <w:szCs w:val="24"/>
+          <w:lang w:val="sk-SK" w:bidi="ar-SA"/>
+        </w:rPr>
+        <w:t>actions on</w:t>
+      </w:r>
+      <w:r>
+        <w:rPr>
+          <w:rStyle w:val="normaltextrun"/>
+          <w:rFonts w:eastAsia="Times New Roman" w:cs="Times New Roman"/>
+          <w:color w:val="auto"/>
+          <w:kern w:val="0"/>
+          <w:sz w:val="24"/>
+          <w:szCs w:val="24"/>
+          <w:lang w:val="sk-SK" w:bidi="ar-SA"/>
+        </w:rPr>
+        <w:t xml:space="preserve"> Acoustics, Speech, Signal Proc</w:t>
+      </w:r>
+      <w:r>
+        <w:rPr>
+          <w:rStyle w:val="normaltextrun"/>
+          <w:rFonts w:eastAsia="Times New Roman" w:cs="Times New Roman"/>
+          <w:color w:val="auto"/>
+          <w:kern w:val="0"/>
+          <w:sz w:val="24"/>
+          <w:szCs w:val="24"/>
+          <w:lang w:val="sk-SK" w:bidi="ar-SA"/>
+        </w:rPr>
+        <w:t>essing</w:t>
+      </w:r>
+      <w:r>
+        <w:rPr>
+          <w:rStyle w:val="normaltextrun"/>
+          <w:rFonts w:eastAsia="Times New Roman" w:cs="Times New Roman"/>
+          <w:color w:val="auto"/>
+          <w:kern w:val="0"/>
+          <w:sz w:val="24"/>
+          <w:szCs w:val="24"/>
+          <w:lang w:val="sk-SK" w:bidi="ar-SA"/>
+        </w:rPr>
+        <w:t>, 37(3), pp. 328–339, 198</w:t>
       </w:r>
     </w:p>
     <w:p>
@@ -6632,7 +7685,31 @@
           <w:szCs w:val="24"/>
           <w:lang w:val="sk-SK" w:bidi="ar-SA"/>
         </w:rPr>
-        <w:t>[32] Y. L. Chow, M. O. Dunham, O. A. Kimball, M. A. Krasner, G. F. Kubala, J. Makhoul, S. Roucos, and R. M. Schwartz, “BYBLOS: The BBN Continuous Speech Recognition System,” Proc. ICASSP 87, 89–92, April 1987.</w:t>
+        <w:t xml:space="preserve">[32] Y. L. Chow, M. O. Dunham, O. A. Kimball, M. A. Krasner, </w:t>
+      </w:r>
+      <w:r>
+        <w:rPr>
+          <w:rStyle w:val="normaltextrun"/>
+          <w:rFonts w:eastAsia="Times New Roman" w:cs="Times New Roman"/>
+          <w:color w:val="auto"/>
+          <w:kern w:val="0"/>
+          <w:sz w:val="24"/>
+          <w:szCs w:val="24"/>
+          <w:lang w:val="sk-SK" w:bidi="ar-SA"/>
+        </w:rPr>
+        <w:t xml:space="preserve">P. Price, </w:t>
+      </w:r>
+      <w:r>
+        <w:rPr>
+          <w:rStyle w:val="normaltextrun"/>
+          <w:rFonts w:eastAsia="Times New Roman" w:cs="Times New Roman"/>
+          <w:color w:val="auto"/>
+          <w:kern w:val="0"/>
+          <w:sz w:val="24"/>
+          <w:szCs w:val="24"/>
+          <w:lang w:val="sk-SK" w:bidi="ar-SA"/>
+        </w:rPr>
+        <w:t>G. F. Kubala, J. Makhoul, S. Roucos, and R. M. Schwartz, “BYBLOS: The BBN Continuous Speech Recognition System,” Proc. ICASSP 87, 89–92, April 1987.</w:t>
       </w:r>
     </w:p>
     <w:p>
@@ -6722,7 +7799,7 @@
           <w:szCs w:val="24"/>
           <w:lang w:val="sk-SK" w:bidi="ar-SA"/>
         </w:rPr>
-        <w:t>[34] M. Weintraub et al., “Linguistic Constraints in Hidden Markov Model Based Speech Recognition,” Proc. ICASSP 89, Glasgow, Scotland, 699–702, May 1989.</w:t>
+        <w:t>[34] M. Weintraub, H. Murveit, M. Cohen, P. Price, J. Bernstein, G. Baldwin, D. Bell, “Linguistic Constraints in Hidden Markov Model Based Speech Recognition,” Proc. ICASSP 89, Glasgow, Scotland, 699–702, May 1989.</w:t>
       </w:r>
     </w:p>
     <w:p>
@@ -6960,7 +8037,7 @@
           <w:szCs w:val="24"/>
           <w:lang w:val="sk-SK" w:bidi="ar-SA"/>
         </w:rPr>
-        <w:t>[39] HINTON, Geoffrey; DENG, Li; YU, Dong; DAHL, George E.; MOHAMED, Abdel-rahman; JAITLY, Navdeep; SENIOR, Andrew; VANHOUCKE, Vincent; NGUYEN, Patrick; SAINATH, Tara N.; KINGSBURY, Brian. Deep neural networks for acoustic modeling in speech recognition. IEEE Signal Processing Magazine. 2012, 29(6), s. 82–97.</w:t>
+        <w:t>[39] HINTON, Geoffrey; DENG, Li; YU, Dong; DAHL, George E.; MOHAMED, Abdel-rahman; JAITLY, Navdeep; SENIOR, Andrew; VANHOUCKE, Vincent; NGUYEN, Patrick; SAINATH, Tara N.; KINGSBURY, Brian. Deep Neural Networks for Acoustic Modeling in Speech Recognition: The Shared Views of Four Research Groups. IEEE Signal Processing Magazine. 2012, 29(6), s. 82–97.</w:t>
       </w:r>
     </w:p>
     <w:p>
@@ -7565,8 +8642,8 @@
     <w:p>
       <w:pPr>
         <w:sectPr>
-          <w:headerReference w:type="even" r:id="rId17"/>
-          <w:headerReference w:type="default" r:id="rId18"/>
+          <w:headerReference w:type="even" r:id="rId21"/>
+          <w:headerReference w:type="default" r:id="rId22"/>
           <w:type w:val="oddPage"/>
           <w:pgSz w:w="11906" w:h="16838"/>
           <w:pgMar w:left="1134" w:right="1134" w:gutter="851" w:header="851" w:top="1701" w:footer="0" w:bottom="1134"/>
@@ -8012,8 +9089,8 @@
       </w:r>
     </w:p>
     <w:sectPr>
-      <w:headerReference w:type="even" r:id="rId19"/>
-      <w:headerReference w:type="default" r:id="rId20"/>
+      <w:headerReference w:type="even" r:id="rId23"/>
+      <w:headerReference w:type="default" r:id="rId24"/>
       <w:type w:val="nextPage"/>
       <w:pgSz w:w="11906" w:h="16838"/>
       <w:pgMar w:left="1134" w:right="1134" w:gutter="0" w:header="851" w:top="1701" w:footer="0" w:bottom="1134"/>
@@ -8289,7 +9366,7 @@
     </w:r>
     <w:r>
       <w:rPr/>
-      <w:t>37</w:t>
+      <w:t>43</w:t>
     </w:r>
     <w:r>
       <w:rPr/>
@@ -11168,8 +12245,8 @@
       <w:lang w:eastAsia="cs-CZ"/>
     </w:rPr>
   </w:style>
-  <w:style w:type="character" w:styleId="FootnoteCharacters">
-    <w:name w:val="Footnote Characters"/>
+  <w:style w:type="character" w:styleId="FootnoteCharactersuser">
+    <w:name w:val="Footnote Characters (user)"/>
     <w:uiPriority w:val="99"/>
     <w:semiHidden/>
     <w:unhideWhenUsed/>
@@ -11179,8 +12256,8 @@
       <w:vertAlign w:val="superscript"/>
     </w:rPr>
   </w:style>
-  <w:style w:type="character" w:styleId="FootnoteCharactersuser">
-    <w:name w:val="Footnote Characters (user)"/>
+  <w:style w:type="character" w:styleId="FootnoteCharacters">
+    <w:name w:val="Footnote Characters"/>
     <w:qFormat/>
     <w:rPr>
       <w:vertAlign w:val="superscript"/>
@@ -11244,8 +12321,8 @@
       <w:rFonts w:ascii="Liberation Mono" w:hAnsi="Liberation Mono" w:eastAsia="Liberation Mono" w:cs="Liberation Mono"/>
     </w:rPr>
   </w:style>
-  <w:style w:type="character" w:styleId="Bullets">
-    <w:name w:val="Bullets"/>
+  <w:style w:type="character" w:styleId="Bulletsuser">
+    <w:name w:val="Bullets (user)"/>
     <w:qFormat/>
     <w:rPr>
       <w:rFonts w:ascii="OpenSymbol" w:hAnsi="OpenSymbol" w:eastAsia="OpenSymbol" w:cs="OpenSymbol"/>
@@ -11846,8 +12923,8 @@
       <w:lang w:val="en-US" w:eastAsia="en-US"/>
     </w:rPr>
   </w:style>
-  <w:style w:type="paragraph" w:styleId="HeaderLeft">
-    <w:name w:val="Header Left"/>
+  <w:style w:type="paragraph" w:styleId="HeaderLeftuser">
+    <w:name w:val="Header Left (user)"/>
     <w:basedOn w:val="Header"/>
     <w:qFormat/>
     <w:pPr/>
@@ -11921,6 +12998,1585 @@
     </w:tblPr>
   </w:style>
 </w:styles>
+</file>
+
+<file path=word/charts/chart1.xml><?xml version="1.0" encoding="utf-8"?>
+<c:chartSpace xmlns:c="http://schemas.openxmlformats.org/drawingml/2006/chart" xmlns:a="http://schemas.openxmlformats.org/drawingml/2006/main" xmlns:r="http://schemas.openxmlformats.org/officeDocument/2006/relationships">
+  <c:date1904 val="0"/>
+  <c:lang val="en-US"/>
+  <c:roundedCorners val="0"/>
+  <c:chart>
+    <c:autoTitleDeleted val="1"/>
+    <c:plotArea>
+      <c:barChart>
+        <c:barDir val="col"/>
+        <c:grouping val="clustered"/>
+        <c:varyColors val="0"/>
+        <c:ser>
+          <c:idx val="0"/>
+          <c:order val="0"/>
+          <c:tx>
+            <c:strRef>
+              <c:f>label 0</c:f>
+              <c:strCache>
+                <c:ptCount val="1"/>
+                <c:pt idx="0">
+                  <c:v>Average WER</c:v>
+                </c:pt>
+              </c:strCache>
+            </c:strRef>
+          </c:tx>
+          <c:spPr>
+            <a:solidFill>
+              <a:srgbClr val="004586"/>
+            </a:solidFill>
+            <a:ln w="0">
+              <a:noFill/>
+            </a:ln>
+          </c:spPr>
+          <c:invertIfNegative val="0"/>
+          <c:dLbls>
+            <c:txPr>
+              <a:bodyPr wrap="none"/>
+              <a:lstStyle/>
+              <a:p>
+                <a:pPr>
+                  <a:defRPr sz="1000" b="0" u="none" strike="noStrike">
+                    <a:uFillTx/>
+                    <a:latin typeface="Arial"/>
+                  </a:defRPr>
+                </a:pPr>
+              </a:p>
+            </c:txPr>
+            <c:showLegendKey val="0"/>
+            <c:showVal val="0"/>
+            <c:showCatName val="0"/>
+            <c:showSerName val="0"/>
+            <c:showPercent val="0"/>
+            <c:separator> </c:separator>
+            <c:showLeaderLines val="1"/>
+            <c:leaderLines>
+              <c:spPr>
+                <a:ln w="0">
+                  <a:solidFill>
+                    <a:srgbClr val="000000"/>
+                  </a:solidFill>
+                </a:ln>
+              </c:spPr>
+            </c:leaderLines>
+            <c:extLst>
+              <c:ext xmlns:c15="http://schemas.microsoft.com/office/drawing/2012/chart" uri="{CE6537A1-D6FC-4f65-9D91-7224C49458BB}">
+                <c15:showLeaderLines val="1"/>
+              </c:ext>
+            </c:extLst>
+          </c:dLbls>
+          <c:cat>
+            <c:strRef>
+              <c:f>categories</c:f>
+              <c:strCache>
+                <c:ptCount val="15"/>
+                <c:pt idx="0">
+                  <c:v>huggingface_whisper_large_v3_czech</c:v>
+                </c:pt>
+                <c:pt idx="1">
+                  <c:v>huggingface_whisper_medium_czech</c:v>
+                </c:pt>
+                <c:pt idx="2">
+                  <c:v>whisper_large</c:v>
+                </c:pt>
+                <c:pt idx="3">
+                  <c:v>speech_recognition_groq</c:v>
+                </c:pt>
+                <c:pt idx="4">
+                  <c:v>faster_whisper_large_float16_cuda</c:v>
+                </c:pt>
+                <c:pt idx="5">
+                  <c:v>faster_whisper_medium_float16_cuda</c:v>
+                </c:pt>
+                <c:pt idx="6">
+                  <c:v>whisper_medium</c:v>
+                </c:pt>
+                <c:pt idx="7">
+                  <c:v>speech_recognition_google</c:v>
+                </c:pt>
+                <c:pt idx="8">
+                  <c:v>whisper_small</c:v>
+                </c:pt>
+                <c:pt idx="9">
+                  <c:v>huggingface_wav2vec2_xlsr_czech_sammy</c:v>
+                </c:pt>
+                <c:pt idx="10">
+                  <c:v>huggingface_wav2vec2_xlsr_53_czech</c:v>
+                </c:pt>
+                <c:pt idx="11">
+                  <c:v>speech_recognition_vosk</c:v>
+                </c:pt>
+                <c:pt idx="12">
+                  <c:v>huggingface_wav2vec2_xlsr_czech</c:v>
+                </c:pt>
+                <c:pt idx="13">
+                  <c:v>whisper_base</c:v>
+                </c:pt>
+                <c:pt idx="14">
+                  <c:v>whisper_tiny</c:v>
+                </c:pt>
+              </c:strCache>
+            </c:strRef>
+          </c:cat>
+          <c:val>
+            <c:numRef>
+              <c:f>0</c:f>
+              <c:numCache>
+                <c:formatCode>General</c:formatCode>
+                <c:ptCount val="15"/>
+                <c:pt idx="0">
+                  <c:v>0.0634760418801414</c:v>
+                </c:pt>
+                <c:pt idx="1">
+                  <c:v>0.116688142120845</c:v>
+                </c:pt>
+                <c:pt idx="2">
+                  <c:v>0.165530059136839</c:v>
+                </c:pt>
+                <c:pt idx="3">
+                  <c:v>0.190445576047138</c:v>
+                </c:pt>
+                <c:pt idx="4">
+                  <c:v>0.211231963903999</c:v>
+                </c:pt>
+                <c:pt idx="5">
+                  <c:v>0.26361342183346</c:v>
+                </c:pt>
+                <c:pt idx="6">
+                  <c:v>0.285377168827284</c:v>
+                </c:pt>
+                <c:pt idx="7">
+                  <c:v>0.45359444074635</c:v>
+                </c:pt>
+                <c:pt idx="8">
+                  <c:v>0.464121922760283</c:v>
+                </c:pt>
+                <c:pt idx="9">
+                  <c:v>0.493553444510357</c:v>
+                </c:pt>
+                <c:pt idx="10">
+                  <c:v>0.511156568105951</c:v>
+                </c:pt>
+                <c:pt idx="11">
+                  <c:v>0.52931151850311</c:v>
+                </c:pt>
+                <c:pt idx="12">
+                  <c:v>0.63761199118342</c:v>
+                </c:pt>
+                <c:pt idx="13">
+                  <c:v>0.758190761753475</c:v>
+                </c:pt>
+                <c:pt idx="14">
+                  <c:v>0.926234460924431</c:v>
+                </c:pt>
+              </c:numCache>
+            </c:numRef>
+          </c:val>
+        </c:ser>
+        <c:gapWidth val="100"/>
+        <c:overlap val="0"/>
+        <c:axId val="27508108"/>
+        <c:axId val="4155419"/>
+      </c:barChart>
+      <c:catAx>
+        <c:axId val="27508108"/>
+        <c:scaling>
+          <c:orientation val="minMax"/>
+        </c:scaling>
+        <c:delete val="0"/>
+        <c:axPos val="b"/>
+        <c:numFmt formatCode="General" sourceLinked="0"/>
+        <c:majorTickMark val="out"/>
+        <c:minorTickMark val="none"/>
+        <c:tickLblPos val="nextTo"/>
+        <c:spPr>
+          <a:ln w="0">
+            <a:solidFill>
+              <a:srgbClr val="b3b3b3"/>
+            </a:solidFill>
+          </a:ln>
+        </c:spPr>
+        <c:txPr>
+          <a:bodyPr/>
+          <a:lstStyle/>
+          <a:p>
+            <a:pPr>
+              <a:defRPr sz="1000" b="0" u="none" strike="noStrike">
+                <a:uFillTx/>
+                <a:latin typeface="Arial"/>
+              </a:defRPr>
+            </a:pPr>
+          </a:p>
+        </c:txPr>
+        <c:crossAx val="4155419"/>
+        <c:crosses val="autoZero"/>
+        <c:auto val="1"/>
+        <c:lblAlgn val="ctr"/>
+        <c:lblOffset val="100"/>
+        <c:noMultiLvlLbl val="0"/>
+      </c:catAx>
+      <c:valAx>
+        <c:axId val="4155419"/>
+        <c:scaling>
+          <c:orientation val="minMax"/>
+        </c:scaling>
+        <c:delete val="0"/>
+        <c:axPos val="l"/>
+        <c:majorGridlines>
+          <c:spPr>
+            <a:ln w="0">
+              <a:solidFill>
+                <a:srgbClr val="b3b3b3"/>
+              </a:solidFill>
+            </a:ln>
+          </c:spPr>
+        </c:majorGridlines>
+        <c:numFmt formatCode="0.000" sourceLinked="0"/>
+        <c:majorTickMark val="out"/>
+        <c:minorTickMark val="none"/>
+        <c:tickLblPos val="nextTo"/>
+        <c:spPr>
+          <a:ln w="0">
+            <a:solidFill>
+              <a:srgbClr val="b3b3b3"/>
+            </a:solidFill>
+          </a:ln>
+        </c:spPr>
+        <c:txPr>
+          <a:bodyPr/>
+          <a:lstStyle/>
+          <a:p>
+            <a:pPr>
+              <a:defRPr sz="1000" b="0" u="none" strike="noStrike">
+                <a:uFillTx/>
+                <a:latin typeface="Arial"/>
+              </a:defRPr>
+            </a:pPr>
+          </a:p>
+        </c:txPr>
+        <c:crossAx val="27508108"/>
+        <c:crossesAt val="1"/>
+        <c:crossBetween val="between"/>
+      </c:valAx>
+      <c:spPr>
+        <a:noFill/>
+        <a:ln w="0">
+          <a:solidFill>
+            <a:srgbClr val="b3b3b3"/>
+          </a:solidFill>
+        </a:ln>
+      </c:spPr>
+    </c:plotArea>
+    <c:legend>
+      <c:legendPos val="r"/>
+      <c:overlay val="0"/>
+      <c:spPr>
+        <a:noFill/>
+        <a:ln w="0">
+          <a:noFill/>
+        </a:ln>
+      </c:spPr>
+      <c:txPr>
+        <a:bodyPr/>
+        <a:lstStyle/>
+        <a:p>
+          <a:pPr>
+            <a:defRPr sz="1000" b="0" u="none" strike="noStrike">
+              <a:uFillTx/>
+              <a:latin typeface="Arial"/>
+            </a:defRPr>
+          </a:pPr>
+        </a:p>
+      </c:txPr>
+    </c:legend>
+    <c:plotVisOnly val="1"/>
+    <c:dispBlanksAs val="gap"/>
+  </c:chart>
+  <c:spPr>
+    <a:solidFill>
+      <a:srgbClr val="dddddd"/>
+    </a:solidFill>
+    <a:ln w="0">
+      <a:noFill/>
+    </a:ln>
+  </c:spPr>
+</c:chartSpace>
+</file>
+
+<file path=word/charts/chart2.xml><?xml version="1.0" encoding="utf-8"?>
+<c:chartSpace xmlns:c="http://schemas.openxmlformats.org/drawingml/2006/chart" xmlns:a="http://schemas.openxmlformats.org/drawingml/2006/main" xmlns:r="http://schemas.openxmlformats.org/officeDocument/2006/relationships">
+  <c:date1904 val="0"/>
+  <c:lang val="en-US"/>
+  <c:roundedCorners val="0"/>
+  <c:chart>
+    <c:autoTitleDeleted val="1"/>
+    <c:plotArea>
+      <c:barChart>
+        <c:barDir val="col"/>
+        <c:grouping val="clustered"/>
+        <c:varyColors val="0"/>
+        <c:ser>
+          <c:idx val="0"/>
+          <c:order val="0"/>
+          <c:tx>
+            <c:strRef>
+              <c:f>label 0</c:f>
+              <c:strCache>
+                <c:ptCount val="1"/>
+                <c:pt idx="0">
+                  <c:v>Average CER</c:v>
+                </c:pt>
+              </c:strCache>
+            </c:strRef>
+          </c:tx>
+          <c:spPr>
+            <a:solidFill>
+              <a:srgbClr val="ff420e"/>
+            </a:solidFill>
+            <a:ln w="0">
+              <a:noFill/>
+            </a:ln>
+          </c:spPr>
+          <c:invertIfNegative val="0"/>
+          <c:dPt>
+            <c:idx val="9"/>
+            <c:invertIfNegative val="0"/>
+            <c:spPr>
+              <a:solidFill>
+                <a:srgbClr val="ff420e"/>
+              </a:solidFill>
+              <a:ln w="0">
+                <a:noFill/>
+              </a:ln>
+            </c:spPr>
+          </c:dPt>
+          <c:dLbls>
+            <c:dLbl>
+              <c:idx val="9"/>
+              <c:txPr>
+                <a:bodyPr wrap="none"/>
+                <a:lstStyle/>
+                <a:p>
+                  <a:pPr>
+                    <a:defRPr sz="1000" b="0" u="none" strike="noStrike">
+                      <a:uFillTx/>
+                      <a:latin typeface="Arial"/>
+                    </a:defRPr>
+                  </a:pPr>
+                </a:p>
+              </c:txPr>
+              <c:showLegendKey val="0"/>
+              <c:showVal val="0"/>
+              <c:showCatName val="0"/>
+              <c:showSerName val="0"/>
+              <c:showPercent val="0"/>
+              <c:separator> </c:separator>
+            </c:dLbl>
+            <c:txPr>
+              <a:bodyPr wrap="none"/>
+              <a:lstStyle/>
+              <a:p>
+                <a:pPr>
+                  <a:defRPr sz="1000" b="0" u="none" strike="noStrike">
+                    <a:uFillTx/>
+                    <a:latin typeface="Arial"/>
+                  </a:defRPr>
+                </a:pPr>
+              </a:p>
+            </c:txPr>
+            <c:showLegendKey val="0"/>
+            <c:showVal val="0"/>
+            <c:showCatName val="0"/>
+            <c:showSerName val="0"/>
+            <c:showPercent val="0"/>
+            <c:separator> </c:separator>
+            <c:showLeaderLines val="1"/>
+            <c:leaderLines>
+              <c:spPr>
+                <a:ln w="0">
+                  <a:solidFill>
+                    <a:srgbClr val="000000"/>
+                  </a:solidFill>
+                </a:ln>
+              </c:spPr>
+            </c:leaderLines>
+            <c:extLst>
+              <c:ext xmlns:c15="http://schemas.microsoft.com/office/drawing/2012/chart" uri="{CE6537A1-D6FC-4f65-9D91-7224C49458BB}">
+                <c15:showLeaderLines val="1"/>
+              </c:ext>
+            </c:extLst>
+          </c:dLbls>
+          <c:cat>
+            <c:strRef>
+              <c:f>categories</c:f>
+              <c:strCache>
+                <c:ptCount val="15"/>
+                <c:pt idx="0">
+                  <c:v>huggingface_whisper_large_v3_czech</c:v>
+                </c:pt>
+                <c:pt idx="1">
+                  <c:v>huggingface_whisper_medium_czech</c:v>
+                </c:pt>
+                <c:pt idx="2">
+                  <c:v>whisper_large</c:v>
+                </c:pt>
+                <c:pt idx="3">
+                  <c:v>speech_recognition_groq</c:v>
+                </c:pt>
+                <c:pt idx="4">
+                  <c:v>faster_whisper_large_float16_cuda</c:v>
+                </c:pt>
+                <c:pt idx="5">
+                  <c:v>faster_whisper_medium_float16_cuda</c:v>
+                </c:pt>
+                <c:pt idx="6">
+                  <c:v>whisper_medium</c:v>
+                </c:pt>
+                <c:pt idx="7">
+                  <c:v>huggingface_wav2vec2_xlsr_czech_sammy</c:v>
+                </c:pt>
+                <c:pt idx="8">
+                  <c:v>huggingface_wav2vec2_xlsr_53_czech</c:v>
+                </c:pt>
+                <c:pt idx="9">
+                  <c:v>speech_recognition_google</c:v>
+                </c:pt>
+                <c:pt idx="10">
+                  <c:v>speech_recognition_vosk</c:v>
+                </c:pt>
+                <c:pt idx="11">
+                  <c:v>whisper_small</c:v>
+                </c:pt>
+                <c:pt idx="12">
+                  <c:v>huggingface_wav2vec2_xlsr_czech</c:v>
+                </c:pt>
+                <c:pt idx="13">
+                  <c:v>whisper_base</c:v>
+                </c:pt>
+                <c:pt idx="14">
+                  <c:v>whisper_tiny</c:v>
+                </c:pt>
+              </c:strCache>
+            </c:strRef>
+          </c:cat>
+          <c:val>
+            <c:numRef>
+              <c:f>0</c:f>
+              <c:numCache>
+                <c:formatCode>General</c:formatCode>
+                <c:ptCount val="15"/>
+                <c:pt idx="0">
+                  <c:v>0.0147280820944806</c:v>
+                </c:pt>
+                <c:pt idx="1">
+                  <c:v>0.0278402638358035</c:v>
+                </c:pt>
+                <c:pt idx="2">
+                  <c:v>0.0440938281502985</c:v>
+                </c:pt>
+                <c:pt idx="3">
+                  <c:v>0.0535375276071712</c:v>
+                </c:pt>
+                <c:pt idx="4">
+                  <c:v>0.0581072165114405</c:v>
+                </c:pt>
+                <c:pt idx="5">
+                  <c:v>0.0716067171792048</c:v>
+                </c:pt>
+                <c:pt idx="6">
+                  <c:v>0.0824529863589437</c:v>
+                </c:pt>
+                <c:pt idx="7">
+                  <c:v>0.102972938151722</c:v>
+                </c:pt>
+                <c:pt idx="8">
+                  <c:v>0.109204969775619</c:v>
+                </c:pt>
+                <c:pt idx="9">
+                  <c:v>0.112540134117956</c:v>
+                </c:pt>
+                <c:pt idx="10">
+                  <c:v>0.141557801094054</c:v>
+                </c:pt>
+                <c:pt idx="11">
+                  <c:v>0.141815069459032</c:v>
+                </c:pt>
+                <c:pt idx="12">
+                  <c:v>0.156725165271304</c:v>
+                </c:pt>
+                <c:pt idx="13">
+                  <c:v>0.279014130933508</c:v>
+                </c:pt>
+                <c:pt idx="14">
+                  <c:v>0.402814787294407</c:v>
+                </c:pt>
+              </c:numCache>
+            </c:numRef>
+          </c:val>
+        </c:ser>
+        <c:gapWidth val="100"/>
+        <c:overlap val="0"/>
+        <c:axId val="73240291"/>
+        <c:axId val="64739104"/>
+      </c:barChart>
+      <c:catAx>
+        <c:axId val="73240291"/>
+        <c:scaling>
+          <c:orientation val="minMax"/>
+        </c:scaling>
+        <c:delete val="0"/>
+        <c:axPos val="b"/>
+        <c:numFmt formatCode="General" sourceLinked="0"/>
+        <c:majorTickMark val="out"/>
+        <c:minorTickMark val="none"/>
+        <c:tickLblPos val="nextTo"/>
+        <c:spPr>
+          <a:ln w="0">
+            <a:solidFill>
+              <a:srgbClr val="b3b3b3"/>
+            </a:solidFill>
+          </a:ln>
+        </c:spPr>
+        <c:txPr>
+          <a:bodyPr/>
+          <a:lstStyle/>
+          <a:p>
+            <a:pPr>
+              <a:defRPr sz="1000" b="0" u="none" strike="noStrike">
+                <a:uFillTx/>
+                <a:latin typeface="Arial"/>
+              </a:defRPr>
+            </a:pPr>
+          </a:p>
+        </c:txPr>
+        <c:crossAx val="64739104"/>
+        <c:crosses val="autoZero"/>
+        <c:auto val="1"/>
+        <c:lblAlgn val="ctr"/>
+        <c:lblOffset val="100"/>
+        <c:noMultiLvlLbl val="0"/>
+      </c:catAx>
+      <c:valAx>
+        <c:axId val="64739104"/>
+        <c:scaling>
+          <c:orientation val="minMax"/>
+        </c:scaling>
+        <c:delete val="0"/>
+        <c:axPos val="l"/>
+        <c:majorGridlines>
+          <c:spPr>
+            <a:ln w="0">
+              <a:solidFill>
+                <a:srgbClr val="b3b3b3"/>
+              </a:solidFill>
+            </a:ln>
+          </c:spPr>
+        </c:majorGridlines>
+        <c:numFmt formatCode="General" sourceLinked="0"/>
+        <c:majorTickMark val="out"/>
+        <c:minorTickMark val="none"/>
+        <c:tickLblPos val="nextTo"/>
+        <c:spPr>
+          <a:ln w="0">
+            <a:solidFill>
+              <a:srgbClr val="b3b3b3"/>
+            </a:solidFill>
+          </a:ln>
+        </c:spPr>
+        <c:txPr>
+          <a:bodyPr/>
+          <a:lstStyle/>
+          <a:p>
+            <a:pPr>
+              <a:defRPr sz="1000" b="0" u="none" strike="noStrike">
+                <a:uFillTx/>
+                <a:latin typeface="Arial"/>
+              </a:defRPr>
+            </a:pPr>
+          </a:p>
+        </c:txPr>
+        <c:crossAx val="73240291"/>
+        <c:crosses val="autoZero"/>
+        <c:crossBetween val="between"/>
+      </c:valAx>
+      <c:spPr>
+        <a:noFill/>
+        <a:ln w="0">
+          <a:solidFill>
+            <a:srgbClr val="b3b3b3"/>
+          </a:solidFill>
+        </a:ln>
+      </c:spPr>
+    </c:plotArea>
+    <c:legend>
+      <c:legendPos val="r"/>
+      <c:overlay val="0"/>
+      <c:spPr>
+        <a:noFill/>
+        <a:ln w="0">
+          <a:noFill/>
+        </a:ln>
+      </c:spPr>
+      <c:txPr>
+        <a:bodyPr/>
+        <a:lstStyle/>
+        <a:p>
+          <a:pPr>
+            <a:defRPr sz="1000" b="0" u="none" strike="noStrike">
+              <a:uFillTx/>
+              <a:latin typeface="Arial"/>
+            </a:defRPr>
+          </a:pPr>
+        </a:p>
+      </c:txPr>
+    </c:legend>
+    <c:plotVisOnly val="1"/>
+    <c:dispBlanksAs val="gap"/>
+  </c:chart>
+  <c:spPr>
+    <a:solidFill>
+      <a:srgbClr val="dddddd"/>
+    </a:solidFill>
+    <a:ln w="0">
+      <a:noFill/>
+    </a:ln>
+  </c:spPr>
+</c:chartSpace>
+</file>
+
+<file path=word/charts/chart3.xml><?xml version="1.0" encoding="utf-8"?>
+<c:chartSpace xmlns:c="http://schemas.openxmlformats.org/drawingml/2006/chart" xmlns:a="http://schemas.openxmlformats.org/drawingml/2006/main" xmlns:r="http://schemas.openxmlformats.org/officeDocument/2006/relationships">
+  <c:date1904 val="0"/>
+  <c:lang val="en-US"/>
+  <c:roundedCorners val="0"/>
+  <c:chart>
+    <c:autoTitleDeleted val="1"/>
+    <c:plotArea>
+      <c:barChart>
+        <c:barDir val="col"/>
+        <c:grouping val="clustered"/>
+        <c:varyColors val="0"/>
+        <c:ser>
+          <c:idx val="0"/>
+          <c:order val="0"/>
+          <c:tx>
+            <c:strRef>
+              <c:f>label 0</c:f>
+              <c:strCache>
+                <c:ptCount val="1"/>
+                <c:pt idx="0">
+                  <c:v>Average transcript ratio</c:v>
+                </c:pt>
+              </c:strCache>
+            </c:strRef>
+          </c:tx>
+          <c:spPr>
+            <a:solidFill>
+              <a:srgbClr val="ffd320"/>
+            </a:solidFill>
+            <a:ln w="0">
+              <a:noFill/>
+            </a:ln>
+          </c:spPr>
+          <c:invertIfNegative val="0"/>
+          <c:dLbls>
+            <c:txPr>
+              <a:bodyPr wrap="none"/>
+              <a:lstStyle/>
+              <a:p>
+                <a:pPr>
+                  <a:defRPr sz="1000" b="0" u="none" strike="noStrike">
+                    <a:uFillTx/>
+                    <a:latin typeface="Arial"/>
+                  </a:defRPr>
+                </a:pPr>
+              </a:p>
+            </c:txPr>
+            <c:showLegendKey val="0"/>
+            <c:showVal val="0"/>
+            <c:showCatName val="0"/>
+            <c:showSerName val="0"/>
+            <c:showPercent val="0"/>
+            <c:separator> </c:separator>
+            <c:showLeaderLines val="1"/>
+            <c:leaderLines>
+              <c:spPr>
+                <a:ln w="0">
+                  <a:solidFill>
+                    <a:srgbClr val="000000"/>
+                  </a:solidFill>
+                </a:ln>
+              </c:spPr>
+            </c:leaderLines>
+            <c:extLst>
+              <c:ext xmlns:c15="http://schemas.microsoft.com/office/drawing/2012/chart" uri="{CE6537A1-D6FC-4f65-9D91-7224C49458BB}">
+                <c15:showLeaderLines val="1"/>
+              </c:ext>
+            </c:extLst>
+          </c:dLbls>
+          <c:cat>
+            <c:strRef>
+              <c:f>categories</c:f>
+              <c:strCache>
+                <c:ptCount val="13"/>
+                <c:pt idx="0">
+                  <c:v>huggingface_wav2vec2_xlsr_czech</c:v>
+                </c:pt>
+                <c:pt idx="1">
+                  <c:v>whisper_base</c:v>
+                </c:pt>
+                <c:pt idx="2">
+                  <c:v>whisper_small</c:v>
+                </c:pt>
+                <c:pt idx="3">
+                  <c:v>whisper_tiny</c:v>
+                </c:pt>
+                <c:pt idx="4">
+                  <c:v>speech_recognition_vosk</c:v>
+                </c:pt>
+                <c:pt idx="5">
+                  <c:v>huggingface_wav2vec2_xlsr_53_czech</c:v>
+                </c:pt>
+                <c:pt idx="6">
+                  <c:v>whisper_medium</c:v>
+                </c:pt>
+                <c:pt idx="7">
+                  <c:v>faster_whisper_medium_float16_cuda</c:v>
+                </c:pt>
+                <c:pt idx="8">
+                  <c:v>faster_whisper_large_float16_cuda</c:v>
+                </c:pt>
+                <c:pt idx="9">
+                  <c:v>speech_recognition_google</c:v>
+                </c:pt>
+                <c:pt idx="10">
+                  <c:v>huggingface_whisper_large_v3_czech</c:v>
+                </c:pt>
+                <c:pt idx="11">
+                  <c:v>huggingface_wav2vec2_xlsr_czech_sammy</c:v>
+                </c:pt>
+                <c:pt idx="12">
+                  <c:v>huggingface_whisper_medium_czech</c:v>
+                </c:pt>
+              </c:strCache>
+            </c:strRef>
+          </c:cat>
+          <c:val>
+            <c:numRef>
+              <c:f>0</c:f>
+              <c:numCache>
+                <c:formatCode>General</c:formatCode>
+                <c:ptCount val="13"/>
+                <c:pt idx="0">
+                  <c:v>0.0441173506620093</c:v>
+                </c:pt>
+                <c:pt idx="1">
+                  <c:v>0.058864187630119</c:v>
+                </c:pt>
+                <c:pt idx="2">
+                  <c:v>0.0737053906193861</c:v>
+                </c:pt>
+                <c:pt idx="3">
+                  <c:v>0.0932991636551523</c:v>
+                </c:pt>
+                <c:pt idx="4">
+                  <c:v>0.111690524931908</c:v>
+                </c:pt>
+                <c:pt idx="5">
+                  <c:v>0.121666608441389</c:v>
+                </c:pt>
+                <c:pt idx="6">
+                  <c:v>0.130435018511475</c:v>
+                </c:pt>
+                <c:pt idx="7">
+                  <c:v>0.136177451289278</c:v>
+                </c:pt>
+                <c:pt idx="8">
+                  <c:v>0.153283050739494</c:v>
+                </c:pt>
+                <c:pt idx="9">
+                  <c:v>0.228220963777834</c:v>
+                </c:pt>
+                <c:pt idx="10">
+                  <c:v>0.256016071870918</c:v>
+                </c:pt>
+                <c:pt idx="11">
+                  <c:v>0.285522869842013</c:v>
+                </c:pt>
+                <c:pt idx="12">
+                  <c:v>0.795146019510512</c:v>
+                </c:pt>
+              </c:numCache>
+            </c:numRef>
+          </c:val>
+        </c:ser>
+        <c:gapWidth val="100"/>
+        <c:overlap val="0"/>
+        <c:axId val="26641791"/>
+        <c:axId val="57349857"/>
+      </c:barChart>
+      <c:catAx>
+        <c:axId val="26641791"/>
+        <c:scaling>
+          <c:orientation val="minMax"/>
+        </c:scaling>
+        <c:delete val="0"/>
+        <c:axPos val="b"/>
+        <c:numFmt formatCode="General" sourceLinked="0"/>
+        <c:majorTickMark val="out"/>
+        <c:minorTickMark val="none"/>
+        <c:tickLblPos val="nextTo"/>
+        <c:spPr>
+          <a:ln w="0">
+            <a:solidFill>
+              <a:srgbClr val="b3b3b3"/>
+            </a:solidFill>
+          </a:ln>
+        </c:spPr>
+        <c:txPr>
+          <a:bodyPr/>
+          <a:lstStyle/>
+          <a:p>
+            <a:pPr>
+              <a:defRPr sz="1000" b="0" u="none" strike="noStrike">
+                <a:uFillTx/>
+                <a:latin typeface="Arial"/>
+              </a:defRPr>
+            </a:pPr>
+          </a:p>
+        </c:txPr>
+        <c:crossAx val="57349857"/>
+        <c:crosses val="autoZero"/>
+        <c:auto val="1"/>
+        <c:lblAlgn val="ctr"/>
+        <c:lblOffset val="100"/>
+        <c:noMultiLvlLbl val="0"/>
+      </c:catAx>
+      <c:valAx>
+        <c:axId val="57349857"/>
+        <c:scaling>
+          <c:orientation val="minMax"/>
+        </c:scaling>
+        <c:delete val="0"/>
+        <c:axPos val="l"/>
+        <c:majorGridlines>
+          <c:spPr>
+            <a:ln w="0">
+              <a:solidFill>
+                <a:srgbClr val="b3b3b3"/>
+              </a:solidFill>
+            </a:ln>
+          </c:spPr>
+        </c:majorGridlines>
+        <c:numFmt formatCode="0.000" sourceLinked="0"/>
+        <c:majorTickMark val="out"/>
+        <c:minorTickMark val="none"/>
+        <c:tickLblPos val="nextTo"/>
+        <c:spPr>
+          <a:ln w="0">
+            <a:solidFill>
+              <a:srgbClr val="b3b3b3"/>
+            </a:solidFill>
+          </a:ln>
+        </c:spPr>
+        <c:txPr>
+          <a:bodyPr/>
+          <a:lstStyle/>
+          <a:p>
+            <a:pPr>
+              <a:defRPr sz="1000" b="0" u="none" strike="noStrike">
+                <a:uFillTx/>
+                <a:latin typeface="Arial"/>
+              </a:defRPr>
+            </a:pPr>
+          </a:p>
+        </c:txPr>
+        <c:crossAx val="26641791"/>
+        <c:crossesAt val="1"/>
+        <c:crossBetween val="between"/>
+      </c:valAx>
+      <c:spPr>
+        <a:noFill/>
+        <a:ln w="0">
+          <a:solidFill>
+            <a:srgbClr val="b3b3b3"/>
+          </a:solidFill>
+        </a:ln>
+      </c:spPr>
+    </c:plotArea>
+    <c:legend>
+      <c:legendPos val="r"/>
+      <c:overlay val="0"/>
+      <c:spPr>
+        <a:noFill/>
+        <a:ln w="0">
+          <a:noFill/>
+        </a:ln>
+      </c:spPr>
+      <c:txPr>
+        <a:bodyPr/>
+        <a:lstStyle/>
+        <a:p>
+          <a:pPr>
+            <a:defRPr sz="1000" b="0" u="none" strike="noStrike">
+              <a:uFillTx/>
+              <a:latin typeface="Arial"/>
+            </a:defRPr>
+          </a:pPr>
+        </a:p>
+      </c:txPr>
+    </c:legend>
+    <c:plotVisOnly val="1"/>
+    <c:dispBlanksAs val="gap"/>
+  </c:chart>
+  <c:spPr>
+    <a:solidFill>
+      <a:srgbClr val="dddddd"/>
+    </a:solidFill>
+    <a:ln w="0">
+      <a:noFill/>
+    </a:ln>
+  </c:spPr>
+</c:chartSpace>
+</file>
+
+<file path=word/charts/chart4.xml><?xml version="1.0" encoding="utf-8"?>
+<c:chartSpace xmlns:c="http://schemas.openxmlformats.org/drawingml/2006/chart" xmlns:a="http://schemas.openxmlformats.org/drawingml/2006/main" xmlns:r="http://schemas.openxmlformats.org/officeDocument/2006/relationships">
+  <c:date1904 val="0"/>
+  <c:lang val="en-US"/>
+  <c:roundedCorners val="0"/>
+  <c:chart>
+    <c:autoTitleDeleted val="1"/>
+    <c:plotArea>
+      <c:barChart>
+        <c:barDir val="col"/>
+        <c:grouping val="clustered"/>
+        <c:varyColors val="0"/>
+        <c:ser>
+          <c:idx val="0"/>
+          <c:order val="0"/>
+          <c:tx>
+            <c:strRef>
+              <c:f>label 0</c:f>
+              <c:strCache>
+                <c:ptCount val="1"/>
+                <c:pt idx="0">
+                  <c:v>Average WER</c:v>
+                </c:pt>
+              </c:strCache>
+            </c:strRef>
+          </c:tx>
+          <c:spPr>
+            <a:solidFill>
+              <a:srgbClr val="004586"/>
+            </a:solidFill>
+            <a:ln w="0">
+              <a:noFill/>
+            </a:ln>
+          </c:spPr>
+          <c:invertIfNegative val="0"/>
+          <c:dLbls>
+            <c:txPr>
+              <a:bodyPr wrap="none"/>
+              <a:lstStyle/>
+              <a:p>
+                <a:pPr>
+                  <a:defRPr sz="1000" b="0" u="none" strike="noStrike">
+                    <a:uFillTx/>
+                    <a:latin typeface="Arial"/>
+                  </a:defRPr>
+                </a:pPr>
+              </a:p>
+            </c:txPr>
+            <c:showLegendKey val="0"/>
+            <c:showVal val="0"/>
+            <c:showCatName val="0"/>
+            <c:showSerName val="0"/>
+            <c:showPercent val="0"/>
+            <c:separator> </c:separator>
+            <c:showLeaderLines val="1"/>
+            <c:leaderLines>
+              <c:spPr>
+                <a:ln w="0">
+                  <a:solidFill>
+                    <a:srgbClr val="000000"/>
+                  </a:solidFill>
+                </a:ln>
+              </c:spPr>
+            </c:leaderLines>
+            <c:extLst>
+              <c:ext xmlns:c15="http://schemas.microsoft.com/office/drawing/2012/chart" uri="{CE6537A1-D6FC-4f65-9D91-7224C49458BB}">
+                <c15:showLeaderLines val="1"/>
+              </c:ext>
+            </c:extLst>
+          </c:dLbls>
+          <c:cat>
+            <c:strRef>
+              <c:f>categories</c:f>
+              <c:strCache>
+                <c:ptCount val="15"/>
+                <c:pt idx="0">
+                  <c:v>huggingface_whisper_large_v3_czech</c:v>
+                </c:pt>
+                <c:pt idx="1">
+                  <c:v>huggingface_whisper_medium_czech</c:v>
+                </c:pt>
+                <c:pt idx="2">
+                  <c:v>whisper_large</c:v>
+                </c:pt>
+                <c:pt idx="3">
+                  <c:v>speech_recognition_groq</c:v>
+                </c:pt>
+                <c:pt idx="4">
+                  <c:v>faster_whisper_large_float16_cuda</c:v>
+                </c:pt>
+                <c:pt idx="5">
+                  <c:v>faster_whisper_medium_float16_cuda</c:v>
+                </c:pt>
+                <c:pt idx="6">
+                  <c:v>whisper_medium</c:v>
+                </c:pt>
+                <c:pt idx="7">
+                  <c:v>speech_recognition_google</c:v>
+                </c:pt>
+                <c:pt idx="8">
+                  <c:v>whisper_small</c:v>
+                </c:pt>
+                <c:pt idx="9">
+                  <c:v>huggingface_wav2vec2_xlsr_czech_sammy</c:v>
+                </c:pt>
+                <c:pt idx="10">
+                  <c:v>huggingface_wav2vec2_xlsr_53_czech</c:v>
+                </c:pt>
+                <c:pt idx="11">
+                  <c:v>speech_recognition_vosk</c:v>
+                </c:pt>
+                <c:pt idx="12">
+                  <c:v>huggingface_wav2vec2_xlsr_czech</c:v>
+                </c:pt>
+                <c:pt idx="13">
+                  <c:v>whisper_base</c:v>
+                </c:pt>
+                <c:pt idx="14">
+                  <c:v>whisper_tiny</c:v>
+                </c:pt>
+              </c:strCache>
+            </c:strRef>
+          </c:cat>
+          <c:val>
+            <c:numRef>
+              <c:f>0</c:f>
+              <c:numCache>
+                <c:formatCode>General</c:formatCode>
+                <c:ptCount val="15"/>
+                <c:pt idx="0">
+                  <c:v>0.0634760418801414</c:v>
+                </c:pt>
+                <c:pt idx="1">
+                  <c:v>0.116688142120845</c:v>
+                </c:pt>
+                <c:pt idx="2">
+                  <c:v>0.165530059136839</c:v>
+                </c:pt>
+                <c:pt idx="3">
+                  <c:v>0.190445576047138</c:v>
+                </c:pt>
+                <c:pt idx="4">
+                  <c:v>0.211231963903999</c:v>
+                </c:pt>
+                <c:pt idx="5">
+                  <c:v>0.26361342183346</c:v>
+                </c:pt>
+                <c:pt idx="6">
+                  <c:v>0.285377168827284</c:v>
+                </c:pt>
+                <c:pt idx="7">
+                  <c:v>0.45359444074635</c:v>
+                </c:pt>
+                <c:pt idx="8">
+                  <c:v>0.464121922760283</c:v>
+                </c:pt>
+                <c:pt idx="9">
+                  <c:v>0.493553444510357</c:v>
+                </c:pt>
+                <c:pt idx="10">
+                  <c:v>0.511156568105951</c:v>
+                </c:pt>
+                <c:pt idx="11">
+                  <c:v>0.52931151850311</c:v>
+                </c:pt>
+                <c:pt idx="12">
+                  <c:v>0.63761199118342</c:v>
+                </c:pt>
+                <c:pt idx="13">
+                  <c:v>0.758190761753475</c:v>
+                </c:pt>
+                <c:pt idx="14">
+                  <c:v>0.926234460924431</c:v>
+                </c:pt>
+              </c:numCache>
+            </c:numRef>
+          </c:val>
+        </c:ser>
+        <c:ser>
+          <c:idx val="1"/>
+          <c:order val="1"/>
+          <c:tx>
+            <c:strRef>
+              <c:f>label 1</c:f>
+              <c:strCache>
+                <c:ptCount val="1"/>
+                <c:pt idx="0">
+                  <c:v>Average CER</c:v>
+                </c:pt>
+              </c:strCache>
+            </c:strRef>
+          </c:tx>
+          <c:spPr>
+            <a:solidFill>
+              <a:srgbClr val="ff420e"/>
+            </a:solidFill>
+            <a:ln w="0">
+              <a:noFill/>
+            </a:ln>
+          </c:spPr>
+          <c:invertIfNegative val="0"/>
+          <c:dLbls>
+            <c:txPr>
+              <a:bodyPr wrap="none"/>
+              <a:lstStyle/>
+              <a:p>
+                <a:pPr>
+                  <a:defRPr sz="1000" b="0" u="none" strike="noStrike">
+                    <a:uFillTx/>
+                    <a:latin typeface="Arial"/>
+                  </a:defRPr>
+                </a:pPr>
+              </a:p>
+            </c:txPr>
+            <c:showLegendKey val="0"/>
+            <c:showVal val="0"/>
+            <c:showCatName val="0"/>
+            <c:showSerName val="0"/>
+            <c:showPercent val="0"/>
+            <c:separator> </c:separator>
+            <c:showLeaderLines val="1"/>
+            <c:leaderLines>
+              <c:spPr>
+                <a:ln w="0">
+                  <a:solidFill>
+                    <a:srgbClr val="000000"/>
+                  </a:solidFill>
+                </a:ln>
+              </c:spPr>
+            </c:leaderLines>
+            <c:extLst>
+              <c:ext xmlns:c15="http://schemas.microsoft.com/office/drawing/2012/chart" uri="{CE6537A1-D6FC-4f65-9D91-7224C49458BB}">
+                <c15:showLeaderLines val="1"/>
+              </c:ext>
+            </c:extLst>
+          </c:dLbls>
+          <c:cat>
+            <c:strRef>
+              <c:f>categories</c:f>
+              <c:strCache>
+                <c:ptCount val="15"/>
+                <c:pt idx="0">
+                  <c:v>huggingface_whisper_large_v3_czech</c:v>
+                </c:pt>
+                <c:pt idx="1">
+                  <c:v>huggingface_whisper_medium_czech</c:v>
+                </c:pt>
+                <c:pt idx="2">
+                  <c:v>whisper_large</c:v>
+                </c:pt>
+                <c:pt idx="3">
+                  <c:v>speech_recognition_groq</c:v>
+                </c:pt>
+                <c:pt idx="4">
+                  <c:v>faster_whisper_large_float16_cuda</c:v>
+                </c:pt>
+                <c:pt idx="5">
+                  <c:v>faster_whisper_medium_float16_cuda</c:v>
+                </c:pt>
+                <c:pt idx="6">
+                  <c:v>whisper_medium</c:v>
+                </c:pt>
+                <c:pt idx="7">
+                  <c:v>speech_recognition_google</c:v>
+                </c:pt>
+                <c:pt idx="8">
+                  <c:v>whisper_small</c:v>
+                </c:pt>
+                <c:pt idx="9">
+                  <c:v>huggingface_wav2vec2_xlsr_czech_sammy</c:v>
+                </c:pt>
+                <c:pt idx="10">
+                  <c:v>huggingface_wav2vec2_xlsr_53_czech</c:v>
+                </c:pt>
+                <c:pt idx="11">
+                  <c:v>speech_recognition_vosk</c:v>
+                </c:pt>
+                <c:pt idx="12">
+                  <c:v>huggingface_wav2vec2_xlsr_czech</c:v>
+                </c:pt>
+                <c:pt idx="13">
+                  <c:v>whisper_base</c:v>
+                </c:pt>
+                <c:pt idx="14">
+                  <c:v>whisper_tiny</c:v>
+                </c:pt>
+              </c:strCache>
+            </c:strRef>
+          </c:cat>
+          <c:val>
+            <c:numRef>
+              <c:f>1</c:f>
+              <c:numCache>
+                <c:formatCode>General</c:formatCode>
+                <c:ptCount val="15"/>
+                <c:pt idx="0">
+                  <c:v>0.0147280820944806</c:v>
+                </c:pt>
+                <c:pt idx="1">
+                  <c:v>0.0278402638358035</c:v>
+                </c:pt>
+                <c:pt idx="2">
+                  <c:v>0.0440938281502985</c:v>
+                </c:pt>
+                <c:pt idx="3">
+                  <c:v>0.0535375276071712</c:v>
+                </c:pt>
+                <c:pt idx="4">
+                  <c:v>0.0581072165114405</c:v>
+                </c:pt>
+                <c:pt idx="5">
+                  <c:v>0.0716067171792048</c:v>
+                </c:pt>
+                <c:pt idx="6">
+                  <c:v>0.0824529863589437</c:v>
+                </c:pt>
+                <c:pt idx="7">
+                  <c:v>0.112540134117956</c:v>
+                </c:pt>
+                <c:pt idx="8">
+                  <c:v>0.141815069459032</c:v>
+                </c:pt>
+                <c:pt idx="9">
+                  <c:v>0.102972938151722</c:v>
+                </c:pt>
+                <c:pt idx="10">
+                  <c:v>0.109204969775619</c:v>
+                </c:pt>
+                <c:pt idx="11">
+                  <c:v>0.141557801094054</c:v>
+                </c:pt>
+                <c:pt idx="12">
+                  <c:v>0.156725165271304</c:v>
+                </c:pt>
+                <c:pt idx="13">
+                  <c:v>0.279014130933508</c:v>
+                </c:pt>
+                <c:pt idx="14">
+                  <c:v>0.402814787294407</c:v>
+                </c:pt>
+              </c:numCache>
+            </c:numRef>
+          </c:val>
+        </c:ser>
+        <c:ser>
+          <c:idx val="2"/>
+          <c:order val="2"/>
+          <c:tx>
+            <c:strRef>
+              <c:f>label 2</c:f>
+              <c:strCache>
+                <c:ptCount val="1"/>
+                <c:pt idx="0">
+                  <c:v>Average transcript ratio</c:v>
+                </c:pt>
+              </c:strCache>
+            </c:strRef>
+          </c:tx>
+          <c:spPr>
+            <a:solidFill>
+              <a:srgbClr val="ffd320"/>
+            </a:solidFill>
+            <a:ln w="0">
+              <a:noFill/>
+            </a:ln>
+          </c:spPr>
+          <c:invertIfNegative val="0"/>
+          <c:dLbls>
+            <c:txPr>
+              <a:bodyPr wrap="none"/>
+              <a:lstStyle/>
+              <a:p>
+                <a:pPr>
+                  <a:defRPr sz="1000" b="0" u="none" strike="noStrike">
+                    <a:uFillTx/>
+                    <a:latin typeface="Arial"/>
+                  </a:defRPr>
+                </a:pPr>
+              </a:p>
+            </c:txPr>
+            <c:showLegendKey val="0"/>
+            <c:showVal val="0"/>
+            <c:showCatName val="0"/>
+            <c:showSerName val="0"/>
+            <c:showPercent val="0"/>
+            <c:separator> </c:separator>
+            <c:showLeaderLines val="1"/>
+            <c:leaderLines>
+              <c:spPr>
+                <a:ln w="0">
+                  <a:solidFill>
+                    <a:srgbClr val="000000"/>
+                  </a:solidFill>
+                </a:ln>
+              </c:spPr>
+            </c:leaderLines>
+            <c:extLst>
+              <c:ext xmlns:c15="http://schemas.microsoft.com/office/drawing/2012/chart" uri="{CE6537A1-D6FC-4f65-9D91-7224C49458BB}">
+                <c15:showLeaderLines val="1"/>
+              </c:ext>
+            </c:extLst>
+          </c:dLbls>
+          <c:cat>
+            <c:strRef>
+              <c:f>categories</c:f>
+              <c:strCache>
+                <c:ptCount val="15"/>
+                <c:pt idx="0">
+                  <c:v>huggingface_whisper_large_v3_czech</c:v>
+                </c:pt>
+                <c:pt idx="1">
+                  <c:v>huggingface_whisper_medium_czech</c:v>
+                </c:pt>
+                <c:pt idx="2">
+                  <c:v>whisper_large</c:v>
+                </c:pt>
+                <c:pt idx="3">
+                  <c:v>speech_recognition_groq</c:v>
+                </c:pt>
+                <c:pt idx="4">
+                  <c:v>faster_whisper_large_float16_cuda</c:v>
+                </c:pt>
+                <c:pt idx="5">
+                  <c:v>faster_whisper_medium_float16_cuda</c:v>
+                </c:pt>
+                <c:pt idx="6">
+                  <c:v>whisper_medium</c:v>
+                </c:pt>
+                <c:pt idx="7">
+                  <c:v>speech_recognition_google</c:v>
+                </c:pt>
+                <c:pt idx="8">
+                  <c:v>whisper_small</c:v>
+                </c:pt>
+                <c:pt idx="9">
+                  <c:v>huggingface_wav2vec2_xlsr_czech_sammy</c:v>
+                </c:pt>
+                <c:pt idx="10">
+                  <c:v>huggingface_wav2vec2_xlsr_53_czech</c:v>
+                </c:pt>
+                <c:pt idx="11">
+                  <c:v>speech_recognition_vosk</c:v>
+                </c:pt>
+                <c:pt idx="12">
+                  <c:v>huggingface_wav2vec2_xlsr_czech</c:v>
+                </c:pt>
+                <c:pt idx="13">
+                  <c:v>whisper_base</c:v>
+                </c:pt>
+                <c:pt idx="14">
+                  <c:v>whisper_tiny</c:v>
+                </c:pt>
+              </c:strCache>
+            </c:strRef>
+          </c:cat>
+          <c:val>
+            <c:numRef>
+              <c:f>2</c:f>
+              <c:numCache>
+                <c:formatCode>General</c:formatCode>
+                <c:ptCount val="15"/>
+                <c:pt idx="0">
+                  <c:v>0.256016071870918</c:v>
+                </c:pt>
+                <c:pt idx="1">
+                  <c:v>0.795146019510512</c:v>
+                </c:pt>
+                <c:pt idx="4">
+                  <c:v>0.153283050739494</c:v>
+                </c:pt>
+                <c:pt idx="5">
+                  <c:v>0.136177451289278</c:v>
+                </c:pt>
+                <c:pt idx="6">
+                  <c:v>0.130435018511475</c:v>
+                </c:pt>
+                <c:pt idx="7">
+                  <c:v>0.228220963777834</c:v>
+                </c:pt>
+                <c:pt idx="8">
+                  <c:v>0.0737053906193861</c:v>
+                </c:pt>
+                <c:pt idx="9">
+                  <c:v>0.285522869842013</c:v>
+                </c:pt>
+                <c:pt idx="10">
+                  <c:v>0.121666608441389</c:v>
+                </c:pt>
+                <c:pt idx="11">
+                  <c:v>0.111690524931908</c:v>
+                </c:pt>
+                <c:pt idx="12">
+                  <c:v>0.0441173506620093</c:v>
+                </c:pt>
+                <c:pt idx="13">
+                  <c:v>0.058864187630119</c:v>
+                </c:pt>
+                <c:pt idx="14">
+                  <c:v>0.0932991636551523</c:v>
+                </c:pt>
+              </c:numCache>
+            </c:numRef>
+          </c:val>
+        </c:ser>
+        <c:gapWidth val="100"/>
+        <c:overlap val="0"/>
+        <c:axId val="22561032"/>
+        <c:axId val="2609424"/>
+      </c:barChart>
+      <c:catAx>
+        <c:axId val="22561032"/>
+        <c:scaling>
+          <c:orientation val="minMax"/>
+        </c:scaling>
+        <c:delete val="0"/>
+        <c:axPos val="b"/>
+        <c:numFmt formatCode="General" sourceLinked="0"/>
+        <c:majorTickMark val="out"/>
+        <c:minorTickMark val="none"/>
+        <c:tickLblPos val="nextTo"/>
+        <c:spPr>
+          <a:ln w="0">
+            <a:solidFill>
+              <a:srgbClr val="b3b3b3"/>
+            </a:solidFill>
+          </a:ln>
+        </c:spPr>
+        <c:txPr>
+          <a:bodyPr/>
+          <a:lstStyle/>
+          <a:p>
+            <a:pPr>
+              <a:defRPr sz="1000" b="0" u="none" strike="noStrike">
+                <a:uFillTx/>
+                <a:latin typeface="Arial"/>
+              </a:defRPr>
+            </a:pPr>
+          </a:p>
+        </c:txPr>
+        <c:crossAx val="2609424"/>
+        <c:crosses val="autoZero"/>
+        <c:auto val="1"/>
+        <c:lblAlgn val="ctr"/>
+        <c:lblOffset val="100"/>
+        <c:noMultiLvlLbl val="0"/>
+      </c:catAx>
+      <c:valAx>
+        <c:axId val="2609424"/>
+        <c:scaling>
+          <c:orientation val="minMax"/>
+        </c:scaling>
+        <c:delete val="0"/>
+        <c:axPos val="l"/>
+        <c:majorGridlines>
+          <c:spPr>
+            <a:ln w="0">
+              <a:solidFill>
+                <a:srgbClr val="b3b3b3"/>
+              </a:solidFill>
+            </a:ln>
+          </c:spPr>
+        </c:majorGridlines>
+        <c:numFmt formatCode="0.000" sourceLinked="0"/>
+        <c:majorTickMark val="out"/>
+        <c:minorTickMark val="none"/>
+        <c:tickLblPos val="nextTo"/>
+        <c:spPr>
+          <a:ln w="0">
+            <a:solidFill>
+              <a:srgbClr val="b3b3b3"/>
+            </a:solidFill>
+          </a:ln>
+        </c:spPr>
+        <c:txPr>
+          <a:bodyPr/>
+          <a:lstStyle/>
+          <a:p>
+            <a:pPr>
+              <a:defRPr sz="1000" b="0" u="none" strike="noStrike">
+                <a:uFillTx/>
+                <a:latin typeface="Arial"/>
+              </a:defRPr>
+            </a:pPr>
+          </a:p>
+        </c:txPr>
+        <c:crossAx val="22561032"/>
+        <c:crossesAt val="1"/>
+        <c:crossBetween val="between"/>
+      </c:valAx>
+      <c:spPr>
+        <a:noFill/>
+        <a:ln w="0">
+          <a:solidFill>
+            <a:srgbClr val="b3b3b3"/>
+          </a:solidFill>
+        </a:ln>
+      </c:spPr>
+    </c:plotArea>
+    <c:legend>
+      <c:legendPos val="r"/>
+      <c:overlay val="0"/>
+      <c:spPr>
+        <a:noFill/>
+        <a:ln w="0">
+          <a:noFill/>
+        </a:ln>
+      </c:spPr>
+      <c:txPr>
+        <a:bodyPr/>
+        <a:lstStyle/>
+        <a:p>
+          <a:pPr>
+            <a:defRPr sz="1000" b="0" u="none" strike="noStrike">
+              <a:uFillTx/>
+              <a:latin typeface="Arial"/>
+            </a:defRPr>
+          </a:pPr>
+        </a:p>
+      </c:txPr>
+    </c:legend>
+    <c:plotVisOnly val="1"/>
+    <c:dispBlanksAs val="gap"/>
+  </c:chart>
+  <c:spPr>
+    <a:solidFill>
+      <a:srgbClr val="dddddd"/>
+    </a:solidFill>
+    <a:ln w="0">
+      <a:noFill/>
+    </a:ln>
+  </c:spPr>
+</c:chartSpace>
 </file>
 
 <file path=word/glossary/document.xml><?xml version="1.0" encoding="utf-8"?>

</xml_diff>

<commit_message>
all in new .odt template
</commit_message>
<xml_diff>
--- a/docs/Králik Juraj.docx
+++ b/docs/Králik Juraj.docx
@@ -1097,14 +1097,14 @@
         <w:pStyle w:val="AbstraktAbstract"/>
         <w:spacing w:before="0" w:after="120"/>
         <w:rPr>
-          <w:color w:themeColor="text1" w:val="000000"/>
+          <w:color w:themeColor="dark1" w:val="000000"/>
           <w:lang w:val="sk-SK"/>
         </w:rPr>
       </w:pPr>
       <w:bookmarkStart w:id="0" w:name="_Toc37577728"/>
       <w:r>
         <w:rPr>
-          <w:color w:themeColor="text1" w:val="000000"/>
+          <w:color w:themeColor="dark1" w:val="000000"/>
           <w:lang w:val="sk-SK"/>
         </w:rPr>
         <w:t>ABSTRAKT</w:t>
@@ -1115,13 +1115,13 @@
       <w:pPr>
         <w:pStyle w:val="AbstraktAbstracttext"/>
         <w:rPr>
-          <w:color w:themeColor="text1" w:val="000000"/>
-          <w:lang w:val="sk-SK"/>
-        </w:rPr>
-      </w:pPr>
-      <w:r>
-        <w:rPr>
-          <w:color w:themeColor="text1" w:val="000000"/>
+          <w:color w:themeColor="dark1" w:val="000000"/>
+          <w:lang w:val="sk-SK"/>
+        </w:rPr>
+      </w:pPr>
+      <w:r>
+        <w:rPr>
+          <w:color w:themeColor="dark1" w:val="000000"/>
           <w:lang w:val="sk-SK"/>
         </w:rPr>
         <w:t>Diplomová práca sa zaoberá problematikou a porovnaním súčasných modelov technológie Speech-to-Text (STT). Cieľom práce je analyzovať dostupné modely z hľadiska ich presnosti, rýchlosti a schopnosti adaptácie na rôzne jazyky a prízvuky. Práca obsahuje teo-retický prehľad histórie a vývoja technológie STT, klasifikáciu modelov na základe použí-vaných technológií a podrobnú analýzu vybraných základných modelov.</w:t>
@@ -1131,13 +1131,13 @@
       <w:pPr>
         <w:pStyle w:val="AbstraktAbstracttext"/>
         <w:rPr>
-          <w:color w:themeColor="text1" w:val="000000"/>
-          <w:lang w:val="sk-SK"/>
-        </w:rPr>
-      </w:pPr>
-      <w:r>
-        <w:rPr>
-          <w:color w:themeColor="text1" w:val="000000"/>
+          <w:color w:themeColor="dark1" w:val="000000"/>
+          <w:lang w:val="sk-SK"/>
+        </w:rPr>
+      </w:pPr>
+      <w:r>
+        <w:rPr>
+          <w:color w:themeColor="dark1" w:val="000000"/>
           <w:lang w:val="sk-SK"/>
         </w:rPr>
       </w:r>
@@ -1146,13 +1146,13 @@
       <w:pPr>
         <w:pStyle w:val="AbstraktAbstracttext"/>
         <w:rPr>
-          <w:color w:themeColor="text1" w:val="000000"/>
-          <w:lang w:val="sk-SK"/>
-        </w:rPr>
-      </w:pPr>
-      <w:r>
-        <w:rPr>
-          <w:color w:themeColor="text1" w:val="000000"/>
+          <w:color w:themeColor="dark1" w:val="000000"/>
+          <w:lang w:val="sk-SK"/>
+        </w:rPr>
+      </w:pPr>
+      <w:r>
+        <w:rPr>
+          <w:color w:themeColor="dark1" w:val="000000"/>
           <w:lang w:val="sk-SK"/>
         </w:rPr>
         <w:t>Praktická časť je zameraná na zostavenie metodiky na porovnanie modelov a vyko-nanie testovania na vybraných datasetoch. Výsledky testov sú analyzované s dôrazom na porovnanie silných a slabých stránok jednotlivých modelov.</w:t>
@@ -1162,13 +1162,13 @@
       <w:pPr>
         <w:pStyle w:val="AbstraktAbstracttext"/>
         <w:rPr>
-          <w:color w:themeColor="text1" w:val="000000"/>
-          <w:lang w:val="sk-SK"/>
-        </w:rPr>
-      </w:pPr>
-      <w:r>
-        <w:rPr>
-          <w:color w:themeColor="text1" w:val="000000"/>
+          <w:color w:themeColor="dark1" w:val="000000"/>
+          <w:lang w:val="sk-SK"/>
+        </w:rPr>
+      </w:pPr>
+      <w:r>
+        <w:rPr>
+          <w:color w:themeColor="dark1" w:val="000000"/>
           <w:lang w:val="sk-SK"/>
         </w:rPr>
       </w:r>
@@ -1177,13 +1177,13 @@
       <w:pPr>
         <w:pStyle w:val="AbstraktAbstracttext"/>
         <w:rPr>
-          <w:color w:themeColor="text1" w:val="000000"/>
-          <w:lang w:val="sk-SK"/>
-        </w:rPr>
-      </w:pPr>
-      <w:r>
-        <w:rPr>
-          <w:color w:themeColor="text1" w:val="000000"/>
+          <w:color w:themeColor="dark1" w:val="000000"/>
+          <w:lang w:val="sk-SK"/>
+        </w:rPr>
+      </w:pPr>
+      <w:r>
+        <w:rPr>
+          <w:color w:themeColor="dark1" w:val="000000"/>
           <w:lang w:val="sk-SK"/>
         </w:rPr>
         <w:t>V závere práce sú zhrnuté hlavné poznatky, vrátane návrhov na možné reálne apli-kácie a odporúčaní pre ďalší výskum v oblasti Speech-to-Text technológií. Práca prispieva k lepšiemu pochopeniu možností súčasných modelov STT a ich využitia v rôznych oblastiach, ako sú automatizácia, prístupnosť alebo lingvistika.</w:t>
@@ -1193,13 +1193,13 @@
       <w:pPr>
         <w:pStyle w:val="AbstraktAbstracttext"/>
         <w:rPr>
-          <w:color w:themeColor="text1" w:val="000000"/>
-          <w:lang w:val="sk-SK"/>
-        </w:rPr>
-      </w:pPr>
-      <w:r>
-        <w:rPr>
-          <w:color w:themeColor="text1" w:val="000000"/>
+          <w:color w:themeColor="dark1" w:val="000000"/>
+          <w:lang w:val="sk-SK"/>
+        </w:rPr>
+      </w:pPr>
+      <w:r>
+        <w:rPr>
+          <w:color w:themeColor="dark1" w:val="000000"/>
           <w:lang w:val="sk-SK"/>
         </w:rPr>
         <w:t>Klíčová slova: Speech-to-Text, Speech recognition</w:t>
@@ -1209,13 +1209,13 @@
       <w:pPr>
         <w:pStyle w:val="AbstraktAbstracttext"/>
         <w:rPr>
-          <w:color w:themeColor="text1" w:val="000000"/>
-          <w:lang w:val="sk-SK"/>
-        </w:rPr>
-      </w:pPr>
-      <w:r>
-        <w:rPr>
-          <w:color w:themeColor="text1" w:val="000000"/>
+          <w:color w:themeColor="dark1" w:val="000000"/>
+          <w:lang w:val="sk-SK"/>
+        </w:rPr>
+      </w:pPr>
+      <w:r>
+        <w:rPr>
+          <w:color w:themeColor="dark1" w:val="000000"/>
           <w:lang w:val="sk-SK"/>
         </w:rPr>
       </w:r>
@@ -1238,13 +1238,13 @@
       <w:pPr>
         <w:pStyle w:val="AbstraktAbstracttext"/>
         <w:rPr>
-          <w:color w:themeColor="text1" w:val="000000"/>
-          <w:lang w:val="sk-SK"/>
-        </w:rPr>
-      </w:pPr>
-      <w:r>
-        <w:rPr>
-          <w:color w:themeColor="text1" w:val="000000"/>
+          <w:color w:themeColor="dark1" w:val="000000"/>
+          <w:lang w:val="sk-SK"/>
+        </w:rPr>
+      </w:pPr>
+      <w:r>
+        <w:rPr>
+          <w:color w:themeColor="dark1" w:val="000000"/>
           <w:lang w:val="sk-SK"/>
         </w:rPr>
         <w:t>The thesis addresses the issues and comparison of current Speech-to-Text (STT) technology models. The aim of the work is to analyze the available models in terms of their accuracy, speed, and adaptability to different languages and accents. The thesis includes a theoretical overview of the history and development of STT technology, a classification of models based on the technologies used, and a detailed analysis of selected foundational models.</w:t>
@@ -1254,13 +1254,13 @@
       <w:pPr>
         <w:pStyle w:val="AbstraktAbstracttext"/>
         <w:rPr>
-          <w:color w:themeColor="text1" w:val="000000"/>
-          <w:lang w:val="sk-SK"/>
-        </w:rPr>
-      </w:pPr>
-      <w:r>
-        <w:rPr>
-          <w:color w:themeColor="text1" w:val="000000"/>
+          <w:color w:themeColor="dark1" w:val="000000"/>
+          <w:lang w:val="sk-SK"/>
+        </w:rPr>
+      </w:pPr>
+      <w:r>
+        <w:rPr>
+          <w:color w:themeColor="dark1" w:val="000000"/>
           <w:lang w:val="sk-SK"/>
         </w:rPr>
       </w:r>
@@ -1269,13 +1269,13 @@
       <w:pPr>
         <w:pStyle w:val="AbstraktAbstracttext"/>
         <w:rPr>
-          <w:color w:themeColor="text1" w:val="000000"/>
-          <w:lang w:val="sk-SK"/>
-        </w:rPr>
-      </w:pPr>
-      <w:r>
-        <w:rPr>
-          <w:color w:themeColor="text1" w:val="000000"/>
+          <w:color w:themeColor="dark1" w:val="000000"/>
+          <w:lang w:val="sk-SK"/>
+        </w:rPr>
+      </w:pPr>
+      <w:r>
+        <w:rPr>
+          <w:color w:themeColor="dark1" w:val="000000"/>
           <w:lang w:val="sk-SK"/>
         </w:rPr>
         <w:t>The practical part focuses on developing a methodology for model comparison and conducting tests on selected datasets. The test results are analyzed with an emphasis on comparing the strengths and weaknesses of individual models.</w:t>
@@ -1285,13 +1285,13 @@
       <w:pPr>
         <w:pStyle w:val="AbstraktAbstracttext"/>
         <w:rPr>
-          <w:color w:themeColor="text1" w:val="000000"/>
-          <w:lang w:val="sk-SK"/>
-        </w:rPr>
-      </w:pPr>
-      <w:r>
-        <w:rPr>
-          <w:color w:themeColor="text1" w:val="000000"/>
+          <w:color w:themeColor="dark1" w:val="000000"/>
+          <w:lang w:val="sk-SK"/>
+        </w:rPr>
+      </w:pPr>
+      <w:r>
+        <w:rPr>
+          <w:color w:themeColor="dark1" w:val="000000"/>
           <w:lang w:val="sk-SK"/>
         </w:rPr>
       </w:r>
@@ -1300,13 +1300,13 @@
       <w:pPr>
         <w:pStyle w:val="AbstraktAbstracttext"/>
         <w:rPr>
-          <w:color w:themeColor="text1" w:val="000000"/>
-          <w:lang w:val="sk-SK"/>
-        </w:rPr>
-      </w:pPr>
-      <w:r>
-        <w:rPr>
-          <w:color w:themeColor="text1" w:val="000000"/>
+          <w:color w:themeColor="dark1" w:val="000000"/>
+          <w:lang w:val="sk-SK"/>
+        </w:rPr>
+      </w:pPr>
+      <w:r>
+        <w:rPr>
+          <w:color w:themeColor="dark1" w:val="000000"/>
           <w:lang w:val="sk-SK"/>
         </w:rPr>
         <w:t>In the conclusion, the thesis summarizes key findings, including suggestions for potential real-world applications and recommendations for further research in the field of Speech-to-Text technology. The work contributes to a better understanding of the capabilities of current STT models and their applications in various areas such as automation, accessibility, and linguistics.</w:t>
@@ -1316,13 +1316,13 @@
       <w:pPr>
         <w:pStyle w:val="AbstraktAbstracttext"/>
         <w:rPr>
-          <w:color w:themeColor="text1" w:val="000000"/>
-          <w:lang w:val="sk-SK"/>
-        </w:rPr>
-      </w:pPr>
-      <w:r>
-        <w:rPr>
-          <w:color w:themeColor="text1" w:val="000000"/>
+          <w:color w:themeColor="dark1" w:val="000000"/>
+          <w:lang w:val="sk-SK"/>
+        </w:rPr>
+      </w:pPr>
+      <w:r>
+        <w:rPr>
+          <w:color w:themeColor="dark1" w:val="000000"/>
           <w:lang w:val="sk-SK"/>
         </w:rPr>
         <w:t>Keywords: Speech-to-Text, Speech recognition</w:t>
@@ -1332,13 +1332,13 @@
       <w:pPr>
         <w:pStyle w:val="AbstraktAbstracttext"/>
         <w:rPr>
-          <w:color w:themeColor="text1" w:val="000000"/>
-          <w:lang w:val="sk-SK"/>
-        </w:rPr>
-      </w:pPr>
-      <w:r>
-        <w:rPr>
-          <w:color w:themeColor="text1" w:val="000000"/>
+          <w:color w:themeColor="dark1" w:val="000000"/>
+          <w:lang w:val="sk-SK"/>
+        </w:rPr>
+      </w:pPr>
+      <w:r>
+        <w:rPr>
+          <w:color w:themeColor="dark1" w:val="000000"/>
           <w:lang w:val="sk-SK"/>
         </w:rPr>
       </w:r>
@@ -1347,13 +1347,13 @@
       <w:pPr>
         <w:pStyle w:val="Normal"/>
         <w:rPr>
-          <w:color w:themeColor="text1" w:val="000000"/>
-          <w:lang w:val="sk-SK"/>
-        </w:rPr>
-      </w:pPr>
-      <w:r>
-        <w:rPr>
-          <w:color w:themeColor="text1" w:val="000000"/>
+          <w:color w:themeColor="dark1" w:val="000000"/>
+          <w:lang w:val="sk-SK"/>
+        </w:rPr>
+      </w:pPr>
+      <w:r>
+        <w:rPr>
+          <w:color w:themeColor="dark1" w:val="000000"/>
           <w:lang w:val="sk-SK"/>
         </w:rPr>
       </w:r>
@@ -1399,32 +1399,32 @@
           <w:lang w:val="sk-SK"/>
         </w:rPr>
       </w:pPr>
-      <w:bookmarkStart w:id="1" w:name="_Toc107635157"/>
-      <w:bookmarkStart w:id="2" w:name="_Toc107634140"/>
-      <w:bookmarkStart w:id="3" w:name="_Toc88128503"/>
-      <w:bookmarkStart w:id="4" w:name="_Toc88127138"/>
-      <w:bookmarkStart w:id="5" w:name="_Toc88127095"/>
-      <w:bookmarkStart w:id="6" w:name="_Toc88126854"/>
-      <w:bookmarkStart w:id="7" w:name="_Toc88126764"/>
-      <w:bookmarkStart w:id="8" w:name="_Toc88126548"/>
-      <w:bookmarkStart w:id="9" w:name="_Toc88126519"/>
-      <w:bookmarkStart w:id="10" w:name="_Toc88126452"/>
-      <w:bookmarkStart w:id="11" w:name="_Toc88126301"/>
-      <w:bookmarkStart w:id="12" w:name="_Toc88125781"/>
-      <w:bookmarkStart w:id="13" w:name="_Toc88124798"/>
-      <w:bookmarkStart w:id="14" w:name="_Toc88124648"/>
-      <w:bookmarkStart w:id="15" w:name="_Toc88124611"/>
-      <w:bookmarkStart w:id="16" w:name="_Toc88122008"/>
-      <w:bookmarkStart w:id="17" w:name="_Toc88121742"/>
-      <w:bookmarkStart w:id="18" w:name="_Toc88121604"/>
-      <w:bookmarkStart w:id="19" w:name="_Toc88121547"/>
-      <w:bookmarkStart w:id="20" w:name="_Toc88121173"/>
-      <w:bookmarkStart w:id="21" w:name="_Toc88121036"/>
-      <w:bookmarkStart w:id="22" w:name="_Toc88120993"/>
-      <w:bookmarkStart w:id="23" w:name="_Toc88120889"/>
-      <w:bookmarkStart w:id="24" w:name="_Toc88120677"/>
-      <w:bookmarkStart w:id="25" w:name="_Toc88120440"/>
-      <w:bookmarkStart w:id="26" w:name="_Toc37577729"/>
+      <w:bookmarkStart w:id="1" w:name="_Toc37577729"/>
+      <w:bookmarkStart w:id="2" w:name="_Toc88120440"/>
+      <w:bookmarkStart w:id="3" w:name="_Toc88120677"/>
+      <w:bookmarkStart w:id="4" w:name="_Toc88120889"/>
+      <w:bookmarkStart w:id="5" w:name="_Toc88120993"/>
+      <w:bookmarkStart w:id="6" w:name="_Toc88121036"/>
+      <w:bookmarkStart w:id="7" w:name="_Toc88121173"/>
+      <w:bookmarkStart w:id="8" w:name="_Toc88121547"/>
+      <w:bookmarkStart w:id="9" w:name="_Toc88121604"/>
+      <w:bookmarkStart w:id="10" w:name="_Toc88121742"/>
+      <w:bookmarkStart w:id="11" w:name="_Toc88122008"/>
+      <w:bookmarkStart w:id="12" w:name="_Toc88124611"/>
+      <w:bookmarkStart w:id="13" w:name="_Toc88124648"/>
+      <w:bookmarkStart w:id="14" w:name="_Toc88124798"/>
+      <w:bookmarkStart w:id="15" w:name="_Toc88125781"/>
+      <w:bookmarkStart w:id="16" w:name="_Toc88126301"/>
+      <w:bookmarkStart w:id="17" w:name="_Toc88126452"/>
+      <w:bookmarkStart w:id="18" w:name="_Toc88126519"/>
+      <w:bookmarkStart w:id="19" w:name="_Toc88126548"/>
+      <w:bookmarkStart w:id="20" w:name="_Toc88126764"/>
+      <w:bookmarkStart w:id="21" w:name="_Toc88126854"/>
+      <w:bookmarkStart w:id="22" w:name="_Toc88127095"/>
+      <w:bookmarkStart w:id="23" w:name="_Toc88127138"/>
+      <w:bookmarkStart w:id="24" w:name="_Toc88128503"/>
+      <w:bookmarkStart w:id="25" w:name="_Toc107634140"/>
+      <w:bookmarkStart w:id="26" w:name="_Toc107635157"/>
       <w:r>
         <w:rPr>
           <w:lang w:val="sk-SK"/>
@@ -1478,6 +1478,7 @@
               <w:tab w:val="left" w:pos="440" w:leader="none"/>
               <w:tab w:val="right" w:pos="8786" w:leader="dot"/>
             </w:tabs>
+            <w:ind w:hanging="360" w:start="720" w:end="567"/>
             <w:rPr/>
           </w:pPr>
           <w:r>
@@ -1495,17 +1496,18 @@
             </w:rPr>
             <w:fldChar w:fldCharType="separate"/>
           </w:r>
-          <w:hyperlink w:anchor="__RefHeading___Toc522_1577340545" w:tooltip="teoRetická časť">
-            <w:r>
-              <w:rPr>
-                <w:rStyle w:val="IndexLink"/>
-              </w:rPr>
-              <w:tab/>
-              <w:t>teoRetická časť</w:t>
-              <w:tab/>
-              <w:t>14</w:t>
-            </w:r>
-          </w:hyperlink>
+          <w:r>
+            <w:rPr>
+              <w:rStyle w:val="IndexLink"/>
+            </w:rPr>
+            <w:tab/>
+          </w:r>
+          <w:r>
+            <w:rPr/>
+            <w:t>teoRetická časť</w:t>
+            <w:tab/>
+            <w:t>14</w:t>
+          </w:r>
         </w:p>
         <w:p>
           <w:pPr>
@@ -1517,18 +1519,14 @@
             </w:tabs>
             <w:rPr/>
           </w:pPr>
-          <w:hyperlink w:anchor="__RefHeading___Toc524_1577340545" w:tooltip="Teoretický prehľad technológie speech-to-text">
-            <w:r>
-              <w:rPr>
-                <w:rStyle w:val="IndexLink"/>
-              </w:rPr>
-              <w:t>1</w:t>
-              <w:tab/>
-              <w:t>Teoretický prehľad technológie speech-to-text</w:t>
-              <w:tab/>
-              <w:t>15</w:t>
-            </w:r>
-          </w:hyperlink>
+          <w:r>
+            <w:rPr/>
+            <w:t>1</w:t>
+            <w:tab/>
+            <w:t>Teoretický prehľad technológie speech-to-text</w:t>
+            <w:tab/>
+            <w:t>15</w:t>
+          </w:r>
         </w:p>
         <w:p>
           <w:pPr>
@@ -1540,18 +1538,14 @@
             </w:tabs>
             <w:rPr/>
           </w:pPr>
-          <w:hyperlink w:anchor="__RefHeading___Toc536_1577340545" w:tooltip="História a vývoj STT technológií">
-            <w:r>
-              <w:rPr>
-                <w:rStyle w:val="IndexLink"/>
-              </w:rPr>
-              <w:t>1.1</w:t>
-              <w:tab/>
-              <w:t>História a vývoj STT technológií</w:t>
-              <w:tab/>
-              <w:t>16</w:t>
-            </w:r>
-          </w:hyperlink>
+          <w:r>
+            <w:rPr/>
+            <w:t>1.1</w:t>
+            <w:tab/>
+            <w:t>História a vývoj STT technológií</w:t>
+            <w:tab/>
+            <w:t>16</w:t>
+          </w:r>
         </w:p>
         <w:p>
           <w:pPr>
@@ -1563,18 +1557,14 @@
             </w:tabs>
             <w:rPr/>
           </w:pPr>
-          <w:hyperlink w:anchor="__RefHeading___Toc562_1577340545" w:tooltip="Prehľad základných princípov a metód (akustické modely, jazykové modely, neurónové siete)">
-            <w:r>
-              <w:rPr>
-                <w:rStyle w:val="IndexLink"/>
-              </w:rPr>
-              <w:t>1.2</w:t>
-              <w:tab/>
-              <w:t>Prehľad základných princípov a metód (akustické modely, jazykové modely, neurónové siete)</w:t>
-              <w:tab/>
-              <w:t>19</w:t>
-            </w:r>
-          </w:hyperlink>
+          <w:r>
+            <w:rPr/>
+            <w:t>1.2</w:t>
+            <w:tab/>
+            <w:t>Prehľad základných princípov a metód (akustické modely, jazykové modely, neurónové siete)</w:t>
+            <w:tab/>
+            <w:t>19</w:t>
+          </w:r>
         </w:p>
         <w:p>
           <w:pPr>
@@ -1586,18 +1576,14 @@
             </w:tabs>
             <w:rPr/>
           </w:pPr>
-          <w:hyperlink w:anchor="__RefHeading___Toc560_1577340545" w:tooltip="Klasifikácia STT modelov podľa technológií a použití">
-            <w:r>
-              <w:rPr>
-                <w:rStyle w:val="IndexLink"/>
-              </w:rPr>
-              <w:t>1.3</w:t>
-              <w:tab/>
-              <w:t>Klasifikácia STT modelov podľa technológií a použití</w:t>
-              <w:tab/>
-              <w:t>21</w:t>
-            </w:r>
-          </w:hyperlink>
+          <w:r>
+            <w:rPr/>
+            <w:t>1.3</w:t>
+            <w:tab/>
+            <w:t>Klasifikácia STT modelov podľa technológií a použití</w:t>
+            <w:tab/>
+            <w:t>21</w:t>
+          </w:r>
         </w:p>
         <w:p>
           <w:pPr>
@@ -1611,19 +1597,16 @@
               <w:tab w:val="left" w:pos="440" w:leader="none"/>
               <w:tab w:val="right" w:pos="8786" w:leader="dot"/>
             </w:tabs>
+            <w:ind w:hanging="360" w:start="720" w:end="567"/>
             <w:rPr/>
           </w:pPr>
-          <w:hyperlink w:anchor="__RefHeading___Toc520_1577340545" w:tooltip="praktická část">
-            <w:r>
-              <w:rPr>
-                <w:rStyle w:val="IndexLink"/>
-              </w:rPr>
-              <w:tab/>
-              <w:t>praktická část</w:t>
-              <w:tab/>
-              <w:t>24</w:t>
-            </w:r>
-          </w:hyperlink>
+          <w:r>
+            <w:rPr/>
+            <w:tab/>
+            <w:t>praktická část</w:t>
+            <w:tab/>
+            <w:t>24</w:t>
+          </w:r>
         </w:p>
         <w:p>
           <w:pPr>
@@ -1635,18 +1618,14 @@
             </w:tabs>
             <w:rPr/>
           </w:pPr>
-          <w:hyperlink w:anchor="__RefHeading___Toc534_1577340545" w:tooltip="Príprava Testovania">
-            <w:r>
-              <w:rPr>
-                <w:rStyle w:val="IndexLink"/>
-              </w:rPr>
-              <w:t>2</w:t>
-              <w:tab/>
-              <w:t>Príprava Testovania</w:t>
-              <w:tab/>
-              <w:t>25</w:t>
-            </w:r>
-          </w:hyperlink>
+          <w:r>
+            <w:rPr/>
+            <w:t>2</w:t>
+            <w:tab/>
+            <w:t>Príprava Testovania</w:t>
+            <w:tab/>
+            <w:t>25</w:t>
+          </w:r>
         </w:p>
         <w:p>
           <w:pPr>
@@ -1658,18 +1637,14 @@
             </w:tabs>
             <w:rPr/>
           </w:pPr>
-          <w:hyperlink w:anchor="__RefHeading___Toc558_1577340545" w:tooltip="Kritériá výberu dostupných modelov">
-            <w:r>
-              <w:rPr>
-                <w:rStyle w:val="IndexLink"/>
-              </w:rPr>
-              <w:t>2.1</w:t>
-              <w:tab/>
-              <w:t>Kritériá výberu dostupných modelov</w:t>
-              <w:tab/>
-              <w:t>25</w:t>
-            </w:r>
-          </w:hyperlink>
+          <w:r>
+            <w:rPr/>
+            <w:t>2.1</w:t>
+            <w:tab/>
+            <w:t>Kritériá výberu dostupných modelov</w:t>
+            <w:tab/>
+            <w:t>25</w:t>
+          </w:r>
         </w:p>
         <w:p>
           <w:pPr>
@@ -1681,18 +1656,14 @@
             </w:tabs>
             <w:rPr/>
           </w:pPr>
-          <w:hyperlink w:anchor="__RefHeading___Toc574_1577340545" w:tooltip="Integrácia v Pythone">
-            <w:r>
-              <w:rPr>
-                <w:rStyle w:val="IndexLink"/>
-              </w:rPr>
-              <w:t>2.1.1</w:t>
-              <w:tab/>
-              <w:t>Integrácia v Pythone</w:t>
-              <w:tab/>
-              <w:t>25</w:t>
-            </w:r>
-          </w:hyperlink>
+          <w:r>
+            <w:rPr/>
+            <w:t>2.1.1</w:t>
+            <w:tab/>
+            <w:t>Integrácia v Pythone</w:t>
+            <w:tab/>
+            <w:t>25</w:t>
+          </w:r>
         </w:p>
         <w:p>
           <w:pPr>
@@ -1704,18 +1675,14 @@
             </w:tabs>
             <w:rPr/>
           </w:pPr>
-          <w:hyperlink w:anchor="__RefHeading___Toc572_1577340545" w:tooltip="Predtrénované modely">
-            <w:r>
-              <w:rPr>
-                <w:rStyle w:val="IndexLink"/>
-              </w:rPr>
-              <w:t>2.1.2</w:t>
-              <w:tab/>
-              <w:t>Predtrénované modely</w:t>
-              <w:tab/>
-              <w:t>25</w:t>
-            </w:r>
-          </w:hyperlink>
+          <w:r>
+            <w:rPr/>
+            <w:t>2.1.2</w:t>
+            <w:tab/>
+            <w:t>Predtrénované modely</w:t>
+            <w:tab/>
+            <w:t>25</w:t>
+          </w:r>
         </w:p>
         <w:p>
           <w:pPr>
@@ -1727,18 +1694,14 @@
             </w:tabs>
             <w:rPr/>
           </w:pPr>
-          <w:hyperlink w:anchor="__RefHeading___Toc570_1577340545" w:tooltip="Použité STT riešenia">
-            <w:r>
-              <w:rPr>
-                <w:rStyle w:val="IndexLink"/>
-              </w:rPr>
-              <w:t>2.1.3</w:t>
-              <w:tab/>
-              <w:t>Použité STT riešenia</w:t>
-              <w:tab/>
-              <w:t>26</w:t>
-            </w:r>
-          </w:hyperlink>
+          <w:r>
+            <w:rPr/>
+            <w:t>2.1.3</w:t>
+            <w:tab/>
+            <w:t>Použité STT riešenia</w:t>
+            <w:tab/>
+            <w:t>26</w:t>
+          </w:r>
         </w:p>
         <w:p>
           <w:pPr>
@@ -1750,18 +1713,14 @@
             </w:tabs>
             <w:rPr/>
           </w:pPr>
-          <w:hyperlink w:anchor="__RefHeading___Toc556_1577340545" w:tooltip="Príprava modelov">
-            <w:r>
-              <w:rPr>
-                <w:rStyle w:val="IndexLink"/>
-              </w:rPr>
-              <w:t>2.2</w:t>
-              <w:tab/>
-              <w:t>Príprava modelov</w:t>
-              <w:tab/>
-              <w:t>27</w:t>
-            </w:r>
-          </w:hyperlink>
+          <w:r>
+            <w:rPr/>
+            <w:t>2.2</w:t>
+            <w:tab/>
+            <w:t>Príprava modelov</w:t>
+            <w:tab/>
+            <w:t>27</w:t>
+          </w:r>
         </w:p>
         <w:p>
           <w:pPr>
@@ -1773,18 +1732,14 @@
             </w:tabs>
             <w:rPr/>
           </w:pPr>
-          <w:hyperlink w:anchor="__RefHeading___Toc568_1577340545" w:tooltip="Moduly pre prácu s modelmi">
-            <w:r>
-              <w:rPr>
-                <w:rStyle w:val="IndexLink"/>
-              </w:rPr>
-              <w:t>2.2.1</w:t>
-              <w:tab/>
-              <w:t>Moduly pre prácu s modelmi</w:t>
-              <w:tab/>
-              <w:t>27</w:t>
-            </w:r>
-          </w:hyperlink>
+          <w:r>
+            <w:rPr/>
+            <w:t>2.2.1</w:t>
+            <w:tab/>
+            <w:t>Moduly pre prácu s modelmi</w:t>
+            <w:tab/>
+            <w:t>27</w:t>
+          </w:r>
         </w:p>
         <w:p>
           <w:pPr>
@@ -1796,18 +1751,14 @@
             </w:tabs>
             <w:rPr/>
           </w:pPr>
-          <w:hyperlink w:anchor="__RefHeading___Toc566_1577340545" w:tooltip="Hlavný script">
-            <w:r>
-              <w:rPr>
-                <w:rStyle w:val="IndexLink"/>
-              </w:rPr>
-              <w:t>2.2.2</w:t>
-              <w:tab/>
-              <w:t>Hlavný script</w:t>
-              <w:tab/>
-              <w:t>28</w:t>
-            </w:r>
-          </w:hyperlink>
+          <w:r>
+            <w:rPr/>
+            <w:t>2.2.2</w:t>
+            <w:tab/>
+            <w:t>Hlavný script</w:t>
+            <w:tab/>
+            <w:t>28</w:t>
+          </w:r>
         </w:p>
         <w:p>
           <w:pPr>
@@ -1819,18 +1770,14 @@
             </w:tabs>
             <w:rPr/>
           </w:pPr>
-          <w:hyperlink w:anchor="__RefHeading___Toc532_1577340545" w:tooltip="Metodika testovania a porovnávania">
-            <w:r>
-              <w:rPr>
-                <w:rStyle w:val="IndexLink"/>
-              </w:rPr>
-              <w:t>3</w:t>
-              <w:tab/>
-              <w:t>Metodika testovania a porovnávania</w:t>
-              <w:tab/>
-              <w:t>29</w:t>
-            </w:r>
-          </w:hyperlink>
+          <w:r>
+            <w:rPr/>
+            <w:t>3</w:t>
+            <w:tab/>
+            <w:t>Metodika testovania a porovnávania</w:t>
+            <w:tab/>
+            <w:t>29</w:t>
+          </w:r>
         </w:p>
         <w:p>
           <w:pPr>
@@ -1842,18 +1789,14 @@
             </w:tabs>
             <w:rPr/>
           </w:pPr>
-          <w:hyperlink w:anchor="__RefHeading___Toc552_1577340545" w:tooltip="Kritéria hodnotenia modelov">
-            <w:r>
-              <w:rPr>
-                <w:rStyle w:val="IndexLink"/>
-              </w:rPr>
-              <w:t>3.1</w:t>
-              <w:tab/>
-              <w:t>Kritéria hodnotenia modelov</w:t>
-              <w:tab/>
-              <w:t>29</w:t>
-            </w:r>
-          </w:hyperlink>
+          <w:r>
+            <w:rPr/>
+            <w:t>3.1</w:t>
+            <w:tab/>
+            <w:t>Kritéria hodnotenia modelov</w:t>
+            <w:tab/>
+            <w:t>29</w:t>
+          </w:r>
         </w:p>
         <w:p>
           <w:pPr>
@@ -1865,18 +1808,14 @@
             </w:tabs>
             <w:rPr/>
           </w:pPr>
-          <w:hyperlink w:anchor="__RefHeading___Toc530_1577340545" w:tooltip="Praktické testovanie modelov">
-            <w:r>
-              <w:rPr>
-                <w:rStyle w:val="IndexLink"/>
-              </w:rPr>
-              <w:t>4</w:t>
-              <w:tab/>
-              <w:t>Praktické testovanie modelov</w:t>
-              <w:tab/>
-              <w:t>31</w:t>
-            </w:r>
-          </w:hyperlink>
+          <w:r>
+            <w:rPr/>
+            <w:t>4</w:t>
+            <w:tab/>
+            <w:t>Praktické testovanie modelov</w:t>
+            <w:tab/>
+            <w:t>31</w:t>
+          </w:r>
         </w:p>
         <w:p>
           <w:pPr>
@@ -1888,18 +1827,14 @@
             </w:tabs>
             <w:rPr/>
           </w:pPr>
-          <w:hyperlink w:anchor="__RefHeading___Toc550_1577340545" w:tooltip="Príprava datasetu">
-            <w:r>
-              <w:rPr>
-                <w:rStyle w:val="IndexLink"/>
-              </w:rPr>
-              <w:t>4.1</w:t>
-              <w:tab/>
-              <w:t>Príprava datasetu</w:t>
-              <w:tab/>
-              <w:t>31</w:t>
-            </w:r>
-          </w:hyperlink>
+          <w:r>
+            <w:rPr/>
+            <w:t>4.1</w:t>
+            <w:tab/>
+            <w:t>Príprava datasetu</w:t>
+            <w:tab/>
+            <w:t>31</w:t>
+          </w:r>
         </w:p>
         <w:p>
           <w:pPr>
@@ -1911,18 +1846,14 @@
             </w:tabs>
             <w:rPr/>
           </w:pPr>
-          <w:hyperlink w:anchor="__RefHeading___Toc548_1577340545" w:tooltip="Postup testovania jednotlivých modelov">
-            <w:r>
-              <w:rPr>
-                <w:rStyle w:val="IndexLink"/>
-              </w:rPr>
-              <w:t>4.2</w:t>
-              <w:tab/>
-              <w:t>Postup testovania jednotlivých modelov</w:t>
-              <w:tab/>
-              <w:t>32</w:t>
-            </w:r>
-          </w:hyperlink>
+          <w:r>
+            <w:rPr/>
+            <w:t>4.2</w:t>
+            <w:tab/>
+            <w:t>Postup testovania jednotlivých modelov</w:t>
+            <w:tab/>
+            <w:t>32</w:t>
+          </w:r>
         </w:p>
         <w:p>
           <w:pPr>
@@ -1934,18 +1865,14 @@
             </w:tabs>
             <w:rPr/>
           </w:pPr>
-          <w:hyperlink w:anchor="__RefHeading___Toc546_1577340545" w:tooltip="Zber a spracovanie výsledkov">
-            <w:r>
-              <w:rPr>
-                <w:rStyle w:val="IndexLink"/>
-              </w:rPr>
-              <w:t>4.3</w:t>
-              <w:tab/>
-              <w:t>Zber a spracovanie výsledkov</w:t>
-              <w:tab/>
-              <w:t>32</w:t>
-            </w:r>
-          </w:hyperlink>
+          <w:r>
+            <w:rPr/>
+            <w:t>4.3</w:t>
+            <w:tab/>
+            <w:t>Zber a spracovanie výsledkov</w:t>
+            <w:tab/>
+            <w:t>32</w:t>
+          </w:r>
         </w:p>
         <w:p>
           <w:pPr>
@@ -1957,18 +1884,14 @@
             </w:tabs>
             <w:rPr/>
           </w:pPr>
-          <w:hyperlink w:anchor="__RefHeading___Toc528_1577340545" w:tooltip="Analýza a prezentácia výsledkov">
-            <w:r>
-              <w:rPr>
-                <w:rStyle w:val="IndexLink"/>
-              </w:rPr>
-              <w:t>5</w:t>
-              <w:tab/>
-              <w:t>Analýza a prezentácia výsledkov</w:t>
-              <w:tab/>
-              <w:t>33</w:t>
-            </w:r>
-          </w:hyperlink>
+          <w:r>
+            <w:rPr/>
+            <w:t>5</w:t>
+            <w:tab/>
+            <w:t>Analýza a prezentácia výsledkov</w:t>
+            <w:tab/>
+            <w:t>33</w:t>
+          </w:r>
         </w:p>
         <w:p>
           <w:pPr>
@@ -1980,18 +1903,14 @@
             </w:tabs>
             <w:rPr/>
           </w:pPr>
-          <w:hyperlink w:anchor="__RefHeading___Toc544_1577340545" w:tooltip="Porovnanie modelov na základe zvolených metrík">
-            <w:r>
-              <w:rPr>
-                <w:rStyle w:val="IndexLink"/>
-              </w:rPr>
-              <w:t>5.1</w:t>
-              <w:tab/>
-              <w:t>Porovnanie modelov na základe zvolených metrík</w:t>
-              <w:tab/>
-              <w:t>33</w:t>
-            </w:r>
-          </w:hyperlink>
+          <w:r>
+            <w:rPr/>
+            <w:t>5.1</w:t>
+            <w:tab/>
+            <w:t>Porovnanie modelov na základe zvolených metrík</w:t>
+            <w:tab/>
+            <w:t>33</w:t>
+          </w:r>
         </w:p>
         <w:p>
           <w:pPr>
@@ -2003,18 +1922,14 @@
             </w:tabs>
             <w:rPr/>
           </w:pPr>
-          <w:hyperlink w:anchor="__RefHeading___Toc542_1577340545" w:tooltip="Vizualizácia výsledkov">
-            <w:r>
-              <w:rPr>
-                <w:rStyle w:val="IndexLink"/>
-              </w:rPr>
-              <w:t>5.2</w:t>
-              <w:tab/>
-              <w:t>Vizualizácia výsledkov</w:t>
-              <w:tab/>
-              <w:t>34</w:t>
-            </w:r>
-          </w:hyperlink>
+          <w:r>
+            <w:rPr/>
+            <w:t>5.2</w:t>
+            <w:tab/>
+            <w:t>Vizualizácia výsledkov</w:t>
+            <w:tab/>
+            <w:t>34</w:t>
+          </w:r>
         </w:p>
         <w:p>
           <w:pPr>
@@ -2026,18 +1941,14 @@
             </w:tabs>
             <w:rPr/>
           </w:pPr>
-          <w:hyperlink w:anchor="__RefHeading___Toc540_1577340545" w:tooltip="Rozbor silných a slabých stránok modelov">
-            <w:r>
-              <w:rPr>
-                <w:rStyle w:val="IndexLink"/>
-              </w:rPr>
-              <w:t>5.3</w:t>
-              <w:tab/>
-              <w:t>Rozbor silných a slabých stránok modelov</w:t>
-              <w:tab/>
-              <w:t>36</w:t>
-            </w:r>
-          </w:hyperlink>
+          <w:r>
+            <w:rPr/>
+            <w:t>5.3</w:t>
+            <w:tab/>
+            <w:t>Rozbor silných a slabých stránok modelov</w:t>
+            <w:tab/>
+            <w:t>36</w:t>
+          </w:r>
         </w:p>
         <w:p>
           <w:pPr>
@@ -2049,18 +1960,14 @@
             </w:tabs>
             <w:rPr/>
           </w:pPr>
-          <w:hyperlink w:anchor="__RefHeading___Toc526_1577340545" w:tooltip="Možnosti využitia STT technológií v praxi">
-            <w:r>
-              <w:rPr>
-                <w:rStyle w:val="IndexLink"/>
-              </w:rPr>
-              <w:t>6</w:t>
-              <w:tab/>
-              <w:t>Možnosti využitia STT technológií v praxi</w:t>
-              <w:tab/>
-              <w:t>37</w:t>
-            </w:r>
-          </w:hyperlink>
+          <w:r>
+            <w:rPr/>
+            <w:t>6</w:t>
+            <w:tab/>
+            <w:t>Možnosti využitia STT technológií v praxi</w:t>
+            <w:tab/>
+            <w:t>37</w:t>
+          </w:r>
         </w:p>
         <w:p>
           <w:pPr>
@@ -2070,24 +1977,19 @@
               <w:tab w:val="left" w:pos="1320" w:leader="none"/>
               <w:tab w:val="right" w:pos="8786" w:leader="dot"/>
             </w:tabs>
+            <w:spacing w:before="120" w:after="0"/>
             <w:rPr/>
           </w:pPr>
-          <w:hyperlink w:anchor="__RefHeading___Toc538_1577340545" w:tooltip="Budúci vývoj a trendy v oblasti STT">
-            <w:r>
-              <w:rPr>
-                <w:rStyle w:val="IndexLink"/>
-              </w:rPr>
-              <w:t>6.1</w:t>
-              <w:tab/>
-              <w:t>Budúci vývoj a trendy v oblasti STT</w:t>
-              <w:tab/>
-              <w:t>38</w:t>
-            </w:r>
-          </w:hyperlink>
           <w:r>
-            <w:rPr>
-              <w:rStyle w:val="IndexLink"/>
-            </w:rPr>
+            <w:rPr/>
+            <w:t>6.1</w:t>
+            <w:tab/>
+            <w:t>Budúci vývoj a trendy v oblasti STT</w:t>
+            <w:tab/>
+            <w:t>38</w:t>
+          </w:r>
+          <w:r>
+            <w:rPr/>
             <w:fldChar w:fldCharType="end"/>
           </w:r>
         </w:p>
@@ -2116,8 +2018,8 @@
           <w:lang w:val="sk-SK"/>
         </w:rPr>
       </w:pPr>
-      <w:bookmarkStart w:id="27" w:name="_Toc22666742"/>
-      <w:bookmarkStart w:id="28" w:name="_Toc117787093"/>
+      <w:bookmarkStart w:id="27" w:name="_Toc117787093"/>
+      <w:bookmarkStart w:id="28" w:name="_Toc22666742"/>
       <w:r>
         <w:rPr>
           <w:lang w:val="sk-SK"/>
@@ -2330,10 +2232,10 @@
         </w:rPr>
       </w:pPr>
       <w:bookmarkStart w:id="30" w:name="__RefHeading___Toc524_1577340545"/>
-      <w:bookmarkStart w:id="31" w:name="_Toc107635235"/>
-      <w:bookmarkStart w:id="32" w:name="_Toc107635218"/>
-      <w:bookmarkStart w:id="33" w:name="_Toc107635178"/>
-      <w:bookmarkStart w:id="34" w:name="_Toc107634143"/>
+      <w:bookmarkStart w:id="31" w:name="_Toc107634143"/>
+      <w:bookmarkStart w:id="32" w:name="_Toc107635178"/>
+      <w:bookmarkStart w:id="33" w:name="_Toc107635218"/>
+      <w:bookmarkStart w:id="34" w:name="_Toc107635235"/>
       <w:bookmarkEnd w:id="30"/>
       <w:bookmarkEnd w:id="31"/>
       <w:bookmarkEnd w:id="32"/>
@@ -3432,10 +3334,10 @@
           <w:lang w:val="sk-SK"/>
         </w:rPr>
       </w:pPr>
-      <w:bookmarkStart w:id="45" w:name="_Toc107635235_Copy_1"/>
-      <w:bookmarkStart w:id="46" w:name="_Toc107635218_Copy_1"/>
-      <w:bookmarkStart w:id="47" w:name="_Toc107635178_Copy_1"/>
-      <w:bookmarkStart w:id="48" w:name="_Toc107634143_Copy_1"/>
+      <w:bookmarkStart w:id="45" w:name="_Toc107634143_Copy_1"/>
+      <w:bookmarkStart w:id="46" w:name="_Toc107635178_Copy_1"/>
+      <w:bookmarkStart w:id="47" w:name="_Toc107635218_Copy_1"/>
+      <w:bookmarkStart w:id="48" w:name="_Toc107635235_Copy_1"/>
       <w:bookmarkEnd w:id="45"/>
       <w:bookmarkEnd w:id="46"/>
       <w:bookmarkEnd w:id="47"/>
@@ -4499,43 +4401,19 @@
           <w:szCs w:val="24"/>
           <w:lang w:val="sk-SK" w:eastAsia="cs-CZ" w:bidi="ar-SA"/>
         </w:rPr>
-        <w:t xml:space="preserve">Čas </w:t>
-      </w:r>
-      <w:r>
-        <w:rPr>
-          <w:rFonts w:eastAsia="Times New Roman" w:cs="Times New Roman"/>
-          <w:kern w:val="0"/>
-          <w:sz w:val="24"/>
-          <w:szCs w:val="24"/>
-          <w:lang w:val="sk-SK" w:eastAsia="cs-CZ" w:bidi="ar-SA"/>
-        </w:rPr>
-        <w:t>s</w:t>
-      </w:r>
-      <w:r>
-        <w:rPr>
-          <w:rFonts w:eastAsia="Times New Roman" w:cs="Times New Roman"/>
-          <w:kern w:val="0"/>
-          <w:sz w:val="24"/>
-          <w:szCs w:val="24"/>
-          <w:lang w:val="sk-SK" w:eastAsia="cs-CZ" w:bidi="ar-SA"/>
-        </w:rPr>
-        <w:t>pracovania však nebol pri všetkých modeloch priamo porovnateľný. Niektoré modely bežali s CUDA akceleráciou, zatiaľ čo iné museli bežať na CPU. Pri niektorých API riešeniach sa navyše prejavilo výrazné spomaľovanie pri väčšom počte požiadaviek.</w:t>
-      </w:r>
-    </w:p>
-    <w:p>
-      <w:pPr>
-        <w:pStyle w:val="TextprceText"/>
-        <w:rPr>
-          <w:lang w:val="sk-SK"/>
-        </w:rPr>
-      </w:pPr>
-      <w:r>
-        <w:rPr>
-          <w:rFonts w:eastAsia="Times New Roman" w:cs="Times New Roman"/>
-          <w:kern w:val="0"/>
-          <w:sz w:val="24"/>
-          <w:szCs w:val="24"/>
-          <w:lang w:val="sk-SK" w:eastAsia="cs-CZ" w:bidi="ar-SA"/>
+        <w:t>Čas spracovania však nebol pri všetkých modeloch priamo porovnateľný. Niektoré modely bežali s CUDA akceleráciou, zatiaľ čo iné museli bežať na CPU. Pri niektorých API riešeniach sa navyše prejavilo výrazné spomaľovanie pri väčšom počte požiadaviek.</w:t>
+      </w:r>
+    </w:p>
+    <w:p>
+      <w:pPr>
+        <w:pStyle w:val="TextprceText"/>
+        <w:rPr>
+          <w:lang w:val="sk-SK"/>
+        </w:rPr>
+      </w:pPr>
+      <w:r>
+        <w:rPr>
+          <w:lang w:val="sk-SK"/>
         </w:rPr>
       </w:r>
     </w:p>
@@ -4911,27 +4789,7 @@
           <w:szCs w:val="24"/>
           <w:lang w:val="sk-SK" w:eastAsia="cs-CZ" w:bidi="ar-SA"/>
         </w:rPr>
-        <w:t xml:space="preserve">pri </w:t>
-      </w:r>
-      <w:r>
-        <w:rPr>
-          <w:rFonts w:eastAsia="Times New Roman" w:cs="Times New Roman"/>
-          <w:kern w:val="0"/>
-          <w:sz w:val="24"/>
-          <w:szCs w:val="24"/>
-          <w:lang w:val="sk-SK" w:eastAsia="cs-CZ" w:bidi="ar-SA"/>
-        </w:rPr>
-        <w:t>malej</w:t>
-      </w:r>
-      <w:r>
-        <w:rPr>
-          <w:rFonts w:eastAsia="Times New Roman" w:cs="Times New Roman"/>
-          <w:kern w:val="0"/>
-          <w:sz w:val="24"/>
-          <w:szCs w:val="24"/>
-          <w:lang w:val="sk-SK" w:eastAsia="cs-CZ" w:bidi="ar-SA"/>
-        </w:rPr>
-        <w:t xml:space="preserve"> časti nahrávok sú dostupné aj doplnkové údaje o hovoriacom, napríklad veková skupina, pohlavie alebo prízvuk.</w:t>
+        <w:t>pri malej časti nahrávok sú dostupné aj doplnkové údaje o hovoriacom, napríklad veková skupina, pohlavie alebo prízvuk.</w:t>
       </w:r>
     </w:p>
     <w:p>
@@ -5246,107 +5104,35 @@
           <w:lang w:val="sk-SK"/>
         </w:rPr>
         <w:tab/>
-        <w:t>Z pohľadu presnosti dosiahol najlepší výsledok model huggingface_whisper_large_v3_czech, ktorý mal priemernú hodnotu WER 0,0</w:t>
-      </w:r>
-      <w:r>
-        <w:rPr>
-          <w:lang w:val="sk-SK"/>
-        </w:rPr>
-        <w:t>441</w:t>
-      </w:r>
-      <w:r>
-        <w:rPr>
-          <w:lang w:val="sk-SK"/>
-        </w:rPr>
-        <w:t xml:space="preserve"> a CER 0,01</w:t>
-      </w:r>
-      <w:r>
-        <w:rPr>
-          <w:lang w:val="sk-SK"/>
-        </w:rPr>
-        <w:t>08</w:t>
-      </w:r>
-      <w:r>
-        <w:rPr>
-          <w:lang w:val="sk-SK"/>
-        </w:rPr>
-        <w:t>. Tento výsledok naznačuje, že jazykovo doladený model Whisper pre český jazyk bol na použitom datasete výrazne presnejší než všeobecné viacjazyčné modely.</w:t>
-      </w:r>
-    </w:p>
-    <w:p>
-      <w:pPr>
-        <w:pStyle w:val="TextprceText"/>
-        <w:rPr>
-          <w:lang w:val="sk-SK"/>
-        </w:rPr>
-      </w:pPr>
-      <w:r>
-        <w:rPr>
-          <w:lang w:val="sk-SK"/>
-        </w:rPr>
-        <w:t>Druhý najlepší výsledok dosiahol model huggingface_whisper_medium_czech s hodnotou WER 0,</w:t>
-      </w:r>
-      <w:r>
-        <w:rPr>
-          <w:lang w:val="sk-SK"/>
-        </w:rPr>
-        <w:t>0914</w:t>
-      </w:r>
-      <w:r>
-        <w:rPr>
-          <w:lang w:val="sk-SK"/>
-        </w:rPr>
-        <w:t xml:space="preserve"> a CER 0,02</w:t>
-      </w:r>
-      <w:r>
-        <w:rPr>
-          <w:lang w:val="sk-SK"/>
-        </w:rPr>
-        <w:t>26</w:t>
-      </w:r>
-      <w:r>
-        <w:rPr>
-          <w:lang w:val="sk-SK"/>
-        </w:rPr>
-        <w:t>. Aj tento model bol doladený pre český jazyk, čo potvrdzuje význam jazykovej adaptácie pri rozpoznávaní reči.</w:t>
-      </w:r>
-    </w:p>
-    <w:p>
-      <w:pPr>
-        <w:pStyle w:val="TextprceText"/>
-        <w:rPr>
-          <w:lang w:val="sk-SK"/>
-        </w:rPr>
-      </w:pPr>
-      <w:r>
-        <w:rPr>
-          <w:lang w:val="sk-SK"/>
-        </w:rPr>
-        <w:t>Z pôvodných lokálnych modelov Whisper dosiahol najlepší výsledok whisper_large s hodnotou WER 0,1</w:t>
-      </w:r>
-      <w:r>
-        <w:rPr>
-          <w:lang w:val="sk-SK"/>
-        </w:rPr>
-        <w:t>124</w:t>
-      </w:r>
-      <w:r>
-        <w:rPr>
-          <w:lang w:val="sk-SK"/>
-        </w:rPr>
-        <w:t xml:space="preserve"> a CER 0,0</w:t>
-      </w:r>
-      <w:r>
-        <w:rPr>
-          <w:lang w:val="sk-SK"/>
-        </w:rPr>
-        <w:t>332</w:t>
-      </w:r>
-      <w:r>
-        <w:rPr>
-          <w:lang w:val="sk-SK"/>
-        </w:rPr>
-        <w:t>. Tento model však nebolo možné spustiť s CUDA akceleráciou na dostupnej grafickej karte, preto bol testovaný iba na menšej vzorke približne 3 000 nahrávok v jednom behu. Jeho presnosť je preto zaujímavá, ale čas spracovania bol výrazne horší než pri modeloch bežiacich na GPU.</w:t>
+        <w:t>Z pohľadu presnosti dosiahol najlepší výsledok model huggingface_whisper_large_v3_czech, ktorý mal priemernú hodnotu WER 0,0441 a CER 0,0108. Tento výsledok naznačuje, že jazykovo doladený model Whisper pre český jazyk bol na použitom datasete výrazne presnejší než všeobecné viacjazyčné modely.</w:t>
+      </w:r>
+    </w:p>
+    <w:p>
+      <w:pPr>
+        <w:pStyle w:val="TextprceText"/>
+        <w:rPr>
+          <w:lang w:val="sk-SK"/>
+        </w:rPr>
+      </w:pPr>
+      <w:r>
+        <w:rPr>
+          <w:lang w:val="sk-SK"/>
+        </w:rPr>
+        <w:t>Druhý najlepší výsledok dosiahol model huggingface_whisper_medium_czech s hodnotou WER 0,0914 a CER 0,0226. Aj tento model bol doladený pre český jazyk, čo potvrdzuje význam jazykovej adaptácie pri rozpoznávaní reči.</w:t>
+      </w:r>
+    </w:p>
+    <w:p>
+      <w:pPr>
+        <w:pStyle w:val="TextprceText"/>
+        <w:rPr>
+          <w:lang w:val="sk-SK"/>
+        </w:rPr>
+      </w:pPr>
+      <w:r>
+        <w:rPr>
+          <w:lang w:val="sk-SK"/>
+        </w:rPr>
+        <w:t>Z pôvodných lokálnych modelov Whisper dosiahol najlepší výsledok whisper_large s hodnotou WER 0,1124 a CER 0,0332. Tento model však nebolo možné spustiť s CUDA akceleráciou na dostupnej grafickej karte, preto bol testovaný iba na menšej vzorke približne 3 000 nahrávok v jednom behu. Jeho presnosť je preto zaujímavá, ale čas spracovania bol výrazne horší než pri modeloch bežiacich na GPU.</w:t>
       </w:r>
     </w:p>
     <w:p>
@@ -6360,35 +6146,35 @@
           <w:lang w:val="sk-SK"/>
         </w:rPr>
       </w:pPr>
-      <w:bookmarkStart w:id="65" w:name="_Toc37577735"/>
-      <w:bookmarkStart w:id="66" w:name="_Toc107635188"/>
-      <w:bookmarkStart w:id="67" w:name="_Toc88120446"/>
-      <w:bookmarkStart w:id="68" w:name="_Toc88120683"/>
-      <w:bookmarkStart w:id="69" w:name="_Toc88120999"/>
-      <w:bookmarkStart w:id="70" w:name="_Toc88121042"/>
-      <w:bookmarkStart w:id="71" w:name="_Toc88121179"/>
-      <w:bookmarkStart w:id="72" w:name="_Toc88121553"/>
-      <w:bookmarkStart w:id="73" w:name="_Toc88121610"/>
-      <w:bookmarkStart w:id="74" w:name="_Toc88122014"/>
-      <w:bookmarkStart w:id="75" w:name="_Toc88124619"/>
-      <w:bookmarkStart w:id="76" w:name="_Toc88124656"/>
-      <w:bookmarkStart w:id="77" w:name="_Toc88126527"/>
-      <w:bookmarkStart w:id="78" w:name="_Toc88125789"/>
+      <w:bookmarkStart w:id="65" w:name="_Toc88120895"/>
+      <w:bookmarkStart w:id="66" w:name="_Toc88124806"/>
+      <w:bookmarkStart w:id="67" w:name="_Toc88126309"/>
+      <w:bookmarkStart w:id="68" w:name="_Toc88126460"/>
+      <w:bookmarkStart w:id="69" w:name="_Toc88126556"/>
+      <w:bookmarkStart w:id="70" w:name="_Toc88126772"/>
+      <w:bookmarkStart w:id="71" w:name="_Toc88126862"/>
+      <w:bookmarkStart w:id="72" w:name="_Toc88127103"/>
+      <w:bookmarkStart w:id="73" w:name="_Toc88127146"/>
+      <w:bookmarkStart w:id="74" w:name="_Toc191630795"/>
+      <w:bookmarkStart w:id="75" w:name="_Toc88128511"/>
+      <w:bookmarkStart w:id="76" w:name="_Toc107634153"/>
+      <w:bookmarkStart w:id="77" w:name="_Toc107635228"/>
+      <w:bookmarkStart w:id="78" w:name="_Toc107635245"/>
       <w:bookmarkStart w:id="79" w:name="_Toc88121748"/>
-      <w:bookmarkStart w:id="80" w:name="_Toc107635245"/>
-      <w:bookmarkStart w:id="81" w:name="_Toc107635228"/>
-      <w:bookmarkStart w:id="82" w:name="_Toc107634153"/>
-      <w:bookmarkStart w:id="83" w:name="_Toc88128511"/>
-      <w:bookmarkStart w:id="84" w:name="_Toc191630795"/>
-      <w:bookmarkStart w:id="85" w:name="_Toc88127146"/>
-      <w:bookmarkStart w:id="86" w:name="_Toc88127103"/>
-      <w:bookmarkStart w:id="87" w:name="_Toc88126862"/>
-      <w:bookmarkStart w:id="88" w:name="_Toc88126772"/>
-      <w:bookmarkStart w:id="89" w:name="_Toc88126556"/>
-      <w:bookmarkStart w:id="90" w:name="_Toc88126460"/>
-      <w:bookmarkStart w:id="91" w:name="_Toc88126309"/>
-      <w:bookmarkStart w:id="92" w:name="_Toc88124806"/>
-      <w:bookmarkStart w:id="93" w:name="_Toc88120895"/>
+      <w:bookmarkStart w:id="80" w:name="_Toc88125789"/>
+      <w:bookmarkStart w:id="81" w:name="_Toc88126527"/>
+      <w:bookmarkStart w:id="82" w:name="_Toc88124656"/>
+      <w:bookmarkStart w:id="83" w:name="_Toc88124619"/>
+      <w:bookmarkStart w:id="84" w:name="_Toc88122014"/>
+      <w:bookmarkStart w:id="85" w:name="_Toc88121610"/>
+      <w:bookmarkStart w:id="86" w:name="_Toc88121553"/>
+      <w:bookmarkStart w:id="87" w:name="_Toc88121179"/>
+      <w:bookmarkStart w:id="88" w:name="_Toc88121042"/>
+      <w:bookmarkStart w:id="89" w:name="_Toc88120999"/>
+      <w:bookmarkStart w:id="90" w:name="_Toc88120683"/>
+      <w:bookmarkStart w:id="91" w:name="_Toc88120446"/>
+      <w:bookmarkStart w:id="92" w:name="_Toc107635188"/>
+      <w:bookmarkStart w:id="93" w:name="_Toc37577735"/>
       <w:r>
         <w:rPr>
           <w:lang w:val="sk-SK"/>
@@ -12035,7 +11821,7 @@
     <w:rsid w:val="007252fb"/>
     <w:rPr>
       <w:rFonts w:ascii="Times New Roman" w:hAnsi="Times New Roman" w:eastAsia="Times New Roman" w:cs="Times New Roman"/>
-      <w:color w:themeColor="text1" w:val="000000"/>
+      <w:color w:themeColor="dark1" w:val="000000"/>
       <w:sz w:val="24"/>
       <w:szCs w:val="24"/>
       <w:lang w:eastAsia="cs-CZ"/>
@@ -12358,8 +12144,8 @@
       <w:lang w:eastAsia="cs-CZ"/>
     </w:rPr>
   </w:style>
-  <w:style w:type="character" w:styleId="FootnoteCharacters">
-    <w:name w:val="Footnote Characters"/>
+  <w:style w:type="character" w:styleId="FootnoteCharactersuser">
+    <w:name w:val="Footnote Characters (user)"/>
     <w:uiPriority w:val="99"/>
     <w:semiHidden/>
     <w:unhideWhenUsed/>
@@ -12369,8 +12155,8 @@
       <w:vertAlign w:val="superscript"/>
     </w:rPr>
   </w:style>
-  <w:style w:type="character" w:styleId="FootnoteCharactersuser">
-    <w:name w:val="Footnote Characters (user)"/>
+  <w:style w:type="character" w:styleId="FootnoteCharacters">
+    <w:name w:val="Footnote Characters"/>
     <w:qFormat/>
     <w:rPr>
       <w:vertAlign w:val="superscript"/>
@@ -12434,8 +12220,8 @@
       <w:rFonts w:ascii="Liberation Mono" w:hAnsi="Liberation Mono" w:eastAsia="Liberation Mono" w:cs="Liberation Mono"/>
     </w:rPr>
   </w:style>
-  <w:style w:type="character" w:styleId="Bullets">
-    <w:name w:val="Bullets"/>
+  <w:style w:type="character" w:styleId="Bulletsuser">
+    <w:name w:val="Bullets (user)"/>
     <w:qFormat/>
     <w:rPr>
       <w:rFonts w:ascii="OpenSymbol" w:hAnsi="OpenSymbol" w:eastAsia="OpenSymbol" w:cs="OpenSymbol"/>
@@ -12640,7 +12426,7 @@
       <w:ind w:firstLine="482"/>
     </w:pPr>
     <w:rPr>
-      <w:color w:themeColor="text1" w:val="000000"/>
+      <w:color w:themeColor="dark1" w:val="000000"/>
     </w:rPr>
   </w:style>
   <w:style w:type="paragraph" w:styleId="st" w:customStyle="1">
@@ -13036,8 +12822,8 @@
       <w:lang w:val="en-US" w:eastAsia="en-US"/>
     </w:rPr>
   </w:style>
-  <w:style w:type="paragraph" w:styleId="HeaderLeft">
-    <w:name w:val="Header Left"/>
+  <w:style w:type="paragraph" w:styleId="HeaderLeftuser">
+    <w:name w:val="Header Left (user)"/>
     <w:basedOn w:val="Header"/>
     <w:qFormat/>
     <w:pPr/>

</xml_diff>